<commit_message>
RIB2 REV02 pass 2: whole-book line edit (201 edits, ch5-12 first; 'the way' 72->23, 'which was' 53->22, 'very' 66->23, 'looked at' 123->71), How to Read with Lesson 6 capstone note, Author's Note (real vs invented, Sud Expresso facts), KDP.md (description + 7 keywords), notes/Book 3 seeds.md
</commit_message>
<xml_diff>
--- a/The Relativistic Investigation Bureau - SERIES/Book 2 - The Warning That Was Sent Too Late/The_Warning_That_Was_Sent_Too_Late_BOOK_2_REV02.docx
+++ b/The Relativistic Investigation Bureau - SERIES/Book 2 - The Warning That Was Sent Too Late/The_Warning_That_Was_Sent_Too_Late_BOOK_2_REV02.docx
@@ -108,6 +108,22 @@
         <w:t>Table of Contents</w:t>
       </w:r>
       <w:bookmarkEnd w:id="903"/>
+    </w:p>
+    <w:p>
+      <w:pPr>
+        <w:spacing w:after="40" w:line="240" w:lineRule="auto"/>
+      </w:pPr>
+      <w:hyperlink w:anchor="how_to_read">
+        <w:r>
+          <w:rPr>
+            <w:rFonts w:ascii="Georgia" w:hAnsi="Georgia"/>
+            <w:sz w:val="22"/>
+            <w:color w:val="0563C1"/>
+            <w:u w:val="single"/>
+          </w:rPr>
+          <w:t xml:space="preserve">How to Read This Book (with Author's Note)</w:t>
+        </w:r>
+      </w:hyperlink>
     </w:p>
     <w:p>
       <w:pPr>
@@ -549,7 +565,7 @@
         <w:spacing w:before="320" w:after="200"/>
         <w:jc w:val="center"/>
       </w:pPr>
-      <w:bookmarkStart w:id="901" w:name="prologue"/>
+      <w:bookmarkStart w:id="9101" w:name="how_to_read"/>
       <w:r>
         <w:rPr>
           <w:rFonts w:ascii="Amazon Ember" w:hAnsi="Amazon Ember" w:eastAsia="Amazon Ember"/>
@@ -557,15 +573,233 @@
           <w:color w:val="0C447C"/>
           <w:sz w:val="36"/>
         </w:rPr>
-        <w:t>PROLOGUE</w:t>
-      </w:r>
-      <w:bookmarkEnd w:id="901"/>
-    </w:p>
-    <w:p>
-      <w:pPr>
+        <w:t>How to Read This Book</w:t>
+      </w:r>
+      <w:bookmarkEnd w:id="9101"/>
+    </w:p>
+    <w:p>
+      <w:pPr>
+        <w:spacing w:after="160" w:line="240" w:lineRule="auto"/>
+      </w:pPr>
+      <w:r>
+        <w:rPr>
+          <w:rFonts w:ascii="Georgia" w:hAnsi="Georgia" w:eastAsia="Georgia"/>
+          <w:b w:val="0"/>
+          <w:sz w:val="22"/>
+        </w:rPr>
+        <w:t>This is the second case of the Relativistic Investigation Bureau, and it stands on its own. You need no physics, and you do not need Book One, to follow it. The comedy is the bait. The geometry is the trap.</w:t>
+      </w:r>
+    </w:p>
+    <w:p>
+      <w:pPr>
+        <w:spacing w:after="160" w:line="240" w:lineRule="auto"/>
+      </w:pPr>
+      <w:r>
+        <w:rPr>
+          <w:rFonts w:ascii="Georgia" w:hAnsi="Georgia" w:eastAsia="Georgia"/>
+          <w:b w:val="0"/>
+          <w:sz w:val="22"/>
+        </w:rPr>
+        <w:t>The novel is the case of the morning sheet: a warning on the Bureau's own form, dated tomorrow, from a sender whose date of birth is NOT YET; an office door that is already open onto a railway platform; and a voice, Derek Gent's own, that arrives too late to stop it. The Bureau has from Monday morning to Wednesday to put three things in the right order and to decide who, if anybody, wrote the first one.</w:t>
+      </w:r>
+    </w:p>
+    <w:p>
+      <w:pPr>
+        <w:spacing w:after="160" w:line="240" w:lineRule="auto"/>
+      </w:pPr>
+      <w:r>
+        <w:rPr>
+          <w:rFonts w:ascii="Georgia" w:hAnsi="Georgia" w:eastAsia="Georgia"/>
+          <w:b w:val="0"/>
+          <w:sz w:val="22"/>
+        </w:rPr>
+        <w:t>The course, Tense for Investigators, follows the novel in six lessons. Most chapters, and the Epilogue, end with a Rule and a link to the lesson they use. Read a lesson when you want the physics behind the investigation; leave it until later when you want to know what happens next.</w:t>
+      </w:r>
+    </w:p>
+    <w:p>
+      <w:pPr>
+        <w:spacing w:after="160" w:line="240" w:lineRule="auto"/>
+      </w:pPr>
+      <w:r>
+        <w:rPr>
+          <w:rFonts w:ascii="Georgia" w:hAnsi="Georgia" w:eastAsia="Georgia"/>
+          <w:b w:val="0"/>
+          <w:sz w:val="22"/>
+        </w:rPr>
+        <w:t>A note on Lesson 6. Lessons 1 to 5 each teach one idea, and the Prologue and Chapters 1 to 9 work through them in order. From Chapter 10 to the Epilogue every link points to Lesson 6. That is deliberate. Lesson 6 is the capstone: it adds no new idea, it puts the first five to work and closes a case of this kind in one paragraph. Read the second half of the book as its worked example, and go back to Lesson 6 as often as the chapters send you. You will understand it better each time.</w:t>
+      </w:r>
+    </w:p>
+    <w:p>
+      <w:pPr>
+        <w:spacing w:after="160" w:line="240" w:lineRule="auto"/>
+      </w:pPr>
+      <w:r>
+        <w:rPr>
+          <w:rFonts w:ascii="Georgia" w:hAnsi="Georgia" w:eastAsia="Georgia"/>
+          <w:b w:val="0"/>
+          <w:sz w:val="22"/>
+        </w:rPr>
+        <w:t>Three honest ways to read this book.</w:t>
+      </w:r>
+    </w:p>
+    <w:p>
+      <w:pPr>
+        <w:spacing w:after="160" w:line="240" w:lineRule="auto"/>
+      </w:pPr>
+      <w:r>
+        <w:rPr>
+          <w:rFonts w:ascii="Georgia" w:hAnsi="Georgia" w:eastAsia="Georgia"/>
+          <w:b w:val="0"/>
+          <w:sz w:val="22"/>
+        </w:rPr>
+        <w:t>For the story alone: read the chapters and stop at each Rule. The case explains its own solution.</w:t>
+      </w:r>
+    </w:p>
+    <w:p>
+      <w:pPr>
+        <w:spacing w:after="160" w:line="240" w:lineRule="auto"/>
+      </w:pPr>
+      <w:r>
+        <w:rPr>
+          <w:rFonts w:ascii="Georgia" w:hAnsi="Georgia" w:eastAsia="Georgia"/>
+          <w:b w:val="0"/>
+          <w:sz w:val="22"/>
+        </w:rPr>
+        <w:t>To take the class: read each chapter, then the lesson it points to. No physics is assumed at the start, and none of Book One's algebra is repeated.</w:t>
+      </w:r>
+    </w:p>
+    <w:p>
+      <w:pPr>
+        <w:spacing w:after="160" w:line="240" w:lineRule="auto"/>
+      </w:pPr>
+      <w:r>
+        <w:rPr>
+          <w:rFonts w:ascii="Georgia" w:hAnsi="Georgia" w:eastAsia="Georgia"/>
+          <w:b w:val="0"/>
+          <w:sz w:val="22"/>
+        </w:rPr>
+        <w:t>If you are impatient: the sheet arrives in the Prologue and the door opens at the end of it. The Bureau understands impatience; it simply prefers it in writing.</w:t>
+      </w:r>
+    </w:p>
+    <w:p>
+      <w:pPr>
+        <w:spacing w:after="160" w:line="240" w:lineRule="auto"/>
+      </w:pPr>
+      <w:r>
+        <w:rPr>
+          <w:rFonts w:ascii="Georgia" w:hAnsi="Georgia" w:eastAsia="Georgia"/>
+          <w:b w:val="0"/>
+          <w:sz w:val="22"/>
+        </w:rPr>
+        <w:t>One promise: relativity will not be used as permission for a message to arrive from its own future. The platform in the doorway is the book's one unexplained thing, and it stays unexplained. Everything else has a cause, an order and a time, and the investigation finds them.</w:t>
+      </w:r>
+    </w:p>
+    <w:p>
+      <w:pPr>
+        <w:spacing w:after="160" w:line="240" w:lineRule="auto"/>
+      </w:pPr>
+      <w:r>
+        <w:rPr>
+          <w:rFonts w:ascii="Georgia" w:hAnsi="Georgia" w:eastAsia="Georgia"/>
+          <w:b w:val="0"/>
+          <w:sz w:val="22"/>
+        </w:rPr>
+        <w:t>A companion film for each lesson is listed at the end of the course. None of them is required.</w:t>
+      </w:r>
+    </w:p>
+    <w:p>
+      <w:pPr>
+        <w:pStyle w:val="Heading2"/>
+        <w:keepNext/>
         <w:spacing w:before="320" w:after="200"/>
         <w:jc w:val="center"/>
       </w:pPr>
+      <w:bookmarkStart w:id="9102" w:name="authors_note"/>
+      <w:r>
+        <w:rPr>
+          <w:rFonts w:ascii="Amazon Ember" w:hAnsi="Amazon Ember" w:eastAsia="Amazon Ember"/>
+          <w:b/>
+          <w:color w:val="0C447C"/>
+          <w:sz w:val="28"/>
+        </w:rPr>
+        <w:t>Author's Note</w:t>
+      </w:r>
+      <w:bookmarkEnd w:id="9102"/>
+    </w:p>
+    <w:p>
+      <w:pPr>
+        <w:spacing w:after="160" w:line="240" w:lineRule="auto"/>
+      </w:pPr>
+      <w:r>
+        <w:rPr>
+          <w:rFonts w:ascii="Georgia" w:hAnsi="Georgia" w:eastAsia="Georgia"/>
+          <w:b w:val="0"/>
+          <w:sz w:val="22"/>
+        </w:rPr>
+        <w:t>As in the first case, the physics is real and the crimes are not.</w:t>
+      </w:r>
+    </w:p>
+    <w:p>
+      <w:pPr>
+        <w:spacing w:after="160" w:line="240" w:lineRule="auto"/>
+      </w:pPr>
+      <w:r>
+        <w:rPr>
+          <w:rFonts w:ascii="Georgia" w:hAnsi="Georgia" w:eastAsia="Georgia"/>
+          <w:b w:val="0"/>
+          <w:sz w:val="22"/>
+        </w:rPr>
+        <w:t>Real: the speed of light and what it does, and does not do, to the order of events; the slowing of moving clocks, including the 1971 Hafele–Keating flights, whose caesium clocks came home about 59 billionths of a second behind after flying east and about 273 ahead after flying west; the second, defined since 1967 as 9,192,631,770 cycles of the caesium atom; the DCF77 time signal, broadcast from near Frankfurt for Germany's national metrology institute, the PTB in Braunschweig; and Paddington station and its airport trains. The films named in the course are real films, and every book in the bibliography exists.</w:t>
+      </w:r>
+    </w:p>
+    <w:p>
+      <w:pPr>
+        <w:spacing w:after="160" w:line="240" w:lineRule="auto"/>
+      </w:pPr>
+      <w:r>
+        <w:rPr>
+          <w:rFonts w:ascii="Georgia" w:hAnsi="Georgia" w:eastAsia="Georgia"/>
+          <w:b w:val="0"/>
+          <w:sz w:val="22"/>
+        </w:rPr>
+        <w:t>Invented: the Bureau and everyone in it; the building, its landlord, his surveyor and both insurers; form PL/9 and every other form; the school; the lost-property slip; and the platform in the doorway.</w:t>
+      </w:r>
+    </w:p>
+    <w:p>
+      <w:pPr>
+        <w:spacing w:after="160" w:line="240" w:lineRule="auto"/>
+      </w:pPr>
+      <w:r>
+        <w:rPr>
+          <w:rFonts w:ascii="Georgia" w:hAnsi="Georgia" w:eastAsia="Georgia"/>
+          <w:b w:val="0"/>
+          <w:sz w:val="22"/>
+        </w:rPr>
+        <w:t>Weinstein's night train is real. The Sud Expresso (the Sud Express, in French) ran overnight from the French–Spanish border at Hendaye and Irún, across Spain, to Lisbon, and entered Portugal at Vilar Formoso. It was suspended on 17 March 2020, at the start of the pandemic, and at the time of writing it has not run since. That is why Weinstein speaks of it in the past tense. The border clocks are real too: mainland Portugal moved to Central European Time, Spain's time, in September 1992, and went back to Western European Time in 1996. A government can move every clock in a country by an hour with a signature. It cannot make one of them tick slower.</w:t>
+      </w:r>
+    </w:p>
+    <w:p>
+      <w:pPr>
+        <w:spacing w:after="160" w:line="240" w:lineRule="auto"/>
+      </w:pPr>
+      <w:r>
+        <w:rPr>
+          <w:rFonts w:ascii="Georgia" w:hAnsi="Georgia" w:eastAsia="Georgia"/>
+          <w:b w:val="0"/>
+          <w:sz w:val="22"/>
+        </w:rPr>
+        <w:t>If you finish the book unsure whether a warning can be early and late at once, congratulations. You are thinking like an investigator. The Bureau files that under Lesson 6.</w:t>
+      </w:r>
+    </w:p>
+    <w:p>
+      <w:pPr>
+        <w:pStyle w:val="Heading1"/>
+        <w:keepNext/>
+        <w:pageBreakBefore/>
+        <w:spacing w:before="320" w:after="200"/>
+        <w:jc w:val="center"/>
+      </w:pPr>
+      <w:bookmarkStart w:id="901" w:name="prologue"/>
       <w:r>
         <w:rPr>
           <w:rFonts w:ascii="Amazon Ember" w:hAnsi="Amazon Ember" w:eastAsia="Amazon Ember"/>
@@ -573,6 +807,22 @@
           <w:color w:val="0C447C"/>
           <w:sz w:val="36"/>
         </w:rPr>
+        <w:t>PROLOGUE</w:t>
+      </w:r>
+      <w:bookmarkEnd w:id="901"/>
+    </w:p>
+    <w:p>
+      <w:pPr>
+        <w:spacing w:before="320" w:after="200"/>
+        <w:jc w:val="center"/>
+      </w:pPr>
+      <w:r>
+        <w:rPr>
+          <w:rFonts w:ascii="Amazon Ember" w:hAnsi="Amazon Ember" w:eastAsia="Amazon Ember"/>
+          <w:b/>
+          <w:color w:val="0C447C"/>
+          <w:sz w:val="36"/>
+        </w:rPr>
         <w:t>In Which a File Arrives Before Its Author</w:t>
       </w:r>
     </w:p>
@@ -859,20 +1109,20 @@
           <w:b w:val="0"/>
           <w:sz w:val="22"/>
         </w:rPr>
-        <w:t xml:space="preserve">Nobody had put it there. Derek was sure of that the way he was sure of the floor. Four people in a small room, all of them facing that desk, and none of them had seen a hand. It was simply there, as if it had always been underneath and the folder had been sitting on it all week. It had been folded in four, once, carefully, and opened out again, so that the creases stood up from the blotter like the ridges of a small roof. On one corner was a pale brown ring, the size of the bottom of a mug, with a little bite out of its left side. A faint grey line ran down the margin.</w:t>
-      </w:r>
-    </w:p>
-    <w:p>
-      <w:pPr>
-        <w:spacing w:after="160" w:line="240" w:lineRule="auto"/>
-      </w:pPr>
-      <w:r>
-        <w:rPr>
-          <w:rFonts w:ascii="Georgia" w:hAnsi="Georgia" w:eastAsia="Georgia"/>
-          <w:b w:val="0"/>
-          <w:sz w:val="22"/>
-        </w:rPr>
-        <w:t>It was on the Bureau's own form. Derek knew the heading the way he knew his own signature.</w:t>
+        <w:t>Nobody had put it there. Derek was as sure of that as he was of the floor. Four people in a small room, all of them facing that desk, and none of them had seen a hand. It was simply there, as if it had always been underneath and the folder had been sitting on it all week. It had been folded in four, once, carefully, and opened out again, so that the creases stood up from the blotter like the ridges of a small roof. On one corner was a pale brown ring, the size of the bottom of a mug, with a little bite out of its left side. A faint grey line ran down the margin.</w:t>
+      </w:r>
+    </w:p>
+    <w:p>
+      <w:pPr>
+        <w:spacing w:after="160" w:line="240" w:lineRule="auto"/>
+      </w:pPr>
+      <w:r>
+        <w:rPr>
+          <w:rFonts w:ascii="Georgia" w:hAnsi="Georgia" w:eastAsia="Georgia"/>
+          <w:b w:val="0"/>
+          <w:sz w:val="22"/>
+        </w:rPr>
+        <w:t>It was on the Bureau's own form. Derek knew the heading as well as his own signature.</w:t>
       </w:r>
     </w:p>
     <w:p>
@@ -1248,7 +1498,7 @@
           <w:b w:val="0"/>
           <w:sz w:val="22"/>
         </w:rPr>
-        <w:t xml:space="preserve">He was visiting. Same jacket, as on every day of the year, on the grounds that changing it introduced a variable. He had no door on this corridor and did not seem to miss one. He was perched on the corner of Derek's desk with the expression of a man who has come to London for a polite few days and been handed, at no extra charge, the most interesting morning of his decade.</w:t>
+        <w:t>He was visiting. Same jacket, as on every day of the year, on the grounds that changing it introduced a variable. He had no door on this corridor and did not seem to miss one. He was perched on the corner of Derek's desk, a man who had come to London for a polite few days and been handed, at no extra charge, the most interesting morning of his decade.</w:t>
       </w:r>
     </w:p>
     <w:p>
@@ -1651,7 +1901,7 @@
           <w:b w:val="0"/>
           <w:sz w:val="22"/>
         </w:rPr>
-        <w:t>Trevor looked at the tape as if it had personally promised him it would not. "Then I'll know that too."</w:t>
+        <w:t>Trevor glared at the tape as if it had personally promised him it would not. "Then I'll know that too."</w:t>
       </w:r>
     </w:p>
     <w:p>
@@ -1755,7 +2005,7 @@
           <w:b w:val="0"/>
           <w:sz w:val="22"/>
         </w:rPr>
-        <w:t>They had heard the knocks once already. Three of them, soft, from somewhere inside the carriage, the way someone knocks on a bathroom door when they suspect the answer. Then the voice, which was his own and was not, which had the same flat register he used for murders and for tea, and also something else in it, worn smooth, like a step that has been used by a great many feet.</w:t>
+        <w:t>They had heard the knocks once already. Three of them, soft, from somewhere inside the carriage, the way someone knocks on a bathroom door when they suspect the answer. Then the voice, his own and not his own, in the same flat register he used for murders and for tea, and also something else in it, worn smooth, like a step that has been used by a great many feet.</w:t>
       </w:r>
     </w:p>
     <w:p>
@@ -1950,7 +2200,7 @@
           <w:b w:val="0"/>
           <w:sz w:val="22"/>
         </w:rPr>
-        <w:t>Instead he looked at the corridor clock again, because Trevor was looking at it, and Trevor was wearing the expression of a man about to enjoy a subtraction.</w:t>
+        <w:t>Instead he looked at the corridor clock again, because Trevor was looking at it, and Trevor looked like a man about to enjoy a subtraction.</w:t>
       </w:r>
     </w:p>
     <w:p>
@@ -2301,7 +2551,7 @@
           <w:b w:val="0"/>
           <w:sz w:val="22"/>
         </w:rPr>
-        <w:t>He went to shut the door. It was a reasonable thing to try. He took hold of the handle and swung it inwards, and it travelled a third of its arc, met station air, and stopped with a small soft refusal, as if it had walked into a curtain. He tried once more, with the patience of a man who already knows. It stopped in the same place. The platform was in the hinge.</w:t>
+        <w:t>He went to shut the door. It was a reasonable thing to try. He took hold of the handle and swung it inwards, and it travelled a third of its arc, met station air, and stopped with a small soft refusal, as if it had walked into a curtain. He tried once more, patiently, already knowing. It stopped in the same place. The platform was in the hinge.</w:t>
       </w:r>
     </w:p>
     <w:p>
@@ -2379,7 +2629,7 @@
           <w:b w:val="0"/>
           <w:sz w:val="22"/>
         </w:rPr>
-        <w:t>Trevor, who had been kneeling, managed to sit down without letting go of the tape, which was a feat of engineering in itself.</w:t>
+        <w:t>Trevor, who had been kneeling, managed to sit down without letting go of the tape, a feat of engineering in itself.</w:t>
       </w:r>
     </w:p>
     <w:p>
@@ -2613,7 +2863,7 @@
           <w:b w:val="0"/>
           <w:sz w:val="22"/>
         </w:rPr>
-        <w:t>"I know I'm not. I wanted to hear whether you did." The radio went off altogether. "Gucci won't come. He looked at the lead and went back to sleep. I'm not translating."</w:t>
+        <w:t>"I know I'm not. I wanted to hear whether you did." The radio went off altogether. "Gucci won't come. He considered the lead and went back to sleep. I'm not translating."</w:t>
       </w:r>
     </w:p>
     <w:p>
@@ -2743,20 +2993,20 @@
           <w:b w:val="0"/>
           <w:sz w:val="22"/>
         </w:rPr>
-        <w:t>Trevor looked at the filing cabinet as if he had been introduced to it before and had not enjoyed the conversation.</w:t>
-      </w:r>
-    </w:p>
-    <w:p>
-      <w:pPr>
-        <w:spacing w:after="160" w:line="240" w:lineRule="auto"/>
-      </w:pPr>
-      <w:r>
-        <w:rPr>
-          <w:rFonts w:ascii="Georgia" w:hAnsi="Georgia" w:eastAsia="Georgia"/>
-          <w:b w:val="0"/>
-          <w:sz w:val="22"/>
-        </w:rPr>
-        <w:t>On the platform the train did not depart and did not arrive. It waited, which is the most expensive thing a train can do, in a doorway already booked as a lunchtime complaint. The amber word above it held steady. Derek stood with his hand flat over the pocket where the sheet was, and for the first time since Tuesday, the old Tuesday, the one with the photograph, he understood exactly what he was supposed to do, and found that knowing it did not make the morning any shorter.</w:t>
+        <w:t>Trevor eyed the filing cabinet as if he had been introduced to it before and had not enjoyed the conversation.</w:t>
+      </w:r>
+    </w:p>
+    <w:p>
+      <w:pPr>
+        <w:spacing w:after="160" w:line="240" w:lineRule="auto"/>
+      </w:pPr>
+      <w:r>
+        <w:rPr>
+          <w:rFonts w:ascii="Georgia" w:hAnsi="Georgia" w:eastAsia="Georgia"/>
+          <w:b w:val="0"/>
+          <w:sz w:val="22"/>
+        </w:rPr>
+        <w:t>On the platform the train did not depart and did not arrive. It waited, which is the most expensive thing a train can do, in a doorway already booked as a lunchtime complaint. The amber word above it held steady. Derek stood with his hand flat over the pocket where the sheet was, and for the first time since the old Tuesday, the one with the photograph, he understood exactly what he was supposed to do, and found that knowing it did not make the morning any shorter.</w:t>
       </w:r>
     </w:p>
     <w:p>
@@ -2911,7 +3161,7 @@
           <w:b w:val="0"/>
           <w:sz w:val="22"/>
         </w:rPr>
-        <w:t>Derek came and stood behind him, a pace back from the sill, and looked. Penny looked. Weinstein, who had been about to sit on the desk again, stood up instead and came over with his hands in his jacket pockets, wearing the face of a man who has been told there is a second dessert.</w:t>
+        <w:t>Derek came and stood behind him, a pace back from the sill, and looked. Penny looked. Weinstein, who had been about to sit on the desk again, stood up instead and came over with his hands in his jacket pockets, beaming like a man told there is a second dessert.</w:t>
       </w:r>
     </w:p>
     <w:p>
@@ -3015,7 +3265,7 @@
           <w:b w:val="0"/>
           <w:sz w:val="22"/>
         </w:rPr>
-        <w:t>Trevor looked at the clock with the expression of a man who has just discovered his own front door has been painted the same colour as everyone else's.</w:t>
+        <w:t>Trevor regarded the clock like a man who has just discovered his own front door has been painted the same colour as everyone else's.</w:t>
       </w:r>
     </w:p>
     <w:p>
@@ -3080,7 +3330,7 @@
           <w:b w:val="0"/>
           <w:sz w:val="22"/>
         </w:rPr>
-        <w:t xml:space="preserve">"Last week the clocks disagreed." Weinstein held up one finger. "That is not the same as lying. A clock that disagrees with you is reporting a fact about its path. A clock that is merely set wrong is reporting a fact about whoever set it. There are two ways for that clock to be different from ours. It can run at a different rate, which would tell us something about the platform, how fast it moves, how deep it sits in gravity. Or it can run at the same rate and simply say something different, which would tell us only that somebody turned the little knob at the back." He bent, very slightly, towards the doorway, and then thought better of it and straightened. "The first is physics. The second is housekeeping. I should like to know which one we have."</w:t>
+        <w:t>"Last week the clocks disagreed." Weinstein held up one finger. "That is not the same as lying. A clock that disagrees with you is reporting a fact about its path. A clock that is merely set wrong is reporting a fact about whoever set it. There are two ways for that clock to be different from ours. It can run at a different rate, which would tell us something about the platform, how fast it moves, how deep it sits in gravity. Or it can run at the same rate and simply say something different, which would tell us only that somebody turned the little knob at the back." He bent, slightly, towards the doorway, and then thought better of it and straightened. "The first is physics. The second is housekeeping. I should like to know which one we have."</w:t>
       </w:r>
     </w:p>
     <w:p>
@@ -3119,7 +3369,7 @@
           <w:b w:val="0"/>
           <w:sz w:val="22"/>
         </w:rPr>
-        <w:t>Trevor did not have anything to measure a clock with. What he had was a phone, and a desk, and the absolute determination of a man who has been told he is the one with a tape measure. He propped the phone against the Klein bottle, which for the first time in its life was useful, and angled it so that the screen held both clocks at once: the white face on the far pillar through the doorway, and, by a long and precarious arrangement of the outer-room door and a shaving mirror Penny produced from her handbag without comment, the corridor clock behind him.</w:t>
+        <w:t>Trevor did not have anything to measure a clock with. What he had was a phone, and a desk, and the absolute determination of the one person present with a tape measure. He propped the phone against the Klein bottle, useful at last, and angled it so that the screen held both clocks at once: the white face on the far pillar through the doorway, and, by a long and precarious arrangement of the outer-room door and a shaving mirror Penny produced from her handbag without comment, the corridor clock behind him.</w:t>
       </w:r>
     </w:p>
     <w:p>
@@ -3392,7 +3642,7 @@
           <w:b w:val="0"/>
           <w:sz w:val="22"/>
         </w:rPr>
-        <w:t>"I don't know. I have looked under Structural, and under Unauthorised Occupancy, and under Acts of God, which is a very small folder. It is not in any of them. It may be in another building." He considered the platform. "It may be in another continuum. I have never had to look there before."</w:t>
+        <w:t>"I don't know. I have looked under Structural, and under Unauthorised Occupancy, and under Acts of God, which is a small folder. It is not in any of them. It may be in another building." He considered the platform. "It may be in another continuum. I have never had to look there before."</w:t>
       </w:r>
     </w:p>
     <w:p>
@@ -3522,7 +3772,7 @@
           <w:b w:val="0"/>
           <w:sz w:val="22"/>
         </w:rPr>
-        <w:t>"So if the platform were moving past us fast enough for its time to stretch by that much, it would have to be going at—" he did it in the margin, very small, "—about twelve thousand kilometres a second. Four per cent of light. It isn't. Or it would have to be sitting in a gravitational well deeper than anything in the solar system. It isn't."</w:t>
+        <w:t>"So if the platform were moving past us fast enough for its time to stretch by that much, it would have to be going at—" he did it in the margin, in tiny figures, "—about twelve thousand kilometres a second. Four per cent of light. It isn't. Or it would have to be sitting in a gravitational well deeper than anything in the solar system. It isn't."</w:t>
       </w:r>
     </w:p>
     <w:p>
@@ -3847,7 +4097,7 @@
           <w:b w:val="0"/>
           <w:sz w:val="22"/>
         </w:rPr>
-        <w:t>Trevor looked down at the tape, and at the platform, and at the clock that had kept perfect time for twenty minutes for no reason anyone could give him. Then he set the case down on the London side of the sill, very gently, as if it might wake, and went out to the stairwell to ask Mrs Marsh whether she would be responsible for a door.</w:t>
+        <w:t>Trevor looked down at the tape, and at the platform, and at the clock that had kept perfect time for twenty minutes for no reason anyone could give him. Then he set the case down on the London side of the sill, gently, as if it might wake, and went out to the stairwell to ask Mrs Marsh whether she would be responsible for a door.</w:t>
       </w:r>
     </w:p>
     <w:p>
@@ -3963,7 +4213,7 @@
           <w:b w:val="0"/>
           <w:sz w:val="22"/>
         </w:rPr>
-        <w:t>Weinstein had refused a chair. His real train was at four, from a real station, to a real airport, and he had the air of a man who intended to catch it without once sitting down in between, in case sitting down became residence. Lunch was the nearer threat.</w:t>
+        <w:t>Weinstein had refused a chair. His real train was at four, from a real station, to a real airport, and he plainly intended to catch it without once sitting down in between, in case sitting down became residence. Lunch was the nearer threat.</w:t>
       </w:r>
     </w:p>
     <w:p>
@@ -4392,7 +4642,7 @@
           <w:b w:val="0"/>
           <w:sz w:val="22"/>
         </w:rPr>
-        <w:t>Weinstein had begun pacing, which in the Bureau's outer room meant three steps and a turn, like a man walking a very small dog. "Because the form has done something the last case never made us do. Suppose later Derek posted this. He wrote it after he knew the sentence. Do not let Derek Gent board. How does he know to write that?"</w:t>
+        <w:t>Weinstein had begun pacing, which in the Bureau's outer room meant three steps and a turn, like a man walking a small dog. "Because the form has done something the last case never made us do. Suppose later Derek posted this. He wrote it after he knew the sentence. Do not let Derek Gent board. How does he know to write that?"</w:t>
       </w:r>
     </w:p>
     <w:p>
@@ -4678,7 +4928,7 @@
           <w:b w:val="0"/>
           <w:sz w:val="22"/>
         </w:rPr>
-        <w:t>Trevor faced the filing cabinet. He did it with dignity. It was a very slight dignity, and it was entirely sincere.</w:t>
+        <w:t>Trevor faced the filing cabinet. He did it with dignity. It was a slight dignity, and entirely sincere.</w:t>
       </w:r>
     </w:p>
     <w:p>
@@ -4886,7 +5136,7 @@
           <w:b w:val="0"/>
           <w:sz w:val="22"/>
         </w:rPr>
-        <w:t>Under the third line, a fourth appeared. It came up letter by letter, the way a sentence comes up when somebody is thinking about each word.</w:t>
+        <w:t>Under the third line, a fourth appeared. It came up letter by letter, like a sentence from somebody weighing each word.</w:t>
       </w:r>
     </w:p>
     <w:p>
@@ -4951,7 +5201,7 @@
           <w:b w:val="0"/>
           <w:sz w:val="22"/>
         </w:rPr>
-        <w:t>Everybody saw it, through the open door, over the empty train. Not to a time. Not to a station. The amber dots rearranged themselves the way they had rearranged themselves once before, in another week, around another word, and they spelled a name. Six letters. It held for three seconds. Derek counted them. He would remember, later, that he had counted, and be ashamed of how steady the counting was.</w:t>
+        <w:t>Everybody saw it, through the open door, over the empty train. Not to a time. Not to a station. The amber dots rearranged themselves as they had once before, in another week, around another word, and they spelled a name. Six letters. It held for three seconds. Derek counted them. He would remember, later, that he had counted, and be ashamed of how steady the counting was.</w:t>
       </w:r>
     </w:p>
     <w:p>
@@ -5107,7 +5357,7 @@
           <w:b w:val="0"/>
           <w:sz w:val="22"/>
         </w:rPr>
-        <w:t>The phone buzzed again before he could think about what to type, which was, he would decide later, the universe's single act of mercy that day. Tuppence. She did not wait for hello. She never had.</w:t>
+        <w:t>The phone buzzed again before he could think about what to type. He would decide later that this was the universe's single act of mercy that day. Tuppence. She did not wait for hello. She never had.</w:t>
       </w:r>
     </w:p>
     <w:p>
@@ -5159,7 +5409,7 @@
           <w:b w:val="0"/>
           <w:sz w:val="22"/>
         </w:rPr>
-        <w:t>Weinstein had a sleeve half on. He looked at the sleeve. He took it off again, and folded the jacket over the back of the chair he had refused, which was the closest he would ever come to sitting.</w:t>
+        <w:t>Weinstein had a sleeve half on. He looked at the sleeve. He took it off again and folded it over the back of the chair he had refused. It was the closest he would ever come to sitting.</w:t>
       </w:r>
     </w:p>
     <w:p>
@@ -5263,7 +5513,7 @@
           <w:b w:val="0"/>
           <w:sz w:val="22"/>
         </w:rPr>
-        <w:t>Derek put the mug down and looked at the form on the screen, at its four lines of grey certainty, and at the gap underneath the fourth where something else might yet appear. Two acts, the sheet had named, if you counted the voice. A door, which was done. A train, which was not. And now a name with no act attached to it at all, hung in amber above a railway like washing.</w:t>
+        <w:t>Derek put the mug down and studied the form on the screen, at its four lines of grey certainty, and at the gap underneath the fourth where something else might yet appear. Two acts, the sheet had named, if you counted the voice. A door, which was done. A train, which was not. And now a name with no act attached to it at all, hung in amber above a railway like washing.</w:t>
       </w:r>
     </w:p>
     <w:p>
@@ -5392,7 +5642,7 @@
           <w:b w:val="0"/>
           <w:sz w:val="22"/>
         </w:rPr>
-        <w:t>Tuppence arrived at a quarter past one, which was not a time anybody had suggested.</w:t>
+        <w:t>Tuppence arrived at a quarter past one, a time no one had suggested.</w:t>
       </w:r>
     </w:p>
     <w:p>
@@ -5496,20 +5746,20 @@
           <w:b w:val="0"/>
           <w:sz w:val="22"/>
         </w:rPr>
-        <w:t>She came in through the outer room without knocking, because the door was open and because she had never in her life knocked on anything Derek owned. She was exactly as she always was, which was to say finished: coat, hair, bag, all of it arranged as though a committee had sat on it overnight and approved the minutes. She took in the room in a single pass, Weinstein, Penny, Tabitha, Trevor's back, the kettle, the apple, and then the doorway, and the platform in it, and the board above the train with its one amber word.</w:t>
-      </w:r>
-    </w:p>
-    <w:p>
-      <w:pPr>
-        <w:spacing w:after="160" w:line="240" w:lineRule="auto"/>
-      </w:pPr>
-      <w:r>
-        <w:rPr>
-          <w:rFonts w:ascii="Georgia" w:hAnsi="Georgia" w:eastAsia="Georgia"/>
-          <w:b w:val="0"/>
-          <w:sz w:val="22"/>
-        </w:rPr>
-        <w:t>She looked at it for perhaps two seconds. Then she looked at Derek.</w:t>
+        <w:t>She came in through the outer room without knocking, because the door was open and because she had never in her life knocked on anything Derek owned. She was as she always was, finished: coat, hair, bag, all of it arranged as though a committee had sat on it overnight and approved the minutes. She took in the room in a single pass, Weinstein, Penny, Tabitha, Trevor's back, the kettle, the apple, and then the doorway, and the platform in it, and the board above the train with its one amber word.</w:t>
+      </w:r>
+    </w:p>
+    <w:p>
+      <w:pPr>
+        <w:spacing w:after="160" w:line="240" w:lineRule="auto"/>
+      </w:pPr>
+      <w:r>
+        <w:rPr>
+          <w:rFonts w:ascii="Georgia" w:hAnsi="Georgia" w:eastAsia="Georgia"/>
+          <w:b w:val="0"/>
+          <w:sz w:val="22"/>
+        </w:rPr>
+        <w:t>She studied it for perhaps two seconds. Then she looked at Derek.</w:t>
       </w:r>
     </w:p>
     <w:p>
@@ -5613,7 +5863,7 @@
           <w:b w:val="0"/>
           <w:sz w:val="22"/>
         </w:rPr>
-        <w:t>Derek had imagined this conversation, on and off, for three years. In none of the versions had it taken place with a railway in the door, and in all of them he had said something clever. He found he did not have anything clever. He had what Penny had taught him on the stairs at ten o'clock, which was the order things were in.</w:t>
+        <w:t>Derek had imagined this conversation, on and off, for three years. In none of the versions had it taken place with a railway in the door, and in all of them he had said something clever. He found he did not have anything clever. He had what Penny had taught him on the stairs at ten o'clock: the order things were in.</w:t>
       </w:r>
     </w:p>
     <w:p>
@@ -5652,7 +5902,7 @@
           <w:b w:val="0"/>
           <w:sz w:val="22"/>
         </w:rPr>
-        <w:t>Penny, Derek noticed, had gone very still at the edge of the room, in the way of somebody who has just watched a man walk across a frozen pond and is waiting to hear whether it holds.</w:t>
+        <w:t>Penny, Derek noticed, had gone still at the edge of the room, like somebody who has just watched a man walk across a frozen pond and is waiting to hear whether it holds.</w:t>
       </w:r>
     </w:p>
     <w:p>
@@ -5691,7 +5941,7 @@
           <w:b w:val="0"/>
           <w:sz w:val="22"/>
         </w:rPr>
-        <w:t>"You used to tell me afterwards. In the kitchen. With diagrams." She glanced, very briefly, at Weinstein, who had the sense to look at the window. "I used to stand there being told about things that had already happened to us, in the order you'd decided they had happened, and you always seemed surprised I wasn't more interested."</w:t>
+        <w:t>"You used to tell me afterwards. In the kitchen. With diagrams." She glanced, briefly, at Weinstein, who had the sense to look at the window. "I used to stand there being told about things that had already happened to us, in the order you'd decided they had happened, and you always seemed surprised I wasn't more interested."</w:t>
       </w:r>
     </w:p>
     <w:p>
@@ -5899,7 +6149,7 @@
           <w:b w:val="0"/>
           <w:sz w:val="22"/>
         </w:rPr>
-        <w:t>That was all. It was, Derek would think later, the most frightening exchange of the day, and it had been conducted entirely about him, in front of him, without either of them requiring him to take part. Trevor, who could not see any of it, said "Oh no" very quietly to the filing cabinet, on general principle.</w:t>
+        <w:t>That was all. It was, Derek would think later, the most frightening exchange of the day, and it had been conducted entirely about him, in front of him, without either of them requiring him to take part. Trevor, who could not see any of it, said "Oh no" quietly to the filing cabinet, on general principle.</w:t>
       </w:r>
     </w:p>
     <w:p>
@@ -6146,7 +6396,7 @@
           <w:b w:val="0"/>
           <w:sz w:val="22"/>
         </w:rPr>
-        <w:t xml:space="preserve">"So I gather. It is a rare skill. Most people's warnings are records. Hers are instructions." He reached for his jacket, which was on the chair he had refused, and did not put it on. "And you told her before it was over. I did not know you could."</w:t>
+        <w:t>"So I gather. It is a rare skill. Most people's warnings are records. Hers are instructions." He reached for his jacket on the chair he had refused, and did not put it on. "And you told her before it was over. I did not know you could."</w:t>
       </w:r>
     </w:p>
     <w:p>
@@ -6172,7 +6422,7 @@
           <w:b w:val="0"/>
           <w:sz w:val="22"/>
         </w:rPr>
-        <w:t xml:space="preserve">"The case is how you answered. She heard it." Weinstein looked at the doorway, at the board, at the word. "People think a warning is a sentence. It is not. It is a sentence and a time. The same sentence early is advice. Late, it is an apology. Sophie's mother has always known this. It is why she rings the school before you do."</w:t>
+        <w:t>"The case is how you answered. She heard it." Weinstein's eyes went to the doorway, to the board, to the word. "People think a warning is a sentence. It is not. It is a sentence and a time. The same sentence early is advice. Late, it is an apology. Sophie's mother has always known this. It is why she rings the school before you do."</w:t>
       </w:r>
     </w:p>
     <w:p>
@@ -6340,7 +6590,7 @@
           <w:b w:val="0"/>
           <w:sz w:val="22"/>
         </w:rPr>
-        <w:t>Trevor drove Penny and Weinstein in the Mini, which was the colour of a bruise in its second week and made a noise on corners like a man being asked about his tax return. Derek walked, because Derek walked; he had no licence, and he mentioned this to Weinstein on the stairs without being asked, out of a lifelong sense that people ought to be warned. Tabitha walked with him. She did not ask about the board. He did not offer. They covered most of a mile in a silence that was not empty, past a bus shelter, a florist, two men arguing about a van, and a school that was not Sophie's, which Derek looked at anyway and then made himself stop looking at.</w:t>
+        <w:t>Trevor drove Penny and Weinstein in the Mini, which was the colour of a bruise in its second week and made a noise on corners like a man being asked about his tax return. Derek walked, because Derek walked; he had no licence, and he mentioned this to Weinstein on the stairs without being asked, out of a lifelong sense that people ought to be warned. Tabitha walked with him. She did not ask about the board. He did not offer. They covered most of a mile in a silence that was not empty, past a bus shelter, a florist, two men arguing about a van, and a school that was not Sophie's, which Derek looked at anyway, and then made himself stop.</w:t>
       </w:r>
     </w:p>
     <w:p>
@@ -6418,7 +6668,7 @@
           <w:b w:val="0"/>
           <w:sz w:val="22"/>
         </w:rPr>
-        <w:t>He bought the ticket. He did it at a machine, standing very upright, and for the forty seconds it took he looked briefly like a member of the public, which he resented and Penny enjoyed more than anything that had happened since the weekend.</w:t>
+        <w:t>He bought the ticket. He did it at a machine, standing bolt upright, and for the forty seconds it took he looked briefly like a member of the public, which he resented and Penny enjoyed more than anything that had happened since the weekend.</w:t>
       </w:r>
     </w:p>
     <w:p>
@@ -6535,7 +6785,7 @@
           <w:b w:val="0"/>
           <w:sz w:val="22"/>
         </w:rPr>
-        <w:t>"I am counting on it. You will be about ten billionths of a second older than the rest of us by the time you land, and I shall be the only person in Bavaria who knows. That is a very exclusive sort of annoyance. One does not get it from just anybody."</w:t>
+        <w:t>"I am counting on it. You will be about ten billionths of a second older than the rest of us by the time you land, and I shall be the only person in Bavaria who knows. That is an exclusive sort of annoyance. One does not get it from just anybody."</w:t>
       </w:r>
     </w:p>
     <w:p>
@@ -6561,7 +6811,7 @@
           <w:b w:val="0"/>
           <w:sz w:val="22"/>
         </w:rPr>
-        <w:t>She made it the way she made most decisions, once, and put the itinerary back in her handbag under the face-down photograph, where it had lived since the old Tuesday. Neither of them looked surprised. Trevor, standing slightly to one side with his hands in his pockets, looked as if he had been shown a second procedure he did not have, and was trying to work out where in the manual it had been all this time.</w:t>
+        <w:t>She made it as she made most decisions, once, and put the itinerary back in her handbag under the face-down photograph, where it had lived since the old Tuesday. Neither of them looked surprised. Trevor, standing slightly to one side with his hands in his pockets, seemed to have been shown a second procedure he did not have, and was trying to work out where in the manual it had been all this time.</w:t>
       </w:r>
     </w:p>
     <w:p>
@@ -6613,7 +6863,7 @@
           <w:b w:val="0"/>
           <w:sz w:val="22"/>
         </w:rPr>
-        <w:t>Lost property, at Paddington, was a window and a man who had already decided their problem was not his. He had the moustache of a man who had once meant to grow a better one and had settled. He was not Pendleton. Pendleton was a specialist; Pendleton had spent decades refining the art of a form being in another building. This man was merely tired. He had the tiredness of someone who had spent twenty years being handed umbrellas by people who were sure they had left a violin.</w:t>
+        <w:t>Lost property, at Paddington, was a window and a man who had already decided their problem was not his. His moustache had once meant to be a better one, and had settled. He was not Pendleton. Pendleton was a specialist; Pendleton had spent decades refining the art of a form being in another building. This man was merely tired. He had the tiredness of someone who had spent twenty years being handed umbrellas by people who were sure they had left a violin.</w:t>
       </w:r>
     </w:p>
     <w:p>
@@ -6639,7 +6889,7 @@
           <w:b w:val="0"/>
           <w:sz w:val="22"/>
         </w:rPr>
-        <w:t>He looked at them for a while. Then, with the resignation of a man who knows the answer before the question has finished arriving, he pulled a slip from a wire tray at his elbow. The heading was theirs.</w:t>
+        <w:t>He considered them for a while. Then, resigned to an answer that had arrived before the question finished, he pulled a slip from a wire tray at his elbow. The heading was theirs.</w:t>
       </w:r>
     </w:p>
     <w:p>
@@ -6678,7 +6928,7 @@
           <w:b w:val="0"/>
           <w:sz w:val="22"/>
         </w:rPr>
-        <w:t>Under that, yesterday's date. Sunday. An act, typed in the same flat capitals as the sheet in Derek's pocket: OPENING THE DOOR. Two times, in a hand that was not theirs: small, upright, careful in the way of someone who did not expect to be believed. 18:00. 18:17.</w:t>
+        <w:t>Under that, yesterday's date. Sunday. An act, typed in the same flat capitals as the sheet in Derek's pocket: OPENING THE DOOR. Two times, in a hand that was not theirs: small, upright, careful, like someone who did not expect to be believed. 18:00. 18:17.</w:t>
       </w:r>
     </w:p>
     <w:p>
@@ -6795,7 +7045,7 @@
           <w:b w:val="0"/>
           <w:sz w:val="22"/>
         </w:rPr>
-        <w:t>On the concourse, under the board and beside a bench that was mostly pigeon, Weinstein held the Sunday slip next to Trevor's envelope with the capitals on it. He held them the way he held patent drawings in Schwabing, one in each hand, at arm's length, as if the truth were a matter of focal distance.</w:t>
+        <w:t>On the concourse, under the board and beside a bench that was mostly pigeon, Weinstein held the Sunday slip next to Trevor's envelope with the capitals on it. He held them as he held patent drawings in Schwabing, one in each hand, at arm's length, as if the truth were a matter of focal distance.</w:t>
       </w:r>
     </w:p>
     <w:p>
@@ -6886,20 +7136,20 @@
           <w:b w:val="0"/>
           <w:sz w:val="22"/>
         </w:rPr>
-        <w:t>"It's the same numeral. Look at what it's counting." She took the slip out of Weinstein's hand, which nobody else would have dared. "Sunday is a notice at 18:17 for an opening at 18:00. That gap is the warning arriving after the act. Somebody opened a door, and seventeen minutes later a piece of paper said please don't. That's a miss. That's how late a warning can be. Today we finished reading at 10:22. That seventeen is how long we stood there. Same numeral. Not the same gap." She put the slip back, very precisely, into Weinstein's fingers. "And this slip could be the previous warning. The back of this morning's sheet might be pointing at Sunday. We have not found where that sentence came from yet."</w:t>
-      </w:r>
-    </w:p>
-    <w:p>
-      <w:pPr>
-        <w:spacing w:after="160" w:line="240" w:lineRule="auto"/>
-      </w:pPr>
-      <w:r>
-        <w:rPr>
-          <w:rFonts w:ascii="Georgia" w:hAnsi="Georgia" w:eastAsia="Georgia"/>
-          <w:b w:val="0"/>
-          <w:sz w:val="22"/>
-        </w:rPr>
-        <w:t>Trevor looked at the slip, and at his envelope, and at the slip again, and Derek watched him take the glasses off and put them on again, which in Trevor meant a theory being lowered gently into the ground.</w:t>
+        <w:t>"It's the same numeral. Look at what it's counting." She took the slip out of Weinstein's hand, which no one else would have dared. "Sunday is a notice at 18:17 for an opening at 18:00. That gap is the warning arriving after the act. Somebody opened a door, and seventeen minutes later a piece of paper said please don't. That's a miss. That's how late a warning can be. Today we finished reading at 10:22. That seventeen is how long we stood there. Same numeral. Not the same gap." She put the slip back, precisely, into Weinstein's fingers. "And this slip could be the previous warning. The back of this morning's sheet might be pointing at Sunday. We have not found where that sentence came from yet."</w:t>
+      </w:r>
+    </w:p>
+    <w:p>
+      <w:pPr>
+        <w:spacing w:after="160" w:line="240" w:lineRule="auto"/>
+      </w:pPr>
+      <w:r>
+        <w:rPr>
+          <w:rFonts w:ascii="Georgia" w:hAnsi="Georgia" w:eastAsia="Georgia"/>
+          <w:b w:val="0"/>
+          <w:sz w:val="22"/>
+        </w:rPr>
+        <w:t>Trevor glanced from the slip to his envelope and back, and Derek watched him take the glasses off and put them on again, which in Trevor meant a theory being lowered gently into the ground.</w:t>
       </w:r>
     </w:p>
     <w:p>
@@ -7029,7 +7279,7 @@
           <w:b w:val="0"/>
           <w:sz w:val="22"/>
         </w:rPr>
-        <w:t>It did not put a child on it. It put cities on it, one after another, in the patient white of a public service: Reading, Didcot Parkway, Swansea, Penzance. The airport at 16:00. It said nothing about yesterday. It said nothing about anyone he loved. It was, he realised, the first board he had looked at all day that was simply doing its job, and he could have kissed it, and he would have been arrested, and Tuppence would have heard about it before the police did.</w:t>
+        <w:t>It did not put a child on it. It put cities on it, one after another, in the patient white of a public service: Reading, Didcot Parkway, Swansea, Penzance. The airport at 16:00. It said nothing about yesterday. It said nothing about anyone he loved. It was, he realised, the first board he had seen all day that was simply doing its job, and he could have kissed it, and he would have been arrested, and Tuppence would have heard about it before the police did.</w:t>
       </w:r>
     </w:p>
     <w:p>
@@ -7379,7 +7629,7 @@
           <w:b w:val="0"/>
           <w:sz w:val="22"/>
         </w:rPr>
-        <w:t xml:space="preserve">Derek told him. He had rehearsed it on the walk without meaning to, the way a man rehearses a phone call to a bank, and it came out in the order the morning had taught him: Sunday's slip, the sheet, the door, the voice, and two seventeens that were not the same.</w:t>
+        <w:t>Derek told him. He had rehearsed it on the walk without meaning to, like a phone call to a bank, and it came out in the order the morning had taught him: Sunday's slip, the sheet, the door, the voice, and two seventeens that were not the same.</w:t>
       </w:r>
     </w:p>
     <w:p>
@@ -7431,7 +7681,7 @@
           <w:b w:val="0"/>
           <w:sz w:val="22"/>
         </w:rPr>
-        <w:t>"Alfred was enjoying it. I could hear him enjoying it from here." A pause, in which, Derek suspected, a ruler was laid very carefully along a line. "Mr Gent, I will tell you what I have drawn, and then I will go back to my afternoon. Your office has a history. It goes up the page, one line, because your office does not go anywhere. Everything that happened in it this morning is a point on that line. The sheet is a point. The door is a point. The voice is a point. They are on one line, and one line has one order. You do not need me to give you the order. You need a pencil."</w:t>
+        <w:t>"Alfred was enjoying it. I could hear him enjoying it from here." A pause, in which, Derek suspected, a ruler was laid carefully along a line. "Mr Gent, I will tell you what I have drawn, and then I will go back to my afternoon. Your office has a history. It goes up the page, one line, because your office does not go anywhere. Everything that happened in it this morning is a point on that line. The sheet is a point. The door is a point. The voice is a point. They are on one line, and one line has one order. You do not need me to give you the order. You need a pencil."</w:t>
       </w:r>
     </w:p>
     <w:p>
@@ -7535,7 +7785,7 @@
           <w:b w:val="0"/>
           <w:sz w:val="22"/>
         </w:rPr>
-        <w:t>Weinstein, who had heard his own name twice and the word homework once, took it with the calm of a man who had been graded in public since he was nineteen.</w:t>
+        <w:t>Weinstein, who had heard his own name twice and the word homework once, took it calmly; he had been graded in public since he was nineteen.</w:t>
       </w:r>
     </w:p>
     <w:p>
@@ -7795,7 +8045,7 @@
           <w:b w:val="0"/>
           <w:sz w:val="22"/>
         </w:rPr>
-        <w:t>Sherlock came in as Sherlock came in, which was not in person. Sherlock was a bottlenose dolphin who had consulted for the Bureau on Case 1047, by methods nobody at the Bureau had ever been able to explain, and who had been paid, at his own insistence, in mackerel.</w:t>
+        <w:t>Sherlock came in as Sherlock always came in: not in person. Sherlock was a bottlenose dolphin who had consulted for the Bureau on Case 1047, by methods nobody at the Bureau had ever been able to explain, and who had been paid, at his own insistence, in mackerel.</w:t>
       </w:r>
     </w:p>
     <w:p>
@@ -7977,20 +8227,20 @@
           <w:b w:val="0"/>
           <w:sz w:val="22"/>
         </w:rPr>
-        <w:t>They did not ring Sophie again. The school had been told. The gate had been refused, twice, by the two people with the right to refuse it. The name sat on Trevor's envelope, unstruck, unexplained and unmoved, which was, Derek thought, the most honest thing on the page; it was the only line on it that did not pretend to know more than it did.</w:t>
-      </w:r>
-    </w:p>
-    <w:p>
-      <w:pPr>
-        <w:spacing w:after="160" w:line="240" w:lineRule="auto"/>
-      </w:pPr>
-      <w:r>
-        <w:rPr>
-          <w:rFonts w:ascii="Georgia" w:hAnsi="Georgia" w:eastAsia="Georgia"/>
-          <w:b w:val="0"/>
-          <w:sz w:val="22"/>
-        </w:rPr>
-        <w:t>The board above them clicked over. The 16:00 to the airport moved up a place. Somewhere in Munich, a man with very good handwriting had gone back to his afternoon, and another had gone back to his clocks, and in an office in London a train that was going nowhere was costing the landlord a fortune in metaphor.</w:t>
+        <w:t>They did not ring Sophie again. The school had been told. The gate had been refused, twice, by the two people with the right to refuse it. The name sat on Trevor's envelope, unstruck, unexplained and unmoved. Derek thought it the most honest thing on the page; it was the only line on it that did not pretend to know more than it did.</w:t>
+      </w:r>
+    </w:p>
+    <w:p>
+      <w:pPr>
+        <w:spacing w:after="160" w:line="240" w:lineRule="auto"/>
+      </w:pPr>
+      <w:r>
+        <w:rPr>
+          <w:rFonts w:ascii="Georgia" w:hAnsi="Georgia" w:eastAsia="Georgia"/>
+          <w:b w:val="0"/>
+          <w:sz w:val="22"/>
+        </w:rPr>
+        <w:t>The board above them clicked over. The 16:00 to the airport moved up a place. Somewhere in Munich, a man with excellent handwriting had gone back to his afternoon, and another had gone back to his clocks, and in an office in London a train that was going nowhere was costing the landlord a fortune in metaphor.</w:t>
       </w:r>
     </w:p>
     <w:p>
@@ -8197,7 +8447,7 @@
           <w:b w:val="0"/>
           <w:sz w:val="22"/>
         </w:rPr>
-        <w:t>She took it. She took the lid off and looked at it and put the lid back on, which was what she did with tea she did not trust, and then drank some anyway.</w:t>
+        <w:t>She took it. She took the lid off and looked at it and put the lid back on, as she did with tea she did not trust, and then drank some anyway.</w:t>
       </w:r>
     </w:p>
     <w:p>
@@ -8275,7 +8525,7 @@
           <w:b w:val="0"/>
           <w:sz w:val="22"/>
         </w:rPr>
-        <w:t>"It's what he's doing. I don't know what he is. I'm not very good at what people are, you know that. I'm good at what they're doing." Trevor stood beside her at the bollard, too tall for the shelter of the doorway behind them and too polite to take it, and the rain began, very gently, to flatten his hair into something closer to a decision. "He's watching it as if it might put her name up again."</w:t>
+        <w:t>"It's what he's doing. I don't know what he is. I'm not very good at what people are, you know that. I'm good at what they're doing." Trevor stood beside her at the bollard, too tall for the shelter of the doorway behind them and too polite to take it, and the rain began, gently, to flatten his hair into something closer to a decision. "He's watching it as if it might put her name up again."</w:t>
       </w:r>
     </w:p>
     <w:p>
@@ -8418,7 +8668,7 @@
           <w:b w:val="0"/>
           <w:sz w:val="22"/>
         </w:rPr>
-        <w:t>Trevor looked at his shoes, which were getting wet in a manner he would later describe as unavoidable.</w:t>
+        <w:t>Trevor studied his shoes, which were getting wet in a manner he would later describe as unavoidable.</w:t>
       </w:r>
     </w:p>
     <w:p>
@@ -8613,7 +8863,7 @@
           <w:b w:val="0"/>
           <w:sz w:val="22"/>
         </w:rPr>
-        <w:t>"No, but it was late in the way the slip's late. It came after the act. It said don't buy the car, and I'd already bought the car." He was talking faster now, the way he did when a problem was turning from a wall into a door. "And when it arrived I thought, that's useless. I thought, she'd gone to all that trouble and it was useless, because you can't send advice backwards. And then I didn't sell the car."</w:t>
+        <w:t>"No, but it was late in the way the slip's late. It came after the act. It said don't buy the car, and I'd already bought the car." He was talking faster now, as he did when a problem was turning from a wall into a door. "And when it arrived I thought, that's useless. I thought, she'd gone to all that trouble and it was useless, because you can't send advice backwards. And then I didn't sell the car."</w:t>
       </w:r>
     </w:p>
     <w:p>
@@ -8717,7 +8967,7 @@
           <w:b w:val="0"/>
           <w:sz w:val="22"/>
         </w:rPr>
-        <w:t>"The sheet doesn't need a sender who's been born. It needs somebody who did something, before five past ten this morning, that put it in the room. That's all. That's the field. Not when were you born. When did you write it." He took his glasses off. The rain got on them immediately, and he looked at them in his hand as if they had betrayed him, and put them in his pocket. "We don't know who. We might never know who. But we've been asking the wrong question since lunch."</w:t>
+        <w:t>"The sheet doesn't need a sender who's been born. It needs somebody who did something, before five past ten this morning, that put it in the room. That's all. That's the field. Not when were you born. When did you write it." He took his glasses off. The rain got on them immediately, and he regarded them in his hand as if they had betrayed him, and put them in his pocket. "We don't know who. We might never know who. But we've been asking the wrong question since lunch."</w:t>
       </w:r>
     </w:p>
     <w:p>
@@ -8769,7 +9019,7 @@
           <w:b w:val="0"/>
           <w:sz w:val="22"/>
         </w:rPr>
-        <w:t>"In a minute." He did not move. He stood there in the rain, a very tall man with wet hair and no glasses, looking at the road. "There was another bit. In green. At the end."</w:t>
+        <w:t>"In a minute." He did not move. He stood there in the rain, a tall man with wet hair and no glasses, looking at the road. "There was another bit. In green. At the end."</w:t>
       </w:r>
     </w:p>
     <w:p>
@@ -8925,7 +9175,7 @@
           <w:b w:val="0"/>
           <w:sz w:val="22"/>
         </w:rPr>
-        <w:t>That was all he said. It was not a procedure. It was not on any form. He had not rehearsed it, and he said it in the same voice he would have used to tell her the boiler was making the noise, and Tabitha, who had been standing in the rain for half an hour without moving, turned and put the empty cup into his hand, which was the nearest the two of them had ever come to an embrace in public.</w:t>
+        <w:t>That was all he said. It was not a procedure. It was not on any form. He had not rehearsed it, and he said it in the same voice he would have used to tell her the boiler was making the noise, and Tabitha, who had been standing in the rain for half an hour without moving, turned and put the empty cup into his hand. It was the nearest the two of them had ever come to an embrace in public.</w:t>
       </w:r>
     </w:p>
     <w:p>
@@ -9055,7 +9305,7 @@
           <w:b w:val="0"/>
           <w:sz w:val="22"/>
         </w:rPr>
-        <w:t xml:space="preserve">"Herbert said it," said Trevor. "My grandmother proved it." He sat down on the metal chairs with the empty cup in his lap and the slip on his knee, and would not explain any further, and nobody asked him to.</w:t>
+        <w:t>"Herbert said it," said Trevor. "My grandmother proved it." He sat down on the metal chairs with the empty cup in his lap and the slip on his knee, and would not explain any further, and no one asked him to.</w:t>
       </w:r>
     </w:p>
     <w:p>
@@ -9158,7 +9408,7 @@
           <w:b w:val="0"/>
           <w:sz w:val="22"/>
         </w:rPr>
-        <w:t>That was all she saw: a grey banner at the top of the screen, the Bureau's name in the capitals her father's office used for everything, and under it the beginning of a second line that the banner had cut off before it became words. Then the banner slid up and away the way banners did, and the phone showed her the lock screen again, which was a photograph of a heron she had taken in Kew and was not prepared to discuss.</w:t>
+        <w:t>That was all she saw: a grey banner at the top of the screen, the Bureau's name in the capitals her father's office used for everything, and under it the beginning of a second line that the banner had cut off before it became words. Then the banner slid up and away, and the phone showed her the lock screen again: a photograph of a heron she had taken in Kew and was not prepared to discuss.</w:t>
       </w:r>
     </w:p>
     <w:p>
@@ -9184,7 +9434,7 @@
           <w:b w:val="0"/>
           <w:sz w:val="22"/>
         </w:rPr>
-        <w:t>She sat on the wall with the sandwich in one hand and the phone in the other and looked at the heron. Priya, beside her, was explaining at length why Mr Okafor was frightened of fractions, a theory that involved his childhood, a divorce, and a pizza. Sophie was not listening. She was doing what her father did when a thing was too big to look at directly, which she had never once admitted to having got from him, and which she had never once pretended not to know about either.</w:t>
+        <w:t>She sat on the wall with the sandwich in one hand and the phone in the other and watched the heron. Priya, beside her, was explaining at length why Mr Okafor was frightened of fractions, a theory that involved his childhood, a divorce, and a pizza. Sophie was not listening. She was doing what her father did when a thing was too big to look at directly, which she had never once admitted to having got from him, and which she had never once pretended not to know about either.</w:t>
       </w:r>
     </w:p>
     <w:p>
@@ -9392,7 +9642,7 @@
           <w:b w:val="0"/>
           <w:sz w:val="22"/>
         </w:rPr>
-        <w:t>Mr Okafor looked at her with the expression of a man who has been hoping, all term, that somebody would.</w:t>
+        <w:t>Mr Okafor looked at her like a man who has been hoping, all term, that somebody would.</w:t>
       </w:r>
     </w:p>
     <w:p>
@@ -9574,7 +9824,7 @@
           <w:b w:val="0"/>
           <w:sz w:val="22"/>
         </w:rPr>
-        <w:t>She wrote nothing down. Her notebook was in her bag, under the PE kit, next to the phone. She did not get it out. She worked through Mr Okafor's sheet, which was about owing people money, and got every question right, and drew, in the margin of the last one, very small, a number line with a zero in the middle and an arrow pointing both ways.</w:t>
+        <w:t>She wrote nothing down. Her notebook was in her bag, under the PE kit, next to the phone. She did not get it out. She worked through Mr Okafor's sheet on owing people money, and got every question right, and drew, in the margin of the last one, tiny, a number line with a zero in the middle and an arrow pointing both ways.</w:t>
       </w:r>
     </w:p>
     <w:p>
@@ -9613,20 +9863,20 @@
           <w:b w:val="0"/>
           <w:sz w:val="22"/>
         </w:rPr>
-        <w:t>Twice, Sophie thought. Twice was data. Once might have been someone being careful. Twice meant someone was frightened and was trying very hard not to look it.</w:t>
-      </w:r>
-    </w:p>
-    <w:p>
-      <w:pPr>
-        <w:spacing w:after="160" w:line="240" w:lineRule="auto"/>
-      </w:pPr>
-      <w:r>
-        <w:rPr>
-          <w:rFonts w:ascii="Georgia" w:hAnsi="Georgia" w:eastAsia="Georgia"/>
-          <w:b w:val="0"/>
-          <w:sz w:val="22"/>
-        </w:rPr>
-        <w:t>She thought about her father, in his office with the frosted glass, being frightened and trying very hard not to look it. He was bad at it. His voice never changed, but his hands did. He straightened things. Once, after a bad case, she had come into the Bureau and found every single object on his desk lined up at right angles, the stapler and the pens and the mug, as if the desk had been told to stand up straight.</w:t>
+        <w:t>Twice, Sophie thought. Twice was data. Once might have been someone being careful. Twice meant someone was frightened and trying hard not to look it.</w:t>
+      </w:r>
+    </w:p>
+    <w:p>
+      <w:pPr>
+        <w:spacing w:after="160" w:line="240" w:lineRule="auto"/>
+      </w:pPr>
+      <w:r>
+        <w:rPr>
+          <w:rFonts w:ascii="Georgia" w:hAnsi="Georgia" w:eastAsia="Georgia"/>
+          <w:b w:val="0"/>
+          <w:sz w:val="22"/>
+        </w:rPr>
+        <w:t>She thought about her father, in his office with the frosted glass, being frightened and trying hard not to look it. He was bad at it. His voice never changed, but his hands did. He straightened things. Once, after a bad case, she had come into the Bureau and found every single object on his desk lined up at right angles, the stapler and the pens and the mug, as if the desk had been told to stand up straight.</w:t>
       </w:r>
     </w:p>
     <w:p>
@@ -9794,7 +10044,7 @@
           <w:b w:val="0"/>
           <w:sz w:val="22"/>
         </w:rPr>
-        <w:t>The hour between the calls and the end of school was the longest of the day, and nobody filled it with anything useful. Weinstein bought a newspaper he did not read and a coffee he described, after one sip, as an argument against the European project. Trevor, back from the pavement with an empty paper cup he would not throw away, sat with the slip and recopied the times onto a second envelope in case the first was confiscated by a pigeon. Penny rang Mrs Marsh twice and was told, twice, that the platform was still a platform, and on the second occasion that the landlord had now sent a second email, which was in capitals, which Mrs Marsh did not hold with. Derek stood. When he sat, he got up again. Every time a family went past with a child in a school jumper, he looked, and every time he made himself look away, and every time Penny watched him do it and said nothing at all, which was its own kind of commentary.</w:t>
+        <w:t>The hour between the calls and the end of school was the longest of the day, and none of them filled it with anything useful. Weinstein bought a newspaper he did not read and a coffee he described, after one sip, as an argument against the European project. Trevor, back from the pavement with an empty paper cup he would not throw away, sat with the slip and recopied the times onto a second envelope in case the first was confiscated by a pigeon. Penny rang Mrs Marsh twice and was told, twice, that the platform was still a platform, and on the second occasion that the landlord had now sent a second email, in capitals, which Mrs Marsh did not hold with. Derek stood. When he sat, he got up again. Every time a family went past with a child in a school jumper, he looked, and every time he made himself look away, and every time Penny watched him do it and said nothing at all. That was its own kind of commentary.</w:t>
       </w:r>
     </w:p>
     <w:p>
@@ -9859,7 +10109,7 @@
           <w:b w:val="0"/>
           <w:sz w:val="22"/>
         </w:rPr>
-        <w:t>He looked down. Trevor's envelope was in his left hand, folded on the crease, and the crease was very sharp.</w:t>
+        <w:t>He looked down. Trevor's envelope was in his left hand, folded on the crease, and the crease was sharp enough to cut.</w:t>
       </w:r>
     </w:p>
     <w:p>
@@ -9976,7 +10226,7 @@
           <w:b w:val="0"/>
           <w:sz w:val="22"/>
         </w:rPr>
-        <w:t>"You'd have struck it to keep you off the floor. That's allowed. It's just not evidence." She turned her cup a quarter turn on the shelf, which was the nearest Penny came to fidgeting. "If we strike her at four, it'll be because she's got no act. If we strike her now, the fear wrote it. And if the fear writes the file, then the next time something frightens us, it writes the next one too, and we'll call that a procedure."</w:t>
+        <w:t>"You'd have struck it to keep you off the floor. That's allowed. It's just not evidence." She turned her cup a quarter turn on the shelf. It was the nearest Penny came to fidgeting. "If we strike her at four, it'll be because she's got no act. If we strike her now, the fear wrote it. And if the fear writes the file, then the next time something frightens us, it writes the next one too, and we'll call that a procedure."</w:t>
       </w:r>
     </w:p>
     <w:p>
@@ -10327,7 +10577,7 @@
           <w:b w:val="0"/>
           <w:sz w:val="22"/>
         </w:rPr>
-        <w:t>Trevor had been sitting at the end of the row of chairs with the slip on his knee, the way a man might sit with a sleeping cat he has been told not to disturb. He looked up.</w:t>
+        <w:t>Trevor had been sitting at the end of the row of chairs with the slip on his knee, like a man with a sleeping cat he has been told not to disturb. He looked up.</w:t>
       </w:r>
     </w:p>
     <w:p>
@@ -10418,7 +10668,7 @@
           <w:b w:val="0"/>
           <w:sz w:val="22"/>
         </w:rPr>
-        <w:t>Weinstein, who had been standing with his back to a pillar studying the departure board as if it owed him money, turned round. "She is right about the loop, the girl," he said. "Your daughter. Not Penny. Penny is also right, but your daughter is right first, and she is right about the harder thing."</w:t>
+        <w:t>Weinstein, who had been standing with his back to a pillar glaring at the departure board as though it owed him money, turned round. "She is right about the loop, the girl," he said. "Your daughter. Not Penny. Penny is also right, but your daughter is right first, and she is right about the harder thing."</w:t>
       </w:r>
     </w:p>
     <w:p>
@@ -10470,7 +10720,7 @@
           <w:b w:val="0"/>
           <w:sz w:val="22"/>
         </w:rPr>
-        <w:t>Tabitha, on the pavement, had heard none of this and understood the posture. She had seen him through the glass of the doors, bent forward on a station chair with a phone in both hands, and she had read it the way she read weather. She came as far as the doors and no further. The glass stayed between them.</w:t>
+        <w:t>Tabitha, on the pavement, had heard none of this and understood the posture. She had seen him through the glass of the doors, bent forward on a station chair with a phone in both hands, and she had read it as she read weather. She came as far as the doors and no further. The glass stayed between them.</w:t>
       </w:r>
     </w:p>
     <w:p>
@@ -10509,7 +10759,7 @@
           <w:b w:val="0"/>
           <w:sz w:val="22"/>
         </w:rPr>
-        <w:t>"Good." She looked at him for a moment, at the hands, at the shoulders, at whatever part of a man shows that he has spent three seconds of the afternoon counting a child's name. "Then you can stop standing like a platform. Come and be a man who has a train to put someone else on."</w:t>
+        <w:t>"Good." She studied him for a moment: the hands, the shoulders, whatever part of a man shows that he has spent three seconds of the afternoon counting a child's name. "Then you can stop standing like a platform. Come and be a man who has a train to put someone else on."</w:t>
       </w:r>
     </w:p>
     <w:p>
@@ -10599,7 +10849,7 @@
           <w:b w:val="0"/>
           <w:sz w:val="22"/>
         </w:rPr>
-        <w:t>At twenty past three the public address system cleared its throat, in the way of public address systems everywhere, and a woman's voice, recorded so long ago that she might by now have retired to the coast, apologised for the late running of the 12:52 from Cardiff Central. The 12:52 from Cardiff Central was already in. It had been in for six minutes. Its passengers were streaming past them towards the Underground, with the faces of people who have already done their suffering and do not wish to hear about it again.</w:t>
+        <w:t>At twenty past three the public address system cleared its throat, as public address systems do everywhere, and a woman's voice, recorded so long ago that she might by now have retired to the coast, apologised for the late running of the 12:52 from Cardiff Central. The 12:52 from Cardiff Central was already in. It had been in for six minutes. Its passengers were streaming past them towards the Underground, with the faces of people who have done their suffering and do not wish to hear about it again.</w:t>
       </w:r>
     </w:p>
     <w:p>
@@ -10638,20 +10888,20 @@
           <w:b w:val="0"/>
           <w:sz w:val="22"/>
         </w:rPr>
-        <w:t>Two minutes later the same recorded voice announced that the 15:36 to Worcester Foregate Street was expected to depart eleven minutes late. A small and very English groan went up from a cluster of people by the coffee stand. One man said something to his phone that the phone did not deserve. A woman with a pushchair turned it round, decisively, and went off to find a sandwich, because the board had told her she had time.</w:t>
-      </w:r>
-    </w:p>
-    <w:p>
-      <w:pPr>
-        <w:spacing w:after="160" w:line="240" w:lineRule="auto"/>
-      </w:pPr>
-      <w:r>
-        <w:rPr>
-          <w:rFonts w:ascii="Georgia" w:hAnsi="Georgia" w:eastAsia="Georgia"/>
-          <w:b w:val="0"/>
-          <w:sz w:val="22"/>
-        </w:rPr>
-        <w:t>Weinstein watched all of this with the delight of a man who has been handed, unexpectedly, a demonstration apparatus.</w:t>
+        <w:t>Two minutes later the same recorded voice announced that the 15:36 to Worcester Foregate Street was expected to depart eleven minutes late. A small and thoroughly English groan went up from a cluster of people by the coffee stand. One man said something to his phone that the phone did not deserve. A woman with a pushchair turned it round, decisively, and went off to find a sandwich, because the board had told her she had time.</w:t>
+      </w:r>
+    </w:p>
+    <w:p>
+      <w:pPr>
+        <w:spacing w:after="160" w:line="240" w:lineRule="auto"/>
+      </w:pPr>
+      <w:r>
+        <w:rPr>
+          <w:rFonts w:ascii="Georgia" w:hAnsi="Georgia" w:eastAsia="Georgia"/>
+          <w:b w:val="0"/>
+          <w:sz w:val="22"/>
+        </w:rPr>
+        <w:t>Weinstein watched all of this with delight, like a man unexpectedly handed a demonstration apparatus.</w:t>
       </w:r>
     </w:p>
     <w:p>
@@ -10794,7 +11044,7 @@
           <w:b w:val="0"/>
           <w:sz w:val="22"/>
         </w:rPr>
-        <w:t>Trevor looked at his envelope, which was full. He turned it over. That was full too, mostly of the sum about the other side of the Sun. He looked about him for paper with the expression of a man whose entire profession had become, for one afternoon, a stationery problem.</w:t>
+        <w:t>Trevor looked at his envelope, which was full. He turned it over. That was full too, mostly of the sum about the other side of the Sun. He looked about him for paper. For one afternoon his entire profession had become a stationery problem.</w:t>
       </w:r>
     </w:p>
     <w:p>
@@ -10833,7 +11083,7 @@
           <w:b w:val="0"/>
           <w:sz w:val="22"/>
         </w:rPr>
-        <w:t xml:space="preserve">Trevor wrote. He had the best handwriting of the three of them, which was not saying a great deal, and he was the only one who could be trusted not to add an adjective. He knelt at the end of the row of metal chairs and used the seat as a desk, while Weinstein read upside down from the far side, which was unnecessary and typical.</w:t>
+        <w:t>Trevor wrote. He had the best handwriting of the three of them, not that this said a great deal, and he was the only one who could be trusted not to add an adjective. He knelt at the end of the row of metal chairs and used the seat as a desk, while Weinstein read upside down from the far side, unnecessarily and typically.</w:t>
       </w:r>
     </w:p>
     <w:p>
@@ -10976,7 +11226,7 @@
           <w:b w:val="0"/>
           <w:sz w:val="22"/>
         </w:rPr>
-        <w:t>Penny took the pencil from Trevor, which was a thing she had never done in his presence before and which he would later describe, to his sister, as like having a tooth removed by a friend. She wrote the last line herself, in her own handwriting, which was faster and less legible than his and entirely unambiguous.</w:t>
+        <w:t>Penny took the pencil from Trevor. She had never done that in his presence before, and he would later describe it, to his sister, as like having a tooth removed by a friend. She wrote the last line herself, in her own handwriting, faster and less legible than his and entirely unambiguous.</w:t>
       </w:r>
     </w:p>
     <w:p>
@@ -11002,20 +11252,20 @@
           <w:b w:val="0"/>
           <w:sz w:val="22"/>
         </w:rPr>
-        <w:t>She handed the pencil back. Nobody said anything about the fact that she had written it.</w:t>
-      </w:r>
-    </w:p>
-    <w:p>
-      <w:pPr>
-        <w:spacing w:after="160" w:line="240" w:lineRule="auto"/>
-      </w:pPr>
-      <w:r>
-        <w:rPr>
-          <w:rFonts w:ascii="Georgia" w:hAnsi="Georgia" w:eastAsia="Georgia"/>
-          <w:b w:val="0"/>
-          <w:sz w:val="22"/>
-        </w:rPr>
-        <w:t>Weinstein read the whole slip upside down from start to finish, moving his lips very slightly on the times, like a man checking a bill.</w:t>
+        <w:t>She handed the pencil back. None of them mentioned that she had written it.</w:t>
+      </w:r>
+    </w:p>
+    <w:p>
+      <w:pPr>
+        <w:spacing w:after="160" w:line="240" w:lineRule="auto"/>
+      </w:pPr>
+      <w:r>
+        <w:rPr>
+          <w:rFonts w:ascii="Georgia" w:hAnsi="Georgia" w:eastAsia="Georgia"/>
+          <w:b w:val="0"/>
+          <w:sz w:val="22"/>
+        </w:rPr>
+        <w:t>Weinstein read the whole slip upside down from start to finish, moving his lips slightly on the times, like a man checking a bill.</w:t>
       </w:r>
     </w:p>
     <w:p>
@@ -11106,7 +11356,7 @@
           <w:b w:val="0"/>
           <w:sz w:val="22"/>
         </w:rPr>
-        <w:t>She ended the call. Penny looked at the phone for a moment with something close to affection.</w:t>
+        <w:t>She ended the call. Penny regarded the phone for a moment with something close to affection.</w:t>
       </w:r>
     </w:p>
     <w:p>
@@ -11158,7 +11408,7 @@
           <w:b w:val="0"/>
           <w:sz w:val="22"/>
         </w:rPr>
-        <w:t>On the board, the sixteen hundred moved one minute closer, which made it the only clock in the building behaving like a public service. Weinstein looked at it, looked at the slip in Trevor's hands, and buttoned the jacket he wore in every weather.</w:t>
+        <w:t>On the board, the sixteen hundred moved one minute closer, which made it the only clock in the building behaving like a public service. Weinstein glanced at it, then at the slip in Trevor's hands, and buttoned the jacket he wore in every weather.</w:t>
       </w:r>
     </w:p>
     <w:p>
@@ -11352,7 +11602,7 @@
           <w:b w:val="0"/>
           <w:sz w:val="22"/>
         </w:rPr>
-        <w:t>"I have learned something about her twice today. Once on a telephone she was not speaking into, and once in a sentence about a notebook. That is more than I have met most of my clients." He looked at the barrier, at the clock above it, and back at Derek. "Children who refuse to file headings they have not read should be given a book with a known error in it. It teaches them that print is not a reason. You will thank me in six years, when she refuses to believe anything you say."</w:t>
+        <w:t>"I have learned something about her twice today. Once on a telephone she was not speaking into, and once in a sentence about a notebook. That is more than I have met most of my clients." His eyes went to the barrier, to the clock above it, and back to Derek. "Children who refuse to file headings they have not read should be given a book with a known error in it. It teaches them that print is not a reason. You will thank me in six years, when she refuses to believe anything you say."</w:t>
       </w:r>
     </w:p>
     <w:p>
@@ -11456,7 +11706,7 @@
           <w:b w:val="0"/>
           <w:sz w:val="22"/>
         </w:rPr>
-        <w:t>Weinstein considered him with real kindness, which in Weinstein looked very much like disappointment.</w:t>
+        <w:t>Weinstein considered him with real kindness, which in Weinstein looked a great deal like disappointment.</w:t>
       </w:r>
     </w:p>
     <w:p>
@@ -11547,7 +11797,7 @@
           <w:b w:val="0"/>
           <w:sz w:val="22"/>
         </w:rPr>
-        <w:t>"Then Mrs Marsh will have a very long correspondence with the landlord, and you will have a very well-measured door." Weinstein glanced at the clock over the barrier, and then, more gently, back at Trevor. "Do not save the form expecting a miracle, Trevor. Save it because it is correct. That is a smaller reward, and it is the only one that has never once let me down."</w:t>
+        <w:t>"Then Mrs Marsh will have a long correspondence with the landlord, and you will have a very well-measured door." Weinstein glanced at the clock over the barrier, and then, more gently, back at Trevor. "Do not save the form expecting a miracle, Trevor. Save it because it is correct. That is a smaller reward, and it is the only one that has never once let me down."</w:t>
       </w:r>
     </w:p>
     <w:p>
@@ -12080,7 +12330,7 @@
           <w:b w:val="0"/>
           <w:sz w:val="22"/>
         </w:rPr>
-        <w:t>He watched him find the carriage. He watched him check the number on the carriage against the number on the ticket, twice. He watched him step up and in, the jacket catching the light at the door, and he watched the shape of him move along behind the windows and sit, very upright, in a seat facing the direction of travel, because Weinstein had once explained at length that facing backwards on a train was a philosophical position he did not hold.</w:t>
+        <w:t>He watched him find the carriage. He watched him check the number on the carriage against the number on the ticket, twice. He watched him step up and in, the jacket catching the light at the door, and he watched the shape of him move along behind the windows and sit, upright, in a seat facing the direction of travel, because Weinstein had once explained at length that facing backwards on a train was a philosophical position he did not hold.</w:t>
       </w:r>
     </w:p>
     <w:p>
@@ -12119,7 +12369,7 @@
           <w:b w:val="0"/>
           <w:sz w:val="22"/>
         </w:rPr>
-        <w:t>It left after he boarded it. That was the whole event. A man on a platform, a door, a seat, then the train going; in that order, in public, in front of a few hundred people, none of whom thought it worth remarking on. The cause was on the platform before the doors shut. The effect pulled out under Brunel's roof towards the light, and every clock in the station agreed about it, and so would every clock on the train, and so would any clock anybody cared to send past at any speed they liked. Derek stood and watched the order happen in public, which was the whole lecture, and felt the other order, door first, warning second, sit down beside it and become ordinary.</w:t>
+        <w:t>It left after he boarded it. That was the whole event. A man on a platform, a door, a seat, then the train going; in that order, in public, in front of a few hundred people, none of whom thought it worth remarking on. The cause was on the platform before the doors shut. The effect pulled out under Brunel's roof towards the light, and every clock in the station agreed about it, and so would every clock on the train, and so would any clock anybody cared to send past at any speed they liked. Derek stood and watched the order happen in public, the whole lecture in one act, and felt the other order, door first, warning second, sit down beside it and become ordinary.</w:t>
       </w:r>
     </w:p>
     <w:p>
@@ -12184,7 +12434,7 @@
           <w:b w:val="0"/>
           <w:sz w:val="22"/>
         </w:rPr>
-        <w:t>His phone rang before they had reached the chairs. Weinstein, already moving; Derek could hear the train under his voice, the particular rising hum of a thing that has committed to leaving.</w:t>
+        <w:t>His phone rang before they had reached the chairs. Weinstein, moving already; Derek could hear the train under his voice, the particular rising hum of a thing that has committed to leaving.</w:t>
       </w:r>
     </w:p>
     <w:p>
@@ -12587,7 +12837,7 @@
           <w:b w:val="0"/>
           <w:sz w:val="22"/>
         </w:rPr>
-        <w:t>The line went dead. Penny looked at the phone, and then at Derek, and for the first time that day she did not have a rule ready.</w:t>
+        <w:t>The line went dead. Penny glanced at the phone, and then at Derek, and for once that day she did not have a rule ready.</w:t>
       </w:r>
     </w:p>
     <w:p>
@@ -12626,7 +12876,7 @@
           <w:b w:val="0"/>
           <w:sz w:val="22"/>
         </w:rPr>
-        <w:t>On the pavement Tabitha was where she had said she would be. She had moved once, perhaps, to stand in a doorway out of a short shower, and then moved back out of it again, on principle, as if the doorway might get ideas. The sentence had already been said. She did not make him repeat it, and she did not ask whether the train had gone; she could see it in the way he walked.</w:t>
+        <w:t>On the pavement Tabitha was where she had said she would be. She had moved once, perhaps, to stand in a doorway out of a short shower, and then moved back out of it again, on principle, as if the doorway might get ideas. The sentence had already been said. She did not make him repeat it, and she did not ask whether the train had gone; she could see it in how he walked.</w:t>
       </w:r>
     </w:p>
     <w:p>
@@ -12729,7 +12979,7 @@
           <w:b w:val="0"/>
           <w:sz w:val="22"/>
         </w:rPr>
-        <w:t>They walked back the way they had come, the long way round, because the short way went past Sophie's school and Tabitha had decided, without discussing it, that it would not.</w:t>
+        <w:t>They walked back the long way round, because the short way went past Sophie's school and Tabitha had decided, without discussing it, that it would not.</w:t>
       </w:r>
     </w:p>
     <w:p>
@@ -12820,7 +13070,7 @@
           <w:b w:val="0"/>
           <w:sz w:val="22"/>
         </w:rPr>
-        <w:t>He knew she hadn't. He walked a little further before he answered, past a launderette with one machine going round and nobody watching it.</w:t>
+        <w:t>He knew she hadn't. He walked a little further before he answered, past a launderette with one machine going round and no one watching it.</w:t>
       </w:r>
     </w:p>
     <w:p>
@@ -12859,33 +13109,33 @@
           <w:b w:val="0"/>
           <w:sz w:val="22"/>
         </w:rPr>
-        <w:t>There had not been a long secret arrangement. There had been the end of last week, and a conversation that had lasted after its reason was finished. She had stayed while he cleared the desk. He had found another thing to clear. Eventually she had asked whether he wanted her to go, and he had managed to answer the question she had asked. It was very little history to put against the ease with which she held his hand. He was glad she was not asking him to make it longer.</w:t>
-      </w:r>
-    </w:p>
-    <w:p>
-      <w:pPr>
-        <w:spacing w:after="160" w:line="240" w:lineRule="auto"/>
-      </w:pPr>
-      <w:r>
-        <w:rPr>
-          <w:rFonts w:ascii="Georgia" w:hAnsi="Georgia" w:eastAsia="Georgia"/>
-          <w:b w:val="0"/>
-          <w:sz w:val="22"/>
-        </w:rPr>
-        <w:t xml:space="preserve">She stopped at the kerb, waiting for the lights, and looked at him sideways with the flat, unhurried look that was, he had learned, the most dangerous thing about her. "Do the form first, Derek. Then come out on to the London side where I'm standing. I'm not going to make you do it in a stairwell."</w:t>
-      </w:r>
-    </w:p>
-    <w:p>
-      <w:pPr>
-        <w:spacing w:after="160" w:line="240" w:lineRule="auto"/>
-      </w:pPr>
-      <w:r>
-        <w:rPr>
-          <w:rFonts w:ascii="Georgia" w:hAnsi="Georgia" w:eastAsia="Georgia"/>
-          <w:b w:val="0"/>
-          <w:sz w:val="22"/>
-        </w:rPr>
-        <w:t>The lights changed. They crossed. By the time they reached the street door of the building, the sky had remembered itself and it was raining again, very lightly, in the way that does not count.</w:t>
+        <w:t>There had not been a long secret arrangement. There had been the end of last week, and a conversation that had lasted after its reason was finished. She had stayed while he cleared the desk. He had found another thing to clear. Eventually she had asked whether he wanted her to go, and he had managed to answer the question she had asked. It was little history to put against the ease with which she held his hand. He was glad she was not asking him to make it longer.</w:t>
+      </w:r>
+    </w:p>
+    <w:p>
+      <w:pPr>
+        <w:spacing w:after="160" w:line="240" w:lineRule="auto"/>
+      </w:pPr>
+      <w:r>
+        <w:rPr>
+          <w:rFonts w:ascii="Georgia" w:hAnsi="Georgia" w:eastAsia="Georgia"/>
+          <w:b w:val="0"/>
+          <w:sz w:val="22"/>
+        </w:rPr>
+        <w:t>She stopped at the kerb, waiting for the lights, and gave him the flat, unhurried sideways look that was, he had learned, the most dangerous thing about her. "Do the form first, Derek. Then come out on to the London side where I'm standing. I'm not going to make you do it in a stairwell."</w:t>
+      </w:r>
+    </w:p>
+    <w:p>
+      <w:pPr>
+        <w:spacing w:after="160" w:line="240" w:lineRule="auto"/>
+      </w:pPr>
+      <w:r>
+        <w:rPr>
+          <w:rFonts w:ascii="Georgia" w:hAnsi="Georgia" w:eastAsia="Georgia"/>
+          <w:b w:val="0"/>
+          <w:sz w:val="22"/>
+        </w:rPr>
+        <w:t>The lights changed. They crossed. By the time they reached the street door of the building, the sky had remembered itself and it was raining again, lightly, in the way that does not count.</w:t>
       </w:r>
     </w:p>
     <w:p>
@@ -12911,7 +13161,7 @@
           <w:b w:val="0"/>
           <w:sz w:val="22"/>
         </w:rPr>
-        <w:t xml:space="preserve">Derek had known it would be. He had known it all the way back, on foot, with Tabitha's hand in his. He had known it on the stairs, and on the landing, where Mrs Marsh rose from her step at their approach with the clipboard already raised and Penny and Trevor stood behind her, not going in. He knew it, and then he came into his office and saw it, and found that knowing a thing and seeing it were still, after all this, two separate events.</w:t>
+        <w:t>Derek had known it would be. He had known it all the way back, on foot, with Tabitha's hand in his. He had known it on the stairs, and on the landing, where Mrs Marsh rose from her step at their approach with the clipboard raised and Penny and Trevor stood behind her, not going in. He knew it, and then he came into his office and saw it, and found that knowing a thing and seeing it were still, after all this, two separate events.</w:t>
       </w:r>
     </w:p>
     <w:p>
@@ -12989,20 +13239,20 @@
           <w:b w:val="0"/>
           <w:sz w:val="22"/>
         </w:rPr>
-        <w:t xml:space="preserve">Nobody looked anywhere else. The paint crept the way a minute hand creeps: you could not see it go, and you could see that it had gone.</w:t>
-      </w:r>
-    </w:p>
-    <w:p>
-      <w:pPr>
-        <w:spacing w:after="160" w:line="240" w:lineRule="auto"/>
-      </w:pPr>
-      <w:r>
-        <w:rPr>
-          <w:rFonts w:ascii="Georgia" w:hAnsi="Georgia" w:eastAsia="Georgia"/>
-          <w:b w:val="0"/>
-          <w:sz w:val="22"/>
-        </w:rPr>
-        <w:t xml:space="preserve">"It doesn't need him to step on." Trevor's voice had gone very level, which in Trevor meant the opposite. "If it comes far enough, it comes to the desk. Then he's standing on a platform without having moved, and the doors are open, and—" He stopped, because he had worked out the end of the sentence and did not want it in the room.</w:t>
+        <w:t>Nobody looked anywhere else. The paint crept like a minute hand: you could not see it go, and you could see that it had gone.</w:t>
+      </w:r>
+    </w:p>
+    <w:p>
+      <w:pPr>
+        <w:spacing w:after="160" w:line="240" w:lineRule="auto"/>
+      </w:pPr>
+      <w:r>
+        <w:rPr>
+          <w:rFonts w:ascii="Georgia" w:hAnsi="Georgia" w:eastAsia="Georgia"/>
+          <w:b w:val="0"/>
+          <w:sz w:val="22"/>
+        </w:rPr>
+        <w:t>"It doesn't need him to step on." Trevor's voice had gone dead level, which in Trevor meant the opposite. "If it comes far enough, it comes to the desk. Then he's standing on a platform without having moved, and the doors are open, and—" He stopped, because he had worked out the end of the sentence and did not want it in the room.</w:t>
       </w:r>
     </w:p>
     <w:p>
@@ -13041,20 +13291,20 @@
           <w:b w:val="0"/>
           <w:sz w:val="22"/>
         </w:rPr>
-        <w:t xml:space="preserve">They both looked at him. It was not a word he used in the office. He used it on the telephone, to clients who wanted him to promise they would not be murdered, and on Sophie, rarely, and badly.</w:t>
-      </w:r>
-    </w:p>
-    <w:p>
-      <w:pPr>
-        <w:spacing w:after="160" w:line="240" w:lineRule="auto"/>
-      </w:pPr>
-      <w:r>
-        <w:rPr>
-          <w:rFonts w:ascii="Georgia" w:hAnsi="Georgia" w:eastAsia="Georgia"/>
-          <w:b w:val="0"/>
-          <w:sz w:val="22"/>
-        </w:rPr>
-        <w:t xml:space="preserve">"We haven't refused anything. We've not boarded. That isn't the same. Not boarding is a thing that keeps not happening. You can't put a time on it." He found he knew this the way he knew the floor. "If Trevor types BOARDING REFUSED with that door standing open, it's a forecast. It's a sentence about what I'm going to do. The platform's got no reason to believe a forecast. Neither have I."</w:t>
+        <w:t>They both turned to him. It was not a word he used in the office. He used it on the telephone, to clients who wanted him to promise they would not be murdered, and on Sophie, rarely, and badly.</w:t>
+      </w:r>
+    </w:p>
+    <w:p>
+      <w:pPr>
+        <w:spacing w:after="160" w:line="240" w:lineRule="auto"/>
+      </w:pPr>
+      <w:r>
+        <w:rPr>
+          <w:rFonts w:ascii="Georgia" w:hAnsi="Georgia" w:eastAsia="Georgia"/>
+          <w:b w:val="0"/>
+          <w:sz w:val="22"/>
+        </w:rPr>
+        <w:t>"We haven't refused anything. We've not boarded. That isn't the same. Not boarding is a thing that keeps not happening. You can't put a time on it." He found he knew this as surely as the floor. "If Trevor types BOARDING REFUSED with that door standing open, it's a forecast. It's a sentence about what I'm going to do. The platform's got no reason to believe a forecast. Neither have I."</w:t>
       </w:r>
     </w:p>
     <w:p>
@@ -13145,7 +13395,7 @@
           <w:b w:val="0"/>
           <w:sz w:val="22"/>
         </w:rPr>
-        <w:t xml:space="preserve">He said it in the voice he used for tea. Then he turned his back on the open door, which was the hardest thing he had done with his body since he had learned to walk, and stepped off the yellow line onto the carpet, and put the sheet back in his pocket, and went to the desk, and put his hand on the back of Trevor's chair.</w:t>
+        <w:t>He said it in the voice he used for tea. Then he turned his back on the open door, the hardest thing he had done with his body since he had learned to walk, and stepped off the yellow line onto the carpet, and put the sheet back in his pocket, and went to the desk, and put his hand on the back of Trevor's chair.</w:t>
       </w:r>
     </w:p>
     <w:p>
@@ -13171,20 +13421,20 @@
           <w:b w:val="0"/>
           <w:sz w:val="22"/>
         </w:rPr>
-        <w:t xml:space="preserve">Trevor looked at the office clock. "Sixteen forty-one."</w:t>
-      </w:r>
-    </w:p>
-    <w:p>
-      <w:pPr>
-        <w:spacing w:after="160" w:line="240" w:lineRule="auto"/>
-      </w:pPr>
-      <w:r>
-        <w:rPr>
-          <w:rFonts w:ascii="Georgia" w:hAnsi="Georgia" w:eastAsia="Georgia"/>
-          <w:b w:val="0"/>
-          <w:sz w:val="22"/>
-        </w:rPr>
-        <w:t>Behind Derek, without a beep, the carriage door slid shut. Nobody heard it. Trevor saw it in the window glass, and said afterwards that it had closed the way a door closes when somebody has finally answered the question it was asking. The paint on the carpet stopped. The slab stood forty-six millimetres past its original position against the fixed scale, and stayed there.</w:t>
+        <w:t>Trevor checked the office clock. "Sixteen forty-one."</w:t>
+      </w:r>
+    </w:p>
+    <w:p>
+      <w:pPr>
+        <w:spacing w:after="160" w:line="240" w:lineRule="auto"/>
+      </w:pPr>
+      <w:r>
+        <w:rPr>
+          <w:rFonts w:ascii="Georgia" w:hAnsi="Georgia" w:eastAsia="Georgia"/>
+          <w:b w:val="0"/>
+          <w:sz w:val="22"/>
+        </w:rPr>
+        <w:t>Behind Derek, without a beep, the carriage door slid shut. Nobody heard it. Trevor saw it in the window glass, and said afterwards that it had closed like a door when somebody has finally answered the question it was asking. The paint on the carpet stopped. The slab stood forty-six millimetres past its original position against the fixed scale, and stayed there.</w:t>
       </w:r>
     </w:p>
     <w:p>
@@ -13236,7 +13486,7 @@
           <w:b w:val="0"/>
           <w:sz w:val="22"/>
         </w:rPr>
-        <w:t xml:space="preserve">He sat down and typed with two fingers, which was how he typed everything, and this time the form took the record he was making. It did not argue. It did not grey anything out. It did not offer to become the morning sheet.</w:t>
+        <w:t>He sat down and typed with two fingers, as he typed everything, and this time the form took the record he was making. It did not argue. It did not grey anything out. It did not offer to become the morning sheet.</w:t>
       </w:r>
     </w:p>
     <w:p>
@@ -13587,7 +13837,7 @@
           <w:b w:val="0"/>
           <w:sz w:val="22"/>
         </w:rPr>
-        <w:t xml:space="preserve">Derek found that he was breathing in an entirely ordinary way, in and out, the way he had breathed every day of his life before a Tuesday not long ago, and that his hands, for once, had nothing to straighten.</w:t>
+        <w:t>Derek found that he was breathing in an entirely ordinary way, in and out, as he had breathed every day of his life before a Tuesday not long ago, and that his hands, for once, had nothing to straighten.</w:t>
       </w:r>
     </w:p>
     <w:p>
@@ -13808,7 +14058,7 @@
           <w:b w:val="0"/>
           <w:sz w:val="22"/>
         </w:rPr>
-        <w:t>Derek went to the door. It was not a decision so much as a habit, the hand reaching for the handle at the end of a day the way it always had. He swung it. It travelled its third of an arc and met the platform, the soft stop of station air, and would not shut. He pushed once more, not hard. Then he stopped pushing.</w:t>
+        <w:t>Derek went to the door. It was not a decision so much as a habit, the hand reaching for the handle at the end of a day as it always had. He swung it. It travelled its third of an arc and met the platform, the soft stop of station air, and would not shut. He pushed once more, not hard. Then he stopped pushing.</w:t>
       </w:r>
     </w:p>
     <w:p>
@@ -13899,7 +14149,7 @@
           <w:b w:val="0"/>
           <w:sz w:val="22"/>
         </w:rPr>
-        <w:t>Penny watched the itinerary, not them. She had taken it out of her bag and unfolded it on her knee, and was reading the flight times with great attention, as if they might have changed since the morning. "Thursday week," she said, to the itinerary. "He'll get the number. You two can have the corridor. The corridor still contains a railway, so I'd keep it brief."</w:t>
+        <w:t>Penny watched the itinerary, not them. She had taken it out of her bag and unfolded it on her knee, and was reading the flight times with great attention, in case they had changed since the morning. "Thursday week," she said, to the itinerary. "He'll get the number. You two can have the corridor. The corridor still contains a railway, so I'd keep it brief."</w:t>
       </w:r>
     </w:p>
     <w:p>
@@ -14054,7 +14304,7 @@
           <w:b w:val="0"/>
           <w:sz w:val="22"/>
         </w:rPr>
-        <w:t>Trevor left at twenty to six, with the tape measure rolled up in his coat pocket and the expression of a man who has done a full day's work and is not sure what any of it was. He said goodnight to the filing cabinet, out of habit, and then to Derek, and then, after a visible internal struggle, to the platform.</w:t>
+        <w:t>Trevor left at twenty to six, with the tape measure rolled up in his coat pocket, looking like a man who had done a full day's work and was not sure what any of it was. He said goodnight to the filing cabinet, out of habit, and then to Derek, and then, after a visible internal struggle, to the platform.</w:t>
       </w:r>
     </w:p>
     <w:p>
@@ -14145,7 +14395,7 @@
           <w:b w:val="0"/>
           <w:sz w:val="22"/>
         </w:rPr>
-        <w:t>Mrs Marsh came up them more slowly than she had all day. She was carrying the clipboard, as always, and under it a hardbacked book with a marbled cover that neither of them had seen before, held flat against her chest the way people hold things they have decided to hand over and have not yet let go of. She came through the outer room. She did not look at the platform. She stopped in the doorway of Derek's office, on the London side of the sill, and stood there.</w:t>
+        <w:t>Mrs Marsh came up them more slowly than she had all day. She was carrying the clipboard, as always, and under it a hardbacked book with a marbled cover that neither of them had seen before, held flat against her chest, as people hold things they have decided to hand over and have not yet let go of. She came through the outer room. She did not look at the platform. She stopped in the doorway of Derek's office, on the London side of the sill, and stood there.</w:t>
       </w:r>
     </w:p>
     <w:p>
@@ -14236,7 +14486,7 @@
           <w:b w:val="0"/>
           <w:sz w:val="22"/>
         </w:rPr>
-        <w:t>"I did not say anything at the time. I wished to check." She turned the book round on the clipboard so that they could read it, and put one finger, very precisely, under a line.</w:t>
+        <w:t>"I did not say anything at the time. I wished to check." She turned the book round on the clipboard so that they could read it, and put one finger, precisely, under a line.</w:t>
       </w:r>
     </w:p>
     <w:p>
@@ -14275,7 +14525,7 @@
           <w:b w:val="0"/>
           <w:sz w:val="22"/>
         </w:rPr>
-        <w:t>"The landlord telephoned me on Sunday afternoon." It was exactly the voice she used for leaks. "He said the radiator in your office had been making a noise that the tenant below had complained about. I told him it had been making that noise for eleven years. He said that was not an answer. I came up at six with the key. I opened your door. I bled the radiator. I locked your door at nine minutes past. There was nothing beyond your door but your office." She paused. "There was no platform. There was your desk, and the kettle, and a glass object on Mr Boltzman's desk that I did not touch."</w:t>
+        <w:t>"The landlord telephoned me on Sunday afternoon." It was the voice she used for leaks. "He said the radiator in your office had been making a noise that the tenant below had complained about. I told him it had been making that noise for eleven years. He said that was not an answer. I came up at six with the key. I opened your door. I bled the radiator. I locked your door at nine minutes past. There was nothing beyond your door but your office." She paused. "There was no platform. There was your desk, and the kettle, and a glass object on Mr Boltzman's desk that I did not touch."</w:t>
       </w:r>
     </w:p>
     <w:p>
@@ -14535,7 +14785,7 @@
           <w:b w:val="0"/>
           <w:sz w:val="22"/>
         </w:rPr>
-        <w:t>"That is a very convenient sentence."</w:t>
+        <w:t>"That is a convenient sentence."</w:t>
       </w:r>
     </w:p>
     <w:p>
@@ -14613,7 +14863,7 @@
           <w:b w:val="0"/>
           <w:sz w:val="22"/>
         </w:rPr>
-        <w:t>"Mr Gent. For something to be a cause, it must be in the past of its effect. This is necessary. It is not sufficient. Your Sunday is in the past of your Monday. So is everything else that happened in London on Sunday. So is everything that happened on Saturday, and in the eighteenth century, and in the Cretaceous. The past of any event is very large. It contains a great many things that were nowhere near it." A pause, very slightly kinder than his pauses usually were. "If you wish to say a particular thing was the cause, you must show more than that it came first. You must show how it got from there to here. Did the person do anything to the door that is still in the door?"</w:t>
+        <w:t>"Mr Gent. For something to be a cause, it must be in the past of its effect. This is necessary. It is not sufficient. Your Sunday is in the past of your Monday. So is everything else that happened in London on Sunday. So is everything that happened on Saturday, and in the eighteenth century, and in the Cretaceous. The past of any event is very large. It contains a great many things that were nowhere near it." A pause, slightly kinder than his pauses usually were. "If you wish to say a particular thing was the cause, you must show more than that it came first. You must show how it got from there to here. Did the person do anything to the door that is still in the door?"</w:t>
       </w:r>
     </w:p>
     <w:p>
@@ -14665,7 +14915,7 @@
           <w:b w:val="0"/>
           <w:sz w:val="22"/>
         </w:rPr>
-        <w:t>Mrs Marsh stood very still in the doorway with the marbled book open on her clipboard. Derek watched her take the sentence and turn it over and check the back of it for anything written there, the way Tuppence had at lunch, and the way she checked every form that had ever crossed her desk.</w:t>
+        <w:t>Mrs Marsh stood still in the doorway with the marbled book open on her clipboard. Derek watched her take the sentence and turn it over and check the back of it for anything written there, as Tuppence had at lunch, and as she checked every form that had ever crossed her desk.</w:t>
       </w:r>
     </w:p>
     <w:p>
@@ -14730,7 +14980,7 @@
           <w:b w:val="0"/>
           <w:sz w:val="22"/>
         </w:rPr>
-        <w:t xml:space="preserve">Penny took a sheet of the Bureau's paper from the tray and wrote on it, in her own fast hand. She did not ask permission. She wrote it the way she had written Sophie's line on the back of the Sunday slip, and when she had finished she turned it round so that Mrs Marsh could read it.</w:t>
+        <w:t>Penny took a sheet of the Bureau's paper from the tray and wrote on it, in her own fast hand. She did not ask permission. She wrote it as she had written Sophie's line on the back of the Sunday slip, and when she had finished she turned it round so that Mrs Marsh could read it.</w:t>
       </w:r>
     </w:p>
     <w:p>
@@ -14977,7 +15227,7 @@
           <w:b w:val="0"/>
           <w:sz w:val="22"/>
         </w:rPr>
-        <w:t>Penny looked at the platform, at the train, at the word. It was getting dark outside now, properly dark, and the lit windows of the carriage were brighter than the office.</w:t>
+        <w:t>Penny took in the platform, the train, the word. It was getting dark outside now, properly dark, and the lit windows of the carriage were brighter than the office.</w:t>
       </w:r>
     </w:p>
     <w:p>
@@ -15288,7 +15538,7 @@
           <w:b w:val="0"/>
           <w:sz w:val="22"/>
         </w:rPr>
-        <w:t>Sophie came down at the second call, which was early for her. She was carrying the notebook, the one that was hers, which came out at the kitchen table only when she wanted somebody to see her not showing it to them. She put it beside her plate, closed. She ate the pasta. She did not speak until she had finished it, which was, in Tuppence's experience, a sign that the speaking was going to be precise.</w:t>
+        <w:t>Sophie came down at the second call, early for her. She was carrying the notebook, the one that was hers, which came out at the kitchen table only when she wanted somebody to see her not showing it to them. She put it beside her plate, closed. She ate the pasta. She did not speak until she had finished it. In Tuppence's experience that was a sign that the speaking was going to be precise.</w:t>
       </w:r>
     </w:p>
     <w:p>
@@ -15366,7 +15616,7 @@
           <w:b w:val="0"/>
           <w:sz w:val="22"/>
         </w:rPr>
-        <w:t>"The heading came. On my phone. On the wall by the science block. It came and it went, and I didn't open it, and I didn't fetch it back." Sophie said it the way she had said it in the text to her father, word for word, and Tuppence understood that she had said it to herself a good many times since lunch. "So I wrote 12:49. And then I crossed it out."</w:t>
+        <w:t>"The heading came. On my phone. On the wall by the science block. It came and it went, and I didn't open it, and I didn't fetch it back." Sophie said it as she had in the text to her father, word for word, and Tuppence understood that she had said it to herself a good many times since lunch. "So I wrote 12:49. And then I crossed it out."</w:t>
       </w:r>
     </w:p>
     <w:p>
@@ -15522,7 +15772,7 @@
           <w:b w:val="0"/>
           <w:sz w:val="22"/>
         </w:rPr>
-        <w:t>Julian turned the tap back on, very quietly, and then off again, and came and sat down at the end of the table with the beech hanger, which he had picked up again on his way past the worktop. He turned it over in his hands. He did not offer an opinion. He had a rule about not offering opinions on Sophie's notebook unless asked, and he had never once been asked, and he kept the rule anyway.</w:t>
+        <w:t>Julian turned the tap back on, quietly, and then off again, and came and sat down at the end of the table with the beech hanger, which he had picked up again on his way past the worktop. He turned it over in his hands. He did not offer an opinion. He had a rule about not offering opinions on Sophie's notebook unless asked, and he had never once been asked, and he kept the rule anyway.</w:t>
       </w:r>
     </w:p>
     <w:p>
@@ -15574,20 +15824,20 @@
           <w:b w:val="0"/>
           <w:sz w:val="22"/>
         </w:rPr>
-        <w:t>"It's about hangers. When I make one, I write the date on the hook end, in pencil, underneath, where nobody looks. The date I finished it. Not the date I started, because sometimes I start one and leave it for a month. Not the date somebody buys it. The day the last thing was done to it." He turned this one round to show her: on the underside of the hook, very small, nothing yet. "This one hasn't got a date because it isn't finished. The shoulder's wrong. When it's finished, it gets a date. If it never gets finished, it never gets one. That's not a mistake. It's just the truth about the hanger."</w:t>
-      </w:r>
-    </w:p>
-    <w:p>
-      <w:pPr>
-        <w:spacing w:after="160" w:line="240" w:lineRule="auto"/>
-      </w:pPr>
-      <w:r>
-        <w:rPr>
-          <w:rFonts w:ascii="Georgia" w:hAnsi="Georgia" w:eastAsia="Georgia"/>
-          <w:b w:val="0"/>
-          <w:sz w:val="22"/>
-        </w:rPr>
-        <w:t>Sophie looked at the blank underside of the hook for a long moment.</w:t>
+        <w:t>"It's about hangers. When I make one, I write the date on the hook end, in pencil, underneath, where nobody looks. The date I finished it. Not the date I started, because sometimes I start one and leave it for a month. Not the date somebody buys it. The day the last thing was done to it." He turned this one round to show her: on the underside of the hook, where a date would go, nothing yet. "This one hasn't got a date because it isn't finished. The shoulder's wrong. When it's finished, it gets a date. If it never gets finished, it never gets one. That's not a mistake. It's just the truth about the hanger."</w:t>
+      </w:r>
+    </w:p>
+    <w:p>
+      <w:pPr>
+        <w:spacing w:after="160" w:line="240" w:lineRule="auto"/>
+      </w:pPr>
+      <w:r>
+        <w:rPr>
+          <w:rFonts w:ascii="Georgia" w:hAnsi="Georgia" w:eastAsia="Georgia"/>
+          <w:b w:val="0"/>
+          <w:sz w:val="22"/>
+        </w:rPr>
+        <w:t>Sophie considered the blank underside of the hook for a long moment.</w:t>
       </w:r>
     </w:p>
     <w:p>
@@ -15626,7 +15876,7 @@
           <w:b w:val="0"/>
           <w:sz w:val="22"/>
         </w:rPr>
-        <w:t>"No, that's right." She took a pencil out of the spine. "Nothing finished. Nothing started. A heading came, and that's the heading's. I didn't do anything. So there isn't a time for me. There's only a date, because it was today, and the line." She wrote, under the date, in the square capitals: Asked not to file what I didn't see. She looked at it. Then she drew a ruler line under it, very straight, and shut the notebook. "There. That's the whole line."</w:t>
+        <w:t>"No, that's right." She took a pencil out of the spine. "Nothing finished. Nothing started. A heading came, and that's the heading's. I didn't do anything. So there isn't a time for me. There's only a date, because it was today, and the line." She wrote, under the date, in the square capitals: Asked not to file what I didn't see. She looked at it. Then she ruled a line under it, dead straight, and shut the notebook. "There. That's the whole line."</w:t>
       </w:r>
     </w:p>
     <w:p>
@@ -15704,7 +15954,7 @@
           <w:b w:val="0"/>
           <w:sz w:val="22"/>
         </w:rPr>
-        <w:t xml:space="preserve">Sophie was at the desk, doing homework that she had already done, in the way of somebody who wants to be in the room with her mother without having to say so. The notebook lay beside the homework, open at an earlier page, and Tuppence, who did not read other people's notebooks, could not help seeing the heading at the top of it, because it was in capitals and underlined twice: DAD'S KITCHEN CLOCK.</w:t>
+        <w:t>Sophie was at the desk, doing homework that she had already done, like somebody who wants to be in the room with her mother without having to say so. The notebook lay beside the homework, open at an earlier page, and Tuppence, who did not read other people's notebooks, could not help seeing the heading at the top of it, because it was in capitals and underlined twice: DAD'S KITCHEN CLOCK.</w:t>
       </w:r>
     </w:p>
     <w:p>
@@ -16120,7 +16370,7 @@
           <w:b w:val="0"/>
           <w:sz w:val="22"/>
         </w:rPr>
-        <w:t>Downstairs, Julian had washed up and was sitting at the kitchen table with the beech hanger and a strip of fine sandpaper, working at the shoulder he did not like. He looked up when she came in, and did not ask, because he did not need to; he had heard the promise through the floor, the way you hear most things in a house that size.</w:t>
+        <w:t>Downstairs, Julian had washed up and was sitting at the kitchen table with the beech hanger and a strip of fine sandpaper, working at the shoulder he did not like. He looked up when she came in, and did not ask, because he did not need to; he had heard the promise through the floor, as you hear most things in a house that size.</w:t>
       </w:r>
     </w:p>
     <w:p>
@@ -16146,7 +16396,7 @@
           <w:b w:val="0"/>
           <w:sz w:val="22"/>
         </w:rPr>
-        <w:t xml:space="preserve">She looked at Derek's name for some time. Then she took the clipboard out of her bag, the one she chaired things with, and turned back two pages to a line in her own hand, written at twenty to two on Sunday morning, in the second of the two one o'clocks: WEDNESDAYS: D., AFTER SCHOOL. She had told Sophie at tea on Sunday, in the voice. She had not told Derek.</w:t>
+        <w:t>She contemplated Derek's name for some time. Then she took the clipboard out of her bag, the one she chaired things with, and turned back two pages to a line in her own hand, written at twenty to two on Sunday morning, in the second of the two one o'clocks: WEDNESDAYS: D., AFTER SCHOOL. She had told Sophie at tea on Sunday, in the voice. She had not told Derek.</w:t>
       </w:r>
     </w:p>
     <w:p>
@@ -16522,7 +16772,7 @@
           <w:b w:val="0"/>
           <w:sz w:val="22"/>
         </w:rPr>
-        <w:t>She looked at the sum for a while. Something in it was bothering her, and she could not find it, the way you cannot find a smell in a room once you have been sitting in it long enough.</w:t>
+        <w:t>She sat over the sum for a while. Something in it was bothering her, and she could not find it, as you cannot find a smell in a room once you have been sitting in it long enough.</w:t>
       </w:r>
     </w:p>
     <w:p>
@@ -16730,7 +16980,7 @@
           <w:b w:val="0"/>
           <w:sz w:val="22"/>
         </w:rPr>
-        <w:t>Penny sat back in her chair. Outside, a bus went past in the rain, lit at all its windows, full of people who were going somewhere ordinary, and she found she had looked at it the way she had spent the day looking at a train.</w:t>
+        <w:t>Penny sat back in her chair. Outside, a bus went past in the rain, lit at all its windows, full of people who were going somewhere ordinary, and she found she had watched it as she had spent the day watching a train.</w:t>
       </w:r>
     </w:p>
     <w:p>
@@ -16938,7 +17188,7 @@
           <w:b w:val="0"/>
           <w:sz w:val="22"/>
         </w:rPr>
-        <w:t xml:space="preserve">Penny looked at the ten and a half on the itinerary, and at the x3 in the margin beside it, and at the four of them standing against the sugar bowl.</w:t>
+        <w:t>Penny considered the ten and a half on the itinerary, and the x3 in the margin beside it, and at the four of them standing against the sugar bowl.</w:t>
       </w:r>
     </w:p>
     <w:p>
@@ -17094,7 +17344,7 @@
           <w:b w:val="0"/>
           <w:sz w:val="22"/>
         </w:rPr>
-        <w:t>A silence came down the line. It went on long enough that she thought for a moment the call had dropped, and then she heard him breathing, slowly, the way he breathed when he was standing at the edge of a thing and deciding whether to say it.</w:t>
+        <w:t>A silence came down the line. It went on long enough that she thought for a moment the call had dropped, and then she heard him breathing, slowly, as he breathed when he was standing at the edge of a thing and deciding whether to say it.</w:t>
       </w:r>
     </w:p>
     <w:p>
@@ -17172,7 +17422,7 @@
           <w:b w:val="0"/>
           <w:sz w:val="22"/>
         </w:rPr>
-        <w:t>"Well, there you are." Trevor sounded pleased and slightly embarrassed, the way he did when someone else had been cleverer than him first. "He knew."</w:t>
+        <w:t>"Well, there you are." Trevor sounded pleased and slightly embarrassed, as he did when someone else had been cleverer than him first. "He knew."</w:t>
       </w:r>
     </w:p>
     <w:p>
@@ -17639,20 +17889,20 @@
           <w:b w:val="0"/>
           <w:sz w:val="22"/>
         </w:rPr>
-        <w:t>He had not meant to. He had meant to stay for a bit, as he had told Penny, and the bit had a way of becoming another bit, the way the evenings had once become shut doors. He made a cup of tea at seven and did not drink it. He made another at eight and drank half. He rang out for nothing and ate nothing. He sat in his own chair, behind his own desk, and turned it, for the first time all day, to face the doorway square.</w:t>
-      </w:r>
-    </w:p>
-    <w:p>
-      <w:pPr>
-        <w:spacing w:after="160" w:line="240" w:lineRule="auto"/>
-      </w:pPr>
-      <w:r>
-        <w:rPr>
-          <w:rFonts w:ascii="Georgia" w:hAnsi="Georgia" w:eastAsia="Georgia"/>
-          <w:b w:val="0"/>
-          <w:sz w:val="22"/>
-        </w:rPr>
-        <w:t>The platform at night was not very different from the platform at ten in the morning. That was the first thing he noticed. The lamp at the far end had not got brighter. The lit windows of the carriage had not changed. The white clock on the far pillar went round at the same rate as every clock in London, as Trevor had shown it did, and told the time it had been telling all day. The board said YESTERDAY.</w:t>
+        <w:t>He had not meant to. He had meant to stay for a bit, as he had told Penny, and the bit had a habit of becoming another bit, as the evenings had once become shut doors. He made a cup of tea at seven and did not drink it. He made another at eight and drank half. He rang out for nothing and ate nothing. He sat in his own chair, behind his own desk, and turned it, for the first time all day, to face the doorway square.</w:t>
+      </w:r>
+    </w:p>
+    <w:p>
+      <w:pPr>
+        <w:spacing w:after="160" w:line="240" w:lineRule="auto"/>
+      </w:pPr>
+      <w:r>
+        <w:rPr>
+          <w:rFonts w:ascii="Georgia" w:hAnsi="Georgia" w:eastAsia="Georgia"/>
+          <w:b w:val="0"/>
+          <w:sz w:val="22"/>
+        </w:rPr>
+        <w:t>The platform at night was not much different from the platform at ten in the morning. That was the first thing he noticed. The lamp at the far end had not got brighter. The lit windows of the carriage had not changed. The white clock on the far pillar went round at the same rate as every clock in London, as Trevor had shown it did, and told the time it had been telling all day. The board said YESTERDAY.</w:t>
       </w:r>
     </w:p>
     <w:p>
@@ -17678,20 +17928,20 @@
           <w:b w:val="0"/>
           <w:sz w:val="22"/>
         </w:rPr>
-        <w:t>He looked at that for a long time.</w:t>
-      </w:r>
-    </w:p>
-    <w:p>
-      <w:pPr>
-        <w:spacing w:after="160" w:line="240" w:lineRule="auto"/>
-      </w:pPr>
-      <w:r>
-        <w:rPr>
-          <w:rFonts w:ascii="Georgia" w:hAnsi="Georgia" w:eastAsia="Georgia"/>
-          <w:b w:val="0"/>
-          <w:sz w:val="22"/>
-        </w:rPr>
-        <w:t xml:space="preserve">It was, he thought, almost the whole lecture. The light came across the sill without being asked, and reached him, and nothing of his had to go back the other way for that to happen. Seeing was not boarding. Being lit by a thing was not being on it. What reaches you is in your past; what you reach is in your future; and a man sitting very still in a chair can be reached by a thing all night without once reaching back, for as long as he likes.</w:t>
+        <w:t>He sat with that for a long time.</w:t>
+      </w:r>
+    </w:p>
+    <w:p>
+      <w:pPr>
+        <w:spacing w:after="160" w:line="240" w:lineRule="auto"/>
+      </w:pPr>
+      <w:r>
+        <w:rPr>
+          <w:rFonts w:ascii="Georgia" w:hAnsi="Georgia" w:eastAsia="Georgia"/>
+          <w:b w:val="0"/>
+          <w:sz w:val="22"/>
+        </w:rPr>
+        <w:t>It was, he thought, almost the whole lecture. The light came across the sill without being asked, and reached him, and nothing of his had to go back the other way for that to happen. Seeing was not boarding. Being lit by a thing was not being on it. What reaches you is in your past; what you reach is in your future; and a man sitting still in a chair can be reached by a thing all night without once reaching back, for as long as he likes.</w:t>
       </w:r>
     </w:p>
     <w:p>
@@ -17795,7 +18045,7 @@
           <w:b w:val="0"/>
           <w:sz w:val="22"/>
         </w:rPr>
-        <w:t>He did not. That was the plain fact of it, and he made himself look at it the way Barbarian had told him to look at the relations: not the letters, not the feeling the letters wanted him to have, but what had actually been done. A voice had said he already knew. He had not boarded. He did not know. Therefore the voice was wrong, or it was not talking to him, or it was talking to a Derek further along who had found out, by doing the thing Derek in the chair was not going to do.</w:t>
+        <w:t>He did not. That was the plain fact of it, and he made himself look at it as Barbarian had told him to look at the relations: not the letters, not the feeling the letters wanted him to have, but what had actually been done. A voice had said he already knew. He had not boarded. He did not know. Therefore the voice was wrong, or it was not talking to him, or it was talking to a Derek further along who had found out, by doing the thing Derek in the chair was not going to do.</w:t>
       </w:r>
     </w:p>
     <w:p>
@@ -18016,7 +18266,7 @@
           <w:b w:val="0"/>
           <w:sz w:val="22"/>
         </w:rPr>
-        <w:t>Tell him it would be open anyway, he wrote, and sent it before he could delete it, and put the phone face-down on the desk, the way Trevor did when he had been brave by accident.</w:t>
+        <w:t>Tell him it would be open anyway, he wrote, and sent it before he could delete it, and put the phone face-down on the desk, as Trevor did when he had been brave by accident.</w:t>
       </w:r>
     </w:p>
     <w:p>
@@ -18107,7 +18357,7 @@
           <w:b w:val="0"/>
           <w:sz w:val="22"/>
         </w:rPr>
-        <w:t>He went back to his desk. He wrote a note on the Bureau's paper, in his own handwriting, which was not as good as Trevor's and nowhere near as good as Herbert's, and he propped it against the kettle where whoever came in first would see it.</w:t>
+        <w:t>He went back to his desk. He wrote a note on the Bureau's paper, in his own handwriting, not as good as Trevor's and nowhere near as good as Herbert's, and he propped it against the kettle where whoever came in first would see it.</w:t>
       </w:r>
     </w:p>
     <w:p>
@@ -18574,20 +18824,20 @@
           <w:b w:val="0"/>
           <w:sz w:val="22"/>
         </w:rPr>
-        <w:t>"That is a different sentence." Herbert put it the way he had put everything to Weinstein since Weinstein was nineteen: as though the difference were obvious, and Weinstein had been very, very lazy not to see it already. "A bootstrap is a thing with no origin. A thing whose origin you do not know is merely a thing you do not know about. One is a paradox. The other is ignorance. Ignorance is not a paradox, Alfred. It is the ordinary condition of a scientist before lunch."</w:t>
-      </w:r>
-    </w:p>
-    <w:p>
-      <w:pPr>
-        <w:spacing w:after="160" w:line="240" w:lineRule="auto"/>
-      </w:pPr>
-      <w:r>
-        <w:rPr>
-          <w:rFonts w:ascii="Georgia" w:hAnsi="Georgia" w:eastAsia="Georgia"/>
-          <w:b w:val="0"/>
-          <w:sz w:val="22"/>
-        </w:rPr>
-        <w:t>Weinstein looked at the question mark.</w:t>
+        <w:t>"That is a different sentence." Herbert put it as he had put everything to Weinstein since Weinstein was nineteen: as though the difference were obvious, and Weinstein had been very, very lazy not to see it already. "A bootstrap is a thing with no origin. A thing whose origin you do not know is merely a thing you do not know about. One is a paradox. The other is ignorance. Ignorance is not a paradox, Alfred. It is the ordinary condition of a scientist before lunch."</w:t>
+      </w:r>
+    </w:p>
+    <w:p>
+      <w:pPr>
+        <w:spacing w:after="160" w:line="240" w:lineRule="auto"/>
+      </w:pPr>
+      <w:r>
+        <w:rPr>
+          <w:rFonts w:ascii="Georgia" w:hAnsi="Georgia" w:eastAsia="Georgia"/>
+          <w:b w:val="0"/>
+          <w:sz w:val="22"/>
+        </w:rPr>
+        <w:t>Weinstein frowned at the question mark.</w:t>
       </w:r>
     </w:p>
     <w:p>
@@ -18613,7 +18863,7 @@
           <w:b w:val="0"/>
           <w:sz w:val="22"/>
         </w:rPr>
-        <w:t>"I am saying you are not necessary. You were the nearest hand. A blank is unbearable, and a name, even your own, is less unbearable than a blank." Herbert put the pencil away. "Mr Gent's daughter did not do it. That woman on the stairs did not do it, though she tried hard to. You are now trying to do it. It is the same mistake three times in two days. I find that very restful. It means the case is consistent."</w:t>
+        <w:t>"I am saying you are not necessary. You were the nearest hand. A blank is unbearable, and a name, even your own, is less unbearable than a blank." Herbert put the pencil away. "Mr Gent's daughter did not do it. That woman on the stairs did not do it, though she tried hard to. You are now trying to do it. It is the same mistake three times in two days. I find that restful. It means the case is consistent."</w:t>
       </w:r>
     </w:p>
     <w:p>
@@ -18652,20 +18902,20 @@
           <w:b w:val="0"/>
           <w:sz w:val="22"/>
         </w:rPr>
-        <w:t>"That is a very cold comfort."</w:t>
-      </w:r>
-    </w:p>
-    <w:p>
-      <w:pPr>
-        <w:spacing w:after="160" w:line="240" w:lineRule="auto"/>
-      </w:pPr>
-      <w:r>
-        <w:rPr>
-          <w:rFonts w:ascii="Georgia" w:hAnsi="Georgia" w:eastAsia="Georgia"/>
-          <w:b w:val="0"/>
-          <w:sz w:val="22"/>
-        </w:rPr>
-        <w:t>"It is a very accurate one. Comfort is not my department." He put the coat on, buttoned it, and then, unusually, did not leave. He stood looking out of the cold window at the trams for a little while. "You told me on the telephone, from the airport, that I was right and that it didn't help."</w:t>
+        <w:t>"That is cold comfort."</w:t>
+      </w:r>
+    </w:p>
+    <w:p>
+      <w:pPr>
+        <w:spacing w:after="160" w:line="240" w:lineRule="auto"/>
+      </w:pPr>
+      <w:r>
+        <w:rPr>
+          <w:rFonts w:ascii="Georgia" w:hAnsi="Georgia" w:eastAsia="Georgia"/>
+          <w:b w:val="0"/>
+          <w:sz w:val="22"/>
+        </w:rPr>
+        <w:t>"It is an accurate one. Comfort is not my department." He put the coat on, buttoned it, and then, unusually, did not leave. He stood looking out of the cold window at the trams for a little while. "You told me on the telephone, from the airport, that I was right and that it didn't help."</w:t>
       </w:r>
     </w:p>
     <w:p>
@@ -19158,7 +19408,7 @@
           <w:b w:val="0"/>
           <w:sz w:val="22"/>
         </w:rPr>
-        <w:t>Barbarian looked at it for a long time. He did not touch it.</w:t>
+        <w:t>Barbarian studied it for a long time. He did not touch it.</w:t>
       </w:r>
     </w:p>
     <w:p>
@@ -19483,7 +19733,7 @@
           <w:b w:val="0"/>
           <w:sz w:val="22"/>
         </w:rPr>
-        <w:t>Herbert looked at the line he had drawn.</w:t>
+        <w:t>Herbert regarded the line he had drawn.</w:t>
       </w:r>
     </w:p>
     <w:p>
@@ -19561,7 +19811,7 @@
           <w:b w:val="0"/>
           <w:sz w:val="22"/>
         </w:rPr>
-        <w:t>"No. Mr Gent should like to know who sent the sheet. That is a different wish." Barbarian looked at the question mark beside SHEET. "And it is the wrong question."</w:t>
+        <w:t>"No. Mr Gent should like to know who sent the sheet. That is a different wish." Barbarian's eyes went to the question mark beside SHEET. "And it is the wrong question."</w:t>
       </w:r>
     </w:p>
     <w:p>
@@ -20094,7 +20344,7 @@
           <w:b w:val="0"/>
           <w:sz w:val="22"/>
         </w:rPr>
-        <w:t xml:space="preserve">"Monday. He told me on the telephone that he very nearly stayed. He went through the barrier at four and turned round once and did not come back. Staying would have been a tenancy. It was the cleanest act of the day, until Mr Gent's. Do not tell him I said he was right. Tell him the hurry was. He will know the difference, and it will annoy him."</w:t>
+        <w:t>"Monday. He told me on the telephone that he nearly stayed. He went through the barrier at four and turned round once and did not come back. Staying would have been a tenancy. It was the cleanest act of the day, until Mr Gent's. Do not tell him I said he was right. Tell him the hurry was. He will know the difference, and it will annoy him."</w:t>
       </w:r>
     </w:p>
     <w:p>
@@ -20133,7 +20383,7 @@
           <w:b w:val="0"/>
           <w:sz w:val="22"/>
         </w:rPr>
-        <w:t xml:space="preserve">He wrote four hundred words, and found that they explained the joke, and deleted them. He wrote two hundred, and found that they agreed with Herbert, and deleted those too. Then he looked at the clocks for a while, each one perfectly honest and none of them in agreement, and wrote four lines that said what he meant.</w:t>
+        <w:t>He wrote four hundred words, and found that they explained the joke, and deleted them. He wrote two hundred, and found that they agreed with Herbert, and deleted those too. Then he watched the clocks for a while, each one perfectly honest and none of them in agreement, and wrote four lines that said what he meant.</w:t>
       </w:r>
     </w:p>
     <w:p>
@@ -20236,7 +20486,7 @@
           <w:b w:val="0"/>
           <w:sz w:val="22"/>
         </w:rPr>
-        <w:t>It was not a day for it. The platform was still in the doorway when Derek arrived at nine, and it was still there at ten, when Penny arrived and looked at it in the manner of a woman checking whether a stain had come out in the wash. The board read YESTERDAY. On the Tuesday, yesterday had been Monday, and the board did not appear to have noticed, which Trevor found more upsetting than anything it had done on the Monday itself.</w:t>
+        <w:t>It was not a day for it. The platform was still in the doorway when Derek arrived at nine, and it was still there at ten, when Penny arrived and inspected it like a woman checking whether a stain had come out in the wash. The board read YESTERDAY. On the Tuesday, yesterday had been Monday, and the board did not appear to have noticed, which Trevor found more upsetting than anything it had done on the Monday itself.</w:t>
       </w:r>
     </w:p>
     <w:p>
@@ -20340,7 +20590,7 @@
           <w:b w:val="0"/>
           <w:sz w:val="22"/>
         </w:rPr>
-        <w:t>He was the landlord's, not the building's, and he made the distinction twice on the stairs, to Mrs Marsh, who had not asked for it. His name was Mr Quayle. He had a clipboard of his own, a laser measure in a holster on his belt, and the manner of a man who has been sent to look at a great many damp patches and has never yet found one that was his fault.</w:t>
+        <w:t>He was the landlord's, not the building's, and he made the distinction twice on the stairs, to Mrs Marsh, who had not asked for it. His name was Mr Quayle. He had a clipboard of his own, a laser measure in a holster on his belt, and the manner of someone sent to look at a great many damp patches and has never yet found one that was his fault.</w:t>
       </w:r>
     </w:p>
     <w:p>
@@ -20652,7 +20902,7 @@
           <w:b w:val="0"/>
           <w:sz w:val="22"/>
         </w:rPr>
-        <w:t>Mr Quayle looked at the holster as if it had spoken. "It bounces off the wall."</w:t>
+        <w:t>Mr Quayle glanced down at the holster as if it had spoken. "It bounces off the wall."</w:t>
       </w:r>
     </w:p>
     <w:p>
@@ -20859,7 +21109,7 @@
           <w:b w:val="0"/>
           <w:sz w:val="22"/>
         </w:rPr>
-        <w:t xml:space="preserve">Mr Pendleton came up just after lunch, at the speed of a man who has never once been sure he is in the right building, and this time he did not put his head round the outer door. He came all the way in. He was carrying a lever-arch file in both arms, the way a man carries a baby he has been told is his.</w:t>
+        <w:t>Mr Pendleton came up just after lunch, at the speed of a man who has never once been sure he is in the right building, and this time he did not put his head round the outer door. He came all the way in. He was carrying a lever-arch file in both arms, like a man holding a baby he has been told is his.</w:t>
       </w:r>
     </w:p>
     <w:p>
@@ -21106,7 +21356,7 @@
           <w:b w:val="0"/>
           <w:sz w:val="22"/>
         </w:rPr>
-        <w:t xml:space="preserve">They did it the way the Bureau had done everything that week, a box at a time, out loud. Location: second floor, inner office. Name of occupier: Derek wrote his own, and Mrs Marsh made him add the word tenant. Date and time first observed: Trevor wrote MONDAY 10:05, NOTICED, ALREADY OPEN, and Mr Pendleton read it upside down and said that he would copy it into his incident report exactly as it stood, because he had written ten oh five in the report on Monday, on the stairs, and he liked his reports to agree with themselves. Nobody thought anything of that at the time. By five o'clock two insurance companies would think a great deal of it.</w:t>
+        <w:t>They did it as the Bureau had done everything that week, a box at a time, out loud. Location: second floor, inner office. Name of occupier: Derek wrote his own, and Mrs Marsh made him add the word tenant. Date and time first observed: Trevor wrote MONDAY 10:05, NOTICED, ALREADY OPEN, and Mr Pendleton read it upside down and said that he would copy it into his incident report exactly as it stood, because he had written ten oh five in the report on Monday, on the stairs, and he liked his reports to agree with themselves. Nobody thought anything of that at the time. By five o'clock two insurance companies would think a great deal of it.</w:t>
       </w:r>
     </w:p>
     <w:p>
@@ -21262,7 +21512,7 @@
           <w:b w:val="0"/>
           <w:sz w:val="22"/>
         </w:rPr>
-        <w:t xml:space="preserve">Mr Quayle had not yet left the building. He was in the lobby writing up the opening, and he came up the stairs a second time with the face of a man called back to a damp patch he had hoped was dry. He looked at the form. He looked at the box. He looked at Mrs Marsh, who held out the pen to him like the baton in a relay he had not entered.</w:t>
+        <w:t>Mr Quayle had not yet left the building. He was in the lobby writing up the opening, and he came up the stairs a second time with the face of a man called back to a damp patch he had hoped was dry. He read the form. He considered the box. He looked at Mrs Marsh, who held out the pen to him like the baton in a relay he had not entered.</w:t>
       </w:r>
     </w:p>
     <w:p>
@@ -21340,7 +21590,7 @@
           <w:b w:val="0"/>
           <w:sz w:val="22"/>
         </w:rPr>
-        <w:t xml:space="preserve">He turned round. It was the first time he had turned round all day, and he did it the way a man gets into cold water, all at once, so as not to have to do it twice. He looked at the platform. He looked at the bench and the lamp and the train and the board, and his face went through several expressions, all of them professional, and settled on the one he presumably kept for subsidence.</w:t>
+        <w:t>He turned round. It was the first time he had turned round all day, and he did it like a man getting into cold water, all at once, so as not to have to do it twice. He looked at the platform. He took in the bench and the lamp and the train and the board, and his face went through several expressions, all of them professional, and settled on the one he presumably kept for subsidence.</w:t>
       </w:r>
     </w:p>
     <w:p>
@@ -21366,7 +21616,7 @@
           <w:b w:val="0"/>
           <w:sz w:val="22"/>
         </w:rPr>
-        <w:t xml:space="preserve">He unholstered the laser, stood with his toes where the office ended, and aimed it down the platform at the far pillar. A red dot appeared under the white clock. The laser beeped. He looked at the number for some time.</w:t>
+        <w:t>He unholstered the laser, stood with his toes where the office ended, and aimed it down the platform at the far pillar. A red dot appeared under the white clock. The laser beeped. He contemplated the number for some time.</w:t>
       </w:r>
     </w:p>
     <w:p>
@@ -21405,7 +21655,7 @@
           <w:b w:val="0"/>
           <w:sz w:val="22"/>
         </w:rPr>
-        <w:t xml:space="preserve">"It's what came back," said Mr Quayle, and then, with a glance at Trevor, "in the time it took to come back." He wrote 45 in the box, very small, as if it might one day be used in evidence against him, and went downstairs without a word to anybody, and this time he did not stop at the bottom.</w:t>
+        <w:t>"It's what came back," said Mr Quayle, and then, with a glance at Trevor, "in the time it took to come back." He wrote 45 in the box, small, as if it might one day be used in evidence against him, and went downstairs without a word to anybody, and this time he did not stop at the bottom.</w:t>
       </w:r>
     </w:p>
     <w:p>
@@ -21561,20 +21811,20 @@
           <w:b w:val="0"/>
           <w:sz w:val="22"/>
         </w:rPr>
-        <w:t>"Forms do not grow fields, Mr Gent. Somebody in your office opened a setting nobody had opened before, very probably Mr Boltzman, while frightened, and has forgotten." A pause. "But if it did grow one by itself, then it grew the correct one, and I should like to know who designed it, because I have been asking universities for that field for forty years."</w:t>
-      </w:r>
-    </w:p>
-    <w:p>
-      <w:pPr>
-        <w:spacing w:after="160" w:line="240" w:lineRule="auto"/>
-      </w:pPr>
-      <w:r>
-        <w:rPr>
-          <w:rFonts w:ascii="Georgia" w:hAnsi="Georgia" w:eastAsia="Georgia"/>
-          <w:b w:val="0"/>
-          <w:sz w:val="22"/>
-        </w:rPr>
-        <w:t>He rang off before Derek could say which. Trevor, who had heard his name, went pale and spent the next twenty minutes inside the form's settings with the expression of a man searching his own house for a burglar he suspected was himself. He found nothing. He reported this, and nobody was surprised, and he went on looking anyway, in case.</w:t>
+        <w:t>"Forms do not grow fields, Mr Gent. Somebody in your office opened a setting no one had opened before, very probably Mr Boltzman, while frightened, and has forgotten." A pause. "But if it did grow one by itself, then it grew the correct one, and I should like to know who designed it, because I have been asking universities for that field for forty years."</w:t>
+      </w:r>
+    </w:p>
+    <w:p>
+      <w:pPr>
+        <w:spacing w:after="160" w:line="240" w:lineRule="auto"/>
+      </w:pPr>
+      <w:r>
+        <w:rPr>
+          <w:rFonts w:ascii="Georgia" w:hAnsi="Georgia" w:eastAsia="Georgia"/>
+          <w:b w:val="0"/>
+          <w:sz w:val="22"/>
+        </w:rPr>
+        <w:t>He rang off before Derek could say which. Trevor, who had heard his name, went pale and spent the next twenty minutes inside the form's settings like a man searching his own house for a burglar he suspected was himself. He found nothing. He reported this, and nobody was surprised, and he went on looking anyway, in case.</w:t>
       </w:r>
     </w:p>
     <w:p>
@@ -21665,7 +21915,7 @@
           <w:b w:val="0"/>
           <w:sz w:val="22"/>
         </w:rPr>
-        <w:t>Afterwards Penny stood at the window with her arms folded and watched the buses, which was what she did when she was deciding something and did not want anyone to see her decide it. Derek let her. He had a pile of ordinary post to open, and he opened it, and it was ordinary: a gas bill, a circular, a letter from a solicitor in Ealing asking whether the Bureau did matrimonial work, which it did not.</w:t>
+        <w:t>Afterwards Penny stood at the window with her arms folded and watched the buses, as she did when she was deciding something and did not want anyone to see her decide it. Derek let her. He had a pile of ordinary post to open, and he opened it, and it was ordinary: a gas bill, a circular, a letter from a solicitor in Ealing asking whether the Bureau did matrimonial work, which it did not.</w:t>
       </w:r>
     </w:p>
     <w:p>
@@ -21756,7 +22006,7 @@
           <w:b w:val="0"/>
           <w:sz w:val="22"/>
         </w:rPr>
-        <w:t>"Good." Penny went back to her desk and took the itinerary out and looked at it with great attention, and Derek, who knew her, understood that the subject was closed and that it had cost her something to close it.</w:t>
+        <w:t>"Good." Penny went back to her desk and took the itinerary out and studied it with great attention, and Derek, who knew her, understood that the subject was closed and that it had cost her something to close it.</w:t>
       </w:r>
     </w:p>
     <w:p>
@@ -21846,20 +22096,20 @@
           <w:b w:val="0"/>
           <w:sz w:val="22"/>
         </w:rPr>
-        <w:t>Mrs Marsh brought him up. She came first, with the clipboard, and stopped on the London side of the outer doorway, and said, "Mr Haskett," in the voice she used for bad news, and stood aside. The man behind her was in his fifties, in a camel coat that had been bought to be looked at, and he turned a signet ring on his little finger as he came in, round and round, the way other men jingle change. He had a leather folder under his arm. He did not knock on the frame. It was his frame.</w:t>
-      </w:r>
-    </w:p>
-    <w:p>
-      <w:pPr>
-        <w:spacing w:after="160" w:line="240" w:lineRule="auto"/>
-      </w:pPr>
-      <w:r>
-        <w:rPr>
-          <w:rFonts w:ascii="Georgia" w:hAnsi="Georgia" w:eastAsia="Georgia"/>
-          <w:b w:val="0"/>
-          <w:sz w:val="22"/>
-        </w:rPr>
-        <w:t xml:space="preserve">He looked at the platform at once, which was the thing that most distinguished him from his surveyor. He crossed the outer room, stood a pace from the sill, where Trevor's tape had been on Monday, and looked at the slabs and the bench and the lit train, and the word.</w:t>
+        <w:t>Mrs Marsh brought him up. She came first, with the clipboard, and stopped on the London side of the outer doorway, and said, "Mr Haskett," in the voice she used for bad news, and stood aside. The man behind her was in his fifties, in a camel coat that had been bought to be looked at, and he turned a signet ring on his little finger as he came in, round and round, as other men jingle change. He had a leather folder under his arm. He did not knock on the frame. It was his frame.</w:t>
+      </w:r>
+    </w:p>
+    <w:p>
+      <w:pPr>
+        <w:spacing w:after="160" w:line="240" w:lineRule="auto"/>
+      </w:pPr>
+      <w:r>
+        <w:rPr>
+          <w:rFonts w:ascii="Georgia" w:hAnsi="Georgia" w:eastAsia="Georgia"/>
+          <w:b w:val="0"/>
+          <w:sz w:val="22"/>
+        </w:rPr>
+        <w:t>He looked at the platform at once. It was what most distinguished him from his surveyor. He crossed the outer room, stood a pace from the sill, where Trevor's tape had been on Monday, and took in the slabs and the bench and the lit train, and the word.</w:t>
       </w:r>
     </w:p>
     <w:p>
@@ -21950,7 +22200,7 @@
           <w:b w:val="0"/>
           <w:sz w:val="22"/>
         </w:rPr>
-        <w:t>Mr Haskett opened the leather folder on the corner of Derek's desk, without asking, and took out two letters, and laid them side by side, the way Weinstein had laid the Sunday slip next to the envelope at Paddington.</w:t>
+        <w:t>Mr Haskett opened the leather folder on the corner of Derek's desk, without asking, and took out two letters, and laid them side by side, as Weinstein had laid the Sunday slip next to the envelope at Paddington.</w:t>
       </w:r>
     </w:p>
     <w:p>
@@ -22223,7 +22473,7 @@
           <w:b w:val="0"/>
           <w:sz w:val="22"/>
         </w:rPr>
-        <w:t>"For a statement with a time in it that suits you." Derek looked at the two letters again. "Mr Haskett, that's how you get a warning that says whatever the person who paid for it wanted it to say. We had one of those this week. It was on a board. It had my daughter's name on it."</w:t>
+        <w:t>"For a statement with a time in it that suits you." Derek went back to the two letters. "Mr Haskett, that's how you get a warning that says whatever the person who paid for it wanted it to say. We had one of those this week. It was on a board. It had my daughter's name on it."</w:t>
       </w:r>
     </w:p>
     <w:p>
@@ -22353,7 +22603,7 @@
           <w:b w:val="0"/>
           <w:sz w:val="22"/>
         </w:rPr>
-        <w:t>Derek looked at the shut door in the photograph for longer than he needed to. It was the last picture anybody had of the office without a railway in it, and Trevor had taken it to win an argument with his sister about a bottle.</w:t>
+        <w:t>Derek studied the shut door in the photograph for longer than he needed to. It was the last picture anybody had of the office without a railway in it, and Trevor had taken it to win an argument with his sister about a bottle.</w:t>
       </w:r>
     </w:p>
     <w:p>
@@ -22470,7 +22720,7 @@
           <w:b w:val="0"/>
           <w:sz w:val="22"/>
         </w:rPr>
-        <w:t>He looked at what he had written. So did Mr Haskett. So, from the outer doorway, did Mrs Marsh.</w:t>
+        <w:t>He read what he had written. So did Mr Haskett. So, from the outer doorway, did Mrs Marsh.</w:t>
       </w:r>
     </w:p>
     <w:p>
@@ -22613,7 +22863,7 @@
           <w:b w:val="0"/>
           <w:sz w:val="22"/>
         </w:rPr>
-        <w:t xml:space="preserve">"There's a good clock in this office," Trevor said. "Sophie's. Brass, from a car boot, quartz inside. It's right to the second." He looked at the filing cabinet, and his face fell. "It was in drawer three. With the file. Locked."</w:t>
+        <w:t>"There's a good clock in this office," Trevor said. "Sophie's. Brass, from a car boot, quartz inside. It's right to the second." He glanced at the filing cabinet, and his face fell. "It was in drawer three. With the file. Locked."</w:t>
       </w:r>
     </w:p>
     <w:p>
@@ -22704,7 +22954,7 @@
           <w:b w:val="0"/>
           <w:sz w:val="22"/>
         </w:rPr>
-        <w:t>"Then what about Sunday?" It came quickly, with the air of a man who has just remembered he holds a better card. "Your superintendent opened that door on Sunday at six. I know she did. It was my instruction. The radiator. If it was opened on Sunday, then it's Northgate's, cleanly, it's a whole day before the changeover, and we can all go home."</w:t>
+        <w:t>"Then what about Sunday?" It came quickly, like a man remembering he holds a better card. "Your superintendent opened that door on Sunday at six. I know she did. It was my instruction. The radiator. If it was opened on Sunday, then it's Northgate's, cleanly, it's a whole day before the changeover, and we can all go home."</w:t>
       </w:r>
     </w:p>
     <w:p>
@@ -22821,7 +23071,7 @@
           <w:b w:val="0"/>
           <w:sz w:val="22"/>
         </w:rPr>
-        <w:t>He put the paper down on the desk, very carefully, beside the two letters. He looked, for the first time since he had come up the stairs, a little less like a man who owned the building and a little more like a man standing in front of a railway.</w:t>
+        <w:t>He put the paper down on the desk, carefully, beside the two letters. He looked, for the first time since he had come up the stairs, a little less like a man who owned the building and a little more like a man standing in front of a railway.</w:t>
       </w:r>
     </w:p>
     <w:p>
@@ -22938,7 +23188,7 @@
           <w:b w:val="0"/>
           <w:sz w:val="22"/>
         </w:rPr>
-        <w:t xml:space="preserve">Mr Haskett looked at the statement.</w:t>
+        <w:t>Mr Haskett read the statement.</w:t>
       </w:r>
     </w:p>
     <w:p>
@@ -23081,7 +23331,7 @@
           <w:b w:val="0"/>
           <w:sz w:val="22"/>
         </w:rPr>
-        <w:t>"Could it be let?" It came out of him as a reflex, Derek thought, the way the ring went round. "A platform. In a second-floor unit. With a train. You'd get something for that, in this postcode."</w:t>
+        <w:t>"Could it be let?" It came out of him as a reflex, Derek thought, like the turning ring. "A platform. In a second-floor unit. With a train. You'd get something for that, in this postcode."</w:t>
       </w:r>
     </w:p>
     <w:p>
@@ -23146,20 +23396,20 @@
           <w:b w:val="0"/>
           <w:sz w:val="22"/>
         </w:rPr>
-        <w:t xml:space="preserve">Trevor sat down on the floor again by the filing cabinet and looked at the photograph on his phone, at the shut door behind the bottle, at nine fifty-eight and twelve seconds. "That's the last picture of it. Before."</w:t>
-      </w:r>
-    </w:p>
-    <w:p>
-      <w:pPr>
-        <w:spacing w:after="160" w:line="240" w:lineRule="auto"/>
-      </w:pPr>
-      <w:r>
-        <w:rPr>
-          <w:rFonts w:ascii="Georgia" w:hAnsi="Georgia" w:eastAsia="Georgia"/>
-          <w:b w:val="0"/>
-          <w:sz w:val="22"/>
-        </w:rPr>
-        <w:t xml:space="preserve">Trevor put the phone away. At ten past six he looked at the window, said something about a warden and the Mini, and went down to move it.</w:t>
+        <w:t>Trevor sat down on the floor again by the filing cabinet and studied the photograph on his phone, the shut door behind the bottle, at nine fifty-eight and twelve seconds. "That's the last picture of it. Before."</w:t>
+      </w:r>
+    </w:p>
+    <w:p>
+      <w:pPr>
+        <w:spacing w:after="160" w:line="240" w:lineRule="auto"/>
+      </w:pPr>
+      <w:r>
+        <w:rPr>
+          <w:rFonts w:ascii="Georgia" w:hAnsi="Georgia" w:eastAsia="Georgia"/>
+          <w:b w:val="0"/>
+          <w:sz w:val="22"/>
+        </w:rPr>
+        <w:t>Trevor put the phone away. At ten past six he glanced at the window, said something about a warden and the Mini, and went down to move it.</w:t>
       </w:r>
     </w:p>
     <w:p>
@@ -23340,7 +23590,7 @@
           <w:b w:val="0"/>
           <w:sz w:val="22"/>
         </w:rPr>
-        <w:t xml:space="preserve">At sixteen minutes past six Derek did what Mrs Marsh had asked, which was to put the case on paper before she locked drawer three. He opened the form, read it through once the way he read a train time he already knew, and pressed Print.</w:t>
+        <w:t>At sixteen minutes past six Derek did what Mrs Marsh had asked and put the case on paper before she locked drawer three. He opened the form, read it through once, as he read a train time he already knew, and pressed Print.</w:t>
       </w:r>
     </w:p>
     <w:p>
@@ -23431,7 +23681,7 @@
           <w:b w:val="0"/>
           <w:sz w:val="22"/>
         </w:rPr>
-        <w:t xml:space="preserve">He did not trust it. He was a man who straightened letters that were already straight, and he knew what a mind like his would do with a coincidence it wanted. So he went through it the way Penny would have, a word at a time, and asked each word where it had come from.</w:t>
+        <w:t>He did not trust it. He was a man who straightened letters that were already straight, and he knew what a mind like his would do with a coincidence it wanted. So he went through it as Penny would have, a word at a time, and asked each word where it had come from.</w:t>
       </w:r>
     </w:p>
     <w:p>
@@ -23613,7 +23863,7 @@
           <w:b w:val="0"/>
           <w:sz w:val="22"/>
         </w:rPr>
-        <w:t xml:space="preserve">He lifted it again almost at once, the way you lift a mug off a library book, and looked at what he had done. A pale brown ring, the size of the bottom of the mug, with a little bite out of its left side where the glaze on the base had a chip in it, a chip Sophie had made with a spoon when she was seven.</w:t>
+        <w:t>He lifted it again almost at once, as you lift a mug off a library book, and looked at what he had done. A pale brown ring, the size of the bottom of the mug, with a little bite out of its left side where the glaze on the base had a chip in it, a chip Sophie had made with a spoon when she was seven.</w:t>
       </w:r>
     </w:p>
     <w:p>
@@ -23691,7 +23941,7 @@
           <w:b w:val="0"/>
           <w:sz w:val="22"/>
         </w:rPr>
-        <w:t xml:space="preserve">And if it did not go, then nothing would have been on the blotter on Monday. Nothing would have stopped him, at ten past ten, from walking through his own door to see what the train was for. He thought about that honestly, the way he would have thought about a client. He would have gone. He knew he would have gone. It was the only warning in the whole case that had arrived in time.</w:t>
+        <w:t>And if it did not go, then nothing would have been on the blotter on Monday. Nothing would have stopped him, at ten past ten, from walking through his own door to see what the train was for. He thought about that honestly, as he would have thought about a client. He would have gone. He knew he would have gone. It was the only warning in the whole case that had arrived in time.</w:t>
       </w:r>
     </w:p>
     <w:p>
@@ -23795,7 +24045,7 @@
           <w:b w:val="0"/>
           <w:sz w:val="22"/>
         </w:rPr>
-        <w:t xml:space="preserve">It was the ordinary sound, the sound of the Paddington doors closing behind Weinstein. A man could step up and in during that sound and be on, and the doors would close after him, and the train would leave after he boarded it, in the right order, and nobody would ever know what yesterday he had got off in. The thought had a pull, the way the edge of a high place has a pull. He would know who had sent the Sunday slip. He would know whose voice it had been behind the carriage door. He would know everything except how to come back.</w:t>
+        <w:t>It was the ordinary sound, the sound of the Paddington doors closing behind Weinstein. A man could step up and in during that sound and be on, and the doors would close after him, and the train would leave after he boarded it, in the right order, and nobody would ever know what yesterday he had got off in. The thought had a pull, like the edge of a high place. He would know who had sent the Sunday slip. He would know whose voice it had been behind the carriage door. He would know everything except how to come back.</w:t>
       </w:r>
     </w:p>
     <w:p>
@@ -24340,7 +24590,7 @@
           <w:b w:val="0"/>
           <w:sz w:val="22"/>
         </w:rPr>
-        <w:t xml:space="preserve">He came in her coat collar, as he did when he came at all, and she set him down on the corridor carpet, and he looked at the sill where the yellow tape had lain until Trevor rolled it up on Monday evening, on the grounds that the platform had proved it could keep still without supervision. He looked at the slabs and the bench and the train. Then he went and lay down a little way along the corridor, as if a railway were a piece of furniture he had declined to discuss.</w:t>
+        <w:t>He came in her coat collar, as he did when he came at all, and she set him down on the corridor carpet, and he looked at the sill where the yellow tape had lain until Trevor rolled it up on Monday evening, on the grounds that the platform had proved it could keep still without supervision. He took in the slabs and the bench and the train. Then he went and lay down a little way along the corridor, as if a railway were a piece of furniture he had declined to discuss.</w:t>
       </w:r>
     </w:p>
     <w:p>
@@ -24392,7 +24642,7 @@
           <w:b w:val="0"/>
           <w:sz w:val="22"/>
         </w:rPr>
-        <w:t>The door stayed open because the platform was in it. Derek would not have shut it on her if the hinge had been willing. He made tea instead. Milk, no. Sugar, one. Tabitha's, he made the way she had made his at lunch on Monday, and she noticed, and did not say so. She left an inch in the bottom of the mug, on purpose, and set it on the carpet in the hall, and Gucci got up, inspected it, established that it was not Earl Grey, and finished it with the air of a dog doing a favour for a household that could not be trusted to manage its own leftovers.</w:t>
+        <w:t>The door stayed open because the platform was in it. Derek would not have shut it on her if the hinge had been willing. He made tea instead. Milk, no. Sugar, one. Tabitha's, he made as she had made his at lunch on Monday, and she noticed, and did not say so. She left an inch in the bottom of the mug, on purpose, and set it on the carpet in the hall, and Gucci got up, inspected it, established that it was not Earl Grey, and finished it with the air of a dog doing a favour for a household that could not be trusted to manage its own leftovers.</w:t>
       </w:r>
     </w:p>
     <w:p>
@@ -24678,7 +24928,7 @@
           <w:b w:val="0"/>
           <w:sz w:val="22"/>
         </w:rPr>
-        <w:t>That was the lot. It was, Derek thought, the longest conversation they had had in three years without anybody being told to save an explanation. He sat with the phone for a moment afterwards, the way he had sat with it on the Monday, and found that the feeling was entirely different and that he did not have a word for it, and decided that was probably correct.</w:t>
+        <w:t>That was the lot. It was, Derek thought, the longest conversation they had had in three years without anybody being told to save an explanation. He sat with the phone for a moment afterwards, as he had sat with it on the Monday, and found that the feeling was entirely different and that he did not have a word for it, and decided that was probably correct.</w:t>
       </w:r>
     </w:p>
     <w:p>
@@ -25029,7 +25279,7 @@
           <w:b w:val="0"/>
           <w:sz w:val="22"/>
         </w:rPr>
-        <w:t>The bus came, which was as much of a railway as the day required. They got on it in the ordinary order: the doors opened, they stepped up, the doors closed, and then it pulled away from the kerb with a noise suggesting that several of its components had voted against the decision.</w:t>
+        <w:t>The bus came. It was as much of a railway as the day required. They got on it in the ordinary order: the doors opened, they stepped up, the doors closed, and then it pulled away from the kerb with a noise suggesting that several of its components had voted against the decision.</w:t>
       </w:r>
     </w:p>
     <w:p>
@@ -25068,7 +25318,7 @@
           <w:b w:val="0"/>
           <w:sz w:val="22"/>
         </w:rPr>
-        <w:t>She looked inside. She looked at the owl.</w:t>
+        <w:t>She looked inside. She considered the owl.</w:t>
       </w:r>
     </w:p>
     <w:p>

</xml_diff>

<commit_message>
RIB2 REV02 pass 2 from book-2-lectures-after-qed a6aeed3: line edit, How to Read + Lesson 6 capstone note, Author's Note, KDP.md, Book 3 seeds
</commit_message>
<xml_diff>
--- a/The Relativistic Investigation Bureau - SERIES/Book 2 - The Warning That Was Sent Too Late/The_Warning_That_Was_Sent_Too_Late_BOOK_2_REV02.docx
+++ b/The Relativistic Investigation Bureau - SERIES/Book 2 - The Warning That Was Sent Too Late/The_Warning_That_Was_Sent_Too_Late_BOOK_2_REV02.docx
@@ -108,6 +108,22 @@
         <w:t>Table of Contents</w:t>
       </w:r>
       <w:bookmarkEnd w:id="903"/>
+    </w:p>
+    <w:p>
+      <w:pPr>
+        <w:spacing w:after="40" w:line="240" w:lineRule="auto"/>
+      </w:pPr>
+      <w:hyperlink w:anchor="how_to_read">
+        <w:r>
+          <w:rPr>
+            <w:rFonts w:ascii="Georgia" w:hAnsi="Georgia"/>
+            <w:sz w:val="22"/>
+            <w:color w:val="0563C1"/>
+            <w:u w:val="single"/>
+          </w:rPr>
+          <w:t xml:space="preserve">How to Read This Book (with Author's Note)</w:t>
+        </w:r>
+      </w:hyperlink>
     </w:p>
     <w:p>
       <w:pPr>
@@ -549,7 +565,7 @@
         <w:spacing w:before="320" w:after="200"/>
         <w:jc w:val="center"/>
       </w:pPr>
-      <w:bookmarkStart w:id="901" w:name="prologue"/>
+      <w:bookmarkStart w:id="9101" w:name="how_to_read"/>
       <w:r>
         <w:rPr>
           <w:rFonts w:ascii="Amazon Ember" w:hAnsi="Amazon Ember" w:eastAsia="Amazon Ember"/>
@@ -557,15 +573,233 @@
           <w:color w:val="0C447C"/>
           <w:sz w:val="36"/>
         </w:rPr>
-        <w:t>PROLOGUE</w:t>
-      </w:r>
-      <w:bookmarkEnd w:id="901"/>
-    </w:p>
-    <w:p>
-      <w:pPr>
+        <w:t>How to Read This Book</w:t>
+      </w:r>
+      <w:bookmarkEnd w:id="9101"/>
+    </w:p>
+    <w:p>
+      <w:pPr>
+        <w:spacing w:after="160" w:line="240" w:lineRule="auto"/>
+      </w:pPr>
+      <w:r>
+        <w:rPr>
+          <w:rFonts w:ascii="Georgia" w:hAnsi="Georgia" w:eastAsia="Georgia"/>
+          <w:b w:val="0"/>
+          <w:sz w:val="22"/>
+        </w:rPr>
+        <w:t>This is the second case of the Relativistic Investigation Bureau, and it stands on its own. You need no physics, and you do not need Book One, to follow it. The comedy is the bait. The geometry is the trap.</w:t>
+      </w:r>
+    </w:p>
+    <w:p>
+      <w:pPr>
+        <w:spacing w:after="160" w:line="240" w:lineRule="auto"/>
+      </w:pPr>
+      <w:r>
+        <w:rPr>
+          <w:rFonts w:ascii="Georgia" w:hAnsi="Georgia" w:eastAsia="Georgia"/>
+          <w:b w:val="0"/>
+          <w:sz w:val="22"/>
+        </w:rPr>
+        <w:t>The novel is the case of the morning sheet: a warning on the Bureau's own form, dated tomorrow, from a sender whose date of birth is NOT YET; an office door that is already open onto a railway platform; and a voice, Derek Gent's own, that arrives too late to stop it. The Bureau has from Monday morning to Wednesday to put three things in the right order and to decide who, if anybody, wrote the first one.</w:t>
+      </w:r>
+    </w:p>
+    <w:p>
+      <w:pPr>
+        <w:spacing w:after="160" w:line="240" w:lineRule="auto"/>
+      </w:pPr>
+      <w:r>
+        <w:rPr>
+          <w:rFonts w:ascii="Georgia" w:hAnsi="Georgia" w:eastAsia="Georgia"/>
+          <w:b w:val="0"/>
+          <w:sz w:val="22"/>
+        </w:rPr>
+        <w:t>The course, Tense for Investigators, follows the novel in six lessons. Most chapters, and the Epilogue, end with a Rule and a link to the lesson they use. Read a lesson when you want the physics behind the investigation; leave it until later when you want to know what happens next.</w:t>
+      </w:r>
+    </w:p>
+    <w:p>
+      <w:pPr>
+        <w:spacing w:after="160" w:line="240" w:lineRule="auto"/>
+      </w:pPr>
+      <w:r>
+        <w:rPr>
+          <w:rFonts w:ascii="Georgia" w:hAnsi="Georgia" w:eastAsia="Georgia"/>
+          <w:b w:val="0"/>
+          <w:sz w:val="22"/>
+        </w:rPr>
+        <w:t>A note on Lesson 6. Lessons 1 to 5 each teach one idea, and the Prologue and Chapters 1 to 9 work through them in order. From Chapter 10 to the Epilogue every link points to Lesson 6. That is deliberate. Lesson 6 is the capstone: it adds no new idea, it puts the first five to work and closes a case of this kind in one paragraph. Read the second half of the book as its worked example, and go back to Lesson 6 as often as the chapters send you. You will understand it better each time.</w:t>
+      </w:r>
+    </w:p>
+    <w:p>
+      <w:pPr>
+        <w:spacing w:after="160" w:line="240" w:lineRule="auto"/>
+      </w:pPr>
+      <w:r>
+        <w:rPr>
+          <w:rFonts w:ascii="Georgia" w:hAnsi="Georgia" w:eastAsia="Georgia"/>
+          <w:b w:val="0"/>
+          <w:sz w:val="22"/>
+        </w:rPr>
+        <w:t>Three honest ways to read this book.</w:t>
+      </w:r>
+    </w:p>
+    <w:p>
+      <w:pPr>
+        <w:spacing w:after="160" w:line="240" w:lineRule="auto"/>
+      </w:pPr>
+      <w:r>
+        <w:rPr>
+          <w:rFonts w:ascii="Georgia" w:hAnsi="Georgia" w:eastAsia="Georgia"/>
+          <w:b w:val="0"/>
+          <w:sz w:val="22"/>
+        </w:rPr>
+        <w:t>For the story alone: read the chapters and stop at each Rule. The case explains its own solution.</w:t>
+      </w:r>
+    </w:p>
+    <w:p>
+      <w:pPr>
+        <w:spacing w:after="160" w:line="240" w:lineRule="auto"/>
+      </w:pPr>
+      <w:r>
+        <w:rPr>
+          <w:rFonts w:ascii="Georgia" w:hAnsi="Georgia" w:eastAsia="Georgia"/>
+          <w:b w:val="0"/>
+          <w:sz w:val="22"/>
+        </w:rPr>
+        <w:t>To take the class: read each chapter, then the lesson it points to. No physics is assumed at the start, and none of Book One's algebra is repeated.</w:t>
+      </w:r>
+    </w:p>
+    <w:p>
+      <w:pPr>
+        <w:spacing w:after="160" w:line="240" w:lineRule="auto"/>
+      </w:pPr>
+      <w:r>
+        <w:rPr>
+          <w:rFonts w:ascii="Georgia" w:hAnsi="Georgia" w:eastAsia="Georgia"/>
+          <w:b w:val="0"/>
+          <w:sz w:val="22"/>
+        </w:rPr>
+        <w:t>If you are impatient: the sheet arrives in the Prologue and the door opens at the end of it. The Bureau understands impatience; it simply prefers it in writing.</w:t>
+      </w:r>
+    </w:p>
+    <w:p>
+      <w:pPr>
+        <w:spacing w:after="160" w:line="240" w:lineRule="auto"/>
+      </w:pPr>
+      <w:r>
+        <w:rPr>
+          <w:rFonts w:ascii="Georgia" w:hAnsi="Georgia" w:eastAsia="Georgia"/>
+          <w:b w:val="0"/>
+          <w:sz w:val="22"/>
+        </w:rPr>
+        <w:t>One promise: relativity will not be used as permission for a message to arrive from its own future. The platform in the doorway is the book's one unexplained thing, and it stays unexplained. Everything else has a cause, an order and a time, and the investigation finds them.</w:t>
+      </w:r>
+    </w:p>
+    <w:p>
+      <w:pPr>
+        <w:spacing w:after="160" w:line="240" w:lineRule="auto"/>
+      </w:pPr>
+      <w:r>
+        <w:rPr>
+          <w:rFonts w:ascii="Georgia" w:hAnsi="Georgia" w:eastAsia="Georgia"/>
+          <w:b w:val="0"/>
+          <w:sz w:val="22"/>
+        </w:rPr>
+        <w:t>A companion film for each lesson is listed at the end of the course. None of them is required.</w:t>
+      </w:r>
+    </w:p>
+    <w:p>
+      <w:pPr>
+        <w:pStyle w:val="Heading2"/>
+        <w:keepNext/>
         <w:spacing w:before="320" w:after="200"/>
         <w:jc w:val="center"/>
       </w:pPr>
+      <w:bookmarkStart w:id="9102" w:name="authors_note"/>
+      <w:r>
+        <w:rPr>
+          <w:rFonts w:ascii="Amazon Ember" w:hAnsi="Amazon Ember" w:eastAsia="Amazon Ember"/>
+          <w:b/>
+          <w:color w:val="0C447C"/>
+          <w:sz w:val="28"/>
+        </w:rPr>
+        <w:t>Author's Note</w:t>
+      </w:r>
+      <w:bookmarkEnd w:id="9102"/>
+    </w:p>
+    <w:p>
+      <w:pPr>
+        <w:spacing w:after="160" w:line="240" w:lineRule="auto"/>
+      </w:pPr>
+      <w:r>
+        <w:rPr>
+          <w:rFonts w:ascii="Georgia" w:hAnsi="Georgia" w:eastAsia="Georgia"/>
+          <w:b w:val="0"/>
+          <w:sz w:val="22"/>
+        </w:rPr>
+        <w:t>As in the first case, the physics is real and the crimes are not.</w:t>
+      </w:r>
+    </w:p>
+    <w:p>
+      <w:pPr>
+        <w:spacing w:after="160" w:line="240" w:lineRule="auto"/>
+      </w:pPr>
+      <w:r>
+        <w:rPr>
+          <w:rFonts w:ascii="Georgia" w:hAnsi="Georgia" w:eastAsia="Georgia"/>
+          <w:b w:val="0"/>
+          <w:sz w:val="22"/>
+        </w:rPr>
+        <w:t>Real: the speed of light and what it does, and does not do, to the order of events; the slowing of moving clocks, including the 1971 Hafele–Keating flights, whose caesium clocks came home about 59 billionths of a second behind after flying east and about 273 ahead after flying west; the second, defined since 1967 as 9,192,631,770 cycles of the caesium atom; the DCF77 time signal, broadcast from near Frankfurt for Germany's national metrology institute, the PTB in Braunschweig; and Paddington station and its airport trains. The films named in the course are real films, and every book in the bibliography exists.</w:t>
+      </w:r>
+    </w:p>
+    <w:p>
+      <w:pPr>
+        <w:spacing w:after="160" w:line="240" w:lineRule="auto"/>
+      </w:pPr>
+      <w:r>
+        <w:rPr>
+          <w:rFonts w:ascii="Georgia" w:hAnsi="Georgia" w:eastAsia="Georgia"/>
+          <w:b w:val="0"/>
+          <w:sz w:val="22"/>
+        </w:rPr>
+        <w:t>Invented: the Bureau and everyone in it; the building, its landlord, his surveyor and both insurers; form PL/9 and every other form; the school; the lost-property slip; and the platform in the doorway.</w:t>
+      </w:r>
+    </w:p>
+    <w:p>
+      <w:pPr>
+        <w:spacing w:after="160" w:line="240" w:lineRule="auto"/>
+      </w:pPr>
+      <w:r>
+        <w:rPr>
+          <w:rFonts w:ascii="Georgia" w:hAnsi="Georgia" w:eastAsia="Georgia"/>
+          <w:b w:val="0"/>
+          <w:sz w:val="22"/>
+        </w:rPr>
+        <w:t>Weinstein's night train is real. The Sud Expresso (the Sud Express, in French) ran overnight from the French–Spanish border at Hendaye and Irún, across Spain, to Lisbon, and entered Portugal at Vilar Formoso. It was suspended on 17 March 2020, at the start of the pandemic, and at the time of writing it has not run since. That is why Weinstein speaks of it in the past tense. The border clocks are real too: mainland Portugal moved to Central European Time, Spain's time, in September 1992, and went back to Western European Time in 1996. A government can move every clock in a country by an hour with a signature. It cannot make one of them tick slower.</w:t>
+      </w:r>
+    </w:p>
+    <w:p>
+      <w:pPr>
+        <w:spacing w:after="160" w:line="240" w:lineRule="auto"/>
+      </w:pPr>
+      <w:r>
+        <w:rPr>
+          <w:rFonts w:ascii="Georgia" w:hAnsi="Georgia" w:eastAsia="Georgia"/>
+          <w:b w:val="0"/>
+          <w:sz w:val="22"/>
+        </w:rPr>
+        <w:t>If you finish the book unsure whether a warning can be early and late at once, congratulations. You are thinking like an investigator. The Bureau files that under Lesson 6.</w:t>
+      </w:r>
+    </w:p>
+    <w:p>
+      <w:pPr>
+        <w:pStyle w:val="Heading1"/>
+        <w:keepNext/>
+        <w:pageBreakBefore/>
+        <w:spacing w:before="320" w:after="200"/>
+        <w:jc w:val="center"/>
+      </w:pPr>
+      <w:bookmarkStart w:id="901" w:name="prologue"/>
       <w:r>
         <w:rPr>
           <w:rFonts w:ascii="Amazon Ember" w:hAnsi="Amazon Ember" w:eastAsia="Amazon Ember"/>
@@ -573,6 +807,22 @@
           <w:color w:val="0C447C"/>
           <w:sz w:val="36"/>
         </w:rPr>
+        <w:t>PROLOGUE</w:t>
+      </w:r>
+      <w:bookmarkEnd w:id="901"/>
+    </w:p>
+    <w:p>
+      <w:pPr>
+        <w:spacing w:before="320" w:after="200"/>
+        <w:jc w:val="center"/>
+      </w:pPr>
+      <w:r>
+        <w:rPr>
+          <w:rFonts w:ascii="Amazon Ember" w:hAnsi="Amazon Ember" w:eastAsia="Amazon Ember"/>
+          <w:b/>
+          <w:color w:val="0C447C"/>
+          <w:sz w:val="36"/>
+        </w:rPr>
         <w:t>In Which a File Arrives Before Its Author</w:t>
       </w:r>
     </w:p>
@@ -859,20 +1109,20 @@
           <w:b w:val="0"/>
           <w:sz w:val="22"/>
         </w:rPr>
-        <w:t xml:space="preserve">Nobody had put it there. Derek was sure of that the way he was sure of the floor. Four people in a small room, all of them facing that desk, and none of them had seen a hand. It was simply there, as if it had always been underneath and the folder had been sitting on it all week. It had been folded in four, once, carefully, and opened out again, so that the creases stood up from the blotter like the ridges of a small roof. On one corner was a pale brown ring, the size of the bottom of a mug, with a little bite out of its left side. A faint grey line ran down the margin.</w:t>
-      </w:r>
-    </w:p>
-    <w:p>
-      <w:pPr>
-        <w:spacing w:after="160" w:line="240" w:lineRule="auto"/>
-      </w:pPr>
-      <w:r>
-        <w:rPr>
-          <w:rFonts w:ascii="Georgia" w:hAnsi="Georgia" w:eastAsia="Georgia"/>
-          <w:b w:val="0"/>
-          <w:sz w:val="22"/>
-        </w:rPr>
-        <w:t>It was on the Bureau's own form. Derek knew the heading the way he knew his own signature.</w:t>
+        <w:t>Nobody had put it there. Derek was as sure of that as he was of the floor. Four people in a small room, all of them facing that desk, and none of them had seen a hand. It was simply there, as if it had always been underneath and the folder had been sitting on it all week. It had been folded in four, once, carefully, and opened out again, so that the creases stood up from the blotter like the ridges of a small roof. On one corner was a pale brown ring, the size of the bottom of a mug, with a little bite out of its left side. A faint grey line ran down the margin.</w:t>
+      </w:r>
+    </w:p>
+    <w:p>
+      <w:pPr>
+        <w:spacing w:after="160" w:line="240" w:lineRule="auto"/>
+      </w:pPr>
+      <w:r>
+        <w:rPr>
+          <w:rFonts w:ascii="Georgia" w:hAnsi="Georgia" w:eastAsia="Georgia"/>
+          <w:b w:val="0"/>
+          <w:sz w:val="22"/>
+        </w:rPr>
+        <w:t>It was on the Bureau's own form. Derek knew the heading as well as his own signature.</w:t>
       </w:r>
     </w:p>
     <w:p>
@@ -1248,7 +1498,7 @@
           <w:b w:val="0"/>
           <w:sz w:val="22"/>
         </w:rPr>
-        <w:t xml:space="preserve">He was visiting. Same jacket, as on every day of the year, on the grounds that changing it introduced a variable. He had no door on this corridor and did not seem to miss one. He was perched on the corner of Derek's desk with the expression of a man who has come to London for a polite few days and been handed, at no extra charge, the most interesting morning of his decade.</w:t>
+        <w:t>He was visiting. Same jacket, as on every day of the year, on the grounds that changing it introduced a variable. He had no door on this corridor and did not seem to miss one. He was perched on the corner of Derek's desk, a man who had come to London for a polite few days and been handed, at no extra charge, the most interesting morning of his decade.</w:t>
       </w:r>
     </w:p>
     <w:p>
@@ -1651,7 +1901,7 @@
           <w:b w:val="0"/>
           <w:sz w:val="22"/>
         </w:rPr>
-        <w:t>Trevor looked at the tape as if it had personally promised him it would not. "Then I'll know that too."</w:t>
+        <w:t>Trevor glared at the tape as if it had personally promised him it would not. "Then I'll know that too."</w:t>
       </w:r>
     </w:p>
     <w:p>
@@ -1755,7 +2005,7 @@
           <w:b w:val="0"/>
           <w:sz w:val="22"/>
         </w:rPr>
-        <w:t>They had heard the knocks once already. Three of them, soft, from somewhere inside the carriage, the way someone knocks on a bathroom door when they suspect the answer. Then the voice, which was his own and was not, which had the same flat register he used for murders and for tea, and also something else in it, worn smooth, like a step that has been used by a great many feet.</w:t>
+        <w:t>They had heard the knocks once already. Three of them, soft, from somewhere inside the carriage, the way someone knocks on a bathroom door when they suspect the answer. Then the voice, his own and not his own, in the same flat register he used for murders and for tea, and also something else in it, worn smooth, like a step that has been used by a great many feet.</w:t>
       </w:r>
     </w:p>
     <w:p>
@@ -1950,7 +2200,7 @@
           <w:b w:val="0"/>
           <w:sz w:val="22"/>
         </w:rPr>
-        <w:t>Instead he looked at the corridor clock again, because Trevor was looking at it, and Trevor was wearing the expression of a man about to enjoy a subtraction.</w:t>
+        <w:t>Instead he looked at the corridor clock again, because Trevor was looking at it, and Trevor looked like a man about to enjoy a subtraction.</w:t>
       </w:r>
     </w:p>
     <w:p>
@@ -2301,7 +2551,7 @@
           <w:b w:val="0"/>
           <w:sz w:val="22"/>
         </w:rPr>
-        <w:t>He went to shut the door. It was a reasonable thing to try. He took hold of the handle and swung it inwards, and it travelled a third of its arc, met station air, and stopped with a small soft refusal, as if it had walked into a curtain. He tried once more, with the patience of a man who already knows. It stopped in the same place. The platform was in the hinge.</w:t>
+        <w:t>He went to shut the door. It was a reasonable thing to try. He took hold of the handle and swung it inwards, and it travelled a third of its arc, met station air, and stopped with a small soft refusal, as if it had walked into a curtain. He tried once more, patiently, already knowing. It stopped in the same place. The platform was in the hinge.</w:t>
       </w:r>
     </w:p>
     <w:p>
@@ -2379,7 +2629,7 @@
           <w:b w:val="0"/>
           <w:sz w:val="22"/>
         </w:rPr>
-        <w:t>Trevor, who had been kneeling, managed to sit down without letting go of the tape, which was a feat of engineering in itself.</w:t>
+        <w:t>Trevor, who had been kneeling, managed to sit down without letting go of the tape, a feat of engineering in itself.</w:t>
       </w:r>
     </w:p>
     <w:p>
@@ -2613,7 +2863,7 @@
           <w:b w:val="0"/>
           <w:sz w:val="22"/>
         </w:rPr>
-        <w:t>"I know I'm not. I wanted to hear whether you did." The radio went off altogether. "Gucci won't come. He looked at the lead and went back to sleep. I'm not translating."</w:t>
+        <w:t>"I know I'm not. I wanted to hear whether you did." The radio went off altogether. "Gucci won't come. He considered the lead and went back to sleep. I'm not translating."</w:t>
       </w:r>
     </w:p>
     <w:p>
@@ -2743,20 +2993,20 @@
           <w:b w:val="0"/>
           <w:sz w:val="22"/>
         </w:rPr>
-        <w:t>Trevor looked at the filing cabinet as if he had been introduced to it before and had not enjoyed the conversation.</w:t>
-      </w:r>
-    </w:p>
-    <w:p>
-      <w:pPr>
-        <w:spacing w:after="160" w:line="240" w:lineRule="auto"/>
-      </w:pPr>
-      <w:r>
-        <w:rPr>
-          <w:rFonts w:ascii="Georgia" w:hAnsi="Georgia" w:eastAsia="Georgia"/>
-          <w:b w:val="0"/>
-          <w:sz w:val="22"/>
-        </w:rPr>
-        <w:t>On the platform the train did not depart and did not arrive. It waited, which is the most expensive thing a train can do, in a doorway already booked as a lunchtime complaint. The amber word above it held steady. Derek stood with his hand flat over the pocket where the sheet was, and for the first time since Tuesday, the old Tuesday, the one with the photograph, he understood exactly what he was supposed to do, and found that knowing it did not make the morning any shorter.</w:t>
+        <w:t>Trevor eyed the filing cabinet as if he had been introduced to it before and had not enjoyed the conversation.</w:t>
+      </w:r>
+    </w:p>
+    <w:p>
+      <w:pPr>
+        <w:spacing w:after="160" w:line="240" w:lineRule="auto"/>
+      </w:pPr>
+      <w:r>
+        <w:rPr>
+          <w:rFonts w:ascii="Georgia" w:hAnsi="Georgia" w:eastAsia="Georgia"/>
+          <w:b w:val="0"/>
+          <w:sz w:val="22"/>
+        </w:rPr>
+        <w:t>On the platform the train did not depart and did not arrive. It waited, which is the most expensive thing a train can do, in a doorway already booked as a lunchtime complaint. The amber word above it held steady. Derek stood with his hand flat over the pocket where the sheet was, and for the first time since the old Tuesday, the one with the photograph, he understood exactly what he was supposed to do, and found that knowing it did not make the morning any shorter.</w:t>
       </w:r>
     </w:p>
     <w:p>
@@ -2911,7 +3161,7 @@
           <w:b w:val="0"/>
           <w:sz w:val="22"/>
         </w:rPr>
-        <w:t>Derek came and stood behind him, a pace back from the sill, and looked. Penny looked. Weinstein, who had been about to sit on the desk again, stood up instead and came over with his hands in his jacket pockets, wearing the face of a man who has been told there is a second dessert.</w:t>
+        <w:t>Derek came and stood behind him, a pace back from the sill, and looked. Penny looked. Weinstein, who had been about to sit on the desk again, stood up instead and came over with his hands in his jacket pockets, beaming like a man told there is a second dessert.</w:t>
       </w:r>
     </w:p>
     <w:p>
@@ -3015,7 +3265,7 @@
           <w:b w:val="0"/>
           <w:sz w:val="22"/>
         </w:rPr>
-        <w:t>Trevor looked at the clock with the expression of a man who has just discovered his own front door has been painted the same colour as everyone else's.</w:t>
+        <w:t>Trevor regarded the clock like a man who has just discovered his own front door has been painted the same colour as everyone else's.</w:t>
       </w:r>
     </w:p>
     <w:p>
@@ -3080,7 +3330,7 @@
           <w:b w:val="0"/>
           <w:sz w:val="22"/>
         </w:rPr>
-        <w:t xml:space="preserve">"Last week the clocks disagreed." Weinstein held up one finger. "That is not the same as lying. A clock that disagrees with you is reporting a fact about its path. A clock that is merely set wrong is reporting a fact about whoever set it. There are two ways for that clock to be different from ours. It can run at a different rate, which would tell us something about the platform, how fast it moves, how deep it sits in gravity. Or it can run at the same rate and simply say something different, which would tell us only that somebody turned the little knob at the back." He bent, very slightly, towards the doorway, and then thought better of it and straightened. "The first is physics. The second is housekeeping. I should like to know which one we have."</w:t>
+        <w:t>"Last week the clocks disagreed." Weinstein held up one finger. "That is not the same as lying. A clock that disagrees with you is reporting a fact about its path. A clock that is merely set wrong is reporting a fact about whoever set it. There are two ways for that clock to be different from ours. It can run at a different rate, which would tell us something about the platform, how fast it moves, how deep it sits in gravity. Or it can run at the same rate and simply say something different, which would tell us only that somebody turned the little knob at the back." He bent, slightly, towards the doorway, and then thought better of it and straightened. "The first is physics. The second is housekeeping. I should like to know which one we have."</w:t>
       </w:r>
     </w:p>
     <w:p>
@@ -3119,7 +3369,7 @@
           <w:b w:val="0"/>
           <w:sz w:val="22"/>
         </w:rPr>
-        <w:t>Trevor did not have anything to measure a clock with. What he had was a phone, and a desk, and the absolute determination of a man who has been told he is the one with a tape measure. He propped the phone against the Klein bottle, which for the first time in its life was useful, and angled it so that the screen held both clocks at once: the white face on the far pillar through the doorway, and, by a long and precarious arrangement of the outer-room door and a shaving mirror Penny produced from her handbag without comment, the corridor clock behind him.</w:t>
+        <w:t>Trevor did not have anything to measure a clock with. What he had was a phone, and a desk, and the absolute determination of the one person present with a tape measure. He propped the phone against the Klein bottle, useful at last, and angled it so that the screen held both clocks at once: the white face on the far pillar through the doorway, and, by a long and precarious arrangement of the outer-room door and a shaving mirror Penny produced from her handbag without comment, the corridor clock behind him.</w:t>
       </w:r>
     </w:p>
     <w:p>
@@ -3392,7 +3642,7 @@
           <w:b w:val="0"/>
           <w:sz w:val="22"/>
         </w:rPr>
-        <w:t>"I don't know. I have looked under Structural, and under Unauthorised Occupancy, and under Acts of God, which is a very small folder. It is not in any of them. It may be in another building." He considered the platform. "It may be in another continuum. I have never had to look there before."</w:t>
+        <w:t>"I don't know. I have looked under Structural, and under Unauthorised Occupancy, and under Acts of God, which is a small folder. It is not in any of them. It may be in another building." He considered the platform. "It may be in another continuum. I have never had to look there before."</w:t>
       </w:r>
     </w:p>
     <w:p>
@@ -3522,7 +3772,7 @@
           <w:b w:val="0"/>
           <w:sz w:val="22"/>
         </w:rPr>
-        <w:t>"So if the platform were moving past us fast enough for its time to stretch by that much, it would have to be going at—" he did it in the margin, very small, "—about twelve thousand kilometres a second. Four per cent of light. It isn't. Or it would have to be sitting in a gravitational well deeper than anything in the solar system. It isn't."</w:t>
+        <w:t>"So if the platform were moving past us fast enough for its time to stretch by that much, it would have to be going at—" he did it in the margin, in tiny figures, "—about twelve thousand kilometres a second. Four per cent of light. It isn't. Or it would have to be sitting in a gravitational well deeper than anything in the solar system. It isn't."</w:t>
       </w:r>
     </w:p>
     <w:p>
@@ -3847,7 +4097,7 @@
           <w:b w:val="0"/>
           <w:sz w:val="22"/>
         </w:rPr>
-        <w:t>Trevor looked down at the tape, and at the platform, and at the clock that had kept perfect time for twenty minutes for no reason anyone could give him. Then he set the case down on the London side of the sill, very gently, as if it might wake, and went out to the stairwell to ask Mrs Marsh whether she would be responsible for a door.</w:t>
+        <w:t>Trevor looked down at the tape, and at the platform, and at the clock that had kept perfect time for twenty minutes for no reason anyone could give him. Then he set the case down on the London side of the sill, gently, as if it might wake, and went out to the stairwell to ask Mrs Marsh whether she would be responsible for a door.</w:t>
       </w:r>
     </w:p>
     <w:p>
@@ -3963,7 +4213,7 @@
           <w:b w:val="0"/>
           <w:sz w:val="22"/>
         </w:rPr>
-        <w:t>Weinstein had refused a chair. His real train was at four, from a real station, to a real airport, and he had the air of a man who intended to catch it without once sitting down in between, in case sitting down became residence. Lunch was the nearer threat.</w:t>
+        <w:t>Weinstein had refused a chair. His real train was at four, from a real station, to a real airport, and he plainly intended to catch it without once sitting down in between, in case sitting down became residence. Lunch was the nearer threat.</w:t>
       </w:r>
     </w:p>
     <w:p>
@@ -4392,7 +4642,7 @@
           <w:b w:val="0"/>
           <w:sz w:val="22"/>
         </w:rPr>
-        <w:t>Weinstein had begun pacing, which in the Bureau's outer room meant three steps and a turn, like a man walking a very small dog. "Because the form has done something the last case never made us do. Suppose later Derek posted this. He wrote it after he knew the sentence. Do not let Derek Gent board. How does he know to write that?"</w:t>
+        <w:t>Weinstein had begun pacing, which in the Bureau's outer room meant three steps and a turn, like a man walking a small dog. "Because the form has done something the last case never made us do. Suppose later Derek posted this. He wrote it after he knew the sentence. Do not let Derek Gent board. How does he know to write that?"</w:t>
       </w:r>
     </w:p>
     <w:p>
@@ -4678,7 +4928,7 @@
           <w:b w:val="0"/>
           <w:sz w:val="22"/>
         </w:rPr>
-        <w:t>Trevor faced the filing cabinet. He did it with dignity. It was a very slight dignity, and it was entirely sincere.</w:t>
+        <w:t>Trevor faced the filing cabinet. He did it with dignity. It was a slight dignity, and entirely sincere.</w:t>
       </w:r>
     </w:p>
     <w:p>
@@ -4886,7 +5136,7 @@
           <w:b w:val="0"/>
           <w:sz w:val="22"/>
         </w:rPr>
-        <w:t>Under the third line, a fourth appeared. It came up letter by letter, the way a sentence comes up when somebody is thinking about each word.</w:t>
+        <w:t>Under the third line, a fourth appeared. It came up letter by letter, like a sentence from somebody weighing each word.</w:t>
       </w:r>
     </w:p>
     <w:p>
@@ -4951,7 +5201,7 @@
           <w:b w:val="0"/>
           <w:sz w:val="22"/>
         </w:rPr>
-        <w:t>Everybody saw it, through the open door, over the empty train. Not to a time. Not to a station. The amber dots rearranged themselves the way they had rearranged themselves once before, in another week, around another word, and they spelled a name. Six letters. It held for three seconds. Derek counted them. He would remember, later, that he had counted, and be ashamed of how steady the counting was.</w:t>
+        <w:t>Everybody saw it, through the open door, over the empty train. Not to a time. Not to a station. The amber dots rearranged themselves as they had once before, in another week, around another word, and they spelled a name. Six letters. It held for three seconds. Derek counted them. He would remember, later, that he had counted, and be ashamed of how steady the counting was.</w:t>
       </w:r>
     </w:p>
     <w:p>
@@ -5107,7 +5357,7 @@
           <w:b w:val="0"/>
           <w:sz w:val="22"/>
         </w:rPr>
-        <w:t>The phone buzzed again before he could think about what to type, which was, he would decide later, the universe's single act of mercy that day. Tuppence. She did not wait for hello. She never had.</w:t>
+        <w:t>The phone buzzed again before he could think about what to type. He would decide later that this was the universe's single act of mercy that day. Tuppence. She did not wait for hello. She never had.</w:t>
       </w:r>
     </w:p>
     <w:p>
@@ -5159,7 +5409,7 @@
           <w:b w:val="0"/>
           <w:sz w:val="22"/>
         </w:rPr>
-        <w:t>Weinstein had a sleeve half on. He looked at the sleeve. He took it off again, and folded the jacket over the back of the chair he had refused, which was the closest he would ever come to sitting.</w:t>
+        <w:t>Weinstein had a sleeve half on. He looked at the sleeve. He took it off again and folded it over the back of the chair he had refused. It was the closest he would ever come to sitting.</w:t>
       </w:r>
     </w:p>
     <w:p>
@@ -5263,7 +5513,7 @@
           <w:b w:val="0"/>
           <w:sz w:val="22"/>
         </w:rPr>
-        <w:t>Derek put the mug down and looked at the form on the screen, at its four lines of grey certainty, and at the gap underneath the fourth where something else might yet appear. Two acts, the sheet had named, if you counted the voice. A door, which was done. A train, which was not. And now a name with no act attached to it at all, hung in amber above a railway like washing.</w:t>
+        <w:t>Derek put the mug down and studied the form on the screen, at its four lines of grey certainty, and at the gap underneath the fourth where something else might yet appear. Two acts, the sheet had named, if you counted the voice. A door, which was done. A train, which was not. And now a name with no act attached to it at all, hung in amber above a railway like washing.</w:t>
       </w:r>
     </w:p>
     <w:p>
@@ -5392,7 +5642,7 @@
           <w:b w:val="0"/>
           <w:sz w:val="22"/>
         </w:rPr>
-        <w:t>Tuppence arrived at a quarter past one, which was not a time anybody had suggested.</w:t>
+        <w:t>Tuppence arrived at a quarter past one, a time no one had suggested.</w:t>
       </w:r>
     </w:p>
     <w:p>
@@ -5496,20 +5746,20 @@
           <w:b w:val="0"/>
           <w:sz w:val="22"/>
         </w:rPr>
-        <w:t>She came in through the outer room without knocking, because the door was open and because she had never in her life knocked on anything Derek owned. She was exactly as she always was, which was to say finished: coat, hair, bag, all of it arranged as though a committee had sat on it overnight and approved the minutes. She took in the room in a single pass, Weinstein, Penny, Tabitha, Trevor's back, the kettle, the apple, and then the doorway, and the platform in it, and the board above the train with its one amber word.</w:t>
-      </w:r>
-    </w:p>
-    <w:p>
-      <w:pPr>
-        <w:spacing w:after="160" w:line="240" w:lineRule="auto"/>
-      </w:pPr>
-      <w:r>
-        <w:rPr>
-          <w:rFonts w:ascii="Georgia" w:hAnsi="Georgia" w:eastAsia="Georgia"/>
-          <w:b w:val="0"/>
-          <w:sz w:val="22"/>
-        </w:rPr>
-        <w:t>She looked at it for perhaps two seconds. Then she looked at Derek.</w:t>
+        <w:t>She came in through the outer room without knocking, because the door was open and because she had never in her life knocked on anything Derek owned. She was as she always was, finished: coat, hair, bag, all of it arranged as though a committee had sat on it overnight and approved the minutes. She took in the room in a single pass, Weinstein, Penny, Tabitha, Trevor's back, the kettle, the apple, and then the doorway, and the platform in it, and the board above the train with its one amber word.</w:t>
+      </w:r>
+    </w:p>
+    <w:p>
+      <w:pPr>
+        <w:spacing w:after="160" w:line="240" w:lineRule="auto"/>
+      </w:pPr>
+      <w:r>
+        <w:rPr>
+          <w:rFonts w:ascii="Georgia" w:hAnsi="Georgia" w:eastAsia="Georgia"/>
+          <w:b w:val="0"/>
+          <w:sz w:val="22"/>
+        </w:rPr>
+        <w:t>She studied it for perhaps two seconds. Then she looked at Derek.</w:t>
       </w:r>
     </w:p>
     <w:p>
@@ -5613,7 +5863,7 @@
           <w:b w:val="0"/>
           <w:sz w:val="22"/>
         </w:rPr>
-        <w:t>Derek had imagined this conversation, on and off, for three years. In none of the versions had it taken place with a railway in the door, and in all of them he had said something clever. He found he did not have anything clever. He had what Penny had taught him on the stairs at ten o'clock, which was the order things were in.</w:t>
+        <w:t>Derek had imagined this conversation, on and off, for three years. In none of the versions had it taken place with a railway in the door, and in all of them he had said something clever. He found he did not have anything clever. He had what Penny had taught him on the stairs at ten o'clock: the order things were in.</w:t>
       </w:r>
     </w:p>
     <w:p>
@@ -5652,7 +5902,7 @@
           <w:b w:val="0"/>
           <w:sz w:val="22"/>
         </w:rPr>
-        <w:t>Penny, Derek noticed, had gone very still at the edge of the room, in the way of somebody who has just watched a man walk across a frozen pond and is waiting to hear whether it holds.</w:t>
+        <w:t>Penny, Derek noticed, had gone still at the edge of the room, like somebody who has just watched a man walk across a frozen pond and is waiting to hear whether it holds.</w:t>
       </w:r>
     </w:p>
     <w:p>
@@ -5691,7 +5941,7 @@
           <w:b w:val="0"/>
           <w:sz w:val="22"/>
         </w:rPr>
-        <w:t>"You used to tell me afterwards. In the kitchen. With diagrams." She glanced, very briefly, at Weinstein, who had the sense to look at the window. "I used to stand there being told about things that had already happened to us, in the order you'd decided they had happened, and you always seemed surprised I wasn't more interested."</w:t>
+        <w:t>"You used to tell me afterwards. In the kitchen. With diagrams." She glanced, briefly, at Weinstein, who had the sense to look at the window. "I used to stand there being told about things that had already happened to us, in the order you'd decided they had happened, and you always seemed surprised I wasn't more interested."</w:t>
       </w:r>
     </w:p>
     <w:p>
@@ -5899,7 +6149,7 @@
           <w:b w:val="0"/>
           <w:sz w:val="22"/>
         </w:rPr>
-        <w:t>That was all. It was, Derek would think later, the most frightening exchange of the day, and it had been conducted entirely about him, in front of him, without either of them requiring him to take part. Trevor, who could not see any of it, said "Oh no" very quietly to the filing cabinet, on general principle.</w:t>
+        <w:t>That was all. It was, Derek would think later, the most frightening exchange of the day, and it had been conducted entirely about him, in front of him, without either of them requiring him to take part. Trevor, who could not see any of it, said "Oh no" quietly to the filing cabinet, on general principle.</w:t>
       </w:r>
     </w:p>
     <w:p>
@@ -6146,7 +6396,7 @@
           <w:b w:val="0"/>
           <w:sz w:val="22"/>
         </w:rPr>
-        <w:t xml:space="preserve">"So I gather. It is a rare skill. Most people's warnings are records. Hers are instructions." He reached for his jacket, which was on the chair he had refused, and did not put it on. "And you told her before it was over. I did not know you could."</w:t>
+        <w:t>"So I gather. It is a rare skill. Most people's warnings are records. Hers are instructions." He reached for his jacket on the chair he had refused, and did not put it on. "And you told her before it was over. I did not know you could."</w:t>
       </w:r>
     </w:p>
     <w:p>
@@ -6172,7 +6422,7 @@
           <w:b w:val="0"/>
           <w:sz w:val="22"/>
         </w:rPr>
-        <w:t xml:space="preserve">"The case is how you answered. She heard it." Weinstein looked at the doorway, at the board, at the word. "People think a warning is a sentence. It is not. It is a sentence and a time. The same sentence early is advice. Late, it is an apology. Sophie's mother has always known this. It is why she rings the school before you do."</w:t>
+        <w:t>"The case is how you answered. She heard it." Weinstein's eyes went to the doorway, to the board, to the word. "People think a warning is a sentence. It is not. It is a sentence and a time. The same sentence early is advice. Late, it is an apology. Sophie's mother has always known this. It is why she rings the school before you do."</w:t>
       </w:r>
     </w:p>
     <w:p>
@@ -6340,7 +6590,7 @@
           <w:b w:val="0"/>
           <w:sz w:val="22"/>
         </w:rPr>
-        <w:t>Trevor drove Penny and Weinstein in the Mini, which was the colour of a bruise in its second week and made a noise on corners like a man being asked about his tax return. Derek walked, because Derek walked; he had no licence, and he mentioned this to Weinstein on the stairs without being asked, out of a lifelong sense that people ought to be warned. Tabitha walked with him. She did not ask about the board. He did not offer. They covered most of a mile in a silence that was not empty, past a bus shelter, a florist, two men arguing about a van, and a school that was not Sophie's, which Derek looked at anyway and then made himself stop looking at.</w:t>
+        <w:t>Trevor drove Penny and Weinstein in the Mini, which was the colour of a bruise in its second week and made a noise on corners like a man being asked about his tax return. Derek walked, because Derek walked; he had no licence, and he mentioned this to Weinstein on the stairs without being asked, out of a lifelong sense that people ought to be warned. Tabitha walked with him. She did not ask about the board. He did not offer. They covered most of a mile in a silence that was not empty, past a bus shelter, a florist, two men arguing about a van, and a school that was not Sophie's, which Derek looked at anyway, and then made himself stop.</w:t>
       </w:r>
     </w:p>
     <w:p>
@@ -6418,7 +6668,7 @@
           <w:b w:val="0"/>
           <w:sz w:val="22"/>
         </w:rPr>
-        <w:t>He bought the ticket. He did it at a machine, standing very upright, and for the forty seconds it took he looked briefly like a member of the public, which he resented and Penny enjoyed more than anything that had happened since the weekend.</w:t>
+        <w:t>He bought the ticket. He did it at a machine, standing bolt upright, and for the forty seconds it took he looked briefly like a member of the public, which he resented and Penny enjoyed more than anything that had happened since the weekend.</w:t>
       </w:r>
     </w:p>
     <w:p>
@@ -6535,7 +6785,7 @@
           <w:b w:val="0"/>
           <w:sz w:val="22"/>
         </w:rPr>
-        <w:t>"I am counting on it. You will be about ten billionths of a second older than the rest of us by the time you land, and I shall be the only person in Bavaria who knows. That is a very exclusive sort of annoyance. One does not get it from just anybody."</w:t>
+        <w:t>"I am counting on it. You will be about ten billionths of a second older than the rest of us by the time you land, and I shall be the only person in Bavaria who knows. That is an exclusive sort of annoyance. One does not get it from just anybody."</w:t>
       </w:r>
     </w:p>
     <w:p>
@@ -6561,7 +6811,7 @@
           <w:b w:val="0"/>
           <w:sz w:val="22"/>
         </w:rPr>
-        <w:t>She made it the way she made most decisions, once, and put the itinerary back in her handbag under the face-down photograph, where it had lived since the old Tuesday. Neither of them looked surprised. Trevor, standing slightly to one side with his hands in his pockets, looked as if he had been shown a second procedure he did not have, and was trying to work out where in the manual it had been all this time.</w:t>
+        <w:t>She made it as she made most decisions, once, and put the itinerary back in her handbag under the face-down photograph, where it had lived since the old Tuesday. Neither of them looked surprised. Trevor, standing slightly to one side with his hands in his pockets, seemed to have been shown a second procedure he did not have, and was trying to work out where in the manual it had been all this time.</w:t>
       </w:r>
     </w:p>
     <w:p>
@@ -6613,7 +6863,7 @@
           <w:b w:val="0"/>
           <w:sz w:val="22"/>
         </w:rPr>
-        <w:t>Lost property, at Paddington, was a window and a man who had already decided their problem was not his. He had the moustache of a man who had once meant to grow a better one and had settled. He was not Pendleton. Pendleton was a specialist; Pendleton had spent decades refining the art of a form being in another building. This man was merely tired. He had the tiredness of someone who had spent twenty years being handed umbrellas by people who were sure they had left a violin.</w:t>
+        <w:t>Lost property, at Paddington, was a window and a man who had already decided their problem was not his. His moustache had once meant to be a better one, and had settled. He was not Pendleton. Pendleton was a specialist; Pendleton had spent decades refining the art of a form being in another building. This man was merely tired. He had the tiredness of someone who had spent twenty years being handed umbrellas by people who were sure they had left a violin.</w:t>
       </w:r>
     </w:p>
     <w:p>
@@ -6639,7 +6889,7 @@
           <w:b w:val="0"/>
           <w:sz w:val="22"/>
         </w:rPr>
-        <w:t>He looked at them for a while. Then, with the resignation of a man who knows the answer before the question has finished arriving, he pulled a slip from a wire tray at his elbow. The heading was theirs.</w:t>
+        <w:t>He considered them for a while. Then, resigned to an answer that had arrived before the question finished, he pulled a slip from a wire tray at his elbow. The heading was theirs.</w:t>
       </w:r>
     </w:p>
     <w:p>
@@ -6678,7 +6928,7 @@
           <w:b w:val="0"/>
           <w:sz w:val="22"/>
         </w:rPr>
-        <w:t>Under that, yesterday's date. Sunday. An act, typed in the same flat capitals as the sheet in Derek's pocket: OPENING THE DOOR. Two times, in a hand that was not theirs: small, upright, careful in the way of someone who did not expect to be believed. 18:00. 18:17.</w:t>
+        <w:t>Under that, yesterday's date. Sunday. An act, typed in the same flat capitals as the sheet in Derek's pocket: OPENING THE DOOR. Two times, in a hand that was not theirs: small, upright, careful, like someone who did not expect to be believed. 18:00. 18:17.</w:t>
       </w:r>
     </w:p>
     <w:p>
@@ -6795,7 +7045,7 @@
           <w:b w:val="0"/>
           <w:sz w:val="22"/>
         </w:rPr>
-        <w:t>On the concourse, under the board and beside a bench that was mostly pigeon, Weinstein held the Sunday slip next to Trevor's envelope with the capitals on it. He held them the way he held patent drawings in Schwabing, one in each hand, at arm's length, as if the truth were a matter of focal distance.</w:t>
+        <w:t>On the concourse, under the board and beside a bench that was mostly pigeon, Weinstein held the Sunday slip next to Trevor's envelope with the capitals on it. He held them as he held patent drawings in Schwabing, one in each hand, at arm's length, as if the truth were a matter of focal distance.</w:t>
       </w:r>
     </w:p>
     <w:p>
@@ -6886,20 +7136,20 @@
           <w:b w:val="0"/>
           <w:sz w:val="22"/>
         </w:rPr>
-        <w:t>"It's the same numeral. Look at what it's counting." She took the slip out of Weinstein's hand, which nobody else would have dared. "Sunday is a notice at 18:17 for an opening at 18:00. That gap is the warning arriving after the act. Somebody opened a door, and seventeen minutes later a piece of paper said please don't. That's a miss. That's how late a warning can be. Today we finished reading at 10:22. That seventeen is how long we stood there. Same numeral. Not the same gap." She put the slip back, very precisely, into Weinstein's fingers. "And this slip could be the previous warning. The back of this morning's sheet might be pointing at Sunday. We have not found where that sentence came from yet."</w:t>
-      </w:r>
-    </w:p>
-    <w:p>
-      <w:pPr>
-        <w:spacing w:after="160" w:line="240" w:lineRule="auto"/>
-      </w:pPr>
-      <w:r>
-        <w:rPr>
-          <w:rFonts w:ascii="Georgia" w:hAnsi="Georgia" w:eastAsia="Georgia"/>
-          <w:b w:val="0"/>
-          <w:sz w:val="22"/>
-        </w:rPr>
-        <w:t>Trevor looked at the slip, and at his envelope, and at the slip again, and Derek watched him take the glasses off and put them on again, which in Trevor meant a theory being lowered gently into the ground.</w:t>
+        <w:t>"It's the same numeral. Look at what it's counting." She took the slip out of Weinstein's hand, which no one else would have dared. "Sunday is a notice at 18:17 for an opening at 18:00. That gap is the warning arriving after the act. Somebody opened a door, and seventeen minutes later a piece of paper said please don't. That's a miss. That's how late a warning can be. Today we finished reading at 10:22. That seventeen is how long we stood there. Same numeral. Not the same gap." She put the slip back, precisely, into Weinstein's fingers. "And this slip could be the previous warning. The back of this morning's sheet might be pointing at Sunday. We have not found where that sentence came from yet."</w:t>
+      </w:r>
+    </w:p>
+    <w:p>
+      <w:pPr>
+        <w:spacing w:after="160" w:line="240" w:lineRule="auto"/>
+      </w:pPr>
+      <w:r>
+        <w:rPr>
+          <w:rFonts w:ascii="Georgia" w:hAnsi="Georgia" w:eastAsia="Georgia"/>
+          <w:b w:val="0"/>
+          <w:sz w:val="22"/>
+        </w:rPr>
+        <w:t>Trevor glanced from the slip to his envelope and back, and Derek watched him take the glasses off and put them on again, which in Trevor meant a theory being lowered gently into the ground.</w:t>
       </w:r>
     </w:p>
     <w:p>
@@ -7029,7 +7279,7 @@
           <w:b w:val="0"/>
           <w:sz w:val="22"/>
         </w:rPr>
-        <w:t>It did not put a child on it. It put cities on it, one after another, in the patient white of a public service: Reading, Didcot Parkway, Swansea, Penzance. The airport at 16:00. It said nothing about yesterday. It said nothing about anyone he loved. It was, he realised, the first board he had looked at all day that was simply doing its job, and he could have kissed it, and he would have been arrested, and Tuppence would have heard about it before the police did.</w:t>
+        <w:t>It did not put a child on it. It put cities on it, one after another, in the patient white of a public service: Reading, Didcot Parkway, Swansea, Penzance. The airport at 16:00. It said nothing about yesterday. It said nothing about anyone he loved. It was, he realised, the first board he had seen all day that was simply doing its job, and he could have kissed it, and he would have been arrested, and Tuppence would have heard about it before the police did.</w:t>
       </w:r>
     </w:p>
     <w:p>
@@ -7379,7 +7629,7 @@
           <w:b w:val="0"/>
           <w:sz w:val="22"/>
         </w:rPr>
-        <w:t xml:space="preserve">Derek told him. He had rehearsed it on the walk without meaning to, the way a man rehearses a phone call to a bank, and it came out in the order the morning had taught him: Sunday's slip, the sheet, the door, the voice, and two seventeens that were not the same.</w:t>
+        <w:t>Derek told him. He had rehearsed it on the walk without meaning to, like a phone call to a bank, and it came out in the order the morning had taught him: Sunday's slip, the sheet, the door, the voice, and two seventeens that were not the same.</w:t>
       </w:r>
     </w:p>
     <w:p>
@@ -7431,7 +7681,7 @@
           <w:b w:val="0"/>
           <w:sz w:val="22"/>
         </w:rPr>
-        <w:t>"Alfred was enjoying it. I could hear him enjoying it from here." A pause, in which, Derek suspected, a ruler was laid very carefully along a line. "Mr Gent, I will tell you what I have drawn, and then I will go back to my afternoon. Your office has a history. It goes up the page, one line, because your office does not go anywhere. Everything that happened in it this morning is a point on that line. The sheet is a point. The door is a point. The voice is a point. They are on one line, and one line has one order. You do not need me to give you the order. You need a pencil."</w:t>
+        <w:t>"Alfred was enjoying it. I could hear him enjoying it from here." A pause, in which, Derek suspected, a ruler was laid carefully along a line. "Mr Gent, I will tell you what I have drawn, and then I will go back to my afternoon. Your office has a history. It goes up the page, one line, because your office does not go anywhere. Everything that happened in it this morning is a point on that line. The sheet is a point. The door is a point. The voice is a point. They are on one line, and one line has one order. You do not need me to give you the order. You need a pencil."</w:t>
       </w:r>
     </w:p>
     <w:p>
@@ -7535,7 +7785,7 @@
           <w:b w:val="0"/>
           <w:sz w:val="22"/>
         </w:rPr>
-        <w:t>Weinstein, who had heard his own name twice and the word homework once, took it with the calm of a man who had been graded in public since he was nineteen.</w:t>
+        <w:t>Weinstein, who had heard his own name twice and the word homework once, took it calmly; he had been graded in public since he was nineteen.</w:t>
       </w:r>
     </w:p>
     <w:p>
@@ -7795,7 +8045,7 @@
           <w:b w:val="0"/>
           <w:sz w:val="22"/>
         </w:rPr>
-        <w:t>Sherlock came in as Sherlock came in, which was not in person. Sherlock was a bottlenose dolphin who had consulted for the Bureau on Case 1047, by methods nobody at the Bureau had ever been able to explain, and who had been paid, at his own insistence, in mackerel.</w:t>
+        <w:t>Sherlock came in as Sherlock always came in: not in person. Sherlock was a bottlenose dolphin who had consulted for the Bureau on Case 1047, by methods nobody at the Bureau had ever been able to explain, and who had been paid, at his own insistence, in mackerel.</w:t>
       </w:r>
     </w:p>
     <w:p>
@@ -7977,20 +8227,20 @@
           <w:b w:val="0"/>
           <w:sz w:val="22"/>
         </w:rPr>
-        <w:t>They did not ring Sophie again. The school had been told. The gate had been refused, twice, by the two people with the right to refuse it. The name sat on Trevor's envelope, unstruck, unexplained and unmoved, which was, Derek thought, the most honest thing on the page; it was the only line on it that did not pretend to know more than it did.</w:t>
-      </w:r>
-    </w:p>
-    <w:p>
-      <w:pPr>
-        <w:spacing w:after="160" w:line="240" w:lineRule="auto"/>
-      </w:pPr>
-      <w:r>
-        <w:rPr>
-          <w:rFonts w:ascii="Georgia" w:hAnsi="Georgia" w:eastAsia="Georgia"/>
-          <w:b w:val="0"/>
-          <w:sz w:val="22"/>
-        </w:rPr>
-        <w:t>The board above them clicked over. The 16:00 to the airport moved up a place. Somewhere in Munich, a man with very good handwriting had gone back to his afternoon, and another had gone back to his clocks, and in an office in London a train that was going nowhere was costing the landlord a fortune in metaphor.</w:t>
+        <w:t>They did not ring Sophie again. The school had been told. The gate had been refused, twice, by the two people with the right to refuse it. The name sat on Trevor's envelope, unstruck, unexplained and unmoved. Derek thought it the most honest thing on the page; it was the only line on it that did not pretend to know more than it did.</w:t>
+      </w:r>
+    </w:p>
+    <w:p>
+      <w:pPr>
+        <w:spacing w:after="160" w:line="240" w:lineRule="auto"/>
+      </w:pPr>
+      <w:r>
+        <w:rPr>
+          <w:rFonts w:ascii="Georgia" w:hAnsi="Georgia" w:eastAsia="Georgia"/>
+          <w:b w:val="0"/>
+          <w:sz w:val="22"/>
+        </w:rPr>
+        <w:t>The board above them clicked over. The 16:00 to the airport moved up a place. Somewhere in Munich, a man with excellent handwriting had gone back to his afternoon, and another had gone back to his clocks, and in an office in London a train that was going nowhere was costing the landlord a fortune in metaphor.</w:t>
       </w:r>
     </w:p>
     <w:p>
@@ -8197,7 +8447,7 @@
           <w:b w:val="0"/>
           <w:sz w:val="22"/>
         </w:rPr>
-        <w:t>She took it. She took the lid off and looked at it and put the lid back on, which was what she did with tea she did not trust, and then drank some anyway.</w:t>
+        <w:t>She took it. She took the lid off and looked at it and put the lid back on, as she did with tea she did not trust, and then drank some anyway.</w:t>
       </w:r>
     </w:p>
     <w:p>
@@ -8275,7 +8525,7 @@
           <w:b w:val="0"/>
           <w:sz w:val="22"/>
         </w:rPr>
-        <w:t>"It's what he's doing. I don't know what he is. I'm not very good at what people are, you know that. I'm good at what they're doing." Trevor stood beside her at the bollard, too tall for the shelter of the doorway behind them and too polite to take it, and the rain began, very gently, to flatten his hair into something closer to a decision. "He's watching it as if it might put her name up again."</w:t>
+        <w:t>"It's what he's doing. I don't know what he is. I'm not very good at what people are, you know that. I'm good at what they're doing." Trevor stood beside her at the bollard, too tall for the shelter of the doorway behind them and too polite to take it, and the rain began, gently, to flatten his hair into something closer to a decision. "He's watching it as if it might put her name up again."</w:t>
       </w:r>
     </w:p>
     <w:p>
@@ -8418,7 +8668,7 @@
           <w:b w:val="0"/>
           <w:sz w:val="22"/>
         </w:rPr>
-        <w:t>Trevor looked at his shoes, which were getting wet in a manner he would later describe as unavoidable.</w:t>
+        <w:t>Trevor studied his shoes, which were getting wet in a manner he would later describe as unavoidable.</w:t>
       </w:r>
     </w:p>
     <w:p>
@@ -8613,7 +8863,7 @@
           <w:b w:val="0"/>
           <w:sz w:val="22"/>
         </w:rPr>
-        <w:t>"No, but it was late in the way the slip's late. It came after the act. It said don't buy the car, and I'd already bought the car." He was talking faster now, the way he did when a problem was turning from a wall into a door. "And when it arrived I thought, that's useless. I thought, she'd gone to all that trouble and it was useless, because you can't send advice backwards. And then I didn't sell the car."</w:t>
+        <w:t>"No, but it was late in the way the slip's late. It came after the act. It said don't buy the car, and I'd already bought the car." He was talking faster now, as he did when a problem was turning from a wall into a door. "And when it arrived I thought, that's useless. I thought, she'd gone to all that trouble and it was useless, because you can't send advice backwards. And then I didn't sell the car."</w:t>
       </w:r>
     </w:p>
     <w:p>
@@ -8717,7 +8967,7 @@
           <w:b w:val="0"/>
           <w:sz w:val="22"/>
         </w:rPr>
-        <w:t>"The sheet doesn't need a sender who's been born. It needs somebody who did something, before five past ten this morning, that put it in the room. That's all. That's the field. Not when were you born. When did you write it." He took his glasses off. The rain got on them immediately, and he looked at them in his hand as if they had betrayed him, and put them in his pocket. "We don't know who. We might never know who. But we've been asking the wrong question since lunch."</w:t>
+        <w:t>"The sheet doesn't need a sender who's been born. It needs somebody who did something, before five past ten this morning, that put it in the room. That's all. That's the field. Not when were you born. When did you write it." He took his glasses off. The rain got on them immediately, and he regarded them in his hand as if they had betrayed him, and put them in his pocket. "We don't know who. We might never know who. But we've been asking the wrong question since lunch."</w:t>
       </w:r>
     </w:p>
     <w:p>
@@ -8769,7 +9019,7 @@
           <w:b w:val="0"/>
           <w:sz w:val="22"/>
         </w:rPr>
-        <w:t>"In a minute." He did not move. He stood there in the rain, a very tall man with wet hair and no glasses, looking at the road. "There was another bit. In green. At the end."</w:t>
+        <w:t>"In a minute." He did not move. He stood there in the rain, a tall man with wet hair and no glasses, looking at the road. "There was another bit. In green. At the end."</w:t>
       </w:r>
     </w:p>
     <w:p>
@@ -8925,7 +9175,7 @@
           <w:b w:val="0"/>
           <w:sz w:val="22"/>
         </w:rPr>
-        <w:t>That was all he said. It was not a procedure. It was not on any form. He had not rehearsed it, and he said it in the same voice he would have used to tell her the boiler was making the noise, and Tabitha, who had been standing in the rain for half an hour without moving, turned and put the empty cup into his hand, which was the nearest the two of them had ever come to an embrace in public.</w:t>
+        <w:t>That was all he said. It was not a procedure. It was not on any form. He had not rehearsed it, and he said it in the same voice he would have used to tell her the boiler was making the noise, and Tabitha, who had been standing in the rain for half an hour without moving, turned and put the empty cup into his hand. It was the nearest the two of them had ever come to an embrace in public.</w:t>
       </w:r>
     </w:p>
     <w:p>
@@ -9055,7 +9305,7 @@
           <w:b w:val="0"/>
           <w:sz w:val="22"/>
         </w:rPr>
-        <w:t xml:space="preserve">"Herbert said it," said Trevor. "My grandmother proved it." He sat down on the metal chairs with the empty cup in his lap and the slip on his knee, and would not explain any further, and nobody asked him to.</w:t>
+        <w:t>"Herbert said it," said Trevor. "My grandmother proved it." He sat down on the metal chairs with the empty cup in his lap and the slip on his knee, and would not explain any further, and no one asked him to.</w:t>
       </w:r>
     </w:p>
     <w:p>
@@ -9158,7 +9408,7 @@
           <w:b w:val="0"/>
           <w:sz w:val="22"/>
         </w:rPr>
-        <w:t>That was all she saw: a grey banner at the top of the screen, the Bureau's name in the capitals her father's office used for everything, and under it the beginning of a second line that the banner had cut off before it became words. Then the banner slid up and away the way banners did, and the phone showed her the lock screen again, which was a photograph of a heron she had taken in Kew and was not prepared to discuss.</w:t>
+        <w:t>That was all she saw: a grey banner at the top of the screen, the Bureau's name in the capitals her father's office used for everything, and under it the beginning of a second line that the banner had cut off before it became words. Then the banner slid up and away, and the phone showed her the lock screen again: a photograph of a heron she had taken in Kew and was not prepared to discuss.</w:t>
       </w:r>
     </w:p>
     <w:p>
@@ -9184,7 +9434,7 @@
           <w:b w:val="0"/>
           <w:sz w:val="22"/>
         </w:rPr>
-        <w:t>She sat on the wall with the sandwich in one hand and the phone in the other and looked at the heron. Priya, beside her, was explaining at length why Mr Okafor was frightened of fractions, a theory that involved his childhood, a divorce, and a pizza. Sophie was not listening. She was doing what her father did when a thing was too big to look at directly, which she had never once admitted to having got from him, and which she had never once pretended not to know about either.</w:t>
+        <w:t>She sat on the wall with the sandwich in one hand and the phone in the other and watched the heron. Priya, beside her, was explaining at length why Mr Okafor was frightened of fractions, a theory that involved his childhood, a divorce, and a pizza. Sophie was not listening. She was doing what her father did when a thing was too big to look at directly, which she had never once admitted to having got from him, and which she had never once pretended not to know about either.</w:t>
       </w:r>
     </w:p>
     <w:p>
@@ -9392,7 +9642,7 @@
           <w:b w:val="0"/>
           <w:sz w:val="22"/>
         </w:rPr>
-        <w:t>Mr Okafor looked at her with the expression of a man who has been hoping, all term, that somebody would.</w:t>
+        <w:t>Mr Okafor looked at her like a man who has been hoping, all term, that somebody would.</w:t>
       </w:r>
     </w:p>
     <w:p>
@@ -9574,7 +9824,7 @@
           <w:b w:val="0"/>
           <w:sz w:val="22"/>
         </w:rPr>
-        <w:t>She wrote nothing down. Her notebook was in her bag, under the PE kit, next to the phone. She did not get it out. She worked through Mr Okafor's sheet, which was about owing people money, and got every question right, and drew, in the margin of the last one, very small, a number line with a zero in the middle and an arrow pointing both ways.</w:t>
+        <w:t>She wrote nothing down. Her notebook was in her bag, under the PE kit, next to the phone. She did not get it out. She worked through Mr Okafor's sheet on owing people money, and got every question right, and drew, in the margin of the last one, tiny, a number line with a zero in the middle and an arrow pointing both ways.</w:t>
       </w:r>
     </w:p>
     <w:p>
@@ -9613,20 +9863,20 @@
           <w:b w:val="0"/>
           <w:sz w:val="22"/>
         </w:rPr>
-        <w:t>Twice, Sophie thought. Twice was data. Once might have been someone being careful. Twice meant someone was frightened and was trying very hard not to look it.</w:t>
-      </w:r>
-    </w:p>
-    <w:p>
-      <w:pPr>
-        <w:spacing w:after="160" w:line="240" w:lineRule="auto"/>
-      </w:pPr>
-      <w:r>
-        <w:rPr>
-          <w:rFonts w:ascii="Georgia" w:hAnsi="Georgia" w:eastAsia="Georgia"/>
-          <w:b w:val="0"/>
-          <w:sz w:val="22"/>
-        </w:rPr>
-        <w:t>She thought about her father, in his office with the frosted glass, being frightened and trying very hard not to look it. He was bad at it. His voice never changed, but his hands did. He straightened things. Once, after a bad case, she had come into the Bureau and found every single object on his desk lined up at right angles, the stapler and the pens and the mug, as if the desk had been told to stand up straight.</w:t>
+        <w:t>Twice, Sophie thought. Twice was data. Once might have been someone being careful. Twice meant someone was frightened and trying hard not to look it.</w:t>
+      </w:r>
+    </w:p>
+    <w:p>
+      <w:pPr>
+        <w:spacing w:after="160" w:line="240" w:lineRule="auto"/>
+      </w:pPr>
+      <w:r>
+        <w:rPr>
+          <w:rFonts w:ascii="Georgia" w:hAnsi="Georgia" w:eastAsia="Georgia"/>
+          <w:b w:val="0"/>
+          <w:sz w:val="22"/>
+        </w:rPr>
+        <w:t>She thought about her father, in his office with the frosted glass, being frightened and trying hard not to look it. He was bad at it. His voice never changed, but his hands did. He straightened things. Once, after a bad case, she had come into the Bureau and found every single object on his desk lined up at right angles, the stapler and the pens and the mug, as if the desk had been told to stand up straight.</w:t>
       </w:r>
     </w:p>
     <w:p>
@@ -9794,7 +10044,7 @@
           <w:b w:val="0"/>
           <w:sz w:val="22"/>
         </w:rPr>
-        <w:t>The hour between the calls and the end of school was the longest of the day, and nobody filled it with anything useful. Weinstein bought a newspaper he did not read and a coffee he described, after one sip, as an argument against the European project. Trevor, back from the pavement with an empty paper cup he would not throw away, sat with the slip and recopied the times onto a second envelope in case the first was confiscated by a pigeon. Penny rang Mrs Marsh twice and was told, twice, that the platform was still a platform, and on the second occasion that the landlord had now sent a second email, which was in capitals, which Mrs Marsh did not hold with. Derek stood. When he sat, he got up again. Every time a family went past with a child in a school jumper, he looked, and every time he made himself look away, and every time Penny watched him do it and said nothing at all, which was its own kind of commentary.</w:t>
+        <w:t>The hour between the calls and the end of school was the longest of the day, and none of them filled it with anything useful. Weinstein bought a newspaper he did not read and a coffee he described, after one sip, as an argument against the European project. Trevor, back from the pavement with an empty paper cup he would not throw away, sat with the slip and recopied the times onto a second envelope in case the first was confiscated by a pigeon. Penny rang Mrs Marsh twice and was told, twice, that the platform was still a platform, and on the second occasion that the landlord had now sent a second email, in capitals, which Mrs Marsh did not hold with. Derek stood. When he sat, he got up again. Every time a family went past with a child in a school jumper, he looked, and every time he made himself look away, and every time Penny watched him do it and said nothing at all. That was its own kind of commentary.</w:t>
       </w:r>
     </w:p>
     <w:p>
@@ -9859,7 +10109,7 @@
           <w:b w:val="0"/>
           <w:sz w:val="22"/>
         </w:rPr>
-        <w:t>He looked down. Trevor's envelope was in his left hand, folded on the crease, and the crease was very sharp.</w:t>
+        <w:t>He looked down. Trevor's envelope was in his left hand, folded on the crease, and the crease was sharp enough to cut.</w:t>
       </w:r>
     </w:p>
     <w:p>
@@ -9976,7 +10226,7 @@
           <w:b w:val="0"/>
           <w:sz w:val="22"/>
         </w:rPr>
-        <w:t>"You'd have struck it to keep you off the floor. That's allowed. It's just not evidence." She turned her cup a quarter turn on the shelf, which was the nearest Penny came to fidgeting. "If we strike her at four, it'll be because she's got no act. If we strike her now, the fear wrote it. And if the fear writes the file, then the next time something frightens us, it writes the next one too, and we'll call that a procedure."</w:t>
+        <w:t>"You'd have struck it to keep you off the floor. That's allowed. It's just not evidence." She turned her cup a quarter turn on the shelf. It was the nearest Penny came to fidgeting. "If we strike her at four, it'll be because she's got no act. If we strike her now, the fear wrote it. And if the fear writes the file, then the next time something frightens us, it writes the next one too, and we'll call that a procedure."</w:t>
       </w:r>
     </w:p>
     <w:p>
@@ -10327,7 +10577,7 @@
           <w:b w:val="0"/>
           <w:sz w:val="22"/>
         </w:rPr>
-        <w:t>Trevor had been sitting at the end of the row of chairs with the slip on his knee, the way a man might sit with a sleeping cat he has been told not to disturb. He looked up.</w:t>
+        <w:t>Trevor had been sitting at the end of the row of chairs with the slip on his knee, like a man with a sleeping cat he has been told not to disturb. He looked up.</w:t>
       </w:r>
     </w:p>
     <w:p>
@@ -10418,7 +10668,7 @@
           <w:b w:val="0"/>
           <w:sz w:val="22"/>
         </w:rPr>
-        <w:t>Weinstein, who had been standing with his back to a pillar studying the departure board as if it owed him money, turned round. "She is right about the loop, the girl," he said. "Your daughter. Not Penny. Penny is also right, but your daughter is right first, and she is right about the harder thing."</w:t>
+        <w:t>Weinstein, who had been standing with his back to a pillar glaring at the departure board as though it owed him money, turned round. "She is right about the loop, the girl," he said. "Your daughter. Not Penny. Penny is also right, but your daughter is right first, and she is right about the harder thing."</w:t>
       </w:r>
     </w:p>
     <w:p>
@@ -10470,7 +10720,7 @@
           <w:b w:val="0"/>
           <w:sz w:val="22"/>
         </w:rPr>
-        <w:t>Tabitha, on the pavement, had heard none of this and understood the posture. She had seen him through the glass of the doors, bent forward on a station chair with a phone in both hands, and she had read it the way she read weather. She came as far as the doors and no further. The glass stayed between them.</w:t>
+        <w:t>Tabitha, on the pavement, had heard none of this and understood the posture. She had seen him through the glass of the doors, bent forward on a station chair with a phone in both hands, and she had read it as she read weather. She came as far as the doors and no further. The glass stayed between them.</w:t>
       </w:r>
     </w:p>
     <w:p>
@@ -10509,7 +10759,7 @@
           <w:b w:val="0"/>
           <w:sz w:val="22"/>
         </w:rPr>
-        <w:t>"Good." She looked at him for a moment, at the hands, at the shoulders, at whatever part of a man shows that he has spent three seconds of the afternoon counting a child's name. "Then you can stop standing like a platform. Come and be a man who has a train to put someone else on."</w:t>
+        <w:t>"Good." She studied him for a moment: the hands, the shoulders, whatever part of a man shows that he has spent three seconds of the afternoon counting a child's name. "Then you can stop standing like a platform. Come and be a man who has a train to put someone else on."</w:t>
       </w:r>
     </w:p>
     <w:p>
@@ -10599,7 +10849,7 @@
           <w:b w:val="0"/>
           <w:sz w:val="22"/>
         </w:rPr>
-        <w:t>At twenty past three the public address system cleared its throat, in the way of public address systems everywhere, and a woman's voice, recorded so long ago that she might by now have retired to the coast, apologised for the late running of the 12:52 from Cardiff Central. The 12:52 from Cardiff Central was already in. It had been in for six minutes. Its passengers were streaming past them towards the Underground, with the faces of people who have already done their suffering and do not wish to hear about it again.</w:t>
+        <w:t>At twenty past three the public address system cleared its throat, as public address systems do everywhere, and a woman's voice, recorded so long ago that she might by now have retired to the coast, apologised for the late running of the 12:52 from Cardiff Central. The 12:52 from Cardiff Central was already in. It had been in for six minutes. Its passengers were streaming past them towards the Underground, with the faces of people who have done their suffering and do not wish to hear about it again.</w:t>
       </w:r>
     </w:p>
     <w:p>
@@ -10638,20 +10888,20 @@
           <w:b w:val="0"/>
           <w:sz w:val="22"/>
         </w:rPr>
-        <w:t>Two minutes later the same recorded voice announced that the 15:36 to Worcester Foregate Street was expected to depart eleven minutes late. A small and very English groan went up from a cluster of people by the coffee stand. One man said something to his phone that the phone did not deserve. A woman with a pushchair turned it round, decisively, and went off to find a sandwich, because the board had told her she had time.</w:t>
-      </w:r>
-    </w:p>
-    <w:p>
-      <w:pPr>
-        <w:spacing w:after="160" w:line="240" w:lineRule="auto"/>
-      </w:pPr>
-      <w:r>
-        <w:rPr>
-          <w:rFonts w:ascii="Georgia" w:hAnsi="Georgia" w:eastAsia="Georgia"/>
-          <w:b w:val="0"/>
-          <w:sz w:val="22"/>
-        </w:rPr>
-        <w:t>Weinstein watched all of this with the delight of a man who has been handed, unexpectedly, a demonstration apparatus.</w:t>
+        <w:t>Two minutes later the same recorded voice announced that the 15:36 to Worcester Foregate Street was expected to depart eleven minutes late. A small and thoroughly English groan went up from a cluster of people by the coffee stand. One man said something to his phone that the phone did not deserve. A woman with a pushchair turned it round, decisively, and went off to find a sandwich, because the board had told her she had time.</w:t>
+      </w:r>
+    </w:p>
+    <w:p>
+      <w:pPr>
+        <w:spacing w:after="160" w:line="240" w:lineRule="auto"/>
+      </w:pPr>
+      <w:r>
+        <w:rPr>
+          <w:rFonts w:ascii="Georgia" w:hAnsi="Georgia" w:eastAsia="Georgia"/>
+          <w:b w:val="0"/>
+          <w:sz w:val="22"/>
+        </w:rPr>
+        <w:t>Weinstein watched all of this with delight, like a man unexpectedly handed a demonstration apparatus.</w:t>
       </w:r>
     </w:p>
     <w:p>
@@ -10794,7 +11044,7 @@
           <w:b w:val="0"/>
           <w:sz w:val="22"/>
         </w:rPr>
-        <w:t>Trevor looked at his envelope, which was full. He turned it over. That was full too, mostly of the sum about the other side of the Sun. He looked about him for paper with the expression of a man whose entire profession had become, for one afternoon, a stationery problem.</w:t>
+        <w:t>Trevor looked at his envelope, which was full. He turned it over. That was full too, mostly of the sum about the other side of the Sun. He looked about him for paper. For one afternoon his entire profession had become a stationery problem.</w:t>
       </w:r>
     </w:p>
     <w:p>
@@ -10833,7 +11083,7 @@
           <w:b w:val="0"/>
           <w:sz w:val="22"/>
         </w:rPr>
-        <w:t xml:space="preserve">Trevor wrote. He had the best handwriting of the three of them, which was not saying a great deal, and he was the only one who could be trusted not to add an adjective. He knelt at the end of the row of metal chairs and used the seat as a desk, while Weinstein read upside down from the far side, which was unnecessary and typical.</w:t>
+        <w:t>Trevor wrote. He had the best handwriting of the three of them, not that this said a great deal, and he was the only one who could be trusted not to add an adjective. He knelt at the end of the row of metal chairs and used the seat as a desk, while Weinstein read upside down from the far side, unnecessarily and typically.</w:t>
       </w:r>
     </w:p>
     <w:p>
@@ -10976,7 +11226,7 @@
           <w:b w:val="0"/>
           <w:sz w:val="22"/>
         </w:rPr>
-        <w:t>Penny took the pencil from Trevor, which was a thing she had never done in his presence before and which he would later describe, to his sister, as like having a tooth removed by a friend. She wrote the last line herself, in her own handwriting, which was faster and less legible than his and entirely unambiguous.</w:t>
+        <w:t>Penny took the pencil from Trevor. She had never done that in his presence before, and he would later describe it, to his sister, as like having a tooth removed by a friend. She wrote the last line herself, in her own handwriting, faster and less legible than his and entirely unambiguous.</w:t>
       </w:r>
     </w:p>
     <w:p>
@@ -11002,20 +11252,20 @@
           <w:b w:val="0"/>
           <w:sz w:val="22"/>
         </w:rPr>
-        <w:t>She handed the pencil back. Nobody said anything about the fact that she had written it.</w:t>
-      </w:r>
-    </w:p>
-    <w:p>
-      <w:pPr>
-        <w:spacing w:after="160" w:line="240" w:lineRule="auto"/>
-      </w:pPr>
-      <w:r>
-        <w:rPr>
-          <w:rFonts w:ascii="Georgia" w:hAnsi="Georgia" w:eastAsia="Georgia"/>
-          <w:b w:val="0"/>
-          <w:sz w:val="22"/>
-        </w:rPr>
-        <w:t>Weinstein read the whole slip upside down from start to finish, moving his lips very slightly on the times, like a man checking a bill.</w:t>
+        <w:t>She handed the pencil back. None of them mentioned that she had written it.</w:t>
+      </w:r>
+    </w:p>
+    <w:p>
+      <w:pPr>
+        <w:spacing w:after="160" w:line="240" w:lineRule="auto"/>
+      </w:pPr>
+      <w:r>
+        <w:rPr>
+          <w:rFonts w:ascii="Georgia" w:hAnsi="Georgia" w:eastAsia="Georgia"/>
+          <w:b w:val="0"/>
+          <w:sz w:val="22"/>
+        </w:rPr>
+        <w:t>Weinstein read the whole slip upside down from start to finish, moving his lips slightly on the times, like a man checking a bill.</w:t>
       </w:r>
     </w:p>
     <w:p>
@@ -11106,7 +11356,7 @@
           <w:b w:val="0"/>
           <w:sz w:val="22"/>
         </w:rPr>
-        <w:t>She ended the call. Penny looked at the phone for a moment with something close to affection.</w:t>
+        <w:t>She ended the call. Penny regarded the phone for a moment with something close to affection.</w:t>
       </w:r>
     </w:p>
     <w:p>
@@ -11158,7 +11408,7 @@
           <w:b w:val="0"/>
           <w:sz w:val="22"/>
         </w:rPr>
-        <w:t>On the board, the sixteen hundred moved one minute closer, which made it the only clock in the building behaving like a public service. Weinstein looked at it, looked at the slip in Trevor's hands, and buttoned the jacket he wore in every weather.</w:t>
+        <w:t>On the board, the sixteen hundred moved one minute closer, which made it the only clock in the building behaving like a public service. Weinstein glanced at it, then at the slip in Trevor's hands, and buttoned the jacket he wore in every weather.</w:t>
       </w:r>
     </w:p>
     <w:p>
@@ -11352,7 +11602,7 @@
           <w:b w:val="0"/>
           <w:sz w:val="22"/>
         </w:rPr>
-        <w:t>"I have learned something about her twice today. Once on a telephone she was not speaking into, and once in a sentence about a notebook. That is more than I have met most of my clients." He looked at the barrier, at the clock above it, and back at Derek. "Children who refuse to file headings they have not read should be given a book with a known error in it. It teaches them that print is not a reason. You will thank me in six years, when she refuses to believe anything you say."</w:t>
+        <w:t>"I have learned something about her twice today. Once on a telephone she was not speaking into, and once in a sentence about a notebook. That is more than I have met most of my clients." His eyes went to the barrier, to the clock above it, and back to Derek. "Children who refuse to file headings they have not read should be given a book with a known error in it. It teaches them that print is not a reason. You will thank me in six years, when she refuses to believe anything you say."</w:t>
       </w:r>
     </w:p>
     <w:p>
@@ -11456,7 +11706,7 @@
           <w:b w:val="0"/>
           <w:sz w:val="22"/>
         </w:rPr>
-        <w:t>Weinstein considered him with real kindness, which in Weinstein looked very much like disappointment.</w:t>
+        <w:t>Weinstein considered him with real kindness, which in Weinstein looked a great deal like disappointment.</w:t>
       </w:r>
     </w:p>
     <w:p>
@@ -11547,7 +11797,7 @@
           <w:b w:val="0"/>
           <w:sz w:val="22"/>
         </w:rPr>
-        <w:t>"Then Mrs Marsh will have a very long correspondence with the landlord, and you will have a very well-measured door." Weinstein glanced at the clock over the barrier, and then, more gently, back at Trevor. "Do not save the form expecting a miracle, Trevor. Save it because it is correct. That is a smaller reward, and it is the only one that has never once let me down."</w:t>
+        <w:t>"Then Mrs Marsh will have a long correspondence with the landlord, and you will have a very well-measured door." Weinstein glanced at the clock over the barrier, and then, more gently, back at Trevor. "Do not save the form expecting a miracle, Trevor. Save it because it is correct. That is a smaller reward, and it is the only one that has never once let me down."</w:t>
       </w:r>
     </w:p>
     <w:p>
@@ -12080,7 +12330,7 @@
           <w:b w:val="0"/>
           <w:sz w:val="22"/>
         </w:rPr>
-        <w:t>He watched him find the carriage. He watched him check the number on the carriage against the number on the ticket, twice. He watched him step up and in, the jacket catching the light at the door, and he watched the shape of him move along behind the windows and sit, very upright, in a seat facing the direction of travel, because Weinstein had once explained at length that facing backwards on a train was a philosophical position he did not hold.</w:t>
+        <w:t>He watched him find the carriage. He watched him check the number on the carriage against the number on the ticket, twice. He watched him step up and in, the jacket catching the light at the door, and he watched the shape of him move along behind the windows and sit, upright, in a seat facing the direction of travel, because Weinstein had once explained at length that facing backwards on a train was a philosophical position he did not hold.</w:t>
       </w:r>
     </w:p>
     <w:p>
@@ -12119,7 +12369,7 @@
           <w:b w:val="0"/>
           <w:sz w:val="22"/>
         </w:rPr>
-        <w:t>It left after he boarded it. That was the whole event. A man on a platform, a door, a seat, then the train going; in that order, in public, in front of a few hundred people, none of whom thought it worth remarking on. The cause was on the platform before the doors shut. The effect pulled out under Brunel's roof towards the light, and every clock in the station agreed about it, and so would every clock on the train, and so would any clock anybody cared to send past at any speed they liked. Derek stood and watched the order happen in public, which was the whole lecture, and felt the other order, door first, warning second, sit down beside it and become ordinary.</w:t>
+        <w:t>It left after he boarded it. That was the whole event. A man on a platform, a door, a seat, then the train going; in that order, in public, in front of a few hundred people, none of whom thought it worth remarking on. The cause was on the platform before the doors shut. The effect pulled out under Brunel's roof towards the light, and every clock in the station agreed about it, and so would every clock on the train, and so would any clock anybody cared to send past at any speed they liked. Derek stood and watched the order happen in public, the whole lecture in one act, and felt the other order, door first, warning second, sit down beside it and become ordinary.</w:t>
       </w:r>
     </w:p>
     <w:p>
@@ -12184,7 +12434,7 @@
           <w:b w:val="0"/>
           <w:sz w:val="22"/>
         </w:rPr>
-        <w:t>His phone rang before they had reached the chairs. Weinstein, already moving; Derek could hear the train under his voice, the particular rising hum of a thing that has committed to leaving.</w:t>
+        <w:t>His phone rang before they had reached the chairs. Weinstein, moving already; Derek could hear the train under his voice, the particular rising hum of a thing that has committed to leaving.</w:t>
       </w:r>
     </w:p>
     <w:p>
@@ -12587,7 +12837,7 @@
           <w:b w:val="0"/>
           <w:sz w:val="22"/>
         </w:rPr>
-        <w:t>The line went dead. Penny looked at the phone, and then at Derek, and for the first time that day she did not have a rule ready.</w:t>
+        <w:t>The line went dead. Penny glanced at the phone, and then at Derek, and for once that day she did not have a rule ready.</w:t>
       </w:r>
     </w:p>
     <w:p>
@@ -12626,7 +12876,7 @@
           <w:b w:val="0"/>
           <w:sz w:val="22"/>
         </w:rPr>
-        <w:t>On the pavement Tabitha was where she had said she would be. She had moved once, perhaps, to stand in a doorway out of a short shower, and then moved back out of it again, on principle, as if the doorway might get ideas. The sentence had already been said. She did not make him repeat it, and she did not ask whether the train had gone; she could see it in the way he walked.</w:t>
+        <w:t>On the pavement Tabitha was where she had said she would be. She had moved once, perhaps, to stand in a doorway out of a short shower, and then moved back out of it again, on principle, as if the doorway might get ideas. The sentence had already been said. She did not make him repeat it, and she did not ask whether the train had gone; she could see it in how he walked.</w:t>
       </w:r>
     </w:p>
     <w:p>
@@ -12729,7 +12979,7 @@
           <w:b w:val="0"/>
           <w:sz w:val="22"/>
         </w:rPr>
-        <w:t>They walked back the way they had come, the long way round, because the short way went past Sophie's school and Tabitha had decided, without discussing it, that it would not.</w:t>
+        <w:t>They walked back the long way round, because the short way went past Sophie's school and Tabitha had decided, without discussing it, that it would not.</w:t>
       </w:r>
     </w:p>
     <w:p>
@@ -12820,7 +13070,7 @@
           <w:b w:val="0"/>
           <w:sz w:val="22"/>
         </w:rPr>
-        <w:t>He knew she hadn't. He walked a little further before he answered, past a launderette with one machine going round and nobody watching it.</w:t>
+        <w:t>He knew she hadn't. He walked a little further before he answered, past a launderette with one machine going round and no one watching it.</w:t>
       </w:r>
     </w:p>
     <w:p>
@@ -12859,33 +13109,33 @@
           <w:b w:val="0"/>
           <w:sz w:val="22"/>
         </w:rPr>
-        <w:t>There had not been a long secret arrangement. There had been the end of last week, and a conversation that had lasted after its reason was finished. She had stayed while he cleared the desk. He had found another thing to clear. Eventually she had asked whether he wanted her to go, and he had managed to answer the question she had asked. It was very little history to put against the ease with which she held his hand. He was glad she was not asking him to make it longer.</w:t>
-      </w:r>
-    </w:p>
-    <w:p>
-      <w:pPr>
-        <w:spacing w:after="160" w:line="240" w:lineRule="auto"/>
-      </w:pPr>
-      <w:r>
-        <w:rPr>
-          <w:rFonts w:ascii="Georgia" w:hAnsi="Georgia" w:eastAsia="Georgia"/>
-          <w:b w:val="0"/>
-          <w:sz w:val="22"/>
-        </w:rPr>
-        <w:t xml:space="preserve">She stopped at the kerb, waiting for the lights, and looked at him sideways with the flat, unhurried look that was, he had learned, the most dangerous thing about her. "Do the form first, Derek. Then come out on to the London side where I'm standing. I'm not going to make you do it in a stairwell."</w:t>
-      </w:r>
-    </w:p>
-    <w:p>
-      <w:pPr>
-        <w:spacing w:after="160" w:line="240" w:lineRule="auto"/>
-      </w:pPr>
-      <w:r>
-        <w:rPr>
-          <w:rFonts w:ascii="Georgia" w:hAnsi="Georgia" w:eastAsia="Georgia"/>
-          <w:b w:val="0"/>
-          <w:sz w:val="22"/>
-        </w:rPr>
-        <w:t>The lights changed. They crossed. By the time they reached the street door of the building, the sky had remembered itself and it was raining again, very lightly, in the way that does not count.</w:t>
+        <w:t>There had not been a long secret arrangement. There had been the end of last week, and a conversation that had lasted after its reason was finished. She had stayed while he cleared the desk. He had found another thing to clear. Eventually she had asked whether he wanted her to go, and he had managed to answer the question she had asked. It was little history to put against the ease with which she held his hand. He was glad she was not asking him to make it longer.</w:t>
+      </w:r>
+    </w:p>
+    <w:p>
+      <w:pPr>
+        <w:spacing w:after="160" w:line="240" w:lineRule="auto"/>
+      </w:pPr>
+      <w:r>
+        <w:rPr>
+          <w:rFonts w:ascii="Georgia" w:hAnsi="Georgia" w:eastAsia="Georgia"/>
+          <w:b w:val="0"/>
+          <w:sz w:val="22"/>
+        </w:rPr>
+        <w:t>She stopped at the kerb, waiting for the lights, and gave him the flat, unhurried sideways look that was, he had learned, the most dangerous thing about her. "Do the form first, Derek. Then come out on to the London side where I'm standing. I'm not going to make you do it in a stairwell."</w:t>
+      </w:r>
+    </w:p>
+    <w:p>
+      <w:pPr>
+        <w:spacing w:after="160" w:line="240" w:lineRule="auto"/>
+      </w:pPr>
+      <w:r>
+        <w:rPr>
+          <w:rFonts w:ascii="Georgia" w:hAnsi="Georgia" w:eastAsia="Georgia"/>
+          <w:b w:val="0"/>
+          <w:sz w:val="22"/>
+        </w:rPr>
+        <w:t>The lights changed. They crossed. By the time they reached the street door of the building, the sky had remembered itself and it was raining again, lightly, in the way that does not count.</w:t>
       </w:r>
     </w:p>
     <w:p>
@@ -12911,7 +13161,7 @@
           <w:b w:val="0"/>
           <w:sz w:val="22"/>
         </w:rPr>
-        <w:t xml:space="preserve">Derek had known it would be. He had known it all the way back, on foot, with Tabitha's hand in his. He had known it on the stairs, and on the landing, where Mrs Marsh rose from her step at their approach with the clipboard already raised and Penny and Trevor stood behind her, not going in. He knew it, and then he came into his office and saw it, and found that knowing a thing and seeing it were still, after all this, two separate events.</w:t>
+        <w:t>Derek had known it would be. He had known it all the way back, on foot, with Tabitha's hand in his. He had known it on the stairs, and on the landing, where Mrs Marsh rose from her step at their approach with the clipboard raised and Penny and Trevor stood behind her, not going in. He knew it, and then he came into his office and saw it, and found that knowing a thing and seeing it were still, after all this, two separate events.</w:t>
       </w:r>
     </w:p>
     <w:p>
@@ -12989,20 +13239,20 @@
           <w:b w:val="0"/>
           <w:sz w:val="22"/>
         </w:rPr>
-        <w:t xml:space="preserve">Nobody looked anywhere else. The paint crept the way a minute hand creeps: you could not see it go, and you could see that it had gone.</w:t>
-      </w:r>
-    </w:p>
-    <w:p>
-      <w:pPr>
-        <w:spacing w:after="160" w:line="240" w:lineRule="auto"/>
-      </w:pPr>
-      <w:r>
-        <w:rPr>
-          <w:rFonts w:ascii="Georgia" w:hAnsi="Georgia" w:eastAsia="Georgia"/>
-          <w:b w:val="0"/>
-          <w:sz w:val="22"/>
-        </w:rPr>
-        <w:t xml:space="preserve">"It doesn't need him to step on." Trevor's voice had gone very level, which in Trevor meant the opposite. "If it comes far enough, it comes to the desk. Then he's standing on a platform without having moved, and the doors are open, and—" He stopped, because he had worked out the end of the sentence and did not want it in the room.</w:t>
+        <w:t>Nobody looked anywhere else. The paint crept like a minute hand: you could not see it go, and you could see that it had gone.</w:t>
+      </w:r>
+    </w:p>
+    <w:p>
+      <w:pPr>
+        <w:spacing w:after="160" w:line="240" w:lineRule="auto"/>
+      </w:pPr>
+      <w:r>
+        <w:rPr>
+          <w:rFonts w:ascii="Georgia" w:hAnsi="Georgia" w:eastAsia="Georgia"/>
+          <w:b w:val="0"/>
+          <w:sz w:val="22"/>
+        </w:rPr>
+        <w:t>"It doesn't need him to step on." Trevor's voice had gone dead level, which in Trevor meant the opposite. "If it comes far enough, it comes to the desk. Then he's standing on a platform without having moved, and the doors are open, and—" He stopped, because he had worked out the end of the sentence and did not want it in the room.</w:t>
       </w:r>
     </w:p>
     <w:p>
@@ -13041,20 +13291,20 @@
           <w:b w:val="0"/>
           <w:sz w:val="22"/>
         </w:rPr>
-        <w:t xml:space="preserve">They both looked at him. It was not a word he used in the office. He used it on the telephone, to clients who wanted him to promise they would not be murdered, and on Sophie, rarely, and badly.</w:t>
-      </w:r>
-    </w:p>
-    <w:p>
-      <w:pPr>
-        <w:spacing w:after="160" w:line="240" w:lineRule="auto"/>
-      </w:pPr>
-      <w:r>
-        <w:rPr>
-          <w:rFonts w:ascii="Georgia" w:hAnsi="Georgia" w:eastAsia="Georgia"/>
-          <w:b w:val="0"/>
-          <w:sz w:val="22"/>
-        </w:rPr>
-        <w:t xml:space="preserve">"We haven't refused anything. We've not boarded. That isn't the same. Not boarding is a thing that keeps not happening. You can't put a time on it." He found he knew this the way he knew the floor. "If Trevor types BOARDING REFUSED with that door standing open, it's a forecast. It's a sentence about what I'm going to do. The platform's got no reason to believe a forecast. Neither have I."</w:t>
+        <w:t>They both turned to him. It was not a word he used in the office. He used it on the telephone, to clients who wanted him to promise they would not be murdered, and on Sophie, rarely, and badly.</w:t>
+      </w:r>
+    </w:p>
+    <w:p>
+      <w:pPr>
+        <w:spacing w:after="160" w:line="240" w:lineRule="auto"/>
+      </w:pPr>
+      <w:r>
+        <w:rPr>
+          <w:rFonts w:ascii="Georgia" w:hAnsi="Georgia" w:eastAsia="Georgia"/>
+          <w:b w:val="0"/>
+          <w:sz w:val="22"/>
+        </w:rPr>
+        <w:t>"We haven't refused anything. We've not boarded. That isn't the same. Not boarding is a thing that keeps not happening. You can't put a time on it." He found he knew this as surely as the floor. "If Trevor types BOARDING REFUSED with that door standing open, it's a forecast. It's a sentence about what I'm going to do. The platform's got no reason to believe a forecast. Neither have I."</w:t>
       </w:r>
     </w:p>
     <w:p>
@@ -13145,7 +13395,7 @@
           <w:b w:val="0"/>
           <w:sz w:val="22"/>
         </w:rPr>
-        <w:t xml:space="preserve">He said it in the voice he used for tea. Then he turned his back on the open door, which was the hardest thing he had done with his body since he had learned to walk, and stepped off the yellow line onto the carpet, and put the sheet back in his pocket, and went to the desk, and put his hand on the back of Trevor's chair.</w:t>
+        <w:t>He said it in the voice he used for tea. Then he turned his back on the open door, the hardest thing he had done with his body since he had learned to walk, and stepped off the yellow line onto the carpet, and put the sheet back in his pocket, and went to the desk, and put his hand on the back of Trevor's chair.</w:t>
       </w:r>
     </w:p>
     <w:p>
@@ -13171,20 +13421,20 @@
           <w:b w:val="0"/>
           <w:sz w:val="22"/>
         </w:rPr>
-        <w:t xml:space="preserve">Trevor looked at the office clock. "Sixteen forty-one."</w:t>
-      </w:r>
-    </w:p>
-    <w:p>
-      <w:pPr>
-        <w:spacing w:after="160" w:line="240" w:lineRule="auto"/>
-      </w:pPr>
-      <w:r>
-        <w:rPr>
-          <w:rFonts w:ascii="Georgia" w:hAnsi="Georgia" w:eastAsia="Georgia"/>
-          <w:b w:val="0"/>
-          <w:sz w:val="22"/>
-        </w:rPr>
-        <w:t>Behind Derek, without a beep, the carriage door slid shut. Nobody heard it. Trevor saw it in the window glass, and said afterwards that it had closed the way a door closes when somebody has finally answered the question it was asking. The paint on the carpet stopped. The slab stood forty-six millimetres past its original position against the fixed scale, and stayed there.</w:t>
+        <w:t>Trevor checked the office clock. "Sixteen forty-one."</w:t>
+      </w:r>
+    </w:p>
+    <w:p>
+      <w:pPr>
+        <w:spacing w:after="160" w:line="240" w:lineRule="auto"/>
+      </w:pPr>
+      <w:r>
+        <w:rPr>
+          <w:rFonts w:ascii="Georgia" w:hAnsi="Georgia" w:eastAsia="Georgia"/>
+          <w:b w:val="0"/>
+          <w:sz w:val="22"/>
+        </w:rPr>
+        <w:t>Behind Derek, without a beep, the carriage door slid shut. Nobody heard it. Trevor saw it in the window glass, and said afterwards that it had closed like a door when somebody has finally answered the question it was asking. The paint on the carpet stopped. The slab stood forty-six millimetres past its original position against the fixed scale, and stayed there.</w:t>
       </w:r>
     </w:p>
     <w:p>
@@ -13236,7 +13486,7 @@
           <w:b w:val="0"/>
           <w:sz w:val="22"/>
         </w:rPr>
-        <w:t xml:space="preserve">He sat down and typed with two fingers, which was how he typed everything, and this time the form took the record he was making. It did not argue. It did not grey anything out. It did not offer to become the morning sheet.</w:t>
+        <w:t>He sat down and typed with two fingers, as he typed everything, and this time the form took the record he was making. It did not argue. It did not grey anything out. It did not offer to become the morning sheet.</w:t>
       </w:r>
     </w:p>
     <w:p>
@@ -13587,7 +13837,7 @@
           <w:b w:val="0"/>
           <w:sz w:val="22"/>
         </w:rPr>
-        <w:t xml:space="preserve">Derek found that he was breathing in an entirely ordinary way, in and out, the way he had breathed every day of his life before a Tuesday not long ago, and that his hands, for once, had nothing to straighten.</w:t>
+        <w:t>Derek found that he was breathing in an entirely ordinary way, in and out, as he had breathed every day of his life before a Tuesday not long ago, and that his hands, for once, had nothing to straighten.</w:t>
       </w:r>
     </w:p>
     <w:p>
@@ -13808,7 +14058,7 @@
           <w:b w:val="0"/>
           <w:sz w:val="22"/>
         </w:rPr>
-        <w:t>Derek went to the door. It was not a decision so much as a habit, the hand reaching for the handle at the end of a day the way it always had. He swung it. It travelled its third of an arc and met the platform, the soft stop of station air, and would not shut. He pushed once more, not hard. Then he stopped pushing.</w:t>
+        <w:t>Derek went to the door. It was not a decision so much as a habit, the hand reaching for the handle at the end of a day as it always had. He swung it. It travelled its third of an arc and met the platform, the soft stop of station air, and would not shut. He pushed once more, not hard. Then he stopped pushing.</w:t>
       </w:r>
     </w:p>
     <w:p>
@@ -13899,7 +14149,7 @@
           <w:b w:val="0"/>
           <w:sz w:val="22"/>
         </w:rPr>
-        <w:t>Penny watched the itinerary, not them. She had taken it out of her bag and unfolded it on her knee, and was reading the flight times with great attention, as if they might have changed since the morning. "Thursday week," she said, to the itinerary. "He'll get the number. You two can have the corridor. The corridor still contains a railway, so I'd keep it brief."</w:t>
+        <w:t>Penny watched the itinerary, not them. She had taken it out of her bag and unfolded it on her knee, and was reading the flight times with great attention, in case they had changed since the morning. "Thursday week," she said, to the itinerary. "He'll get the number. You two can have the corridor. The corridor still contains a railway, so I'd keep it brief."</w:t>
       </w:r>
     </w:p>
     <w:p>
@@ -14054,7 +14304,7 @@
           <w:b w:val="0"/>
           <w:sz w:val="22"/>
         </w:rPr>
-        <w:t>Trevor left at twenty to six, with the tape measure rolled up in his coat pocket and the expression of a man who has done a full day's work and is not sure what any of it was. He said goodnight to the filing cabinet, out of habit, and then to Derek, and then, after a visible internal struggle, to the platform.</w:t>
+        <w:t>Trevor left at twenty to six, with the tape measure rolled up in his coat pocket, looking like a man who had done a full day's work and was not sure what any of it was. He said goodnight to the filing cabinet, out of habit, and then to Derek, and then, after a visible internal struggle, to the platform.</w:t>
       </w:r>
     </w:p>
     <w:p>
@@ -14145,7 +14395,7 @@
           <w:b w:val="0"/>
           <w:sz w:val="22"/>
         </w:rPr>
-        <w:t>Mrs Marsh came up them more slowly than she had all day. She was carrying the clipboard, as always, and under it a hardbacked book with a marbled cover that neither of them had seen before, held flat against her chest the way people hold things they have decided to hand over and have not yet let go of. She came through the outer room. She did not look at the platform. She stopped in the doorway of Derek's office, on the London side of the sill, and stood there.</w:t>
+        <w:t>Mrs Marsh came up them more slowly than she had all day. She was carrying the clipboard, as always, and under it a hardbacked book with a marbled cover that neither of them had seen before, held flat against her chest, as people hold things they have decided to hand over and have not yet let go of. She came through the outer room. She did not look at the platform. She stopped in the doorway of Derek's office, on the London side of the sill, and stood there.</w:t>
       </w:r>
     </w:p>
     <w:p>
@@ -14236,7 +14486,7 @@
           <w:b w:val="0"/>
           <w:sz w:val="22"/>
         </w:rPr>
-        <w:t>"I did not say anything at the time. I wished to check." She turned the book round on the clipboard so that they could read it, and put one finger, very precisely, under a line.</w:t>
+        <w:t>"I did not say anything at the time. I wished to check." She turned the book round on the clipboard so that they could read it, and put one finger, precisely, under a line.</w:t>
       </w:r>
     </w:p>
     <w:p>
@@ -14275,7 +14525,7 @@
           <w:b w:val="0"/>
           <w:sz w:val="22"/>
         </w:rPr>
-        <w:t>"The landlord telephoned me on Sunday afternoon." It was exactly the voice she used for leaks. "He said the radiator in your office had been making a noise that the tenant below had complained about. I told him it had been making that noise for eleven years. He said that was not an answer. I came up at six with the key. I opened your door. I bled the radiator. I locked your door at nine minutes past. There was nothing beyond your door but your office." She paused. "There was no platform. There was your desk, and the kettle, and a glass object on Mr Boltzman's desk that I did not touch."</w:t>
+        <w:t>"The landlord telephoned me on Sunday afternoon." It was the voice she used for leaks. "He said the radiator in your office had been making a noise that the tenant below had complained about. I told him it had been making that noise for eleven years. He said that was not an answer. I came up at six with the key. I opened your door. I bled the radiator. I locked your door at nine minutes past. There was nothing beyond your door but your office." She paused. "There was no platform. There was your desk, and the kettle, and a glass object on Mr Boltzman's desk that I did not touch."</w:t>
       </w:r>
     </w:p>
     <w:p>
@@ -14535,7 +14785,7 @@
           <w:b w:val="0"/>
           <w:sz w:val="22"/>
         </w:rPr>
-        <w:t>"That is a very convenient sentence."</w:t>
+        <w:t>"That is a convenient sentence."</w:t>
       </w:r>
     </w:p>
     <w:p>
@@ -14613,7 +14863,7 @@
           <w:b w:val="0"/>
           <w:sz w:val="22"/>
         </w:rPr>
-        <w:t>"Mr Gent. For something to be a cause, it must be in the past of its effect. This is necessary. It is not sufficient. Your Sunday is in the past of your Monday. So is everything else that happened in London on Sunday. So is everything that happened on Saturday, and in the eighteenth century, and in the Cretaceous. The past of any event is very large. It contains a great many things that were nowhere near it." A pause, very slightly kinder than his pauses usually were. "If you wish to say a particular thing was the cause, you must show more than that it came first. You must show how it got from there to here. Did the person do anything to the door that is still in the door?"</w:t>
+        <w:t>"Mr Gent. For something to be a cause, it must be in the past of its effect. This is necessary. It is not sufficient. Your Sunday is in the past of your Monday. So is everything else that happened in London on Sunday. So is everything that happened on Saturday, and in the eighteenth century, and in the Cretaceous. The past of any event is very large. It contains a great many things that were nowhere near it." A pause, slightly kinder than his pauses usually were. "If you wish to say a particular thing was the cause, you must show more than that it came first. You must show how it got from there to here. Did the person do anything to the door that is still in the door?"</w:t>
       </w:r>
     </w:p>
     <w:p>
@@ -14665,7 +14915,7 @@
           <w:b w:val="0"/>
           <w:sz w:val="22"/>
         </w:rPr>
-        <w:t>Mrs Marsh stood very still in the doorway with the marbled book open on her clipboard. Derek watched her take the sentence and turn it over and check the back of it for anything written there, the way Tuppence had at lunch, and the way she checked every form that had ever crossed her desk.</w:t>
+        <w:t>Mrs Marsh stood still in the doorway with the marbled book open on her clipboard. Derek watched her take the sentence and turn it over and check the back of it for anything written there, as Tuppence had at lunch, and as she checked every form that had ever crossed her desk.</w:t>
       </w:r>
     </w:p>
     <w:p>
@@ -14730,7 +14980,7 @@
           <w:b w:val="0"/>
           <w:sz w:val="22"/>
         </w:rPr>
-        <w:t xml:space="preserve">Penny took a sheet of the Bureau's paper from the tray and wrote on it, in her own fast hand. She did not ask permission. She wrote it the way she had written Sophie's line on the back of the Sunday slip, and when she had finished she turned it round so that Mrs Marsh could read it.</w:t>
+        <w:t>Penny took a sheet of the Bureau's paper from the tray and wrote on it, in her own fast hand. She did not ask permission. She wrote it as she had written Sophie's line on the back of the Sunday slip, and when she had finished she turned it round so that Mrs Marsh could read it.</w:t>
       </w:r>
     </w:p>
     <w:p>
@@ -14977,7 +15227,7 @@
           <w:b w:val="0"/>
           <w:sz w:val="22"/>
         </w:rPr>
-        <w:t>Penny looked at the platform, at the train, at the word. It was getting dark outside now, properly dark, and the lit windows of the carriage were brighter than the office.</w:t>
+        <w:t>Penny took in the platform, the train, the word. It was getting dark outside now, properly dark, and the lit windows of the carriage were brighter than the office.</w:t>
       </w:r>
     </w:p>
     <w:p>
@@ -15288,7 +15538,7 @@
           <w:b w:val="0"/>
           <w:sz w:val="22"/>
         </w:rPr>
-        <w:t>Sophie came down at the second call, which was early for her. She was carrying the notebook, the one that was hers, which came out at the kitchen table only when she wanted somebody to see her not showing it to them. She put it beside her plate, closed. She ate the pasta. She did not speak until she had finished it, which was, in Tuppence's experience, a sign that the speaking was going to be precise.</w:t>
+        <w:t>Sophie came down at the second call, early for her. She was carrying the notebook, the one that was hers, which came out at the kitchen table only when she wanted somebody to see her not showing it to them. She put it beside her plate, closed. She ate the pasta. She did not speak until she had finished it. In Tuppence's experience that was a sign that the speaking was going to be precise.</w:t>
       </w:r>
     </w:p>
     <w:p>
@@ -15366,7 +15616,7 @@
           <w:b w:val="0"/>
           <w:sz w:val="22"/>
         </w:rPr>
-        <w:t>"The heading came. On my phone. On the wall by the science block. It came and it went, and I didn't open it, and I didn't fetch it back." Sophie said it the way she had said it in the text to her father, word for word, and Tuppence understood that she had said it to herself a good many times since lunch. "So I wrote 12:49. And then I crossed it out."</w:t>
+        <w:t>"The heading came. On my phone. On the wall by the science block. It came and it went, and I didn't open it, and I didn't fetch it back." Sophie said it as she had in the text to her father, word for word, and Tuppence understood that she had said it to herself a good many times since lunch. "So I wrote 12:49. And then I crossed it out."</w:t>
       </w:r>
     </w:p>
     <w:p>
@@ -15522,7 +15772,7 @@
           <w:b w:val="0"/>
           <w:sz w:val="22"/>
         </w:rPr>
-        <w:t>Julian turned the tap back on, very quietly, and then off again, and came and sat down at the end of the table with the beech hanger, which he had picked up again on his way past the worktop. He turned it over in his hands. He did not offer an opinion. He had a rule about not offering opinions on Sophie's notebook unless asked, and he had never once been asked, and he kept the rule anyway.</w:t>
+        <w:t>Julian turned the tap back on, quietly, and then off again, and came and sat down at the end of the table with the beech hanger, which he had picked up again on his way past the worktop. He turned it over in his hands. He did not offer an opinion. He had a rule about not offering opinions on Sophie's notebook unless asked, and he had never once been asked, and he kept the rule anyway.</w:t>
       </w:r>
     </w:p>
     <w:p>
@@ -15574,20 +15824,20 @@
           <w:b w:val="0"/>
           <w:sz w:val="22"/>
         </w:rPr>
-        <w:t>"It's about hangers. When I make one, I write the date on the hook end, in pencil, underneath, where nobody looks. The date I finished it. Not the date I started, because sometimes I start one and leave it for a month. Not the date somebody buys it. The day the last thing was done to it." He turned this one round to show her: on the underside of the hook, very small, nothing yet. "This one hasn't got a date because it isn't finished. The shoulder's wrong. When it's finished, it gets a date. If it never gets finished, it never gets one. That's not a mistake. It's just the truth about the hanger."</w:t>
-      </w:r>
-    </w:p>
-    <w:p>
-      <w:pPr>
-        <w:spacing w:after="160" w:line="240" w:lineRule="auto"/>
-      </w:pPr>
-      <w:r>
-        <w:rPr>
-          <w:rFonts w:ascii="Georgia" w:hAnsi="Georgia" w:eastAsia="Georgia"/>
-          <w:b w:val="0"/>
-          <w:sz w:val="22"/>
-        </w:rPr>
-        <w:t>Sophie looked at the blank underside of the hook for a long moment.</w:t>
+        <w:t>"It's about hangers. When I make one, I write the date on the hook end, in pencil, underneath, where nobody looks. The date I finished it. Not the date I started, because sometimes I start one and leave it for a month. Not the date somebody buys it. The day the last thing was done to it." He turned this one round to show her: on the underside of the hook, where a date would go, nothing yet. "This one hasn't got a date because it isn't finished. The shoulder's wrong. When it's finished, it gets a date. If it never gets finished, it never gets one. That's not a mistake. It's just the truth about the hanger."</w:t>
+      </w:r>
+    </w:p>
+    <w:p>
+      <w:pPr>
+        <w:spacing w:after="160" w:line="240" w:lineRule="auto"/>
+      </w:pPr>
+      <w:r>
+        <w:rPr>
+          <w:rFonts w:ascii="Georgia" w:hAnsi="Georgia" w:eastAsia="Georgia"/>
+          <w:b w:val="0"/>
+          <w:sz w:val="22"/>
+        </w:rPr>
+        <w:t>Sophie considered the blank underside of the hook for a long moment.</w:t>
       </w:r>
     </w:p>
     <w:p>
@@ -15626,7 +15876,7 @@
           <w:b w:val="0"/>
           <w:sz w:val="22"/>
         </w:rPr>
-        <w:t>"No, that's right." She took a pencil out of the spine. "Nothing finished. Nothing started. A heading came, and that's the heading's. I didn't do anything. So there isn't a time for me. There's only a date, because it was today, and the line." She wrote, under the date, in the square capitals: Asked not to file what I didn't see. She looked at it. Then she drew a ruler line under it, very straight, and shut the notebook. "There. That's the whole line."</w:t>
+        <w:t>"No, that's right." She took a pencil out of the spine. "Nothing finished. Nothing started. A heading came, and that's the heading's. I didn't do anything. So there isn't a time for me. There's only a date, because it was today, and the line." She wrote, under the date, in the square capitals: Asked not to file what I didn't see. She looked at it. Then she ruled a line under it, dead straight, and shut the notebook. "There. That's the whole line."</w:t>
       </w:r>
     </w:p>
     <w:p>
@@ -15704,7 +15954,7 @@
           <w:b w:val="0"/>
           <w:sz w:val="22"/>
         </w:rPr>
-        <w:t xml:space="preserve">Sophie was at the desk, doing homework that she had already done, in the way of somebody who wants to be in the room with her mother without having to say so. The notebook lay beside the homework, open at an earlier page, and Tuppence, who did not read other people's notebooks, could not help seeing the heading at the top of it, because it was in capitals and underlined twice: DAD'S KITCHEN CLOCK.</w:t>
+        <w:t>Sophie was at the desk, doing homework that she had already done, like somebody who wants to be in the room with her mother without having to say so. The notebook lay beside the homework, open at an earlier page, and Tuppence, who did not read other people's notebooks, could not help seeing the heading at the top of it, because it was in capitals and underlined twice: DAD'S KITCHEN CLOCK.</w:t>
       </w:r>
     </w:p>
     <w:p>
@@ -16120,7 +16370,7 @@
           <w:b w:val="0"/>
           <w:sz w:val="22"/>
         </w:rPr>
-        <w:t>Downstairs, Julian had washed up and was sitting at the kitchen table with the beech hanger and a strip of fine sandpaper, working at the shoulder he did not like. He looked up when she came in, and did not ask, because he did not need to; he had heard the promise through the floor, the way you hear most things in a house that size.</w:t>
+        <w:t>Downstairs, Julian had washed up and was sitting at the kitchen table with the beech hanger and a strip of fine sandpaper, working at the shoulder he did not like. He looked up when she came in, and did not ask, because he did not need to; he had heard the promise through the floor, as you hear most things in a house that size.</w:t>
       </w:r>
     </w:p>
     <w:p>
@@ -16146,7 +16396,7 @@
           <w:b w:val="0"/>
           <w:sz w:val="22"/>
         </w:rPr>
-        <w:t xml:space="preserve">She looked at Derek's name for some time. Then she took the clipboard out of her bag, the one she chaired things with, and turned back two pages to a line in her own hand, written at twenty to two on Sunday morning, in the second of the two one o'clocks: WEDNESDAYS: D., AFTER SCHOOL. She had told Sophie at tea on Sunday, in the voice. She had not told Derek.</w:t>
+        <w:t>She contemplated Derek's name for some time. Then she took the clipboard out of her bag, the one she chaired things with, and turned back two pages to a line in her own hand, written at twenty to two on Sunday morning, in the second of the two one o'clocks: WEDNESDAYS: D., AFTER SCHOOL. She had told Sophie at tea on Sunday, in the voice. She had not told Derek.</w:t>
       </w:r>
     </w:p>
     <w:p>
@@ -16522,7 +16772,7 @@
           <w:b w:val="0"/>
           <w:sz w:val="22"/>
         </w:rPr>
-        <w:t>She looked at the sum for a while. Something in it was bothering her, and she could not find it, the way you cannot find a smell in a room once you have been sitting in it long enough.</w:t>
+        <w:t>She sat over the sum for a while. Something in it was bothering her, and she could not find it, as you cannot find a smell in a room once you have been sitting in it long enough.</w:t>
       </w:r>
     </w:p>
     <w:p>
@@ -16730,7 +16980,7 @@
           <w:b w:val="0"/>
           <w:sz w:val="22"/>
         </w:rPr>
-        <w:t>Penny sat back in her chair. Outside, a bus went past in the rain, lit at all its windows, full of people who were going somewhere ordinary, and she found she had looked at it the way she had spent the day looking at a train.</w:t>
+        <w:t>Penny sat back in her chair. Outside, a bus went past in the rain, lit at all its windows, full of people who were going somewhere ordinary, and she found she had watched it as she had spent the day watching a train.</w:t>
       </w:r>
     </w:p>
     <w:p>
@@ -16938,7 +17188,7 @@
           <w:b w:val="0"/>
           <w:sz w:val="22"/>
         </w:rPr>
-        <w:t xml:space="preserve">Penny looked at the ten and a half on the itinerary, and at the x3 in the margin beside it, and at the four of them standing against the sugar bowl.</w:t>
+        <w:t>Penny considered the ten and a half on the itinerary, and the x3 in the margin beside it, and at the four of them standing against the sugar bowl.</w:t>
       </w:r>
     </w:p>
     <w:p>
@@ -17094,7 +17344,7 @@
           <w:b w:val="0"/>
           <w:sz w:val="22"/>
         </w:rPr>
-        <w:t>A silence came down the line. It went on long enough that she thought for a moment the call had dropped, and then she heard him breathing, slowly, the way he breathed when he was standing at the edge of a thing and deciding whether to say it.</w:t>
+        <w:t>A silence came down the line. It went on long enough that she thought for a moment the call had dropped, and then she heard him breathing, slowly, as he breathed when he was standing at the edge of a thing and deciding whether to say it.</w:t>
       </w:r>
     </w:p>
     <w:p>
@@ -17172,7 +17422,7 @@
           <w:b w:val="0"/>
           <w:sz w:val="22"/>
         </w:rPr>
-        <w:t>"Well, there you are." Trevor sounded pleased and slightly embarrassed, the way he did when someone else had been cleverer than him first. "He knew."</w:t>
+        <w:t>"Well, there you are." Trevor sounded pleased and slightly embarrassed, as he did when someone else had been cleverer than him first. "He knew."</w:t>
       </w:r>
     </w:p>
     <w:p>
@@ -17639,20 +17889,20 @@
           <w:b w:val="0"/>
           <w:sz w:val="22"/>
         </w:rPr>
-        <w:t>He had not meant to. He had meant to stay for a bit, as he had told Penny, and the bit had a way of becoming another bit, the way the evenings had once become shut doors. He made a cup of tea at seven and did not drink it. He made another at eight and drank half. He rang out for nothing and ate nothing. He sat in his own chair, behind his own desk, and turned it, for the first time all day, to face the doorway square.</w:t>
-      </w:r>
-    </w:p>
-    <w:p>
-      <w:pPr>
-        <w:spacing w:after="160" w:line="240" w:lineRule="auto"/>
-      </w:pPr>
-      <w:r>
-        <w:rPr>
-          <w:rFonts w:ascii="Georgia" w:hAnsi="Georgia" w:eastAsia="Georgia"/>
-          <w:b w:val="0"/>
-          <w:sz w:val="22"/>
-        </w:rPr>
-        <w:t>The platform at night was not very different from the platform at ten in the morning. That was the first thing he noticed. The lamp at the far end had not got brighter. The lit windows of the carriage had not changed. The white clock on the far pillar went round at the same rate as every clock in London, as Trevor had shown it did, and told the time it had been telling all day. The board said YESTERDAY.</w:t>
+        <w:t>He had not meant to. He had meant to stay for a bit, as he had told Penny, and the bit had a habit of becoming another bit, as the evenings had once become shut doors. He made a cup of tea at seven and did not drink it. He made another at eight and drank half. He rang out for nothing and ate nothing. He sat in his own chair, behind his own desk, and turned it, for the first time all day, to face the doorway square.</w:t>
+      </w:r>
+    </w:p>
+    <w:p>
+      <w:pPr>
+        <w:spacing w:after="160" w:line="240" w:lineRule="auto"/>
+      </w:pPr>
+      <w:r>
+        <w:rPr>
+          <w:rFonts w:ascii="Georgia" w:hAnsi="Georgia" w:eastAsia="Georgia"/>
+          <w:b w:val="0"/>
+          <w:sz w:val="22"/>
+        </w:rPr>
+        <w:t>The platform at night was not much different from the platform at ten in the morning. That was the first thing he noticed. The lamp at the far end had not got brighter. The lit windows of the carriage had not changed. The white clock on the far pillar went round at the same rate as every clock in London, as Trevor had shown it did, and told the time it had been telling all day. The board said YESTERDAY.</w:t>
       </w:r>
     </w:p>
     <w:p>
@@ -17678,20 +17928,20 @@
           <w:b w:val="0"/>
           <w:sz w:val="22"/>
         </w:rPr>
-        <w:t>He looked at that for a long time.</w:t>
-      </w:r>
-    </w:p>
-    <w:p>
-      <w:pPr>
-        <w:spacing w:after="160" w:line="240" w:lineRule="auto"/>
-      </w:pPr>
-      <w:r>
-        <w:rPr>
-          <w:rFonts w:ascii="Georgia" w:hAnsi="Georgia" w:eastAsia="Georgia"/>
-          <w:b w:val="0"/>
-          <w:sz w:val="22"/>
-        </w:rPr>
-        <w:t xml:space="preserve">It was, he thought, almost the whole lecture. The light came across the sill without being asked, and reached him, and nothing of his had to go back the other way for that to happen. Seeing was not boarding. Being lit by a thing was not being on it. What reaches you is in your past; what you reach is in your future; and a man sitting very still in a chair can be reached by a thing all night without once reaching back, for as long as he likes.</w:t>
+        <w:t>He sat with that for a long time.</w:t>
+      </w:r>
+    </w:p>
+    <w:p>
+      <w:pPr>
+        <w:spacing w:after="160" w:line="240" w:lineRule="auto"/>
+      </w:pPr>
+      <w:r>
+        <w:rPr>
+          <w:rFonts w:ascii="Georgia" w:hAnsi="Georgia" w:eastAsia="Georgia"/>
+          <w:b w:val="0"/>
+          <w:sz w:val="22"/>
+        </w:rPr>
+        <w:t>It was, he thought, almost the whole lecture. The light came across the sill without being asked, and reached him, and nothing of his had to go back the other way for that to happen. Seeing was not boarding. Being lit by a thing was not being on it. What reaches you is in your past; what you reach is in your future; and a man sitting still in a chair can be reached by a thing all night without once reaching back, for as long as he likes.</w:t>
       </w:r>
     </w:p>
     <w:p>
@@ -17795,7 +18045,7 @@
           <w:b w:val="0"/>
           <w:sz w:val="22"/>
         </w:rPr>
-        <w:t>He did not. That was the plain fact of it, and he made himself look at it the way Barbarian had told him to look at the relations: not the letters, not the feeling the letters wanted him to have, but what had actually been done. A voice had said he already knew. He had not boarded. He did not know. Therefore the voice was wrong, or it was not talking to him, or it was talking to a Derek further along who had found out, by doing the thing Derek in the chair was not going to do.</w:t>
+        <w:t>He did not. That was the plain fact of it, and he made himself look at it as Barbarian had told him to look at the relations: not the letters, not the feeling the letters wanted him to have, but what had actually been done. A voice had said he already knew. He had not boarded. He did not know. Therefore the voice was wrong, or it was not talking to him, or it was talking to a Derek further along who had found out, by doing the thing Derek in the chair was not going to do.</w:t>
       </w:r>
     </w:p>
     <w:p>
@@ -18016,7 +18266,7 @@
           <w:b w:val="0"/>
           <w:sz w:val="22"/>
         </w:rPr>
-        <w:t>Tell him it would be open anyway, he wrote, and sent it before he could delete it, and put the phone face-down on the desk, the way Trevor did when he had been brave by accident.</w:t>
+        <w:t>Tell him it would be open anyway, he wrote, and sent it before he could delete it, and put the phone face-down on the desk, as Trevor did when he had been brave by accident.</w:t>
       </w:r>
     </w:p>
     <w:p>
@@ -18107,7 +18357,7 @@
           <w:b w:val="0"/>
           <w:sz w:val="22"/>
         </w:rPr>
-        <w:t>He went back to his desk. He wrote a note on the Bureau's paper, in his own handwriting, which was not as good as Trevor's and nowhere near as good as Herbert's, and he propped it against the kettle where whoever came in first would see it.</w:t>
+        <w:t>He went back to his desk. He wrote a note on the Bureau's paper, in his own handwriting, not as good as Trevor's and nowhere near as good as Herbert's, and he propped it against the kettle where whoever came in first would see it.</w:t>
       </w:r>
     </w:p>
     <w:p>
@@ -18574,20 +18824,20 @@
           <w:b w:val="0"/>
           <w:sz w:val="22"/>
         </w:rPr>
-        <w:t>"That is a different sentence." Herbert put it the way he had put everything to Weinstein since Weinstein was nineteen: as though the difference were obvious, and Weinstein had been very, very lazy not to see it already. "A bootstrap is a thing with no origin. A thing whose origin you do not know is merely a thing you do not know about. One is a paradox. The other is ignorance. Ignorance is not a paradox, Alfred. It is the ordinary condition of a scientist before lunch."</w:t>
-      </w:r>
-    </w:p>
-    <w:p>
-      <w:pPr>
-        <w:spacing w:after="160" w:line="240" w:lineRule="auto"/>
-      </w:pPr>
-      <w:r>
-        <w:rPr>
-          <w:rFonts w:ascii="Georgia" w:hAnsi="Georgia" w:eastAsia="Georgia"/>
-          <w:b w:val="0"/>
-          <w:sz w:val="22"/>
-        </w:rPr>
-        <w:t>Weinstein looked at the question mark.</w:t>
+        <w:t>"That is a different sentence." Herbert put it as he had put everything to Weinstein since Weinstein was nineteen: as though the difference were obvious, and Weinstein had been very, very lazy not to see it already. "A bootstrap is a thing with no origin. A thing whose origin you do not know is merely a thing you do not know about. One is a paradox. The other is ignorance. Ignorance is not a paradox, Alfred. It is the ordinary condition of a scientist before lunch."</w:t>
+      </w:r>
+    </w:p>
+    <w:p>
+      <w:pPr>
+        <w:spacing w:after="160" w:line="240" w:lineRule="auto"/>
+      </w:pPr>
+      <w:r>
+        <w:rPr>
+          <w:rFonts w:ascii="Georgia" w:hAnsi="Georgia" w:eastAsia="Georgia"/>
+          <w:b w:val="0"/>
+          <w:sz w:val="22"/>
+        </w:rPr>
+        <w:t>Weinstein frowned at the question mark.</w:t>
       </w:r>
     </w:p>
     <w:p>
@@ -18613,7 +18863,7 @@
           <w:b w:val="0"/>
           <w:sz w:val="22"/>
         </w:rPr>
-        <w:t>"I am saying you are not necessary. You were the nearest hand. A blank is unbearable, and a name, even your own, is less unbearable than a blank." Herbert put the pencil away. "Mr Gent's daughter did not do it. That woman on the stairs did not do it, though she tried hard to. You are now trying to do it. It is the same mistake three times in two days. I find that very restful. It means the case is consistent."</w:t>
+        <w:t>"I am saying you are not necessary. You were the nearest hand. A blank is unbearable, and a name, even your own, is less unbearable than a blank." Herbert put the pencil away. "Mr Gent's daughter did not do it. That woman on the stairs did not do it, though she tried hard to. You are now trying to do it. It is the same mistake three times in two days. I find that restful. It means the case is consistent."</w:t>
       </w:r>
     </w:p>
     <w:p>
@@ -18652,20 +18902,20 @@
           <w:b w:val="0"/>
           <w:sz w:val="22"/>
         </w:rPr>
-        <w:t>"That is a very cold comfort."</w:t>
-      </w:r>
-    </w:p>
-    <w:p>
-      <w:pPr>
-        <w:spacing w:after="160" w:line="240" w:lineRule="auto"/>
-      </w:pPr>
-      <w:r>
-        <w:rPr>
-          <w:rFonts w:ascii="Georgia" w:hAnsi="Georgia" w:eastAsia="Georgia"/>
-          <w:b w:val="0"/>
-          <w:sz w:val="22"/>
-        </w:rPr>
-        <w:t>"It is a very accurate one. Comfort is not my department." He put the coat on, buttoned it, and then, unusually, did not leave. He stood looking out of the cold window at the trams for a little while. "You told me on the telephone, from the airport, that I was right and that it didn't help."</w:t>
+        <w:t>"That is cold comfort."</w:t>
+      </w:r>
+    </w:p>
+    <w:p>
+      <w:pPr>
+        <w:spacing w:after="160" w:line="240" w:lineRule="auto"/>
+      </w:pPr>
+      <w:r>
+        <w:rPr>
+          <w:rFonts w:ascii="Georgia" w:hAnsi="Georgia" w:eastAsia="Georgia"/>
+          <w:b w:val="0"/>
+          <w:sz w:val="22"/>
+        </w:rPr>
+        <w:t>"It is an accurate one. Comfort is not my department." He put the coat on, buttoned it, and then, unusually, did not leave. He stood looking out of the cold window at the trams for a little while. "You told me on the telephone, from the airport, that I was right and that it didn't help."</w:t>
       </w:r>
     </w:p>
     <w:p>
@@ -19158,7 +19408,7 @@
           <w:b w:val="0"/>
           <w:sz w:val="22"/>
         </w:rPr>
-        <w:t>Barbarian looked at it for a long time. He did not touch it.</w:t>
+        <w:t>Barbarian studied it for a long time. He did not touch it.</w:t>
       </w:r>
     </w:p>
     <w:p>
@@ -19483,7 +19733,7 @@
           <w:b w:val="0"/>
           <w:sz w:val="22"/>
         </w:rPr>
-        <w:t>Herbert looked at the line he had drawn.</w:t>
+        <w:t>Herbert regarded the line he had drawn.</w:t>
       </w:r>
     </w:p>
     <w:p>
@@ -19561,7 +19811,7 @@
           <w:b w:val="0"/>
           <w:sz w:val="22"/>
         </w:rPr>
-        <w:t>"No. Mr Gent should like to know who sent the sheet. That is a different wish." Barbarian looked at the question mark beside SHEET. "And it is the wrong question."</w:t>
+        <w:t>"No. Mr Gent should like to know who sent the sheet. That is a different wish." Barbarian's eyes went to the question mark beside SHEET. "And it is the wrong question."</w:t>
       </w:r>
     </w:p>
     <w:p>
@@ -20094,7 +20344,7 @@
           <w:b w:val="0"/>
           <w:sz w:val="22"/>
         </w:rPr>
-        <w:t xml:space="preserve">"Monday. He told me on the telephone that he very nearly stayed. He went through the barrier at four and turned round once and did not come back. Staying would have been a tenancy. It was the cleanest act of the day, until Mr Gent's. Do not tell him I said he was right. Tell him the hurry was. He will know the difference, and it will annoy him."</w:t>
+        <w:t>"Monday. He told me on the telephone that he nearly stayed. He went through the barrier at four and turned round once and did not come back. Staying would have been a tenancy. It was the cleanest act of the day, until Mr Gent's. Do not tell him I said he was right. Tell him the hurry was. He will know the difference, and it will annoy him."</w:t>
       </w:r>
     </w:p>
     <w:p>
@@ -20133,7 +20383,7 @@
           <w:b w:val="0"/>
           <w:sz w:val="22"/>
         </w:rPr>
-        <w:t xml:space="preserve">He wrote four hundred words, and found that they explained the joke, and deleted them. He wrote two hundred, and found that they agreed with Herbert, and deleted those too. Then he looked at the clocks for a while, each one perfectly honest and none of them in agreement, and wrote four lines that said what he meant.</w:t>
+        <w:t>He wrote four hundred words, and found that they explained the joke, and deleted them. He wrote two hundred, and found that they agreed with Herbert, and deleted those too. Then he watched the clocks for a while, each one perfectly honest and none of them in agreement, and wrote four lines that said what he meant.</w:t>
       </w:r>
     </w:p>
     <w:p>
@@ -20236,7 +20486,7 @@
           <w:b w:val="0"/>
           <w:sz w:val="22"/>
         </w:rPr>
-        <w:t>It was not a day for it. The platform was still in the doorway when Derek arrived at nine, and it was still there at ten, when Penny arrived and looked at it in the manner of a woman checking whether a stain had come out in the wash. The board read YESTERDAY. On the Tuesday, yesterday had been Monday, and the board did not appear to have noticed, which Trevor found more upsetting than anything it had done on the Monday itself.</w:t>
+        <w:t>It was not a day for it. The platform was still in the doorway when Derek arrived at nine, and it was still there at ten, when Penny arrived and inspected it like a woman checking whether a stain had come out in the wash. The board read YESTERDAY. On the Tuesday, yesterday had been Monday, and the board did not appear to have noticed, which Trevor found more upsetting than anything it had done on the Monday itself.</w:t>
       </w:r>
     </w:p>
     <w:p>
@@ -20340,7 +20590,7 @@
           <w:b w:val="0"/>
           <w:sz w:val="22"/>
         </w:rPr>
-        <w:t>He was the landlord's, not the building's, and he made the distinction twice on the stairs, to Mrs Marsh, who had not asked for it. His name was Mr Quayle. He had a clipboard of his own, a laser measure in a holster on his belt, and the manner of a man who has been sent to look at a great many damp patches and has never yet found one that was his fault.</w:t>
+        <w:t>He was the landlord's, not the building's, and he made the distinction twice on the stairs, to Mrs Marsh, who had not asked for it. His name was Mr Quayle. He had a clipboard of his own, a laser measure in a holster on his belt, and the manner of someone sent to look at a great many damp patches and has never yet found one that was his fault.</w:t>
       </w:r>
     </w:p>
     <w:p>
@@ -20652,7 +20902,7 @@
           <w:b w:val="0"/>
           <w:sz w:val="22"/>
         </w:rPr>
-        <w:t>Mr Quayle looked at the holster as if it had spoken. "It bounces off the wall."</w:t>
+        <w:t>Mr Quayle glanced down at the holster as if it had spoken. "It bounces off the wall."</w:t>
       </w:r>
     </w:p>
     <w:p>
@@ -20859,7 +21109,7 @@
           <w:b w:val="0"/>
           <w:sz w:val="22"/>
         </w:rPr>
-        <w:t xml:space="preserve">Mr Pendleton came up just after lunch, at the speed of a man who has never once been sure he is in the right building, and this time he did not put his head round the outer door. He came all the way in. He was carrying a lever-arch file in both arms, the way a man carries a baby he has been told is his.</w:t>
+        <w:t>Mr Pendleton came up just after lunch, at the speed of a man who has never once been sure he is in the right building, and this time he did not put his head round the outer door. He came all the way in. He was carrying a lever-arch file in both arms, like a man holding a baby he has been told is his.</w:t>
       </w:r>
     </w:p>
     <w:p>
@@ -21106,7 +21356,7 @@
           <w:b w:val="0"/>
           <w:sz w:val="22"/>
         </w:rPr>
-        <w:t xml:space="preserve">They did it the way the Bureau had done everything that week, a box at a time, out loud. Location: second floor, inner office. Name of occupier: Derek wrote his own, and Mrs Marsh made him add the word tenant. Date and time first observed: Trevor wrote MONDAY 10:05, NOTICED, ALREADY OPEN, and Mr Pendleton read it upside down and said that he would copy it into his incident report exactly as it stood, because he had written ten oh five in the report on Monday, on the stairs, and he liked his reports to agree with themselves. Nobody thought anything of that at the time. By five o'clock two insurance companies would think a great deal of it.</w:t>
+        <w:t>They did it as the Bureau had done everything that week, a box at a time, out loud. Location: second floor, inner office. Name of occupier: Derek wrote his own, and Mrs Marsh made him add the word tenant. Date and time first observed: Trevor wrote MONDAY 10:05, NOTICED, ALREADY OPEN, and Mr Pendleton read it upside down and said that he would copy it into his incident report exactly as it stood, because he had written ten oh five in the report on Monday, on the stairs, and he liked his reports to agree with themselves. Nobody thought anything of that at the time. By five o'clock two insurance companies would think a great deal of it.</w:t>
       </w:r>
     </w:p>
     <w:p>
@@ -21262,7 +21512,7 @@
           <w:b w:val="0"/>
           <w:sz w:val="22"/>
         </w:rPr>
-        <w:t xml:space="preserve">Mr Quayle had not yet left the building. He was in the lobby writing up the opening, and he came up the stairs a second time with the face of a man called back to a damp patch he had hoped was dry. He looked at the form. He looked at the box. He looked at Mrs Marsh, who held out the pen to him like the baton in a relay he had not entered.</w:t>
+        <w:t>Mr Quayle had not yet left the building. He was in the lobby writing up the opening, and he came up the stairs a second time with the face of a man called back to a damp patch he had hoped was dry. He read the form. He considered the box. He looked at Mrs Marsh, who held out the pen to him like the baton in a relay he had not entered.</w:t>
       </w:r>
     </w:p>
     <w:p>
@@ -21340,7 +21590,7 @@
           <w:b w:val="0"/>
           <w:sz w:val="22"/>
         </w:rPr>
-        <w:t xml:space="preserve">He turned round. It was the first time he had turned round all day, and he did it the way a man gets into cold water, all at once, so as not to have to do it twice. He looked at the platform. He looked at the bench and the lamp and the train and the board, and his face went through several expressions, all of them professional, and settled on the one he presumably kept for subsidence.</w:t>
+        <w:t>He turned round. It was the first time he had turned round all day, and he did it like a man getting into cold water, all at once, so as not to have to do it twice. He looked at the platform. He took in the bench and the lamp and the train and the board, and his face went through several expressions, all of them professional, and settled on the one he presumably kept for subsidence.</w:t>
       </w:r>
     </w:p>
     <w:p>
@@ -21366,7 +21616,7 @@
           <w:b w:val="0"/>
           <w:sz w:val="22"/>
         </w:rPr>
-        <w:t xml:space="preserve">He unholstered the laser, stood with his toes where the office ended, and aimed it down the platform at the far pillar. A red dot appeared under the white clock. The laser beeped. He looked at the number for some time.</w:t>
+        <w:t>He unholstered the laser, stood with his toes where the office ended, and aimed it down the platform at the far pillar. A red dot appeared under the white clock. The laser beeped. He contemplated the number for some time.</w:t>
       </w:r>
     </w:p>
     <w:p>
@@ -21405,7 +21655,7 @@
           <w:b w:val="0"/>
           <w:sz w:val="22"/>
         </w:rPr>
-        <w:t xml:space="preserve">"It's what came back," said Mr Quayle, and then, with a glance at Trevor, "in the time it took to come back." He wrote 45 in the box, very small, as if it might one day be used in evidence against him, and went downstairs without a word to anybody, and this time he did not stop at the bottom.</w:t>
+        <w:t>"It's what came back," said Mr Quayle, and then, with a glance at Trevor, "in the time it took to come back." He wrote 45 in the box, small, as if it might one day be used in evidence against him, and went downstairs without a word to anybody, and this time he did not stop at the bottom.</w:t>
       </w:r>
     </w:p>
     <w:p>
@@ -21561,20 +21811,20 @@
           <w:b w:val="0"/>
           <w:sz w:val="22"/>
         </w:rPr>
-        <w:t>"Forms do not grow fields, Mr Gent. Somebody in your office opened a setting nobody had opened before, very probably Mr Boltzman, while frightened, and has forgotten." A pause. "But if it did grow one by itself, then it grew the correct one, and I should like to know who designed it, because I have been asking universities for that field for forty years."</w:t>
-      </w:r>
-    </w:p>
-    <w:p>
-      <w:pPr>
-        <w:spacing w:after="160" w:line="240" w:lineRule="auto"/>
-      </w:pPr>
-      <w:r>
-        <w:rPr>
-          <w:rFonts w:ascii="Georgia" w:hAnsi="Georgia" w:eastAsia="Georgia"/>
-          <w:b w:val="0"/>
-          <w:sz w:val="22"/>
-        </w:rPr>
-        <w:t>He rang off before Derek could say which. Trevor, who had heard his name, went pale and spent the next twenty minutes inside the form's settings with the expression of a man searching his own house for a burglar he suspected was himself. He found nothing. He reported this, and nobody was surprised, and he went on looking anyway, in case.</w:t>
+        <w:t>"Forms do not grow fields, Mr Gent. Somebody in your office opened a setting no one had opened before, very probably Mr Boltzman, while frightened, and has forgotten." A pause. "But if it did grow one by itself, then it grew the correct one, and I should like to know who designed it, because I have been asking universities for that field for forty years."</w:t>
+      </w:r>
+    </w:p>
+    <w:p>
+      <w:pPr>
+        <w:spacing w:after="160" w:line="240" w:lineRule="auto"/>
+      </w:pPr>
+      <w:r>
+        <w:rPr>
+          <w:rFonts w:ascii="Georgia" w:hAnsi="Georgia" w:eastAsia="Georgia"/>
+          <w:b w:val="0"/>
+          <w:sz w:val="22"/>
+        </w:rPr>
+        <w:t>He rang off before Derek could say which. Trevor, who had heard his name, went pale and spent the next twenty minutes inside the form's settings like a man searching his own house for a burglar he suspected was himself. He found nothing. He reported this, and nobody was surprised, and he went on looking anyway, in case.</w:t>
       </w:r>
     </w:p>
     <w:p>
@@ -21665,7 +21915,7 @@
           <w:b w:val="0"/>
           <w:sz w:val="22"/>
         </w:rPr>
-        <w:t>Afterwards Penny stood at the window with her arms folded and watched the buses, which was what she did when she was deciding something and did not want anyone to see her decide it. Derek let her. He had a pile of ordinary post to open, and he opened it, and it was ordinary: a gas bill, a circular, a letter from a solicitor in Ealing asking whether the Bureau did matrimonial work, which it did not.</w:t>
+        <w:t>Afterwards Penny stood at the window with her arms folded and watched the buses, as she did when she was deciding something and did not want anyone to see her decide it. Derek let her. He had a pile of ordinary post to open, and he opened it, and it was ordinary: a gas bill, a circular, a letter from a solicitor in Ealing asking whether the Bureau did matrimonial work, which it did not.</w:t>
       </w:r>
     </w:p>
     <w:p>
@@ -21756,7 +22006,7 @@
           <w:b w:val="0"/>
           <w:sz w:val="22"/>
         </w:rPr>
-        <w:t>"Good." Penny went back to her desk and took the itinerary out and looked at it with great attention, and Derek, who knew her, understood that the subject was closed and that it had cost her something to close it.</w:t>
+        <w:t>"Good." Penny went back to her desk and took the itinerary out and studied it with great attention, and Derek, who knew her, understood that the subject was closed and that it had cost her something to close it.</w:t>
       </w:r>
     </w:p>
     <w:p>
@@ -21846,20 +22096,20 @@
           <w:b w:val="0"/>
           <w:sz w:val="22"/>
         </w:rPr>
-        <w:t>Mrs Marsh brought him up. She came first, with the clipboard, and stopped on the London side of the outer doorway, and said, "Mr Haskett," in the voice she used for bad news, and stood aside. The man behind her was in his fifties, in a camel coat that had been bought to be looked at, and he turned a signet ring on his little finger as he came in, round and round, the way other men jingle change. He had a leather folder under his arm. He did not knock on the frame. It was his frame.</w:t>
-      </w:r>
-    </w:p>
-    <w:p>
-      <w:pPr>
-        <w:spacing w:after="160" w:line="240" w:lineRule="auto"/>
-      </w:pPr>
-      <w:r>
-        <w:rPr>
-          <w:rFonts w:ascii="Georgia" w:hAnsi="Georgia" w:eastAsia="Georgia"/>
-          <w:b w:val="0"/>
-          <w:sz w:val="22"/>
-        </w:rPr>
-        <w:t xml:space="preserve">He looked at the platform at once, which was the thing that most distinguished him from his surveyor. He crossed the outer room, stood a pace from the sill, where Trevor's tape had been on Monday, and looked at the slabs and the bench and the lit train, and the word.</w:t>
+        <w:t>Mrs Marsh brought him up. She came first, with the clipboard, and stopped on the London side of the outer doorway, and said, "Mr Haskett," in the voice she used for bad news, and stood aside. The man behind her was in his fifties, in a camel coat that had been bought to be looked at, and he turned a signet ring on his little finger as he came in, round and round, as other men jingle change. He had a leather folder under his arm. He did not knock on the frame. It was his frame.</w:t>
+      </w:r>
+    </w:p>
+    <w:p>
+      <w:pPr>
+        <w:spacing w:after="160" w:line="240" w:lineRule="auto"/>
+      </w:pPr>
+      <w:r>
+        <w:rPr>
+          <w:rFonts w:ascii="Georgia" w:hAnsi="Georgia" w:eastAsia="Georgia"/>
+          <w:b w:val="0"/>
+          <w:sz w:val="22"/>
+        </w:rPr>
+        <w:t>He looked at the platform at once. It was what most distinguished him from his surveyor. He crossed the outer room, stood a pace from the sill, where Trevor's tape had been on Monday, and took in the slabs and the bench and the lit train, and the word.</w:t>
       </w:r>
     </w:p>
     <w:p>
@@ -21950,7 +22200,7 @@
           <w:b w:val="0"/>
           <w:sz w:val="22"/>
         </w:rPr>
-        <w:t>Mr Haskett opened the leather folder on the corner of Derek's desk, without asking, and took out two letters, and laid them side by side, the way Weinstein had laid the Sunday slip next to the envelope at Paddington.</w:t>
+        <w:t>Mr Haskett opened the leather folder on the corner of Derek's desk, without asking, and took out two letters, and laid them side by side, as Weinstein had laid the Sunday slip next to the envelope at Paddington.</w:t>
       </w:r>
     </w:p>
     <w:p>
@@ -22223,7 +22473,7 @@
           <w:b w:val="0"/>
           <w:sz w:val="22"/>
         </w:rPr>
-        <w:t>"For a statement with a time in it that suits you." Derek looked at the two letters again. "Mr Haskett, that's how you get a warning that says whatever the person who paid for it wanted it to say. We had one of those this week. It was on a board. It had my daughter's name on it."</w:t>
+        <w:t>"For a statement with a time in it that suits you." Derek went back to the two letters. "Mr Haskett, that's how you get a warning that says whatever the person who paid for it wanted it to say. We had one of those this week. It was on a board. It had my daughter's name on it."</w:t>
       </w:r>
     </w:p>
     <w:p>
@@ -22353,7 +22603,7 @@
           <w:b w:val="0"/>
           <w:sz w:val="22"/>
         </w:rPr>
-        <w:t>Derek looked at the shut door in the photograph for longer than he needed to. It was the last picture anybody had of the office without a railway in it, and Trevor had taken it to win an argument with his sister about a bottle.</w:t>
+        <w:t>Derek studied the shut door in the photograph for longer than he needed to. It was the last picture anybody had of the office without a railway in it, and Trevor had taken it to win an argument with his sister about a bottle.</w:t>
       </w:r>
     </w:p>
     <w:p>
@@ -22470,7 +22720,7 @@
           <w:b w:val="0"/>
           <w:sz w:val="22"/>
         </w:rPr>
-        <w:t>He looked at what he had written. So did Mr Haskett. So, from the outer doorway, did Mrs Marsh.</w:t>
+        <w:t>He read what he had written. So did Mr Haskett. So, from the outer doorway, did Mrs Marsh.</w:t>
       </w:r>
     </w:p>
     <w:p>
@@ -22613,7 +22863,7 @@
           <w:b w:val="0"/>
           <w:sz w:val="22"/>
         </w:rPr>
-        <w:t xml:space="preserve">"There's a good clock in this office," Trevor said. "Sophie's. Brass, from a car boot, quartz inside. It's right to the second." He looked at the filing cabinet, and his face fell. "It was in drawer three. With the file. Locked."</w:t>
+        <w:t>"There's a good clock in this office," Trevor said. "Sophie's. Brass, from a car boot, quartz inside. It's right to the second." He glanced at the filing cabinet, and his face fell. "It was in drawer three. With the file. Locked."</w:t>
       </w:r>
     </w:p>
     <w:p>
@@ -22704,7 +22954,7 @@
           <w:b w:val="0"/>
           <w:sz w:val="22"/>
         </w:rPr>
-        <w:t>"Then what about Sunday?" It came quickly, with the air of a man who has just remembered he holds a better card. "Your superintendent opened that door on Sunday at six. I know she did. It was my instruction. The radiator. If it was opened on Sunday, then it's Northgate's, cleanly, it's a whole day before the changeover, and we can all go home."</w:t>
+        <w:t>"Then what about Sunday?" It came quickly, like a man remembering he holds a better card. "Your superintendent opened that door on Sunday at six. I know she did. It was my instruction. The radiator. If it was opened on Sunday, then it's Northgate's, cleanly, it's a whole day before the changeover, and we can all go home."</w:t>
       </w:r>
     </w:p>
     <w:p>
@@ -22821,7 +23071,7 @@
           <w:b w:val="0"/>
           <w:sz w:val="22"/>
         </w:rPr>
-        <w:t>He put the paper down on the desk, very carefully, beside the two letters. He looked, for the first time since he had come up the stairs, a little less like a man who owned the building and a little more like a man standing in front of a railway.</w:t>
+        <w:t>He put the paper down on the desk, carefully, beside the two letters. He looked, for the first time since he had come up the stairs, a little less like a man who owned the building and a little more like a man standing in front of a railway.</w:t>
       </w:r>
     </w:p>
     <w:p>
@@ -22938,7 +23188,7 @@
           <w:b w:val="0"/>
           <w:sz w:val="22"/>
         </w:rPr>
-        <w:t xml:space="preserve">Mr Haskett looked at the statement.</w:t>
+        <w:t>Mr Haskett read the statement.</w:t>
       </w:r>
     </w:p>
     <w:p>
@@ -23081,7 +23331,7 @@
           <w:b w:val="0"/>
           <w:sz w:val="22"/>
         </w:rPr>
-        <w:t>"Could it be let?" It came out of him as a reflex, Derek thought, the way the ring went round. "A platform. In a second-floor unit. With a train. You'd get something for that, in this postcode."</w:t>
+        <w:t>"Could it be let?" It came out of him as a reflex, Derek thought, like the turning ring. "A platform. In a second-floor unit. With a train. You'd get something for that, in this postcode."</w:t>
       </w:r>
     </w:p>
     <w:p>
@@ -23146,20 +23396,20 @@
           <w:b w:val="0"/>
           <w:sz w:val="22"/>
         </w:rPr>
-        <w:t xml:space="preserve">Trevor sat down on the floor again by the filing cabinet and looked at the photograph on his phone, at the shut door behind the bottle, at nine fifty-eight and twelve seconds. "That's the last picture of it. Before."</w:t>
-      </w:r>
-    </w:p>
-    <w:p>
-      <w:pPr>
-        <w:spacing w:after="160" w:line="240" w:lineRule="auto"/>
-      </w:pPr>
-      <w:r>
-        <w:rPr>
-          <w:rFonts w:ascii="Georgia" w:hAnsi="Georgia" w:eastAsia="Georgia"/>
-          <w:b w:val="0"/>
-          <w:sz w:val="22"/>
-        </w:rPr>
-        <w:t xml:space="preserve">Trevor put the phone away. At ten past six he looked at the window, said something about a warden and the Mini, and went down to move it.</w:t>
+        <w:t>Trevor sat down on the floor again by the filing cabinet and studied the photograph on his phone, the shut door behind the bottle, at nine fifty-eight and twelve seconds. "That's the last picture of it. Before."</w:t>
+      </w:r>
+    </w:p>
+    <w:p>
+      <w:pPr>
+        <w:spacing w:after="160" w:line="240" w:lineRule="auto"/>
+      </w:pPr>
+      <w:r>
+        <w:rPr>
+          <w:rFonts w:ascii="Georgia" w:hAnsi="Georgia" w:eastAsia="Georgia"/>
+          <w:b w:val="0"/>
+          <w:sz w:val="22"/>
+        </w:rPr>
+        <w:t>Trevor put the phone away. At ten past six he glanced at the window, said something about a warden and the Mini, and went down to move it.</w:t>
       </w:r>
     </w:p>
     <w:p>
@@ -23340,7 +23590,7 @@
           <w:b w:val="0"/>
           <w:sz w:val="22"/>
         </w:rPr>
-        <w:t xml:space="preserve">At sixteen minutes past six Derek did what Mrs Marsh had asked, which was to put the case on paper before she locked drawer three. He opened the form, read it through once the way he read a train time he already knew, and pressed Print.</w:t>
+        <w:t>At sixteen minutes past six Derek did what Mrs Marsh had asked and put the case on paper before she locked drawer three. He opened the form, read it through once, as he read a train time he already knew, and pressed Print.</w:t>
       </w:r>
     </w:p>
     <w:p>
@@ -23431,7 +23681,7 @@
           <w:b w:val="0"/>
           <w:sz w:val="22"/>
         </w:rPr>
-        <w:t xml:space="preserve">He did not trust it. He was a man who straightened letters that were already straight, and he knew what a mind like his would do with a coincidence it wanted. So he went through it the way Penny would have, a word at a time, and asked each word where it had come from.</w:t>
+        <w:t>He did not trust it. He was a man who straightened letters that were already straight, and he knew what a mind like his would do with a coincidence it wanted. So he went through it as Penny would have, a word at a time, and asked each word where it had come from.</w:t>
       </w:r>
     </w:p>
     <w:p>
@@ -23613,7 +23863,7 @@
           <w:b w:val="0"/>
           <w:sz w:val="22"/>
         </w:rPr>
-        <w:t xml:space="preserve">He lifted it again almost at once, the way you lift a mug off a library book, and looked at what he had done. A pale brown ring, the size of the bottom of the mug, with a little bite out of its left side where the glaze on the base had a chip in it, a chip Sophie had made with a spoon when she was seven.</w:t>
+        <w:t>He lifted it again almost at once, as you lift a mug off a library book, and looked at what he had done. A pale brown ring, the size of the bottom of the mug, with a little bite out of its left side where the glaze on the base had a chip in it, a chip Sophie had made with a spoon when she was seven.</w:t>
       </w:r>
     </w:p>
     <w:p>
@@ -23691,7 +23941,7 @@
           <w:b w:val="0"/>
           <w:sz w:val="22"/>
         </w:rPr>
-        <w:t xml:space="preserve">And if it did not go, then nothing would have been on the blotter on Monday. Nothing would have stopped him, at ten past ten, from walking through his own door to see what the train was for. He thought about that honestly, the way he would have thought about a client. He would have gone. He knew he would have gone. It was the only warning in the whole case that had arrived in time.</w:t>
+        <w:t>And if it did not go, then nothing would have been on the blotter on Monday. Nothing would have stopped him, at ten past ten, from walking through his own door to see what the train was for. He thought about that honestly, as he would have thought about a client. He would have gone. He knew he would have gone. It was the only warning in the whole case that had arrived in time.</w:t>
       </w:r>
     </w:p>
     <w:p>
@@ -23795,7 +24045,7 @@
           <w:b w:val="0"/>
           <w:sz w:val="22"/>
         </w:rPr>
-        <w:t xml:space="preserve">It was the ordinary sound, the sound of the Paddington doors closing behind Weinstein. A man could step up and in during that sound and be on, and the doors would close after him, and the train would leave after he boarded it, in the right order, and nobody would ever know what yesterday he had got off in. The thought had a pull, the way the edge of a high place has a pull. He would know who had sent the Sunday slip. He would know whose voice it had been behind the carriage door. He would know everything except how to come back.</w:t>
+        <w:t>It was the ordinary sound, the sound of the Paddington doors closing behind Weinstein. A man could step up and in during that sound and be on, and the doors would close after him, and the train would leave after he boarded it, in the right order, and nobody would ever know what yesterday he had got off in. The thought had a pull, like the edge of a high place. He would know who had sent the Sunday slip. He would know whose voice it had been behind the carriage door. He would know everything except how to come back.</w:t>
       </w:r>
     </w:p>
     <w:p>
@@ -24340,7 +24590,7 @@
           <w:b w:val="0"/>
           <w:sz w:val="22"/>
         </w:rPr>
-        <w:t xml:space="preserve">He came in her coat collar, as he did when he came at all, and she set him down on the corridor carpet, and he looked at the sill where the yellow tape had lain until Trevor rolled it up on Monday evening, on the grounds that the platform had proved it could keep still without supervision. He looked at the slabs and the bench and the train. Then he went and lay down a little way along the corridor, as if a railway were a piece of furniture he had declined to discuss.</w:t>
+        <w:t>He came in her coat collar, as he did when he came at all, and she set him down on the corridor carpet, and he looked at the sill where the yellow tape had lain until Trevor rolled it up on Monday evening, on the grounds that the platform had proved it could keep still without supervision. He took in the slabs and the bench and the train. Then he went and lay down a little way along the corridor, as if a railway were a piece of furniture he had declined to discuss.</w:t>
       </w:r>
     </w:p>
     <w:p>
@@ -24392,7 +24642,7 @@
           <w:b w:val="0"/>
           <w:sz w:val="22"/>
         </w:rPr>
-        <w:t>The door stayed open because the platform was in it. Derek would not have shut it on her if the hinge had been willing. He made tea instead. Milk, no. Sugar, one. Tabitha's, he made the way she had made his at lunch on Monday, and she noticed, and did not say so. She left an inch in the bottom of the mug, on purpose, and set it on the carpet in the hall, and Gucci got up, inspected it, established that it was not Earl Grey, and finished it with the air of a dog doing a favour for a household that could not be trusted to manage its own leftovers.</w:t>
+        <w:t>The door stayed open because the platform was in it. Derek would not have shut it on her if the hinge had been willing. He made tea instead. Milk, no. Sugar, one. Tabitha's, he made as she had made his at lunch on Monday, and she noticed, and did not say so. She left an inch in the bottom of the mug, on purpose, and set it on the carpet in the hall, and Gucci got up, inspected it, established that it was not Earl Grey, and finished it with the air of a dog doing a favour for a household that could not be trusted to manage its own leftovers.</w:t>
       </w:r>
     </w:p>
     <w:p>
@@ -24678,7 +24928,7 @@
           <w:b w:val="0"/>
           <w:sz w:val="22"/>
         </w:rPr>
-        <w:t>That was the lot. It was, Derek thought, the longest conversation they had had in three years without anybody being told to save an explanation. He sat with the phone for a moment afterwards, the way he had sat with it on the Monday, and found that the feeling was entirely different and that he did not have a word for it, and decided that was probably correct.</w:t>
+        <w:t>That was the lot. It was, Derek thought, the longest conversation they had had in three years without anybody being told to save an explanation. He sat with the phone for a moment afterwards, as he had sat with it on the Monday, and found that the feeling was entirely different and that he did not have a word for it, and decided that was probably correct.</w:t>
       </w:r>
     </w:p>
     <w:p>
@@ -25029,7 +25279,7 @@
           <w:b w:val="0"/>
           <w:sz w:val="22"/>
         </w:rPr>
-        <w:t>The bus came, which was as much of a railway as the day required. They got on it in the ordinary order: the doors opened, they stepped up, the doors closed, and then it pulled away from the kerb with a noise suggesting that several of its components had voted against the decision.</w:t>
+        <w:t>The bus came. It was as much of a railway as the day required. They got on it in the ordinary order: the doors opened, they stepped up, the doors closed, and then it pulled away from the kerb with a noise suggesting that several of its components had voted against the decision.</w:t>
       </w:r>
     </w:p>
     <w:p>
@@ -25068,7 +25318,7 @@
           <w:b w:val="0"/>
           <w:sz w:val="22"/>
         </w:rPr>
-        <w:t>She looked inside. She looked at the owl.</w:t>
+        <w:t>She looked inside. She considered the owl.</w:t>
       </w:r>
     </w:p>
     <w:p>

</xml_diff>

<commit_message>
RIB2 follow-ups: drop Book 2 from its own Also-by; pace pass ch5-11 (21 cuts of repeated beats, 12,322->12,030 words, no plot removed); SERIES_SEAM names REV02 as Book 2 master
</commit_message>
<xml_diff>
--- a/The Relativistic Investigation Bureau - SERIES/Book 2 - The Warning That Was Sent Too Late/The_Warning_That_Was_Sent_Too_Late_BOOK_2_REV02.docx
+++ b/The Relativistic Investigation Bureau - SERIES/Book 2 - The Warning That Was Sent Too Late/The_Warning_That_Was_Sent_Too_Late_BOOK_2_REV02.docx
@@ -6655,7 +6655,7 @@
           <w:b w:val="0"/>
           <w:sz w:val="22"/>
         </w:rPr>
-        <w:t>Paddington was doing Monday in the ordinary way. Brunel's great roof hung over everything in its long arches of iron and glass, letting in a grey light that made the whole concourse look like it had been developed slightly too long. Pigeons conducted their business at ankle height with the air of tenants who had been there first. The departure board changed for reasons, as departure boards do, rearranging Reading and Oxford and Bristol Temple Meads with no apparent malice. Among them, in the same tired white as everything else, was a train to the airport at 16:00, with Weinstein's name not on it because he had not yet bought the ticket.</w:t>
+        <w:t>Paddington was doing Monday in the ordinary way. Brunel's great roof hung over everything in its long arches of iron and glass, letting in a grey light that made the whole concourse look like it had been developed slightly too long. Pigeons conducted their business at ankle height with the air of tenants who had been there first. On the board, in the same tired white as everything else, was a train to the airport at 16:00, with Weinstein's name not on it because he had not yet bought the ticket.</w:t>
       </w:r>
     </w:p>
     <w:p>
@@ -6863,7 +6863,7 @@
           <w:b w:val="0"/>
           <w:sz w:val="22"/>
         </w:rPr>
-        <w:t>Lost property, at Paddington, was a window and a man who had already decided their problem was not his. His moustache had once meant to be a better one, and had settled. He was not Pendleton. Pendleton was a specialist; Pendleton had spent decades refining the art of a form being in another building. This man was merely tired. He had the tiredness of someone who had spent twenty years being handed umbrellas by people who were sure they had left a violin.</w:t>
+        <w:t>Lost property, at Paddington, was a window and a man who had already decided their problem was not his. His moustache had once meant to be a better one, and had settled. He was not Pendleton, who had spent decades refining the art of a form being in another building. This man was merely tired. He had the tiredness of someone who had spent twenty years being handed umbrellas by people who were sure they had left a violin.</w:t>
       </w:r>
     </w:p>
     <w:p>
@@ -7344,7 +7344,7 @@
           <w:b w:val="0"/>
           <w:sz w:val="22"/>
         </w:rPr>
-        <w:t>Tabitha had come as far as the pavement and no further. She was exactly where she had said she would be, on Praed Street, by a bollard, and had plainly not moved except to be rained on. She had said she would stand where London was, and Paddington's pavement qualified.</w:t>
+        <w:t>Tabitha had come as far as the pavement and no further. She was exactly where she had said she would be, on Praed Street, by a bollard, and had plainly not moved except to be rained on.</w:t>
       </w:r>
     </w:p>
     <w:p>
@@ -7629,7 +7629,7 @@
           <w:b w:val="0"/>
           <w:sz w:val="22"/>
         </w:rPr>
-        <w:t>Derek told him. He had rehearsed it on the walk without meaning to, like a phone call to a bank, and it came out in the order the morning had taught him: Sunday's slip, the sheet, the door, the voice, and two seventeens that were not the same.</w:t>
+        <w:t>Derek told him. It came out in the order the morning had taught him: Sunday's slip, the sheet, the door, the voice, and two seventeens that were not the same.</w:t>
       </w:r>
     </w:p>
     <w:p>
@@ -8058,7 +8058,7 @@
           <w:b w:val="0"/>
           <w:sz w:val="22"/>
         </w:rPr>
-        <w:t>Trevor's phone woke on his knee without being touched. The screen did not show a number. Nobody had ever seen Sherlock's number, and Accounts had stopped asking; the line on the Bureau's books still read Miscellaneous Marine, and the receipts were for mackerel. A single line of text arrived in the middle of a white screen, the way a stone arrives at the bottom of a pond.</w:t>
+        <w:t>Trevor's phone woke on his knee without being touched. The screen did not show a number; nobody had ever seen Sherlock's number, and on the Bureau's books he was still Miscellaneous Marine. A single line of text arrived in the middle of a white screen, the way a stone arrives at the bottom of a pond.</w:t>
       </w:r>
     </w:p>
     <w:p>
@@ -8227,7 +8227,7 @@
           <w:b w:val="0"/>
           <w:sz w:val="22"/>
         </w:rPr>
-        <w:t>They did not ring Sophie again. The school had been told. The gate had been refused, twice, by the two people with the right to refuse it. The name sat on Trevor's envelope, unstruck, unexplained and unmoved. Derek thought it the most honest thing on the page; it was the only line on it that did not pretend to know more than it did.</w:t>
+        <w:t>They did not ring Sophie again. The gate had been refused, twice, by the two people with the right to refuse it. The name sat on Trevor's envelope, unstruck, unexplained and unmoved. Derek thought it the most honest thing on the page; it was the only line on it that did not pretend to know more than it did.</w:t>
       </w:r>
     </w:p>
     <w:p>
@@ -8564,7 +8564,7 @@
           <w:b w:val="0"/>
           <w:sz w:val="22"/>
         </w:rPr>
-        <w:t>Tabitha considered the traffic. A bus came and went. A man with a suitcase walked past them twice, in opposite directions, with the air of someone who had been given directions by a pigeon.</w:t>
+        <w:t>Tabitha considered the traffic. A bus came and went.</w:t>
       </w:r>
     </w:p>
     <w:p>
@@ -8967,7 +8967,7 @@
           <w:b w:val="0"/>
           <w:sz w:val="22"/>
         </w:rPr>
-        <w:t>"The sheet doesn't need a sender who's been born. It needs somebody who did something, before five past ten this morning, that put it in the room. That's all. That's the field. Not when were you born. When did you write it." He took his glasses off. The rain got on them immediately, and he regarded them in his hand as if they had betrayed him, and put them in his pocket. "We don't know who. We might never know who. But we've been asking the wrong question since lunch."</w:t>
+        <w:t>"The sheet doesn't need a sender who's been born. It needs somebody who did something, before five past ten this morning, that put it in the room. That's all. That's the field. Not when were you born. When did you write it." He took his glasses off, and the rain got on them at once, and he put them in his pocket. "We don't know who. We might never know who. But we've been asking the wrong question since lunch."</w:t>
       </w:r>
     </w:p>
     <w:p>
@@ -9434,7 +9434,7 @@
           <w:b w:val="0"/>
           <w:sz w:val="22"/>
         </w:rPr>
-        <w:t>She sat on the wall with the sandwich in one hand and the phone in the other and watched the heron. Priya, beside her, was explaining at length why Mr Okafor was frightened of fractions, a theory that involved his childhood, a divorce, and a pizza. Sophie was not listening. She was doing what her father did when a thing was too big to look at directly, which she had never once admitted to having got from him, and which she had never once pretended not to know about either.</w:t>
+        <w:t>She sat on the wall with the sandwich in one hand and the phone in the other and watched the heron. Priya, beside her, was explaining at length why Mr Okafor was frightened of fractions, a theory that involved his childhood, a divorce, and a pizza. Sophie was not listening.</w:t>
       </w:r>
     </w:p>
     <w:p>
@@ -9694,7 +9694,7 @@
           <w:b w:val="0"/>
           <w:sz w:val="22"/>
         </w:rPr>
-        <w:t>She did not know why it made her feel better. It was Year Seven work. But it did, a little: the idea that a thing could be exactly as big as another thing and still point somewhere else entirely, and that the sign was just a direction, and that you could tell which direction by looking where you were standing.</w:t>
+        <w:t>It was Year Seven work, and it made her feel better anyway: the idea that a thing could be exactly as big as another thing and still point somewhere else entirely, and that the sign was just a direction, and that you could tell which direction by looking where you were standing.</w:t>
       </w:r>
     </w:p>
     <w:p>
@@ -9759,7 +9759,7 @@
           <w:b w:val="0"/>
           <w:sz w:val="22"/>
         </w:rPr>
-        <w:t xml:space="preserve">Somebody had rung the school. Her mother, almost certainly; the school always rang her mother first, and her mother had probably rung back to check, because that was what her mother did. And then somebody else had rung, and the school had sent Mrs Halloran to look, and Mrs Halloran had looked, and gone away without fetching her.</w:t>
+        <w:t>Somebody had rung the school. Her mother, almost certainly; the school always rang her mother first. And then somebody else had rung, and the school had sent Mrs Halloran to look, and Mrs Halloran had looked, and gone away without fetching her.</w:t>
       </w:r>
     </w:p>
     <w:p>
@@ -10044,7 +10044,7 @@
           <w:b w:val="0"/>
           <w:sz w:val="22"/>
         </w:rPr>
-        <w:t>The hour between the calls and the end of school was the longest of the day, and none of them filled it with anything useful. Weinstein bought a newspaper he did not read and a coffee he described, after one sip, as an argument against the European project. Trevor, back from the pavement with an empty paper cup he would not throw away, sat with the slip and recopied the times onto a second envelope in case the first was confiscated by a pigeon. Penny rang Mrs Marsh twice and was told, twice, that the platform was still a platform, and on the second occasion that the landlord had now sent a second email, in capitals, which Mrs Marsh did not hold with. Derek stood. When he sat, he got up again. Every time a family went past with a child in a school jumper, he looked, and every time he made himself look away, and every time Penny watched him do it and said nothing at all. That was its own kind of commentary.</w:t>
+        <w:t>The hour between the calls and the end of school was the longest of the day, and none of them filled it with anything useful. Weinstein bought a newspaper he did not read and a coffee he described, after one sip, as an argument against the European project. Trevor, back from the pavement with an empty paper cup he would not throw away, sat with the slip and recopied the times onto a second envelope in case the first went missing. Penny rang Mrs Marsh twice and was told, twice, that the platform was still a platform, and on the second occasion that the landlord had now sent a second email, in capitals, which Mrs Marsh did not hold with. Derek could not sit. Every time a family went past with a child in a school jumper, he looked, and every time he made himself look away, and every time Penny watched him do it and said nothing at all. That was its own kind of commentary.</w:t>
       </w:r>
     </w:p>
     <w:p>
@@ -10122,7 +10122,7 @@
           <w:b w:val="0"/>
           <w:sz w:val="22"/>
         </w:rPr>
-        <w:t>They stood at a shelf by the window where people stood when they did not have the time to sit and did not have the courage to say so. Outside, a taxi rank shuffled forward a car at a time. Penny put her handbag on the shelf, opened it, and took out the photograph.</w:t>
+        <w:t>They stood at a shelf by the window. Outside, a taxi rank shuffled forward a car at a time. Penny put her handbag on the shelf, opened it, and took out the photograph.</w:t>
       </w:r>
     </w:p>
     <w:p>
@@ -10486,7 +10486,7 @@
           <w:b w:val="0"/>
           <w:sz w:val="22"/>
         </w:rPr>
-        <w:t>Derek sat down on a station chair as if the chair had been recommended by a doctor. It was a metal chair with holes in it, bolted to three others in a row, designed by somebody who had wanted people to wait but not to enjoy it. He sat in it with his elbows on his knees and the phone in both hands.</w:t>
+        <w:t>Derek sat down on a station chair as if the chair had been recommended by a doctor. It was a metal chair with holes in it, designed by somebody who had wanted people to wait but not to enjoy it. He sat with his elbows on his knees and the phone in both hands.</w:t>
       </w:r>
     </w:p>
     <w:p>
@@ -10525,7 +10525,7 @@
           <w:b w:val="0"/>
           <w:sz w:val="22"/>
         </w:rPr>
-        <w:t>Penny had remained standing. Penny generally did, in stations; she regarded a seat on a concourse as an admission that the railway had won. She stood over him now with her handbag on her arm and the photograph in it and the itinerary under the photograph, and she did not touch his shoulder, which he was grateful for, because if she had he would have had to notice that he needed it.</w:t>
+        <w:t>Penny had remained standing. Penny generally did, in stations; she regarded a seat on a concourse as an admission that the railway had won. She stood over him now with her handbag on her arm, and she did not touch his shoulder, which he was grateful for, because if she had he would have had to notice that he needed it.</w:t>
       </w:r>
     </w:p>
     <w:p>
@@ -10655,7 +10655,7 @@
           <w:b w:val="0"/>
           <w:sz w:val="22"/>
         </w:rPr>
-        <w:t xml:space="preserve">"Not till four," Penny said. "The open act is still boarding. If we strike her now, the fear did it, and the next time a board puts a name up we'll strike that one too, and one day it'll be a name that did have an act. At four we strike her because it's true, not because it's soothing."</w:t>
+        <w:t>"Not till four," Penny said. "The open act is still boarding. At four we strike her because it's true, not because it's soothing."</w:t>
       </w:r>
     </w:p>
     <w:p>
@@ -10849,7 +10849,7 @@
           <w:b w:val="0"/>
           <w:sz w:val="22"/>
         </w:rPr>
-        <w:t>At twenty past three the public address system cleared its throat, as public address systems do everywhere, and a woman's voice, recorded so long ago that she might by now have retired to the coast, apologised for the late running of the 12:52 from Cardiff Central. The 12:52 from Cardiff Central was already in. It had been in for six minutes. Its passengers were streaming past them towards the Underground, with the faces of people who have done their suffering and do not wish to hear about it again.</w:t>
+        <w:t>At twenty past three the public address system cleared its throat, and a woman's voice, recorded so long ago that she might by now have retired to the coast, apologised for the late running of the 12:52 from Cardiff Central. The 12:52 from Cardiff Central was already in. It had been in for six minutes. Its passengers were streaming past them towards the Underground, with the faces of people who have done their suffering and do not wish to hear about it again.</w:t>
       </w:r>
     </w:p>
     <w:p>
@@ -10888,7 +10888,7 @@
           <w:b w:val="0"/>
           <w:sz w:val="22"/>
         </w:rPr>
-        <w:t>Two minutes later the same recorded voice announced that the 15:36 to Worcester Foregate Street was expected to depart eleven minutes late. A small and thoroughly English groan went up from a cluster of people by the coffee stand. One man said something to his phone that the phone did not deserve. A woman with a pushchair turned it round, decisively, and went off to find a sandwich, because the board had told her she had time.</w:t>
+        <w:t>Two minutes later the same recorded voice announced that the 15:36 to Worcester Foregate Street was expected to depart eleven minutes late. A small and thoroughly English groan went up from a cluster of people by the coffee stand. A woman with a pushchair turned it round, decisively, and went off to find a sandwich, because the board had told her she had time.</w:t>
       </w:r>
     </w:p>
     <w:p>
@@ -12577,7 +12577,7 @@
           <w:b w:val="0"/>
           <w:sz w:val="22"/>
         </w:rPr>
-        <w:t>They did not go straight back to the chairs. Penny stopped by the barrier, after the phone call, and stood looking down the length of the empty platform where the airport train had been, the rails shining under Brunel's glass and nothing on them at all.</w:t>
+        <w:t>They did not go straight back to the chairs. Penny stood at the barrier looking down the length of the empty platform where the airport train had been, the rails shining under Brunel's glass and nothing on them at all.</w:t>
       </w:r>
     </w:p>
     <w:p>
@@ -12733,7 +12733,7 @@
           <w:b w:val="0"/>
           <w:sz w:val="22"/>
         </w:rPr>
-        <w:t>"That's what I said." Penny turned away from the platform and hitched the bag on her arm, the photograph and the itinerary and whatever else lived in it. "Come on. Trevor's guarding a slip of paper from pigeons and he's going to want a reason to stand up."</w:t>
+        <w:t>"That's what I said." Penny turned away from the platform and hitched the bag on her arm. "Come on. Trevor's guarding a slip of paper from pigeons and he's going to want a reason to stand up."</w:t>
       </w:r>
     </w:p>
     <w:p>
@@ -27574,20 +27574,6 @@
           <w:sz w:val="22"/>
         </w:rPr>
         <w:t xml:space="preserve">The Murder That Hadn't Happened Yet (The Relativistic Investigation Bureau, Book 1)</w:t>
-      </w:r>
-    </w:p>
-    <w:p>
-      <w:pPr>
-        <w:spacing w:after="20" w:line="240" w:lineRule="auto" w:before="0"/>
-        <w:ind w:left="360" w:firstLine="0" w:right="0"/>
-        <w:jc w:val="left"/>
-      </w:pPr>
-      <w:r>
-        <w:rPr>
-          <w:rFonts w:ascii="Georgia" w:hAnsi="Georgia" w:eastAsia="Georgia"/>
-          <w:sz w:val="22"/>
-        </w:rPr>
-        <w:t xml:space="preserve">The Warning That Was Sent Too Late (The Relativistic Investigation Bureau, Book 2)</w:t>
       </w:r>
     </w:p>
     <w:p>

</xml_diff>

<commit_message>
RIB2 follow-ups from book-2-lectures-after-qed 9454114: Also-by self entry removed, pace pass ch5-11, SERIES_SEAM names REV02 as Book 2 master
</commit_message>
<xml_diff>
--- a/The Relativistic Investigation Bureau - SERIES/Book 2 - The Warning That Was Sent Too Late/The_Warning_That_Was_Sent_Too_Late_BOOK_2_REV02.docx
+++ b/The Relativistic Investigation Bureau - SERIES/Book 2 - The Warning That Was Sent Too Late/The_Warning_That_Was_Sent_Too_Late_BOOK_2_REV02.docx
@@ -6655,7 +6655,7 @@
           <w:b w:val="0"/>
           <w:sz w:val="22"/>
         </w:rPr>
-        <w:t>Paddington was doing Monday in the ordinary way. Brunel's great roof hung over everything in its long arches of iron and glass, letting in a grey light that made the whole concourse look like it had been developed slightly too long. Pigeons conducted their business at ankle height with the air of tenants who had been there first. The departure board changed for reasons, as departure boards do, rearranging Reading and Oxford and Bristol Temple Meads with no apparent malice. Among them, in the same tired white as everything else, was a train to the airport at 16:00, with Weinstein's name not on it because he had not yet bought the ticket.</w:t>
+        <w:t>Paddington was doing Monday in the ordinary way. Brunel's great roof hung over everything in its long arches of iron and glass, letting in a grey light that made the whole concourse look like it had been developed slightly too long. Pigeons conducted their business at ankle height with the air of tenants who had been there first. On the board, in the same tired white as everything else, was a train to the airport at 16:00, with Weinstein's name not on it because he had not yet bought the ticket.</w:t>
       </w:r>
     </w:p>
     <w:p>
@@ -6863,7 +6863,7 @@
           <w:b w:val="0"/>
           <w:sz w:val="22"/>
         </w:rPr>
-        <w:t>Lost property, at Paddington, was a window and a man who had already decided their problem was not his. His moustache had once meant to be a better one, and had settled. He was not Pendleton. Pendleton was a specialist; Pendleton had spent decades refining the art of a form being in another building. This man was merely tired. He had the tiredness of someone who had spent twenty years being handed umbrellas by people who were sure they had left a violin.</w:t>
+        <w:t>Lost property, at Paddington, was a window and a man who had already decided their problem was not his. His moustache had once meant to be a better one, and had settled. He was not Pendleton, who had spent decades refining the art of a form being in another building. This man was merely tired. He had the tiredness of someone who had spent twenty years being handed umbrellas by people who were sure they had left a violin.</w:t>
       </w:r>
     </w:p>
     <w:p>
@@ -7344,7 +7344,7 @@
           <w:b w:val="0"/>
           <w:sz w:val="22"/>
         </w:rPr>
-        <w:t>Tabitha had come as far as the pavement and no further. She was exactly where she had said she would be, on Praed Street, by a bollard, and had plainly not moved except to be rained on. She had said she would stand where London was, and Paddington's pavement qualified.</w:t>
+        <w:t>Tabitha had come as far as the pavement and no further. She was exactly where she had said she would be, on Praed Street, by a bollard, and had plainly not moved except to be rained on.</w:t>
       </w:r>
     </w:p>
     <w:p>
@@ -7629,7 +7629,7 @@
           <w:b w:val="0"/>
           <w:sz w:val="22"/>
         </w:rPr>
-        <w:t>Derek told him. He had rehearsed it on the walk without meaning to, like a phone call to a bank, and it came out in the order the morning had taught him: Sunday's slip, the sheet, the door, the voice, and two seventeens that were not the same.</w:t>
+        <w:t>Derek told him. It came out in the order the morning had taught him: Sunday's slip, the sheet, the door, the voice, and two seventeens that were not the same.</w:t>
       </w:r>
     </w:p>
     <w:p>
@@ -8058,7 +8058,7 @@
           <w:b w:val="0"/>
           <w:sz w:val="22"/>
         </w:rPr>
-        <w:t>Trevor's phone woke on his knee without being touched. The screen did not show a number. Nobody had ever seen Sherlock's number, and Accounts had stopped asking; the line on the Bureau's books still read Miscellaneous Marine, and the receipts were for mackerel. A single line of text arrived in the middle of a white screen, the way a stone arrives at the bottom of a pond.</w:t>
+        <w:t>Trevor's phone woke on his knee without being touched. The screen did not show a number; nobody had ever seen Sherlock's number, and on the Bureau's books he was still Miscellaneous Marine. A single line of text arrived in the middle of a white screen, the way a stone arrives at the bottom of a pond.</w:t>
       </w:r>
     </w:p>
     <w:p>
@@ -8227,7 +8227,7 @@
           <w:b w:val="0"/>
           <w:sz w:val="22"/>
         </w:rPr>
-        <w:t>They did not ring Sophie again. The school had been told. The gate had been refused, twice, by the two people with the right to refuse it. The name sat on Trevor's envelope, unstruck, unexplained and unmoved. Derek thought it the most honest thing on the page; it was the only line on it that did not pretend to know more than it did.</w:t>
+        <w:t>They did not ring Sophie again. The gate had been refused, twice, by the two people with the right to refuse it. The name sat on Trevor's envelope, unstruck, unexplained and unmoved. Derek thought it the most honest thing on the page; it was the only line on it that did not pretend to know more than it did.</w:t>
       </w:r>
     </w:p>
     <w:p>
@@ -8564,7 +8564,7 @@
           <w:b w:val="0"/>
           <w:sz w:val="22"/>
         </w:rPr>
-        <w:t>Tabitha considered the traffic. A bus came and went. A man with a suitcase walked past them twice, in opposite directions, with the air of someone who had been given directions by a pigeon.</w:t>
+        <w:t>Tabitha considered the traffic. A bus came and went.</w:t>
       </w:r>
     </w:p>
     <w:p>
@@ -8967,7 +8967,7 @@
           <w:b w:val="0"/>
           <w:sz w:val="22"/>
         </w:rPr>
-        <w:t>"The sheet doesn't need a sender who's been born. It needs somebody who did something, before five past ten this morning, that put it in the room. That's all. That's the field. Not when were you born. When did you write it." He took his glasses off. The rain got on them immediately, and he regarded them in his hand as if they had betrayed him, and put them in his pocket. "We don't know who. We might never know who. But we've been asking the wrong question since lunch."</w:t>
+        <w:t>"The sheet doesn't need a sender who's been born. It needs somebody who did something, before five past ten this morning, that put it in the room. That's all. That's the field. Not when were you born. When did you write it." He took his glasses off, and the rain got on them at once, and he put them in his pocket. "We don't know who. We might never know who. But we've been asking the wrong question since lunch."</w:t>
       </w:r>
     </w:p>
     <w:p>
@@ -9434,7 +9434,7 @@
           <w:b w:val="0"/>
           <w:sz w:val="22"/>
         </w:rPr>
-        <w:t>She sat on the wall with the sandwich in one hand and the phone in the other and watched the heron. Priya, beside her, was explaining at length why Mr Okafor was frightened of fractions, a theory that involved his childhood, a divorce, and a pizza. Sophie was not listening. She was doing what her father did when a thing was too big to look at directly, which she had never once admitted to having got from him, and which she had never once pretended not to know about either.</w:t>
+        <w:t>She sat on the wall with the sandwich in one hand and the phone in the other and watched the heron. Priya, beside her, was explaining at length why Mr Okafor was frightened of fractions, a theory that involved his childhood, a divorce, and a pizza. Sophie was not listening.</w:t>
       </w:r>
     </w:p>
     <w:p>
@@ -9694,7 +9694,7 @@
           <w:b w:val="0"/>
           <w:sz w:val="22"/>
         </w:rPr>
-        <w:t>She did not know why it made her feel better. It was Year Seven work. But it did, a little: the idea that a thing could be exactly as big as another thing and still point somewhere else entirely, and that the sign was just a direction, and that you could tell which direction by looking where you were standing.</w:t>
+        <w:t>It was Year Seven work, and it made her feel better anyway: the idea that a thing could be exactly as big as another thing and still point somewhere else entirely, and that the sign was just a direction, and that you could tell which direction by looking where you were standing.</w:t>
       </w:r>
     </w:p>
     <w:p>
@@ -9759,7 +9759,7 @@
           <w:b w:val="0"/>
           <w:sz w:val="22"/>
         </w:rPr>
-        <w:t xml:space="preserve">Somebody had rung the school. Her mother, almost certainly; the school always rang her mother first, and her mother had probably rung back to check, because that was what her mother did. And then somebody else had rung, and the school had sent Mrs Halloran to look, and Mrs Halloran had looked, and gone away without fetching her.</w:t>
+        <w:t>Somebody had rung the school. Her mother, almost certainly; the school always rang her mother first. And then somebody else had rung, and the school had sent Mrs Halloran to look, and Mrs Halloran had looked, and gone away without fetching her.</w:t>
       </w:r>
     </w:p>
     <w:p>
@@ -10044,7 +10044,7 @@
           <w:b w:val="0"/>
           <w:sz w:val="22"/>
         </w:rPr>
-        <w:t>The hour between the calls and the end of school was the longest of the day, and none of them filled it with anything useful. Weinstein bought a newspaper he did not read and a coffee he described, after one sip, as an argument against the European project. Trevor, back from the pavement with an empty paper cup he would not throw away, sat with the slip and recopied the times onto a second envelope in case the first was confiscated by a pigeon. Penny rang Mrs Marsh twice and was told, twice, that the platform was still a platform, and on the second occasion that the landlord had now sent a second email, in capitals, which Mrs Marsh did not hold with. Derek stood. When he sat, he got up again. Every time a family went past with a child in a school jumper, he looked, and every time he made himself look away, and every time Penny watched him do it and said nothing at all. That was its own kind of commentary.</w:t>
+        <w:t>The hour between the calls and the end of school was the longest of the day, and none of them filled it with anything useful. Weinstein bought a newspaper he did not read and a coffee he described, after one sip, as an argument against the European project. Trevor, back from the pavement with an empty paper cup he would not throw away, sat with the slip and recopied the times onto a second envelope in case the first went missing. Penny rang Mrs Marsh twice and was told, twice, that the platform was still a platform, and on the second occasion that the landlord had now sent a second email, in capitals, which Mrs Marsh did not hold with. Derek could not sit. Every time a family went past with a child in a school jumper, he looked, and every time he made himself look away, and every time Penny watched him do it and said nothing at all. That was its own kind of commentary.</w:t>
       </w:r>
     </w:p>
     <w:p>
@@ -10122,7 +10122,7 @@
           <w:b w:val="0"/>
           <w:sz w:val="22"/>
         </w:rPr>
-        <w:t>They stood at a shelf by the window where people stood when they did not have the time to sit and did not have the courage to say so. Outside, a taxi rank shuffled forward a car at a time. Penny put her handbag on the shelf, opened it, and took out the photograph.</w:t>
+        <w:t>They stood at a shelf by the window. Outside, a taxi rank shuffled forward a car at a time. Penny put her handbag on the shelf, opened it, and took out the photograph.</w:t>
       </w:r>
     </w:p>
     <w:p>
@@ -10486,7 +10486,7 @@
           <w:b w:val="0"/>
           <w:sz w:val="22"/>
         </w:rPr>
-        <w:t>Derek sat down on a station chair as if the chair had been recommended by a doctor. It was a metal chair with holes in it, bolted to three others in a row, designed by somebody who had wanted people to wait but not to enjoy it. He sat in it with his elbows on his knees and the phone in both hands.</w:t>
+        <w:t>Derek sat down on a station chair as if the chair had been recommended by a doctor. It was a metal chair with holes in it, designed by somebody who had wanted people to wait but not to enjoy it. He sat with his elbows on his knees and the phone in both hands.</w:t>
       </w:r>
     </w:p>
     <w:p>
@@ -10525,7 +10525,7 @@
           <w:b w:val="0"/>
           <w:sz w:val="22"/>
         </w:rPr>
-        <w:t>Penny had remained standing. Penny generally did, in stations; she regarded a seat on a concourse as an admission that the railway had won. She stood over him now with her handbag on her arm and the photograph in it and the itinerary under the photograph, and she did not touch his shoulder, which he was grateful for, because if she had he would have had to notice that he needed it.</w:t>
+        <w:t>Penny had remained standing. Penny generally did, in stations; she regarded a seat on a concourse as an admission that the railway had won. She stood over him now with her handbag on her arm, and she did not touch his shoulder, which he was grateful for, because if she had he would have had to notice that he needed it.</w:t>
       </w:r>
     </w:p>
     <w:p>
@@ -10655,7 +10655,7 @@
           <w:b w:val="0"/>
           <w:sz w:val="22"/>
         </w:rPr>
-        <w:t xml:space="preserve">"Not till four," Penny said. "The open act is still boarding. If we strike her now, the fear did it, and the next time a board puts a name up we'll strike that one too, and one day it'll be a name that did have an act. At four we strike her because it's true, not because it's soothing."</w:t>
+        <w:t>"Not till four," Penny said. "The open act is still boarding. At four we strike her because it's true, not because it's soothing."</w:t>
       </w:r>
     </w:p>
     <w:p>
@@ -10849,7 +10849,7 @@
           <w:b w:val="0"/>
           <w:sz w:val="22"/>
         </w:rPr>
-        <w:t>At twenty past three the public address system cleared its throat, as public address systems do everywhere, and a woman's voice, recorded so long ago that she might by now have retired to the coast, apologised for the late running of the 12:52 from Cardiff Central. The 12:52 from Cardiff Central was already in. It had been in for six minutes. Its passengers were streaming past them towards the Underground, with the faces of people who have done their suffering and do not wish to hear about it again.</w:t>
+        <w:t>At twenty past three the public address system cleared its throat, and a woman's voice, recorded so long ago that she might by now have retired to the coast, apologised for the late running of the 12:52 from Cardiff Central. The 12:52 from Cardiff Central was already in. It had been in for six minutes. Its passengers were streaming past them towards the Underground, with the faces of people who have done their suffering and do not wish to hear about it again.</w:t>
       </w:r>
     </w:p>
     <w:p>
@@ -10888,7 +10888,7 @@
           <w:b w:val="0"/>
           <w:sz w:val="22"/>
         </w:rPr>
-        <w:t>Two minutes later the same recorded voice announced that the 15:36 to Worcester Foregate Street was expected to depart eleven minutes late. A small and thoroughly English groan went up from a cluster of people by the coffee stand. One man said something to his phone that the phone did not deserve. A woman with a pushchair turned it round, decisively, and went off to find a sandwich, because the board had told her she had time.</w:t>
+        <w:t>Two minutes later the same recorded voice announced that the 15:36 to Worcester Foregate Street was expected to depart eleven minutes late. A small and thoroughly English groan went up from a cluster of people by the coffee stand. A woman with a pushchair turned it round, decisively, and went off to find a sandwich, because the board had told her she had time.</w:t>
       </w:r>
     </w:p>
     <w:p>
@@ -12577,7 +12577,7 @@
           <w:b w:val="0"/>
           <w:sz w:val="22"/>
         </w:rPr>
-        <w:t>They did not go straight back to the chairs. Penny stopped by the barrier, after the phone call, and stood looking down the length of the empty platform where the airport train had been, the rails shining under Brunel's glass and nothing on them at all.</w:t>
+        <w:t>They did not go straight back to the chairs. Penny stood at the barrier looking down the length of the empty platform where the airport train had been, the rails shining under Brunel's glass and nothing on them at all.</w:t>
       </w:r>
     </w:p>
     <w:p>
@@ -12733,7 +12733,7 @@
           <w:b w:val="0"/>
           <w:sz w:val="22"/>
         </w:rPr>
-        <w:t>"That's what I said." Penny turned away from the platform and hitched the bag on her arm, the photograph and the itinerary and whatever else lived in it. "Come on. Trevor's guarding a slip of paper from pigeons and he's going to want a reason to stand up."</w:t>
+        <w:t>"That's what I said." Penny turned away from the platform and hitched the bag on her arm. "Come on. Trevor's guarding a slip of paper from pigeons and he's going to want a reason to stand up."</w:t>
       </w:r>
     </w:p>
     <w:p>
@@ -27574,20 +27574,6 @@
           <w:sz w:val="22"/>
         </w:rPr>
         <w:t xml:space="preserve">The Murder That Hadn't Happened Yet (The Relativistic Investigation Bureau, Book 1)</w:t>
-      </w:r>
-    </w:p>
-    <w:p>
-      <w:pPr>
-        <w:spacing w:after="20" w:line="240" w:lineRule="auto" w:before="0"/>
-        <w:ind w:left="360" w:firstLine="0" w:right="0"/>
-        <w:jc w:val="left"/>
-      </w:pPr>
-      <w:r>
-        <w:rPr>
-          <w:rFonts w:ascii="Georgia" w:hAnsi="Georgia" w:eastAsia="Georgia"/>
-          <w:sz w:val="22"/>
-        </w:rPr>
-        <w:t xml:space="preserve">The Warning That Was Sent Too Late (The Relativistic Investigation Bureau, Book 2)</w:t>
       </w:r>
     </w:p>
     <w:p>

</xml_diff>

<commit_message>
Also-by: RIB Books 1-2 to canonical list
</commit_message>
<xml_diff>
--- a/The Relativistic Investigation Bureau - SERIES/Book 2 - The Warning That Was Sent Too Late/The_Warning_That_Was_Sent_Too_Late_BOOK_2_REV02.docx
+++ b/The Relativistic Investigation Bureau - SERIES/Book 2 - The Warning That Was Sent Too Late/The_Warning_That_Was_Sent_Too_Late_BOOK_2_REV02.docx
@@ -27225,7 +27225,7 @@
           <w:b/>
           <w:sz w:val="22"/>
         </w:rPr>
-        <w:t xml:space="preserve">Math, Actually</w:t>
+        <w:t xml:space="preserve">More Actually Books</w:t>
       </w:r>
     </w:p>
     <w:p>
@@ -27239,7 +27239,7 @@
           <w:rFonts w:ascii="Georgia" w:hAnsi="Georgia" w:eastAsia="Georgia"/>
           <w:sz w:val="22"/>
         </w:rPr>
-        <w:t xml:space="preserve">Math, Actually, Volume 1: From Arithmetic to Calculus</w:t>
+        <w:t xml:space="preserve">Gravitation, Actually: A Short Book on Gravity</w:t>
       </w:r>
     </w:p>
     <w:p>
@@ -27253,35 +27253,7 @@
           <w:rFonts w:ascii="Georgia" w:hAnsi="Georgia" w:eastAsia="Georgia"/>
           <w:sz w:val="22"/>
         </w:rPr>
-        <w:t xml:space="preserve">Math, Actually, Volume 2: From Multivariable Calculus to Set Theory &amp; Logic</w:t>
-      </w:r>
-    </w:p>
-    <w:p>
-      <w:pPr>
-        <w:spacing w:after="20" w:line="240" w:lineRule="auto" w:before="0"/>
-        <w:ind w:left="360" w:firstLine="0" w:right="0"/>
-        <w:jc w:val="left"/>
-      </w:pPr>
-      <w:r>
-        <w:rPr>
-          <w:rFonts w:ascii="Georgia" w:hAnsi="Georgia" w:eastAsia="Georgia"/>
-          <w:sz w:val="22"/>
-        </w:rPr>
-        <w:t xml:space="preserve">Math, Actually, Volume 3: From Differential Equations to Abstract Algebra</w:t>
-      </w:r>
-    </w:p>
-    <w:p>
-      <w:pPr>
-        <w:spacing w:after="20" w:line="240" w:lineRule="auto" w:before="0"/>
-        <w:ind w:left="360" w:firstLine="0" w:right="0"/>
-        <w:jc w:val="left"/>
-      </w:pPr>
-      <w:r>
-        <w:rPr>
-          <w:rFonts w:ascii="Georgia" w:hAnsi="Georgia" w:eastAsia="Georgia"/>
-          <w:sz w:val="22"/>
-        </w:rPr>
-        <w:t xml:space="preserve">Math, Actually, Volume 4: From Category Theory to the Frontier</w:t>
+        <w:t xml:space="preserve">The Universe, Actually: What Humanity Currently Understands About Reality</w:t>
       </w:r>
     </w:p>
     <w:p>
@@ -27297,7 +27269,7 @@
           <w:b/>
           <w:sz w:val="22"/>
         </w:rPr>
-        <w:t>Quantum, Actually</w:t>
+        <w:t xml:space="preserve">Math, Actually</w:t>
       </w:r>
     </w:p>
     <w:p>
@@ -27311,7 +27283,7 @@
           <w:rFonts w:ascii="Georgia" w:hAnsi="Georgia" w:eastAsia="Georgia"/>
           <w:sz w:val="22"/>
         </w:rPr>
-        <w:t>Quantum, Actually, Volume 1: Questions and Answers from the Double Slit to the Superconducting Wire</w:t>
+        <w:t xml:space="preserve">Math, Actually, Volume 1: From Arithmetic to Calculus</w:t>
       </w:r>
     </w:p>
     <w:p>
@@ -27325,7 +27297,35 @@
           <w:rFonts w:ascii="Georgia" w:hAnsi="Georgia" w:eastAsia="Georgia"/>
           <w:sz w:val="22"/>
         </w:rPr>
-        <w:t>Quantum, Actually, Volume 2: A QED Course</w:t>
+        <w:t xml:space="preserve">Math, Actually, Volume 2: From Multivariable Calculus to Set Theory &amp; Logic</w:t>
+      </w:r>
+    </w:p>
+    <w:p>
+      <w:pPr>
+        <w:spacing w:after="20" w:line="240" w:lineRule="auto" w:before="0"/>
+        <w:ind w:left="360" w:firstLine="0" w:right="0"/>
+        <w:jc w:val="left"/>
+      </w:pPr>
+      <w:r>
+        <w:rPr>
+          <w:rFonts w:ascii="Georgia" w:hAnsi="Georgia" w:eastAsia="Georgia"/>
+          <w:sz w:val="22"/>
+        </w:rPr>
+        <w:t xml:space="preserve">Math, Actually, Volume 3: From Differential Equations to Abstract Algebra</w:t>
+      </w:r>
+    </w:p>
+    <w:p>
+      <w:pPr>
+        <w:spacing w:after="20" w:line="240" w:lineRule="auto" w:before="0"/>
+        <w:ind w:left="360" w:firstLine="0" w:right="0"/>
+        <w:jc w:val="left"/>
+      </w:pPr>
+      <w:r>
+        <w:rPr>
+          <w:rFonts w:ascii="Georgia" w:hAnsi="Georgia" w:eastAsia="Georgia"/>
+          <w:sz w:val="22"/>
+        </w:rPr>
+        <w:t xml:space="preserve">Math, Actually, Volume 4: From Category Theory to the Frontier</w:t>
       </w:r>
     </w:p>
     <w:p>
@@ -27341,7 +27341,7 @@
           <w:b/>
           <w:sz w:val="22"/>
         </w:rPr>
-        <w:t xml:space="preserve">Science Sparks</w:t>
+        <w:t xml:space="preserve">Quantum, Actually</w:t>
       </w:r>
     </w:p>
     <w:p>
@@ -27355,7 +27355,21 @@
           <w:rFonts w:ascii="Georgia" w:hAnsi="Georgia" w:eastAsia="Georgia"/>
           <w:sz w:val="22"/>
         </w:rPr>
-        <w:t xml:space="preserve">Science Sparks: Physics, Life, and Mathematics — The Same Few Rules, Told in Highlights</w:t>
+        <w:t xml:space="preserve">Quantum, Actually, Volume 1: Questions and Answers from the Double Slit to the Superconducting Wire</w:t>
+      </w:r>
+    </w:p>
+    <w:p>
+      <w:pPr>
+        <w:spacing w:after="20" w:line="240" w:lineRule="auto" w:before="0"/>
+        <w:ind w:left="360" w:firstLine="0" w:right="0"/>
+        <w:jc w:val="left"/>
+      </w:pPr>
+      <w:r>
+        <w:rPr>
+          <w:rFonts w:ascii="Georgia" w:hAnsi="Georgia" w:eastAsia="Georgia"/>
+          <w:sz w:val="22"/>
+        </w:rPr>
+        <w:t xml:space="preserve">Quantum, Actually, Volume 2: A QED Course</w:t>
       </w:r>
     </w:p>
     <w:p>
@@ -27371,7 +27385,7 @@
           <w:b/>
           <w:sz w:val="22"/>
         </w:rPr>
-        <w:t xml:space="preserve">Look First</w:t>
+        <w:t xml:space="preserve">Science Sparks</w:t>
       </w:r>
     </w:p>
     <w:p>
@@ -27385,21 +27399,7 @@
           <w:rFonts w:ascii="Georgia" w:hAnsi="Georgia" w:eastAsia="Georgia"/>
           <w:sz w:val="22"/>
         </w:rPr>
-        <w:t xml:space="preserve">Look First, Volume 1: The Universe Has No Now</w:t>
-      </w:r>
-    </w:p>
-    <w:p>
-      <w:pPr>
-        <w:spacing w:after="20" w:line="240" w:lineRule="auto" w:before="0"/>
-        <w:ind w:left="360" w:firstLine="0" w:right="0"/>
-        <w:jc w:val="left"/>
-      </w:pPr>
-      <w:r>
-        <w:rPr>
-          <w:rFonts w:ascii="Georgia" w:hAnsi="Georgia" w:eastAsia="Georgia"/>
-          <w:sz w:val="22"/>
-        </w:rPr>
-        <w:t xml:space="preserve">Look First, Volume 2: A Trip Is Not a New Life</w:t>
+        <w:t xml:space="preserve">Science Sparks: Physics, Life, and Mathematics — The Same Few Rules, Told in Highlights</w:t>
       </w:r>
     </w:p>
     <w:p>
@@ -27415,7 +27415,7 @@
           <w:b/>
           <w:sz w:val="22"/>
         </w:rPr>
-        <w:t xml:space="preserve">Electrical Engineering Series</w:t>
+        <w:t xml:space="preserve">Look First</w:t>
       </w:r>
     </w:p>
     <w:p>
@@ -27429,7 +27429,7 @@
           <w:rFonts w:ascii="Georgia" w:hAnsi="Georgia" w:eastAsia="Georgia"/>
           <w:sz w:val="22"/>
         </w:rPr>
-        <w:t xml:space="preserve">Foundations of Electronics (Book 1)</w:t>
+        <w:t xml:space="preserve">Look First, Volume 1: The Universe Has No Now</w:t>
       </w:r>
     </w:p>
     <w:p>
@@ -27443,77 +27443,7 @@
           <w:rFonts w:ascii="Georgia" w:hAnsi="Georgia" w:eastAsia="Georgia"/>
           <w:sz w:val="22"/>
         </w:rPr>
-        <w:t xml:space="preserve">Circuits, Components, and Control (Book 2)</w:t>
-      </w:r>
-    </w:p>
-    <w:p>
-      <w:pPr>
-        <w:spacing w:after="20" w:line="240" w:lineRule="auto" w:before="0"/>
-        <w:ind w:left="360" w:firstLine="0" w:right="0"/>
-        <w:jc w:val="left"/>
-      </w:pPr>
-      <w:r>
-        <w:rPr>
-          <w:rFonts w:ascii="Georgia" w:hAnsi="Georgia" w:eastAsia="Georgia"/>
-          <w:sz w:val="22"/>
-        </w:rPr>
-        <w:t xml:space="preserve">Semiconductor Physics and Devices (Book 3)</w:t>
-      </w:r>
-    </w:p>
-    <w:p>
-      <w:pPr>
-        <w:spacing w:after="20" w:line="240" w:lineRule="auto" w:before="0"/>
-        <w:ind w:left="360" w:firstLine="0" w:right="0"/>
-        <w:jc w:val="left"/>
-      </w:pPr>
-      <w:r>
-        <w:rPr>
-          <w:rFonts w:ascii="Georgia" w:hAnsi="Georgia" w:eastAsia="Georgia"/>
-          <w:sz w:val="22"/>
-        </w:rPr>
-        <w:t xml:space="preserve">RF, Microwave, and Transceivers (Book 4)</w:t>
-      </w:r>
-    </w:p>
-    <w:p>
-      <w:pPr>
-        <w:spacing w:after="20" w:line="240" w:lineRule="auto" w:before="0"/>
-        <w:ind w:left="360" w:firstLine="0" w:right="0"/>
-        <w:jc w:val="left"/>
-      </w:pPr>
-      <w:r>
-        <w:rPr>
-          <w:rFonts w:ascii="Georgia" w:hAnsi="Georgia" w:eastAsia="Georgia"/>
-          <w:sz w:val="22"/>
-        </w:rPr>
-        <w:t xml:space="preserve">Communications, Wireless, and SDR (Book 5)</w:t>
-      </w:r>
-    </w:p>
-    <w:p>
-      <w:pPr>
-        <w:spacing w:after="20" w:line="240" w:lineRule="auto" w:before="0"/>
-        <w:ind w:left="360" w:firstLine="0" w:right="0"/>
-        <w:jc w:val="left"/>
-      </w:pPr>
-      <w:r>
-        <w:rPr>
-          <w:rFonts w:ascii="Georgia" w:hAnsi="Georgia" w:eastAsia="Georgia"/>
-          <w:sz w:val="22"/>
-        </w:rPr>
-        <w:t xml:space="preserve">Power and Energy (Book 6)</w:t>
-      </w:r>
-    </w:p>
-    <w:p>
-      <w:pPr>
-        <w:spacing w:after="20" w:line="240" w:lineRule="auto" w:before="0"/>
-        <w:ind w:left="360" w:firstLine="0" w:right="0"/>
-        <w:jc w:val="left"/>
-      </w:pPr>
-      <w:r>
-        <w:rPr>
-          <w:rFonts w:ascii="Georgia" w:hAnsi="Georgia" w:eastAsia="Georgia"/>
-          <w:sz w:val="22"/>
-        </w:rPr>
-        <w:t xml:space="preserve">Packaging, Layout, EMC, and Test (Book 7)</w:t>
+        <w:t xml:space="preserve">Look First, Volume 2: A Trip Is Not a New Life</w:t>
       </w:r>
     </w:p>
     <w:p>
@@ -27529,7 +27459,7 @@
           <w:b/>
           <w:sz w:val="22"/>
         </w:rPr>
-        <w:t xml:space="preserve">History</w:t>
+        <w:t xml:space="preserve">Electrical Engineering Series</w:t>
       </w:r>
     </w:p>
     <w:p>
@@ -27543,7 +27473,91 @@
           <w:rFonts w:ascii="Georgia" w:hAnsi="Georgia" w:eastAsia="Georgia"/>
           <w:sz w:val="22"/>
         </w:rPr>
-        <w:t xml:space="preserve">The Dolphins' View of History</w:t>
+        <w:t xml:space="preserve">Foundations of Electronics (Book 1)</w:t>
+      </w:r>
+    </w:p>
+    <w:p>
+      <w:pPr>
+        <w:spacing w:after="20" w:line="240" w:lineRule="auto" w:before="0"/>
+        <w:ind w:left="360" w:firstLine="0" w:right="0"/>
+        <w:jc w:val="left"/>
+      </w:pPr>
+      <w:r>
+        <w:rPr>
+          <w:rFonts w:ascii="Georgia" w:hAnsi="Georgia" w:eastAsia="Georgia"/>
+          <w:sz w:val="22"/>
+        </w:rPr>
+        <w:t xml:space="preserve">Circuits, Components, and Control (Book 2)</w:t>
+      </w:r>
+    </w:p>
+    <w:p>
+      <w:pPr>
+        <w:spacing w:after="20" w:line="240" w:lineRule="auto" w:before="0"/>
+        <w:ind w:left="360" w:firstLine="0" w:right="0"/>
+        <w:jc w:val="left"/>
+      </w:pPr>
+      <w:r>
+        <w:rPr>
+          <w:rFonts w:ascii="Georgia" w:hAnsi="Georgia" w:eastAsia="Georgia"/>
+          <w:sz w:val="22"/>
+        </w:rPr>
+        <w:t xml:space="preserve">Semiconductor Physics and Devices (Book 3)</w:t>
+      </w:r>
+    </w:p>
+    <w:p>
+      <w:pPr>
+        <w:spacing w:after="20" w:line="240" w:lineRule="auto" w:before="0"/>
+        <w:ind w:left="360" w:firstLine="0" w:right="0"/>
+        <w:jc w:val="left"/>
+      </w:pPr>
+      <w:r>
+        <w:rPr>
+          <w:rFonts w:ascii="Georgia" w:hAnsi="Georgia" w:eastAsia="Georgia"/>
+          <w:sz w:val="22"/>
+        </w:rPr>
+        <w:t xml:space="preserve">RF, Microwave, and Transceivers (Book 4)</w:t>
+      </w:r>
+    </w:p>
+    <w:p>
+      <w:pPr>
+        <w:spacing w:after="20" w:line="240" w:lineRule="auto" w:before="0"/>
+        <w:ind w:left="360" w:firstLine="0" w:right="0"/>
+        <w:jc w:val="left"/>
+      </w:pPr>
+      <w:r>
+        <w:rPr>
+          <w:rFonts w:ascii="Georgia" w:hAnsi="Georgia" w:eastAsia="Georgia"/>
+          <w:sz w:val="22"/>
+        </w:rPr>
+        <w:t xml:space="preserve">Communications, Wireless, and SDR (Book 5)</w:t>
+      </w:r>
+    </w:p>
+    <w:p>
+      <w:pPr>
+        <w:spacing w:after="20" w:line="240" w:lineRule="auto" w:before="0"/>
+        <w:ind w:left="360" w:firstLine="0" w:right="0"/>
+        <w:jc w:val="left"/>
+      </w:pPr>
+      <w:r>
+        <w:rPr>
+          <w:rFonts w:ascii="Georgia" w:hAnsi="Georgia" w:eastAsia="Georgia"/>
+          <w:sz w:val="22"/>
+        </w:rPr>
+        <w:t xml:space="preserve">Power and Energy (Book 6)</w:t>
+      </w:r>
+    </w:p>
+    <w:p>
+      <w:pPr>
+        <w:spacing w:after="20" w:line="240" w:lineRule="auto" w:before="0"/>
+        <w:ind w:left="360" w:firstLine="0" w:right="0"/>
+        <w:jc w:val="left"/>
+      </w:pPr>
+      <w:r>
+        <w:rPr>
+          <w:rFonts w:ascii="Georgia" w:hAnsi="Georgia" w:eastAsia="Georgia"/>
+          <w:sz w:val="22"/>
+        </w:rPr>
+        <w:t xml:space="preserve">Packaging, Layout, EMC, and Test (Book 7)</w:t>
       </w:r>
     </w:p>
     <w:p>
@@ -27559,7 +27573,7 @@
           <w:b/>
           <w:sz w:val="22"/>
         </w:rPr>
-        <w:t xml:space="preserve">Fiction</w:t>
+        <w:t xml:space="preserve">History</w:t>
       </w:r>
     </w:p>
     <w:p>
@@ -27573,49 +27587,7 @@
           <w:rFonts w:ascii="Georgia" w:hAnsi="Georgia" w:eastAsia="Georgia"/>
           <w:sz w:val="22"/>
         </w:rPr>
-        <w:t xml:space="preserve">The Murder That Hadn't Happened Yet (The Relativistic Investigation Bureau, Book 1)</w:t>
-      </w:r>
-    </w:p>
-    <w:p>
-      <w:pPr>
-        <w:spacing w:after="20" w:line="240" w:lineRule="auto" w:before="0"/>
-        <w:ind w:left="360" w:firstLine="0" w:right="0"/>
-        <w:jc w:val="left"/>
-      </w:pPr>
-      <w:r>
-        <w:rPr>
-          <w:rFonts w:ascii="Georgia" w:hAnsi="Georgia" w:eastAsia="Georgia"/>
-          <w:sz w:val="22"/>
-        </w:rPr>
-        <w:t>Schrödinger's Paperwork (Lolly Wren's Curious Science Adventures, Book 1)</w:t>
-      </w:r>
-    </w:p>
-    <w:p>
-      <w:pPr>
-        <w:spacing w:after="20" w:line="240" w:lineRule="auto" w:before="0"/>
-        <w:ind w:left="360" w:firstLine="0" w:right="0"/>
-        <w:jc w:val="left"/>
-      </w:pPr>
-      <w:r>
-        <w:rPr>
-          <w:rFonts w:ascii="Georgia" w:hAnsi="Georgia" w:eastAsia="Georgia"/>
-          <w:sz w:val="22"/>
-        </w:rPr>
-        <w:t>The Permitted Options (Lolly Wren's Curious Science Adventures, Book 2)</w:t>
-      </w:r>
-    </w:p>
-    <w:p>
-      <w:pPr>
-        <w:spacing w:after="20" w:line="240" w:lineRule="auto" w:before="0"/>
-        <w:ind w:left="360" w:firstLine="0" w:right="0"/>
-        <w:jc w:val="left"/>
-      </w:pPr>
-      <w:r>
-        <w:rPr>
-          <w:rFonts w:ascii="Georgia" w:hAnsi="Georgia" w:eastAsia="Georgia"/>
-          <w:sz w:val="22"/>
-        </w:rPr>
-        <w:t xml:space="preserve">Protocol Flamingo (The Invasion Storybooks, Book 1), as George Herbert Fontaine</w:t>
+        <w:t xml:space="preserve">The Dolphins' View of History</w:t>
       </w:r>
     </w:p>
     <w:p>
@@ -27631,7 +27603,7 @@
           <w:b/>
           <w:sz w:val="22"/>
         </w:rPr>
-        <w:t xml:space="preserve">How-To</w:t>
+        <w:t xml:space="preserve">Fiction</w:t>
       </w:r>
     </w:p>
     <w:p>
@@ -27645,7 +27617,7 @@
           <w:rFonts w:ascii="Georgia" w:hAnsi="Georgia" w:eastAsia="Georgia"/>
           <w:sz w:val="22"/>
         </w:rPr>
-        <w:t xml:space="preserve">Your First Book That Sells</w:t>
+        <w:t xml:space="preserve">The Murder That Hadn't Happened Yet (The Relativistic Investigation Bureau, Book 1), Lothar J. Musiol writing as Spezala Genara Relavi (S.G.R.)</w:t>
       </w:r>
     </w:p>
     <w:p>
@@ -27659,7 +27631,79 @@
           <w:rFonts w:ascii="Georgia" w:hAnsi="Georgia" w:eastAsia="Georgia"/>
           <w:sz w:val="22"/>
         </w:rPr>
-        <w:t xml:space="preserve">Your First YouTube Channel That Rocks</w:t>
+        <w:t xml:space="preserve">Schrödinger's Paperwork (Lolly Wren's Curious Science Adventures, Book 1), Lothar J. Musiol writing as Quentin Edmund Darling (Q.E.D.)</w:t>
+      </w:r>
+    </w:p>
+    <w:p>
+      <w:pPr>
+        <w:spacing w:after="20" w:line="240" w:lineRule="auto" w:before="0"/>
+        <w:ind w:left="360" w:firstLine="0" w:right="0"/>
+        <w:jc w:val="left"/>
+      </w:pPr>
+      <w:r>
+        <w:rPr>
+          <w:rFonts w:ascii="Georgia" w:hAnsi="Georgia" w:eastAsia="Georgia"/>
+          <w:sz w:val="22"/>
+        </w:rPr>
+        <w:t xml:space="preserve">The Permitted Options (Lolly Wren's Curious Science Adventures, Book 2), Lothar J. Musiol writing as Quentin Edmund Darling (Q.E.D.)</w:t>
+      </w:r>
+    </w:p>
+    <w:p>
+      <w:pPr>
+        <w:spacing w:after="20" w:line="240" w:lineRule="auto" w:before="0"/>
+        <w:ind w:left="360" w:firstLine="0" w:right="0"/>
+        <w:jc w:val="left"/>
+      </w:pPr>
+      <w:r>
+        <w:rPr>
+          <w:rFonts w:ascii="Georgia" w:hAnsi="Georgia" w:eastAsia="Georgia"/>
+          <w:sz w:val="22"/>
+        </w:rPr>
+        <w:t xml:space="preserve">Protocol Flamingo (The Invasion Storybooks, Book 1), Lothar J. Musiol writing as George Herbert Fontaine</w:t>
+      </w:r>
+    </w:p>
+    <w:p>
+      <w:pPr>
+        <w:spacing w:after="20" w:line="240" w:lineRule="auto" w:before="0"/>
+        <w:ind w:left="360" w:firstLine="0" w:right="0"/>
+        <w:jc w:val="left"/>
+      </w:pPr>
+      <w:r>
+        <w:rPr>
+          <w:rFonts w:ascii="Georgia" w:hAnsi="Georgia" w:eastAsia="Georgia"/>
+          <w:sz w:val="22"/>
+        </w:rPr>
+        <w:t xml:space="preserve">In Love with Murder, Actually: A Comic Mystery, Lothar J. Musiol writing as Romuald Livingston</w:t>
+      </w:r>
+    </w:p>
+    <w:p>
+      <w:pPr>
+        <w:keepNext/>
+        <w:spacing w:after="40" w:line="240" w:lineRule="auto" w:before="160"/>
+        <w:ind w:left="0" w:firstLine="0" w:right="0"/>
+        <w:jc w:val="left"/>
+      </w:pPr>
+      <w:r>
+        <w:rPr>
+          <w:rFonts w:ascii="Georgia" w:hAnsi="Georgia" w:eastAsia="Georgia"/>
+          <w:b/>
+          <w:sz w:val="22"/>
+        </w:rPr>
+        <w:t xml:space="preserve">In German</w:t>
+      </w:r>
+    </w:p>
+    <w:p>
+      <w:pPr>
+        <w:spacing w:after="20" w:line="240" w:lineRule="auto" w:before="0"/>
+        <w:ind w:left="360" w:firstLine="0" w:right="0"/>
+        <w:jc w:val="left"/>
+      </w:pPr>
+      <w:r>
+        <w:rPr>
+          <w:rFonts w:ascii="Georgia" w:hAnsi="Georgia" w:eastAsia="Georgia"/>
+          <w:sz w:val="22"/>
+        </w:rPr>
+        <w:t xml:space="preserve">Auswandern – Ab in die USA, Kanada, Australien oder Neuseeland?</w:t>
       </w:r>
     </w:p>
     <w:sectPr>

</xml_diff>

<commit_message>
Also-by: RIB Books 1-2 to canonical list [merged onto main from book-2-lectures-after-qed 9bb037f, paths only]
</commit_message>
<xml_diff>
--- a/The Relativistic Investigation Bureau - SERIES/Book 2 - The Warning That Was Sent Too Late/The_Warning_That_Was_Sent_Too_Late_BOOK_2_REV02.docx
+++ b/The Relativistic Investigation Bureau - SERIES/Book 2 - The Warning That Was Sent Too Late/The_Warning_That_Was_Sent_Too_Late_BOOK_2_REV02.docx
@@ -27225,7 +27225,7 @@
           <w:b/>
           <w:sz w:val="22"/>
         </w:rPr>
-        <w:t xml:space="preserve">Math, Actually</w:t>
+        <w:t xml:space="preserve">More Actually Books</w:t>
       </w:r>
     </w:p>
     <w:p>
@@ -27239,7 +27239,7 @@
           <w:rFonts w:ascii="Georgia" w:hAnsi="Georgia" w:eastAsia="Georgia"/>
           <w:sz w:val="22"/>
         </w:rPr>
-        <w:t xml:space="preserve">Math, Actually, Volume 1: From Arithmetic to Calculus</w:t>
+        <w:t xml:space="preserve">Gravitation, Actually: A Short Book on Gravity</w:t>
       </w:r>
     </w:p>
     <w:p>
@@ -27253,35 +27253,7 @@
           <w:rFonts w:ascii="Georgia" w:hAnsi="Georgia" w:eastAsia="Georgia"/>
           <w:sz w:val="22"/>
         </w:rPr>
-        <w:t xml:space="preserve">Math, Actually, Volume 2: From Multivariable Calculus to Set Theory &amp; Logic</w:t>
-      </w:r>
-    </w:p>
-    <w:p>
-      <w:pPr>
-        <w:spacing w:after="20" w:line="240" w:lineRule="auto" w:before="0"/>
-        <w:ind w:left="360" w:firstLine="0" w:right="0"/>
-        <w:jc w:val="left"/>
-      </w:pPr>
-      <w:r>
-        <w:rPr>
-          <w:rFonts w:ascii="Georgia" w:hAnsi="Georgia" w:eastAsia="Georgia"/>
-          <w:sz w:val="22"/>
-        </w:rPr>
-        <w:t xml:space="preserve">Math, Actually, Volume 3: From Differential Equations to Abstract Algebra</w:t>
-      </w:r>
-    </w:p>
-    <w:p>
-      <w:pPr>
-        <w:spacing w:after="20" w:line="240" w:lineRule="auto" w:before="0"/>
-        <w:ind w:left="360" w:firstLine="0" w:right="0"/>
-        <w:jc w:val="left"/>
-      </w:pPr>
-      <w:r>
-        <w:rPr>
-          <w:rFonts w:ascii="Georgia" w:hAnsi="Georgia" w:eastAsia="Georgia"/>
-          <w:sz w:val="22"/>
-        </w:rPr>
-        <w:t xml:space="preserve">Math, Actually, Volume 4: From Category Theory to the Frontier</w:t>
+        <w:t xml:space="preserve">The Universe, Actually: What Humanity Currently Understands About Reality</w:t>
       </w:r>
     </w:p>
     <w:p>
@@ -27297,7 +27269,7 @@
           <w:b/>
           <w:sz w:val="22"/>
         </w:rPr>
-        <w:t>Quantum, Actually</w:t>
+        <w:t xml:space="preserve">Math, Actually</w:t>
       </w:r>
     </w:p>
     <w:p>
@@ -27311,7 +27283,7 @@
           <w:rFonts w:ascii="Georgia" w:hAnsi="Georgia" w:eastAsia="Georgia"/>
           <w:sz w:val="22"/>
         </w:rPr>
-        <w:t>Quantum, Actually, Volume 1: Questions and Answers from the Double Slit to the Superconducting Wire</w:t>
+        <w:t xml:space="preserve">Math, Actually, Volume 1: From Arithmetic to Calculus</w:t>
       </w:r>
     </w:p>
     <w:p>
@@ -27325,7 +27297,35 @@
           <w:rFonts w:ascii="Georgia" w:hAnsi="Georgia" w:eastAsia="Georgia"/>
           <w:sz w:val="22"/>
         </w:rPr>
-        <w:t>Quantum, Actually, Volume 2: A QED Course</w:t>
+        <w:t xml:space="preserve">Math, Actually, Volume 2: From Multivariable Calculus to Set Theory &amp; Logic</w:t>
+      </w:r>
+    </w:p>
+    <w:p>
+      <w:pPr>
+        <w:spacing w:after="20" w:line="240" w:lineRule="auto" w:before="0"/>
+        <w:ind w:left="360" w:firstLine="0" w:right="0"/>
+        <w:jc w:val="left"/>
+      </w:pPr>
+      <w:r>
+        <w:rPr>
+          <w:rFonts w:ascii="Georgia" w:hAnsi="Georgia" w:eastAsia="Georgia"/>
+          <w:sz w:val="22"/>
+        </w:rPr>
+        <w:t xml:space="preserve">Math, Actually, Volume 3: From Differential Equations to Abstract Algebra</w:t>
+      </w:r>
+    </w:p>
+    <w:p>
+      <w:pPr>
+        <w:spacing w:after="20" w:line="240" w:lineRule="auto" w:before="0"/>
+        <w:ind w:left="360" w:firstLine="0" w:right="0"/>
+        <w:jc w:val="left"/>
+      </w:pPr>
+      <w:r>
+        <w:rPr>
+          <w:rFonts w:ascii="Georgia" w:hAnsi="Georgia" w:eastAsia="Georgia"/>
+          <w:sz w:val="22"/>
+        </w:rPr>
+        <w:t xml:space="preserve">Math, Actually, Volume 4: From Category Theory to the Frontier</w:t>
       </w:r>
     </w:p>
     <w:p>
@@ -27341,7 +27341,7 @@
           <w:b/>
           <w:sz w:val="22"/>
         </w:rPr>
-        <w:t xml:space="preserve">Science Sparks</w:t>
+        <w:t xml:space="preserve">Quantum, Actually</w:t>
       </w:r>
     </w:p>
     <w:p>
@@ -27355,7 +27355,21 @@
           <w:rFonts w:ascii="Georgia" w:hAnsi="Georgia" w:eastAsia="Georgia"/>
           <w:sz w:val="22"/>
         </w:rPr>
-        <w:t xml:space="preserve">Science Sparks: Physics, Life, and Mathematics — The Same Few Rules, Told in Highlights</w:t>
+        <w:t xml:space="preserve">Quantum, Actually, Volume 1: Questions and Answers from the Double Slit to the Superconducting Wire</w:t>
+      </w:r>
+    </w:p>
+    <w:p>
+      <w:pPr>
+        <w:spacing w:after="20" w:line="240" w:lineRule="auto" w:before="0"/>
+        <w:ind w:left="360" w:firstLine="0" w:right="0"/>
+        <w:jc w:val="left"/>
+      </w:pPr>
+      <w:r>
+        <w:rPr>
+          <w:rFonts w:ascii="Georgia" w:hAnsi="Georgia" w:eastAsia="Georgia"/>
+          <w:sz w:val="22"/>
+        </w:rPr>
+        <w:t xml:space="preserve">Quantum, Actually, Volume 2: A QED Course</w:t>
       </w:r>
     </w:p>
     <w:p>
@@ -27371,7 +27385,7 @@
           <w:b/>
           <w:sz w:val="22"/>
         </w:rPr>
-        <w:t xml:space="preserve">Look First</w:t>
+        <w:t xml:space="preserve">Science Sparks</w:t>
       </w:r>
     </w:p>
     <w:p>
@@ -27385,21 +27399,7 @@
           <w:rFonts w:ascii="Georgia" w:hAnsi="Georgia" w:eastAsia="Georgia"/>
           <w:sz w:val="22"/>
         </w:rPr>
-        <w:t xml:space="preserve">Look First, Volume 1: The Universe Has No Now</w:t>
-      </w:r>
-    </w:p>
-    <w:p>
-      <w:pPr>
-        <w:spacing w:after="20" w:line="240" w:lineRule="auto" w:before="0"/>
-        <w:ind w:left="360" w:firstLine="0" w:right="0"/>
-        <w:jc w:val="left"/>
-      </w:pPr>
-      <w:r>
-        <w:rPr>
-          <w:rFonts w:ascii="Georgia" w:hAnsi="Georgia" w:eastAsia="Georgia"/>
-          <w:sz w:val="22"/>
-        </w:rPr>
-        <w:t xml:space="preserve">Look First, Volume 2: A Trip Is Not a New Life</w:t>
+        <w:t xml:space="preserve">Science Sparks: Physics, Life, and Mathematics — The Same Few Rules, Told in Highlights</w:t>
       </w:r>
     </w:p>
     <w:p>
@@ -27415,7 +27415,7 @@
           <w:b/>
           <w:sz w:val="22"/>
         </w:rPr>
-        <w:t xml:space="preserve">Electrical Engineering Series</w:t>
+        <w:t xml:space="preserve">Look First</w:t>
       </w:r>
     </w:p>
     <w:p>
@@ -27429,7 +27429,7 @@
           <w:rFonts w:ascii="Georgia" w:hAnsi="Georgia" w:eastAsia="Georgia"/>
           <w:sz w:val="22"/>
         </w:rPr>
-        <w:t xml:space="preserve">Foundations of Electronics (Book 1)</w:t>
+        <w:t xml:space="preserve">Look First, Volume 1: The Universe Has No Now</w:t>
       </w:r>
     </w:p>
     <w:p>
@@ -27443,77 +27443,7 @@
           <w:rFonts w:ascii="Georgia" w:hAnsi="Georgia" w:eastAsia="Georgia"/>
           <w:sz w:val="22"/>
         </w:rPr>
-        <w:t xml:space="preserve">Circuits, Components, and Control (Book 2)</w:t>
-      </w:r>
-    </w:p>
-    <w:p>
-      <w:pPr>
-        <w:spacing w:after="20" w:line="240" w:lineRule="auto" w:before="0"/>
-        <w:ind w:left="360" w:firstLine="0" w:right="0"/>
-        <w:jc w:val="left"/>
-      </w:pPr>
-      <w:r>
-        <w:rPr>
-          <w:rFonts w:ascii="Georgia" w:hAnsi="Georgia" w:eastAsia="Georgia"/>
-          <w:sz w:val="22"/>
-        </w:rPr>
-        <w:t xml:space="preserve">Semiconductor Physics and Devices (Book 3)</w:t>
-      </w:r>
-    </w:p>
-    <w:p>
-      <w:pPr>
-        <w:spacing w:after="20" w:line="240" w:lineRule="auto" w:before="0"/>
-        <w:ind w:left="360" w:firstLine="0" w:right="0"/>
-        <w:jc w:val="left"/>
-      </w:pPr>
-      <w:r>
-        <w:rPr>
-          <w:rFonts w:ascii="Georgia" w:hAnsi="Georgia" w:eastAsia="Georgia"/>
-          <w:sz w:val="22"/>
-        </w:rPr>
-        <w:t xml:space="preserve">RF, Microwave, and Transceivers (Book 4)</w:t>
-      </w:r>
-    </w:p>
-    <w:p>
-      <w:pPr>
-        <w:spacing w:after="20" w:line="240" w:lineRule="auto" w:before="0"/>
-        <w:ind w:left="360" w:firstLine="0" w:right="0"/>
-        <w:jc w:val="left"/>
-      </w:pPr>
-      <w:r>
-        <w:rPr>
-          <w:rFonts w:ascii="Georgia" w:hAnsi="Georgia" w:eastAsia="Georgia"/>
-          <w:sz w:val="22"/>
-        </w:rPr>
-        <w:t xml:space="preserve">Communications, Wireless, and SDR (Book 5)</w:t>
-      </w:r>
-    </w:p>
-    <w:p>
-      <w:pPr>
-        <w:spacing w:after="20" w:line="240" w:lineRule="auto" w:before="0"/>
-        <w:ind w:left="360" w:firstLine="0" w:right="0"/>
-        <w:jc w:val="left"/>
-      </w:pPr>
-      <w:r>
-        <w:rPr>
-          <w:rFonts w:ascii="Georgia" w:hAnsi="Georgia" w:eastAsia="Georgia"/>
-          <w:sz w:val="22"/>
-        </w:rPr>
-        <w:t xml:space="preserve">Power and Energy (Book 6)</w:t>
-      </w:r>
-    </w:p>
-    <w:p>
-      <w:pPr>
-        <w:spacing w:after="20" w:line="240" w:lineRule="auto" w:before="0"/>
-        <w:ind w:left="360" w:firstLine="0" w:right="0"/>
-        <w:jc w:val="left"/>
-      </w:pPr>
-      <w:r>
-        <w:rPr>
-          <w:rFonts w:ascii="Georgia" w:hAnsi="Georgia" w:eastAsia="Georgia"/>
-          <w:sz w:val="22"/>
-        </w:rPr>
-        <w:t xml:space="preserve">Packaging, Layout, EMC, and Test (Book 7)</w:t>
+        <w:t xml:space="preserve">Look First, Volume 2: A Trip Is Not a New Life</w:t>
       </w:r>
     </w:p>
     <w:p>
@@ -27529,7 +27459,7 @@
           <w:b/>
           <w:sz w:val="22"/>
         </w:rPr>
-        <w:t xml:space="preserve">History</w:t>
+        <w:t xml:space="preserve">Electrical Engineering Series</w:t>
       </w:r>
     </w:p>
     <w:p>
@@ -27543,7 +27473,91 @@
           <w:rFonts w:ascii="Georgia" w:hAnsi="Georgia" w:eastAsia="Georgia"/>
           <w:sz w:val="22"/>
         </w:rPr>
-        <w:t xml:space="preserve">The Dolphins' View of History</w:t>
+        <w:t xml:space="preserve">Foundations of Electronics (Book 1)</w:t>
+      </w:r>
+    </w:p>
+    <w:p>
+      <w:pPr>
+        <w:spacing w:after="20" w:line="240" w:lineRule="auto" w:before="0"/>
+        <w:ind w:left="360" w:firstLine="0" w:right="0"/>
+        <w:jc w:val="left"/>
+      </w:pPr>
+      <w:r>
+        <w:rPr>
+          <w:rFonts w:ascii="Georgia" w:hAnsi="Georgia" w:eastAsia="Georgia"/>
+          <w:sz w:val="22"/>
+        </w:rPr>
+        <w:t xml:space="preserve">Circuits, Components, and Control (Book 2)</w:t>
+      </w:r>
+    </w:p>
+    <w:p>
+      <w:pPr>
+        <w:spacing w:after="20" w:line="240" w:lineRule="auto" w:before="0"/>
+        <w:ind w:left="360" w:firstLine="0" w:right="0"/>
+        <w:jc w:val="left"/>
+      </w:pPr>
+      <w:r>
+        <w:rPr>
+          <w:rFonts w:ascii="Georgia" w:hAnsi="Georgia" w:eastAsia="Georgia"/>
+          <w:sz w:val="22"/>
+        </w:rPr>
+        <w:t xml:space="preserve">Semiconductor Physics and Devices (Book 3)</w:t>
+      </w:r>
+    </w:p>
+    <w:p>
+      <w:pPr>
+        <w:spacing w:after="20" w:line="240" w:lineRule="auto" w:before="0"/>
+        <w:ind w:left="360" w:firstLine="0" w:right="0"/>
+        <w:jc w:val="left"/>
+      </w:pPr>
+      <w:r>
+        <w:rPr>
+          <w:rFonts w:ascii="Georgia" w:hAnsi="Georgia" w:eastAsia="Georgia"/>
+          <w:sz w:val="22"/>
+        </w:rPr>
+        <w:t xml:space="preserve">RF, Microwave, and Transceivers (Book 4)</w:t>
+      </w:r>
+    </w:p>
+    <w:p>
+      <w:pPr>
+        <w:spacing w:after="20" w:line="240" w:lineRule="auto" w:before="0"/>
+        <w:ind w:left="360" w:firstLine="0" w:right="0"/>
+        <w:jc w:val="left"/>
+      </w:pPr>
+      <w:r>
+        <w:rPr>
+          <w:rFonts w:ascii="Georgia" w:hAnsi="Georgia" w:eastAsia="Georgia"/>
+          <w:sz w:val="22"/>
+        </w:rPr>
+        <w:t xml:space="preserve">Communications, Wireless, and SDR (Book 5)</w:t>
+      </w:r>
+    </w:p>
+    <w:p>
+      <w:pPr>
+        <w:spacing w:after="20" w:line="240" w:lineRule="auto" w:before="0"/>
+        <w:ind w:left="360" w:firstLine="0" w:right="0"/>
+        <w:jc w:val="left"/>
+      </w:pPr>
+      <w:r>
+        <w:rPr>
+          <w:rFonts w:ascii="Georgia" w:hAnsi="Georgia" w:eastAsia="Georgia"/>
+          <w:sz w:val="22"/>
+        </w:rPr>
+        <w:t xml:space="preserve">Power and Energy (Book 6)</w:t>
+      </w:r>
+    </w:p>
+    <w:p>
+      <w:pPr>
+        <w:spacing w:after="20" w:line="240" w:lineRule="auto" w:before="0"/>
+        <w:ind w:left="360" w:firstLine="0" w:right="0"/>
+        <w:jc w:val="left"/>
+      </w:pPr>
+      <w:r>
+        <w:rPr>
+          <w:rFonts w:ascii="Georgia" w:hAnsi="Georgia" w:eastAsia="Georgia"/>
+          <w:sz w:val="22"/>
+        </w:rPr>
+        <w:t xml:space="preserve">Packaging, Layout, EMC, and Test (Book 7)</w:t>
       </w:r>
     </w:p>
     <w:p>
@@ -27559,7 +27573,7 @@
           <w:b/>
           <w:sz w:val="22"/>
         </w:rPr>
-        <w:t xml:space="preserve">Fiction</w:t>
+        <w:t xml:space="preserve">History</w:t>
       </w:r>
     </w:p>
     <w:p>
@@ -27573,49 +27587,7 @@
           <w:rFonts w:ascii="Georgia" w:hAnsi="Georgia" w:eastAsia="Georgia"/>
           <w:sz w:val="22"/>
         </w:rPr>
-        <w:t xml:space="preserve">The Murder That Hadn't Happened Yet (The Relativistic Investigation Bureau, Book 1)</w:t>
-      </w:r>
-    </w:p>
-    <w:p>
-      <w:pPr>
-        <w:spacing w:after="20" w:line="240" w:lineRule="auto" w:before="0"/>
-        <w:ind w:left="360" w:firstLine="0" w:right="0"/>
-        <w:jc w:val="left"/>
-      </w:pPr>
-      <w:r>
-        <w:rPr>
-          <w:rFonts w:ascii="Georgia" w:hAnsi="Georgia" w:eastAsia="Georgia"/>
-          <w:sz w:val="22"/>
-        </w:rPr>
-        <w:t>Schrödinger's Paperwork (Lolly Wren's Curious Science Adventures, Book 1)</w:t>
-      </w:r>
-    </w:p>
-    <w:p>
-      <w:pPr>
-        <w:spacing w:after="20" w:line="240" w:lineRule="auto" w:before="0"/>
-        <w:ind w:left="360" w:firstLine="0" w:right="0"/>
-        <w:jc w:val="left"/>
-      </w:pPr>
-      <w:r>
-        <w:rPr>
-          <w:rFonts w:ascii="Georgia" w:hAnsi="Georgia" w:eastAsia="Georgia"/>
-          <w:sz w:val="22"/>
-        </w:rPr>
-        <w:t>The Permitted Options (Lolly Wren's Curious Science Adventures, Book 2)</w:t>
-      </w:r>
-    </w:p>
-    <w:p>
-      <w:pPr>
-        <w:spacing w:after="20" w:line="240" w:lineRule="auto" w:before="0"/>
-        <w:ind w:left="360" w:firstLine="0" w:right="0"/>
-        <w:jc w:val="left"/>
-      </w:pPr>
-      <w:r>
-        <w:rPr>
-          <w:rFonts w:ascii="Georgia" w:hAnsi="Georgia" w:eastAsia="Georgia"/>
-          <w:sz w:val="22"/>
-        </w:rPr>
-        <w:t xml:space="preserve">Protocol Flamingo (The Invasion Storybooks, Book 1), as George Herbert Fontaine</w:t>
+        <w:t xml:space="preserve">The Dolphins' View of History</w:t>
       </w:r>
     </w:p>
     <w:p>
@@ -27631,7 +27603,7 @@
           <w:b/>
           <w:sz w:val="22"/>
         </w:rPr>
-        <w:t xml:space="preserve">How-To</w:t>
+        <w:t xml:space="preserve">Fiction</w:t>
       </w:r>
     </w:p>
     <w:p>
@@ -27645,7 +27617,7 @@
           <w:rFonts w:ascii="Georgia" w:hAnsi="Georgia" w:eastAsia="Georgia"/>
           <w:sz w:val="22"/>
         </w:rPr>
-        <w:t xml:space="preserve">Your First Book That Sells</w:t>
+        <w:t xml:space="preserve">The Murder That Hadn't Happened Yet (The Relativistic Investigation Bureau, Book 1), Lothar J. Musiol writing as Spezala Genara Relavi (S.G.R.)</w:t>
       </w:r>
     </w:p>
     <w:p>
@@ -27659,7 +27631,79 @@
           <w:rFonts w:ascii="Georgia" w:hAnsi="Georgia" w:eastAsia="Georgia"/>
           <w:sz w:val="22"/>
         </w:rPr>
-        <w:t xml:space="preserve">Your First YouTube Channel That Rocks</w:t>
+        <w:t xml:space="preserve">Schrödinger's Paperwork (Lolly Wren's Curious Science Adventures, Book 1), Lothar J. Musiol writing as Quentin Edmund Darling (Q.E.D.)</w:t>
+      </w:r>
+    </w:p>
+    <w:p>
+      <w:pPr>
+        <w:spacing w:after="20" w:line="240" w:lineRule="auto" w:before="0"/>
+        <w:ind w:left="360" w:firstLine="0" w:right="0"/>
+        <w:jc w:val="left"/>
+      </w:pPr>
+      <w:r>
+        <w:rPr>
+          <w:rFonts w:ascii="Georgia" w:hAnsi="Georgia" w:eastAsia="Georgia"/>
+          <w:sz w:val="22"/>
+        </w:rPr>
+        <w:t xml:space="preserve">The Permitted Options (Lolly Wren's Curious Science Adventures, Book 2), Lothar J. Musiol writing as Quentin Edmund Darling (Q.E.D.)</w:t>
+      </w:r>
+    </w:p>
+    <w:p>
+      <w:pPr>
+        <w:spacing w:after="20" w:line="240" w:lineRule="auto" w:before="0"/>
+        <w:ind w:left="360" w:firstLine="0" w:right="0"/>
+        <w:jc w:val="left"/>
+      </w:pPr>
+      <w:r>
+        <w:rPr>
+          <w:rFonts w:ascii="Georgia" w:hAnsi="Georgia" w:eastAsia="Georgia"/>
+          <w:sz w:val="22"/>
+        </w:rPr>
+        <w:t xml:space="preserve">Protocol Flamingo (The Invasion Storybooks, Book 1), Lothar J. Musiol writing as George Herbert Fontaine</w:t>
+      </w:r>
+    </w:p>
+    <w:p>
+      <w:pPr>
+        <w:spacing w:after="20" w:line="240" w:lineRule="auto" w:before="0"/>
+        <w:ind w:left="360" w:firstLine="0" w:right="0"/>
+        <w:jc w:val="left"/>
+      </w:pPr>
+      <w:r>
+        <w:rPr>
+          <w:rFonts w:ascii="Georgia" w:hAnsi="Georgia" w:eastAsia="Georgia"/>
+          <w:sz w:val="22"/>
+        </w:rPr>
+        <w:t xml:space="preserve">In Love with Murder, Actually: A Comic Mystery, Lothar J. Musiol writing as Romuald Livingston</w:t>
+      </w:r>
+    </w:p>
+    <w:p>
+      <w:pPr>
+        <w:keepNext/>
+        <w:spacing w:after="40" w:line="240" w:lineRule="auto" w:before="160"/>
+        <w:ind w:left="0" w:firstLine="0" w:right="0"/>
+        <w:jc w:val="left"/>
+      </w:pPr>
+      <w:r>
+        <w:rPr>
+          <w:rFonts w:ascii="Georgia" w:hAnsi="Georgia" w:eastAsia="Georgia"/>
+          <w:b/>
+          <w:sz w:val="22"/>
+        </w:rPr>
+        <w:t xml:space="preserve">In German</w:t>
+      </w:r>
+    </w:p>
+    <w:p>
+      <w:pPr>
+        <w:spacing w:after="20" w:line="240" w:lineRule="auto" w:before="0"/>
+        <w:ind w:left="360" w:firstLine="0" w:right="0"/>
+        <w:jc w:val="left"/>
+      </w:pPr>
+      <w:r>
+        <w:rPr>
+          <w:rFonts w:ascii="Georgia" w:hAnsi="Georgia" w:eastAsia="Georgia"/>
+          <w:sz w:val="22"/>
+        </w:rPr>
+        <w:t xml:space="preserve">Auswandern – Ab in die USA, Kanada, Australien oder Neuseeland?</w:t>
       </w:r>
     </w:p>
     <w:sectPr>

</xml_diff>

<commit_message>
About the Author (A): RIB Books 1-2 after the S.G.R. paragraphs; KDP author biography
</commit_message>
<xml_diff>
--- a/The Relativistic Investigation Bureau - SERIES/Book 2 - The Warning That Was Sent Too Late/The_Warning_That_Was_Sent_Too_Late_BOOK_2_REV02.docx
+++ b/The Relativistic Investigation Bureau - SERIES/Book 2 - The Warning That Was Sent Too Late/The_Warning_That_Was_Sent_Too_Late_BOOK_2_REV02.docx
@@ -27114,10 +27114,53 @@
       <w:r>
         <w:rPr>
           <w:rFonts w:ascii="Georgia" w:hAnsi="Georgia" w:eastAsia="Georgia"/>
-          <w:b w:val="0"/>
-          <w:sz w:val="22"/>
-        </w:rPr>
-        <w:t>The real author, Lothar J. Musiol, exists in a more conventional sense and is responsible for the nonfiction behind the weird work of fiction. He is German by birth, American by choice, and writes in British because he regards it as the most awkward American dialect.</w:t>
+          <w:sz w:val="22"/>
+        </w:rPr>
+        <w:t xml:space="preserve">Lothar J. Musiol is German by birth and American by choice, and he writes in British because he regards it as the most awkward American dialect. For exactly that reason he is a staunch aficionado of British films such as </w:t>
+      </w:r>
+      <w:r>
+        <w:rPr>
+          <w:i/>
+          <w:iCs/>
+          <w:rFonts w:ascii="Georgia" w:hAnsi="Georgia" w:eastAsia="Georgia"/>
+          <w:sz w:val="22"/>
+        </w:rPr>
+        <w:t xml:space="preserve">Four Weddings and a Funeral</w:t>
+      </w:r>
+      <w:r>
+        <w:rPr>
+          <w:rFonts w:ascii="Georgia" w:hAnsi="Georgia" w:eastAsia="Georgia"/>
+          <w:sz w:val="22"/>
+        </w:rPr>
+        <w:t xml:space="preserve">. The preposterous accent, however, was inspired by </w:t>
+      </w:r>
+      <w:r>
+        <w:rPr>
+          <w:i/>
+          <w:iCs/>
+          <w:rFonts w:ascii="Georgia" w:hAnsi="Georgia" w:eastAsia="Georgia"/>
+          <w:sz w:val="22"/>
+        </w:rPr>
+        <w:t xml:space="preserve">Love Actually</w:t>
+      </w:r>
+      <w:r>
+        <w:rPr>
+          <w:rFonts w:ascii="Georgia" w:hAnsi="Georgia" w:eastAsia="Georgia"/>
+          <w:sz w:val="22"/>
+        </w:rPr>
+        <w:t xml:space="preserve">, in which a daft sod named Colin Frissell flies to America and has a conversation in a bar before arriving at the true purpose of his travels. The author found that eye-opening and still hopes to get there one day, if he keeps up his admittedly naff British long enough.</w:t>
+      </w:r>
+    </w:p>
+    <w:p>
+      <w:pPr>
+        <w:spacing w:after="160" w:line="240" w:lineRule="auto"/>
+      </w:pPr>
+      <w:r>
+        <w:rPr>
+          <w:rFonts w:ascii="Georgia" w:hAnsi="Georgia" w:eastAsia="Georgia"/>
+          <w:sz w:val="22"/>
+        </w:rPr>
+        <w:t xml:space="preserve">A graduate of Munich University of Applied Sciences, he spent more than forty years in the semiconductor industry, first at Germany's largest company in the field, then at a string of American start-ups. Dual citizenship, put to its most sensible use, lets him split his time between San Clemente, California, and Passau, Bavaria, where Austria begins at the garden fence. The household includes one married daughter, one grumpy Teacup Pomeranian named Gucci, and eleven chickens, listed in order of seniority rather than volume.</w:t>
       </w:r>
     </w:p>
     <w:p>

</xml_diff>

<commit_message>
About the Author (A): RIB Books 1-2 after the S.G.R. paragraphs; KDP author biography [merged onto main from book-2-lectures-after-qed ef957c7, paths only]
</commit_message>
<xml_diff>
--- a/The Relativistic Investigation Bureau - SERIES/Book 2 - The Warning That Was Sent Too Late/The_Warning_That_Was_Sent_Too_Late_BOOK_2_REV02.docx
+++ b/The Relativistic Investigation Bureau - SERIES/Book 2 - The Warning That Was Sent Too Late/The_Warning_That_Was_Sent_Too_Late_BOOK_2_REV02.docx
@@ -27114,10 +27114,53 @@
       <w:r>
         <w:rPr>
           <w:rFonts w:ascii="Georgia" w:hAnsi="Georgia" w:eastAsia="Georgia"/>
-          <w:b w:val="0"/>
-          <w:sz w:val="22"/>
-        </w:rPr>
-        <w:t>The real author, Lothar J. Musiol, exists in a more conventional sense and is responsible for the nonfiction behind the weird work of fiction. He is German by birth, American by choice, and writes in British because he regards it as the most awkward American dialect.</w:t>
+          <w:sz w:val="22"/>
+        </w:rPr>
+        <w:t xml:space="preserve">Lothar J. Musiol is German by birth and American by choice, and he writes in British because he regards it as the most awkward American dialect. For exactly that reason he is a staunch aficionado of British films such as </w:t>
+      </w:r>
+      <w:r>
+        <w:rPr>
+          <w:i/>
+          <w:iCs/>
+          <w:rFonts w:ascii="Georgia" w:hAnsi="Georgia" w:eastAsia="Georgia"/>
+          <w:sz w:val="22"/>
+        </w:rPr>
+        <w:t xml:space="preserve">Four Weddings and a Funeral</w:t>
+      </w:r>
+      <w:r>
+        <w:rPr>
+          <w:rFonts w:ascii="Georgia" w:hAnsi="Georgia" w:eastAsia="Georgia"/>
+          <w:sz w:val="22"/>
+        </w:rPr>
+        <w:t xml:space="preserve">. The preposterous accent, however, was inspired by </w:t>
+      </w:r>
+      <w:r>
+        <w:rPr>
+          <w:i/>
+          <w:iCs/>
+          <w:rFonts w:ascii="Georgia" w:hAnsi="Georgia" w:eastAsia="Georgia"/>
+          <w:sz w:val="22"/>
+        </w:rPr>
+        <w:t xml:space="preserve">Love Actually</w:t>
+      </w:r>
+      <w:r>
+        <w:rPr>
+          <w:rFonts w:ascii="Georgia" w:hAnsi="Georgia" w:eastAsia="Georgia"/>
+          <w:sz w:val="22"/>
+        </w:rPr>
+        <w:t xml:space="preserve">, in which a daft sod named Colin Frissell flies to America and has a conversation in a bar before arriving at the true purpose of his travels. The author found that eye-opening and still hopes to get there one day, if he keeps up his admittedly naff British long enough.</w:t>
+      </w:r>
+    </w:p>
+    <w:p>
+      <w:pPr>
+        <w:spacing w:after="160" w:line="240" w:lineRule="auto"/>
+      </w:pPr>
+      <w:r>
+        <w:rPr>
+          <w:rFonts w:ascii="Georgia" w:hAnsi="Georgia" w:eastAsia="Georgia"/>
+          <w:sz w:val="22"/>
+        </w:rPr>
+        <w:t xml:space="preserve">A graduate of Munich University of Applied Sciences, he spent more than forty years in the semiconductor industry, first at Germany's largest company in the field, then at a string of American start-ups. Dual citizenship, put to its most sensible use, lets him split his time between San Clemente, California, and Passau, Bavaria, where Austria begins at the garden fence. The household includes one married daughter, one grumpy Teacup Pomeranian named Gucci, and eleven chickens, listed in order of seniority rather than volume.</w:t>
       </w:r>
     </w:p>
     <w:p>

</xml_diff>

<commit_message>
TOC complete and linked + review invitation: The Relativistic Investigation Bureau Books 1-2
</commit_message>
<xml_diff>
--- a/The Relativistic Investigation Bureau - SERIES/Book 2 - The Warning That Was Sent Too Late/The_Warning_That_Was_Sent_Too_Late_BOOK_2_REV02.docx
+++ b/The Relativistic Investigation Bureau - SERIES/Book 2 - The Warning That Was Sent Too Late/The_Warning_That_Was_Sent_Too_Late_BOOK_2_REV02.docx
@@ -513,6 +513,22 @@
       <w:pPr>
         <w:spacing w:after="40" w:line="240" w:lineRule="auto"/>
       </w:pPr>
+      <w:hyperlink w:anchor="coming_next">
+        <w:r>
+          <w:rPr>
+            <w:rFonts w:ascii="Georgia" w:hAnsi="Georgia"/>
+            <w:sz w:val="22"/>
+            <w:color w:val="0563C1"/>
+            <w:u w:val="single"/>
+          </w:rPr>
+          <w:t xml:space="preserve">Coming Next in the Relativistic Investigation Bureau Series</w:t>
+        </w:r>
+      </w:hyperlink>
+    </w:p>
+    <w:p>
+      <w:pPr>
+        <w:spacing w:after="40" w:line="240" w:lineRule="auto"/>
+      </w:pPr>
       <w:hyperlink w:anchor="course">
         <w:r>
           <w:rPr>
@@ -529,6 +545,166 @@
       <w:pPr>
         <w:spacing w:after="40" w:line="240" w:lineRule="auto"/>
       </w:pPr>
+      <w:hyperlink w:anchor="lesson_1">
+        <w:r>
+          <w:rPr>
+            <w:rFonts w:ascii="Georgia" w:hAnsi="Georgia"/>
+            <w:sz w:val="22"/>
+            <w:color w:val="0563C1"/>
+            <w:u w:val="single"/>
+          </w:rPr>
+          <w:t xml:space="preserve">Lesson 1 - Too Late Is Not a Frame</w:t>
+        </w:r>
+      </w:hyperlink>
+    </w:p>
+    <w:p>
+      <w:pPr>
+        <w:spacing w:after="40" w:line="240" w:lineRule="auto"/>
+      </w:pPr>
+      <w:hyperlink w:anchor="lesson_2">
+        <w:r>
+          <w:rPr>
+            <w:rFonts w:ascii="Georgia" w:hAnsi="Georgia"/>
+            <w:sz w:val="22"/>
+            <w:color w:val="0563C1"/>
+            <w:u w:val="single"/>
+          </w:rPr>
+          <w:t xml:space="preserve">Lesson 2 - One Message, Two Acts</w:t>
+        </w:r>
+      </w:hyperlink>
+    </w:p>
+    <w:p>
+      <w:pPr>
+        <w:spacing w:after="40" w:line="240" w:lineRule="auto"/>
+      </w:pPr>
+      <w:hyperlink w:anchor="lesson_3">
+        <w:r>
+          <w:rPr>
+            <w:rFonts w:ascii="Georgia" w:hAnsi="Georgia"/>
+            <w:sz w:val="22"/>
+            <w:color w:val="0563C1"/>
+            <w:u w:val="single"/>
+          </w:rPr>
+          <w:t xml:space="preserve">Lesson 3 - Seventeen Minutes</w:t>
+        </w:r>
+      </w:hyperlink>
+    </w:p>
+    <w:p>
+      <w:pPr>
+        <w:spacing w:after="40" w:line="240" w:lineRule="auto"/>
+      </w:pPr>
+      <w:hyperlink w:anchor="lesson_4">
+        <w:r>
+          <w:rPr>
+            <w:rFonts w:ascii="Georgia" w:hAnsi="Georgia"/>
+            <w:sz w:val="22"/>
+            <w:color w:val="0563C1"/>
+            <w:u w:val="single"/>
+          </w:rPr>
+          <w:t xml:space="preserve">Lesson 4 - The Wrong Field</w:t>
+        </w:r>
+      </w:hyperlink>
+    </w:p>
+    <w:p>
+      <w:pPr>
+        <w:spacing w:after="40" w:line="240" w:lineRule="auto"/>
+      </w:pPr>
+      <w:hyperlink w:anchor="lesson_5">
+        <w:r>
+          <w:rPr>
+            <w:rFonts w:ascii="Georgia" w:hAnsi="Georgia"/>
+            <w:sz w:val="22"/>
+            <w:color w:val="0563C1"/>
+            <w:u w:val="single"/>
+          </w:rPr>
+          <w:t xml:space="preserve">Lesson 5 - The Loop You Don't Need</w:t>
+        </w:r>
+      </w:hyperlink>
+    </w:p>
+    <w:p>
+      <w:pPr>
+        <w:spacing w:after="40" w:line="240" w:lineRule="auto"/>
+      </w:pPr>
+      <w:hyperlink w:anchor="lesson_6">
+        <w:r>
+          <w:rPr>
+            <w:rFonts w:ascii="Georgia" w:hAnsi="Georgia"/>
+            <w:sz w:val="22"/>
+            <w:color w:val="0563C1"/>
+            <w:u w:val="single"/>
+          </w:rPr>
+          <w:t xml:space="preserve">Lesson 6 - Capstone: File the Later Time</w:t>
+        </w:r>
+      </w:hyperlink>
+    </w:p>
+    <w:p>
+      <w:pPr>
+        <w:spacing w:after="40" w:line="240" w:lineRule="auto"/>
+      </w:pPr>
+      <w:hyperlink w:anchor="_TocAll0001">
+        <w:r>
+          <w:rPr>
+            <w:rFonts w:ascii="Georgia" w:hAnsi="Georgia"/>
+            <w:sz w:val="22"/>
+            <w:color w:val="0563C1"/>
+            <w:u w:val="single"/>
+          </w:rPr>
+          <w:t xml:space="preserve">GLOSSARY</w:t>
+        </w:r>
+      </w:hyperlink>
+    </w:p>
+    <w:p>
+      <w:pPr>
+        <w:spacing w:after="40" w:line="240" w:lineRule="auto"/>
+      </w:pPr>
+      <w:hyperlink w:anchor="_TocAll0002">
+        <w:r>
+          <w:rPr>
+            <w:rFonts w:ascii="Georgia" w:hAnsi="Georgia"/>
+            <w:sz w:val="22"/>
+            <w:color w:val="0563C1"/>
+            <w:u w:val="single"/>
+          </w:rPr>
+          <w:t xml:space="preserve">FURTHER READING</w:t>
+        </w:r>
+      </w:hyperlink>
+    </w:p>
+    <w:p>
+      <w:pPr>
+        <w:spacing w:after="40" w:line="240" w:lineRule="auto"/>
+      </w:pPr>
+      <w:hyperlink w:anchor="_TocAll0003">
+        <w:r>
+          <w:rPr>
+            <w:rFonts w:ascii="Georgia" w:hAnsi="Georgia"/>
+            <w:sz w:val="22"/>
+            <w:color w:val="0563C1"/>
+            <w:u w:val="single"/>
+          </w:rPr>
+          <w:t xml:space="preserve">BIBLIOGRAPHY</w:t>
+        </w:r>
+      </w:hyperlink>
+    </w:p>
+    <w:p>
+      <w:pPr>
+        <w:spacing w:after="40" w:line="240" w:lineRule="auto"/>
+      </w:pPr>
+      <w:hyperlink w:anchor="_TocAll0004">
+        <w:r>
+          <w:rPr>
+            <w:rFonts w:ascii="Georgia" w:hAnsi="Georgia"/>
+            <w:sz w:val="22"/>
+            <w:color w:val="0563C1"/>
+            <w:u w:val="single"/>
+          </w:rPr>
+          <w:t xml:space="preserve">ACKNOWLEDGEMENTS</w:t>
+        </w:r>
+      </w:hyperlink>
+    </w:p>
+    <w:p>
+      <w:pPr>
+        <w:spacing w:after="40" w:line="240" w:lineRule="auto"/>
+      </w:pPr>
       <w:hyperlink w:anchor="about">
         <w:r>
           <w:rPr>
@@ -26559,6 +26735,8 @@
         <w:spacing w:before="320" w:after="200"/>
         <w:jc w:val="center"/>
       </w:pPr>
+      <w:bookmarkStart w:id="9203" w:name="_TocAll0001"/>
+      <w:bookmarkEnd w:id="9203"/>
       <w:r>
         <w:rPr>
           <w:rFonts w:ascii="Amazon Ember" w:hAnsi="Amazon Ember" w:eastAsia="Amazon Ember"/>
@@ -26785,6 +26963,8 @@
         <w:spacing w:before="320" w:after="200"/>
         <w:jc w:val="center"/>
       </w:pPr>
+      <w:bookmarkStart w:id="9204" w:name="_TocAll0002"/>
+      <w:bookmarkEnd w:id="9204"/>
       <w:r>
         <w:rPr>
           <w:rFonts w:ascii="Amazon Ember" w:hAnsi="Amazon Ember" w:eastAsia="Amazon Ember"/>
@@ -26890,6 +27070,8 @@
         <w:spacing w:before="320" w:after="200"/>
         <w:jc w:val="center"/>
       </w:pPr>
+      <w:bookmarkStart w:id="9205" w:name="_TocAll0003"/>
+      <w:bookmarkEnd w:id="9205"/>
       <w:r>
         <w:rPr>
           <w:rFonts w:ascii="Amazon Ember" w:hAnsi="Amazon Ember" w:eastAsia="Amazon Ember"/>
@@ -27012,6 +27194,8 @@
         <w:spacing w:before="320" w:after="200"/>
         <w:jc w:val="center"/>
       </w:pPr>
+      <w:bookmarkStart w:id="9206" w:name="_TocAll0004"/>
+      <w:bookmarkEnd w:id="9206"/>
       <w:r>
         <w:rPr>
           <w:rFonts w:ascii="Amazon Ember" w:hAnsi="Amazon Ember" w:eastAsia="Amazon Ember"/>
@@ -27033,6 +27217,21 @@
           <w:sz w:val="22"/>
         </w:rPr>
         <w:t>The voice was late. The sheet was earlier than the door. The refusal was on time. Anyone who wrote to say the seventeen minutes must be a portal is thanked, and referred to Lesson 3.</w:t>
+      </w:r>
+    </w:p>
+    <w:p>
+      <w:pPr>
+        <w:pageBreakBefore/>
+        <w:spacing w:after="160" w:line="240" w:lineRule="auto"/>
+      </w:pPr>
+      <w:r>
+        <w:rPr>
+          <w:rFonts w:ascii="Georgia" w:hAnsi="Georgia" w:eastAsia="Georgia"/>
+          <w:sz w:val="22"/>
+          <w:i/>
+          <w:iCs/>
+        </w:rPr>
+        <w:t xml:space="preserve">If you enjoyed the story, a few words on Amazon would mean a great deal. It's how other readers find their way here, and I read every one.</w:t>
       </w:r>
     </w:p>
     <w:p>

</xml_diff>

<commit_message>
TOC complete and linked + review invitation: The Relativistic Investigation Bureau Books 1-2 [merged onto main from book-2-lectures-after-qed 6ef6001, paths only]
</commit_message>
<xml_diff>
--- a/The Relativistic Investigation Bureau - SERIES/Book 2 - The Warning That Was Sent Too Late/The_Warning_That_Was_Sent_Too_Late_BOOK_2_REV02.docx
+++ b/The Relativistic Investigation Bureau - SERIES/Book 2 - The Warning That Was Sent Too Late/The_Warning_That_Was_Sent_Too_Late_BOOK_2_REV02.docx
@@ -513,6 +513,22 @@
       <w:pPr>
         <w:spacing w:after="40" w:line="240" w:lineRule="auto"/>
       </w:pPr>
+      <w:hyperlink w:anchor="coming_next">
+        <w:r>
+          <w:rPr>
+            <w:rFonts w:ascii="Georgia" w:hAnsi="Georgia"/>
+            <w:sz w:val="22"/>
+            <w:color w:val="0563C1"/>
+            <w:u w:val="single"/>
+          </w:rPr>
+          <w:t xml:space="preserve">Coming Next in the Relativistic Investigation Bureau Series</w:t>
+        </w:r>
+      </w:hyperlink>
+    </w:p>
+    <w:p>
+      <w:pPr>
+        <w:spacing w:after="40" w:line="240" w:lineRule="auto"/>
+      </w:pPr>
       <w:hyperlink w:anchor="course">
         <w:r>
           <w:rPr>
@@ -529,6 +545,166 @@
       <w:pPr>
         <w:spacing w:after="40" w:line="240" w:lineRule="auto"/>
       </w:pPr>
+      <w:hyperlink w:anchor="lesson_1">
+        <w:r>
+          <w:rPr>
+            <w:rFonts w:ascii="Georgia" w:hAnsi="Georgia"/>
+            <w:sz w:val="22"/>
+            <w:color w:val="0563C1"/>
+            <w:u w:val="single"/>
+          </w:rPr>
+          <w:t xml:space="preserve">Lesson 1 - Too Late Is Not a Frame</w:t>
+        </w:r>
+      </w:hyperlink>
+    </w:p>
+    <w:p>
+      <w:pPr>
+        <w:spacing w:after="40" w:line="240" w:lineRule="auto"/>
+      </w:pPr>
+      <w:hyperlink w:anchor="lesson_2">
+        <w:r>
+          <w:rPr>
+            <w:rFonts w:ascii="Georgia" w:hAnsi="Georgia"/>
+            <w:sz w:val="22"/>
+            <w:color w:val="0563C1"/>
+            <w:u w:val="single"/>
+          </w:rPr>
+          <w:t xml:space="preserve">Lesson 2 - One Message, Two Acts</w:t>
+        </w:r>
+      </w:hyperlink>
+    </w:p>
+    <w:p>
+      <w:pPr>
+        <w:spacing w:after="40" w:line="240" w:lineRule="auto"/>
+      </w:pPr>
+      <w:hyperlink w:anchor="lesson_3">
+        <w:r>
+          <w:rPr>
+            <w:rFonts w:ascii="Georgia" w:hAnsi="Georgia"/>
+            <w:sz w:val="22"/>
+            <w:color w:val="0563C1"/>
+            <w:u w:val="single"/>
+          </w:rPr>
+          <w:t xml:space="preserve">Lesson 3 - Seventeen Minutes</w:t>
+        </w:r>
+      </w:hyperlink>
+    </w:p>
+    <w:p>
+      <w:pPr>
+        <w:spacing w:after="40" w:line="240" w:lineRule="auto"/>
+      </w:pPr>
+      <w:hyperlink w:anchor="lesson_4">
+        <w:r>
+          <w:rPr>
+            <w:rFonts w:ascii="Georgia" w:hAnsi="Georgia"/>
+            <w:sz w:val="22"/>
+            <w:color w:val="0563C1"/>
+            <w:u w:val="single"/>
+          </w:rPr>
+          <w:t xml:space="preserve">Lesson 4 - The Wrong Field</w:t>
+        </w:r>
+      </w:hyperlink>
+    </w:p>
+    <w:p>
+      <w:pPr>
+        <w:spacing w:after="40" w:line="240" w:lineRule="auto"/>
+      </w:pPr>
+      <w:hyperlink w:anchor="lesson_5">
+        <w:r>
+          <w:rPr>
+            <w:rFonts w:ascii="Georgia" w:hAnsi="Georgia"/>
+            <w:sz w:val="22"/>
+            <w:color w:val="0563C1"/>
+            <w:u w:val="single"/>
+          </w:rPr>
+          <w:t xml:space="preserve">Lesson 5 - The Loop You Don't Need</w:t>
+        </w:r>
+      </w:hyperlink>
+    </w:p>
+    <w:p>
+      <w:pPr>
+        <w:spacing w:after="40" w:line="240" w:lineRule="auto"/>
+      </w:pPr>
+      <w:hyperlink w:anchor="lesson_6">
+        <w:r>
+          <w:rPr>
+            <w:rFonts w:ascii="Georgia" w:hAnsi="Georgia"/>
+            <w:sz w:val="22"/>
+            <w:color w:val="0563C1"/>
+            <w:u w:val="single"/>
+          </w:rPr>
+          <w:t xml:space="preserve">Lesson 6 - Capstone: File the Later Time</w:t>
+        </w:r>
+      </w:hyperlink>
+    </w:p>
+    <w:p>
+      <w:pPr>
+        <w:spacing w:after="40" w:line="240" w:lineRule="auto"/>
+      </w:pPr>
+      <w:hyperlink w:anchor="_TocAll0001">
+        <w:r>
+          <w:rPr>
+            <w:rFonts w:ascii="Georgia" w:hAnsi="Georgia"/>
+            <w:sz w:val="22"/>
+            <w:color w:val="0563C1"/>
+            <w:u w:val="single"/>
+          </w:rPr>
+          <w:t xml:space="preserve">GLOSSARY</w:t>
+        </w:r>
+      </w:hyperlink>
+    </w:p>
+    <w:p>
+      <w:pPr>
+        <w:spacing w:after="40" w:line="240" w:lineRule="auto"/>
+      </w:pPr>
+      <w:hyperlink w:anchor="_TocAll0002">
+        <w:r>
+          <w:rPr>
+            <w:rFonts w:ascii="Georgia" w:hAnsi="Georgia"/>
+            <w:sz w:val="22"/>
+            <w:color w:val="0563C1"/>
+            <w:u w:val="single"/>
+          </w:rPr>
+          <w:t xml:space="preserve">FURTHER READING</w:t>
+        </w:r>
+      </w:hyperlink>
+    </w:p>
+    <w:p>
+      <w:pPr>
+        <w:spacing w:after="40" w:line="240" w:lineRule="auto"/>
+      </w:pPr>
+      <w:hyperlink w:anchor="_TocAll0003">
+        <w:r>
+          <w:rPr>
+            <w:rFonts w:ascii="Georgia" w:hAnsi="Georgia"/>
+            <w:sz w:val="22"/>
+            <w:color w:val="0563C1"/>
+            <w:u w:val="single"/>
+          </w:rPr>
+          <w:t xml:space="preserve">BIBLIOGRAPHY</w:t>
+        </w:r>
+      </w:hyperlink>
+    </w:p>
+    <w:p>
+      <w:pPr>
+        <w:spacing w:after="40" w:line="240" w:lineRule="auto"/>
+      </w:pPr>
+      <w:hyperlink w:anchor="_TocAll0004">
+        <w:r>
+          <w:rPr>
+            <w:rFonts w:ascii="Georgia" w:hAnsi="Georgia"/>
+            <w:sz w:val="22"/>
+            <w:color w:val="0563C1"/>
+            <w:u w:val="single"/>
+          </w:rPr>
+          <w:t xml:space="preserve">ACKNOWLEDGEMENTS</w:t>
+        </w:r>
+      </w:hyperlink>
+    </w:p>
+    <w:p>
+      <w:pPr>
+        <w:spacing w:after="40" w:line="240" w:lineRule="auto"/>
+      </w:pPr>
       <w:hyperlink w:anchor="about">
         <w:r>
           <w:rPr>
@@ -26559,6 +26735,8 @@
         <w:spacing w:before="320" w:after="200"/>
         <w:jc w:val="center"/>
       </w:pPr>
+      <w:bookmarkStart w:id="9203" w:name="_TocAll0001"/>
+      <w:bookmarkEnd w:id="9203"/>
       <w:r>
         <w:rPr>
           <w:rFonts w:ascii="Amazon Ember" w:hAnsi="Amazon Ember" w:eastAsia="Amazon Ember"/>
@@ -26785,6 +26963,8 @@
         <w:spacing w:before="320" w:after="200"/>
         <w:jc w:val="center"/>
       </w:pPr>
+      <w:bookmarkStart w:id="9204" w:name="_TocAll0002"/>
+      <w:bookmarkEnd w:id="9204"/>
       <w:r>
         <w:rPr>
           <w:rFonts w:ascii="Amazon Ember" w:hAnsi="Amazon Ember" w:eastAsia="Amazon Ember"/>
@@ -26890,6 +27070,8 @@
         <w:spacing w:before="320" w:after="200"/>
         <w:jc w:val="center"/>
       </w:pPr>
+      <w:bookmarkStart w:id="9205" w:name="_TocAll0003"/>
+      <w:bookmarkEnd w:id="9205"/>
       <w:r>
         <w:rPr>
           <w:rFonts w:ascii="Amazon Ember" w:hAnsi="Amazon Ember" w:eastAsia="Amazon Ember"/>
@@ -27012,6 +27194,8 @@
         <w:spacing w:before="320" w:after="200"/>
         <w:jc w:val="center"/>
       </w:pPr>
+      <w:bookmarkStart w:id="9206" w:name="_TocAll0004"/>
+      <w:bookmarkEnd w:id="9206"/>
       <w:r>
         <w:rPr>
           <w:rFonts w:ascii="Amazon Ember" w:hAnsi="Amazon Ember" w:eastAsia="Amazon Ember"/>
@@ -27033,6 +27217,21 @@
           <w:sz w:val="22"/>
         </w:rPr>
         <w:t>The voice was late. The sheet was earlier than the door. The refusal was on time. Anyone who wrote to say the seventeen minutes must be a portal is thanked, and referred to Lesson 3.</w:t>
+      </w:r>
+    </w:p>
+    <w:p>
+      <w:pPr>
+        <w:pageBreakBefore/>
+        <w:spacing w:after="160" w:line="240" w:lineRule="auto"/>
+      </w:pPr>
+      <w:r>
+        <w:rPr>
+          <w:rFonts w:ascii="Georgia" w:hAnsi="Georgia" w:eastAsia="Georgia"/>
+          <w:sz w:val="22"/>
+          <w:i/>
+          <w:iCs/>
+        </w:rPr>
+        <w:t xml:space="preserve">If you enjoyed the story, a few words on Amazon would mean a great deal. It's how other readers find their way here, and I read every one.</w:t>
       </w:r>
     </w:p>
     <w:p>

</xml_diff>

<commit_message>
The Warning That Was Sent Too Late: full read-through, 38 fixes. Ch22 printout now matches the Prologue sheet word for word (heading; back = the form's note, now 'THE PREVIOUS WARNING WAS SENT TOO LATE'); the recipient line Penny deletes is shown first; carrier route and sill geometry corrected; continuity fixes against Book 1 and within the book (mug, kettle, 01:33 revocation, hangers, Weinstein's stay, lodge kettle, timings); Hafele-Keating papers, chronology-protection wording; Sophie no longer uses 'nearest name'. Script scripts/readthrough_2026-10-11.py; md regenerated from the docx; old files in bak
</commit_message>
<xml_diff>
--- a/The Relativistic Investigation Bureau - SERIES/Book 2 - The Warning That Was Sent Too Late/The_Warning_That_Was_Sent_Too_Late_BOOK_2_REV02.docx
+++ b/The Relativistic Investigation Bureau - SERIES/Book 2 - The Warning That Was Sent Too Late/The_Warning_That_Was_Sent_Too_Late_BOOK_2_REV02.docx
@@ -1220,7 +1220,7 @@
           <w:b w:val="0"/>
           <w:sz w:val="22"/>
         </w:rPr>
-        <w:t>Derek closed the folder. He did it slowly, because it had been a long week, and a closed folder was the nearest thing the Bureau had to a holiday. He lifted Penny’s mug off it first. Then he slid the folder across to the out-tray.</w:t>
+        <w:t>Derek closed the folder. He did it slowly, because it had been a long week, and a closed folder was the nearest thing the Bureau had to a holiday. He lifted the mug off it first. Then he slid the folder across to the out-tray.</w:t>
       </w:r>
     </w:p>
     <w:p>
@@ -2298,7 +2298,7 @@
           <w:b w:val="0"/>
           <w:sz w:val="22"/>
         </w:rPr>
-        <w:t xml:space="preserve">“Last week’s photograph came off our own camera, through our own machine, from a phone nobody has named. Its share was revoked at half past one on Sunday morning, and it is still nobody we can name. Device three is still open, and it can stay open. This did not come from there. Different paper, different route, different lie. I do not want anybody in this room solving last week again because it was comfortable.”</w:t>
+        <w:t>“Last week’s photograph came off our own camera, through our own machine, from a phone nobody has named. Its share was revoked at 01:33 on Sunday morning, in the second of the two one o’clocks, and it is still nobody we can name. Device three is still open, and it can stay open. This did not come from there. Different paper, different route, different lie. I do not want anybody in this room solving last week again because it was comfortable.”</w:t>
       </w:r>
     </w:p>
     <w:p>
@@ -2363,7 +2363,7 @@
           <w:b w:val="0"/>
           <w:sz w:val="22"/>
         </w:rPr>
-        <w:t>The kettle clicked off in the corner. Somebody had boiled it for a closed file, out of habit, sometime before the sheet had appeared; it had taken this long to notice. Derek did not pour it. A kettle was for tea and for cases that had finished. He was not prepared to tell it which this was.</w:t>
+        <w:t>The kettle ticked in the corner as it cooled. Penny had boiled it for a closed file before the sheet appeared, and the four mugs she had poured were going cold where she had left them. Derek did not touch his. A kettle was for tea and for cases that had finished. He was not prepared to tell it which this was.</w:t>
       </w:r>
     </w:p>
     <w:p>
@@ -2636,7 +2636,7 @@
           <w:b w:val="0"/>
           <w:sz w:val="22"/>
         </w:rPr>
-        <w:t>“The order only flips if nothing could get from one event to the other. Not even light. If the gap were seventeen minutes, light would cover about three hundred and six million kilometres in it.”</w:t>
+        <w:t>“The order only flips if nothing could get from one event to the other. Not even light. If the gap were seventeen minutes, light would cover about three hundred and six million kilometres in it. That’s past the far side of the Sun.”</w:t>
       </w:r>
     </w:p>
     <w:p>
@@ -2844,7 +2844,7 @@
           <w:b w:val="0"/>
           <w:sz w:val="22"/>
         </w:rPr>
-        <w:t>He had not decided to. He found the phone in his hand and her name on the screen and the ring already going, and he let it, because it was the first thing all morning he had done on purpose. She answered on the third ring, from home, already on a different subject.</w:t>
+        <w:t>He had not decided to. He found the phone in his hand and her name on the screen and the ring already going, and he let it, because it was the first thing all morning he had done on purpose. She answered on the third ring, from home, where she had a brief to read and was not reading it, already on a different subject.</w:t>
       </w:r>
     </w:p>
     <w:p>
@@ -5948,7 +5948,7 @@
           <w:b w:val="0"/>
           <w:sz w:val="22"/>
         </w:rPr>
-        <w:t>“The school rang me again. Twice in a morning. They said the father’s office had rung as well. The father’s office. They said it as if you were a department.”</w:t>
+        <w:t>“The school rang me again. Twice in one day. They said the father’s office had rung as well. The father’s office. They said it as if you were a department.”</w:t>
       </w:r>
     </w:p>
     <w:p>
@@ -6039,20 +6039,20 @@
           <w:b w:val="0"/>
           <w:sz w:val="22"/>
         </w:rPr>
-        <w:t>Derek had imagined this conversation, on and off, for three years. In none of the versions had it taken place with a railway in the door, and in all of them he had said something clever. He found he did not have anything clever. He had what Penny had taught him on the stairs at ten o’clock: the order things were in.</w:t>
-      </w:r>
-    </w:p>
-    <w:p>
-      <w:pPr>
-        <w:spacing w:after="160" w:line="240" w:lineRule="auto"/>
-      </w:pPr>
-      <w:r>
-        <w:rPr>
-          <w:rFonts w:ascii="Georgia" w:hAnsi="Georgia" w:eastAsia="Georgia"/>
-          <w:b w:val="0"/>
-          <w:sz w:val="22"/>
-        </w:rPr>
-        <w:t>“A sheet of paper turned up this morning. Before the door opened. It said I wasn’t to board the train. I’m not boarding the train. At lunch a board in there showed her name for three seconds. She has nothing to do with it. She didn’t read the heading. She’s said she won’t write it down, and she’s right not to. I’m not going to the gates. I’m not ringing her again unless she rings me. And I’ll tell you when it’s over.”</w:t>
+        <w:t>Derek had imagined this conversation, on and off, for three years. In none of the versions had it taken place with a railway in the door, and in all of them he had said something clever. He found he did not have anything clever. He had what Penny had made Trevor write on an envelope at twenty past ten: the order things were in.</w:t>
+      </w:r>
+    </w:p>
+    <w:p>
+      <w:pPr>
+        <w:spacing w:after="160" w:line="240" w:lineRule="auto"/>
+      </w:pPr>
+      <w:r>
+        <w:rPr>
+          <w:rFonts w:ascii="Georgia" w:hAnsi="Georgia" w:eastAsia="Georgia"/>
+          <w:b w:val="0"/>
+          <w:sz w:val="22"/>
+        </w:rPr>
+        <w:t>“A sheet of paper turned up this morning. Before the door opened. It said I wasn’t to board the train. I’m not boarding the train. At lunch a board in there showed her name for three seconds. She has nothing to do with it. She didn’t read the heading. She hasn’t fetched it back, and she’s right not to. I’m not going to the gates. I’m not ringing her again unless she rings me. And I’ll tell you when it’s over.”</w:t>
       </w:r>
     </w:p>
     <w:p>
@@ -6987,7 +6987,7 @@
           <w:b w:val="0"/>
           <w:sz w:val="22"/>
         </w:rPr>
-        <w:t>She made it as she made most decisions, once, and put the itinerary back in her handbag under the face-down photograph, where it had lived since the old Tuesday. Neither of them looked surprised. Trevor, standing slightly to one side with his hands in his pockets, seemed to have been shown a second procedure he did not have, and was trying to work out where in the manual it had been all this time.</w:t>
+        <w:t>She made it as she made most decisions, once, and put the itinerary back in her handbag, under the face-down photograph. Neither of them looked surprised. Trevor, standing slightly to one side with his hands in his pockets, seemed to have been shown a second procedure he did not have, and was trying to work out where in the manual it had been all this time.</w:t>
       </w:r>
     </w:p>
     <w:p>
@@ -7792,7 +7792,7 @@
           <w:b w:val="0"/>
           <w:sz w:val="22"/>
         </w:rPr>
-        <w:t>“I know where you are. Alfred told me on Saturday that he was staying in London to be polite for a week, and I told him he had never in his life been polite for a week, and that something would happen to rescue him. What has happened to rescue him?”</w:t>
+        <w:t>“I know where you are. Alfred told me on Saturday that he was staying in London until Monday to be polite, and I told him he had never in his life been polite for three days together, and that something would happen to rescue him. What has happened to rescue him?”</w:t>
       </w:r>
     </w:p>
     <w:p>
@@ -10636,7 +10636,7 @@
           <w:b w:val="0"/>
           <w:sz w:val="22"/>
         </w:rPr>
-        <w:t>“He’s right about most things except fractions. He’s frightened of fractions.” Another pause. “Good. Double maths was ordinary. The phone wasn’t. I’m going home. Julian’s hangers are in the hall, in case you were about to ask whose life is whose. I’m not discussing them. Bye.”</w:t>
+        <w:t>“He’s right about most things except fractions. He’s frightened of fractions.” Another pause. “Good. Double maths was ordinary. The phone wasn’t. I’m going home. Julian’s hangers are in my wardrobe, in case you were about to ask whose life is whose. I’m not discussing them. Bye.”</w:t>
       </w:r>
     </w:p>
     <w:p>
@@ -13805,7 +13805,7 @@
           <w:b w:val="0"/>
           <w:sz w:val="22"/>
         </w:rPr>
-        <w:t>PLEASE NOTE. THE PREVIOUS WARNING ARRIVED AFTER THE ACT.</w:t>
+        <w:t>PLEASE NOTE. THE PREVIOUS WARNING WAS SENT TOO LATE.</w:t>
       </w:r>
     </w:p>
     <w:p>
@@ -13883,7 +13883,7 @@
           <w:b w:val="0"/>
           <w:sz w:val="22"/>
         </w:rPr>
-        <w:t>Nobody touched it. The board through the doorway held its one word. The train, behind it, held its breath, if trains had breath, which this one appeared to.</w:t>
+        <w:t>Nobody touched it. The board through the doorway held its one word. The train, behind it, held its breath, if trains had breath, which this one appeared to. Under the new sentence, on the line Trevor had filled at lunch because the Bureau wrote down whatever a board said, the recipient field still read SOPHIE.</w:t>
       </w:r>
     </w:p>
     <w:p>
@@ -14312,7 +14312,7 @@
           <w:b w:val="0"/>
           <w:sz w:val="22"/>
         </w:rPr>
-        <w:t xml:space="preserve">Trevor, who had taken the chair back, stood up again, said nothing useful, and went to the kitchen. They heard the kettle go on. It was, by any reasonable reading, the correct kettle.</w:t>
+        <w:t>Trevor, who had taken the chair back, stood up again, said nothing useful, and went to the kettle in the corner and switched it on. It was, by any reasonable reading, the correct kettle.</w:t>
       </w:r>
     </w:p>
     <w:p>
@@ -14844,7 +14844,7 @@
           <w:b w:val="0"/>
           <w:sz w:val="22"/>
         </w:rPr>
-        <w:t>“A slip at Paddington. Which I did not see. Which says it came seventeen minutes after.” She looked at the book. “At seventeen minutes past six I was in the kitchen downstairs with the kettle on. I had locked your door eight minutes before.”</w:t>
+        <w:t>“A slip at Paddington. Which I did not see. Which says it came seventeen minutes after.” She looked at the book. “At seventeen minutes past six I was in the lodge downstairs with the kettle on. I had locked your door eight minutes before.”</w:t>
       </w:r>
     </w:p>
     <w:p>
@@ -16650,7 +16650,7 @@
           <w:b w:val="0"/>
           <w:sz w:val="22"/>
         </w:rPr>
-        <w:t>“No.” She put the phone face-down on the table, next to the hanger. “Tomorrow. In the daytime. When it’s not the same day as the railway. If I ring tonight it’ll look like a reaction. I want it to be a decision.”</w:t>
+        <w:t>“No.” She put the phone face-down on the table, next to the hanger. “Tomorrow. When it’s not the same day as the railway. If I ring tonight it’ll look like a reaction. I want it to be a decision.”</w:t>
       </w:r>
     </w:p>
     <w:p>
@@ -17390,7 +17390,7 @@
           <w:b w:val="0"/>
           <w:sz w:val="22"/>
         </w:rPr>
-        <w:t>“Somebody did it. Nineteen seventy-one. Two men took four atomic clocks round the world on ordinary airliners and bought them seats.” He sounded happy. “East, the clocks lost. West, they gained. Same planes, roughly the same heights. The only difference was which way they went round a planet that was already turning. Hafele and Keating. It’s two pages. It’s the best two pages in the world.”</w:t>
+        <w:t>“Somebody did it. Nineteen seventy-one. Two men took four atomic clocks round the world on ordinary airliners and bought them seats.” He sounded happy. “East, the clocks lost. West, they gained. Same planes, roughly the same heights. The only difference was which way they went round a planet that was already turning. Hafele and Keating. It’s two short papers. The best few pages in the world.”</w:t>
       </w:r>
     </w:p>
     <w:p>
@@ -17975,7 +17975,7 @@
           <w:b w:val="0"/>
           <w:sz w:val="22"/>
         </w:rPr>
-        <w:t>She put the itinerary back in the bag, on top of the photograph, and got up for the first time in two and a half hours, and took her coat off at last, and hung it on the back of the kitchen door, which was in the hall, where the builder had put it.</w:t>
+        <w:t>She put the itinerary back in the bag, on top of the photograph, and got up for the first time in nearly three hours, and took her coat off at last, and hung it on the back of the kitchen door, which was in the hall, where the builder had put it.</w:t>
       </w:r>
     </w:p>
     <w:p>
@@ -18520,7 +18520,7 @@
           <w:b w:val="0"/>
           <w:sz w:val="22"/>
         </w:rPr>
-        <w:t xml:space="preserve">He said it to the platform in his own voice, the one for tea, as he had said it at sixteen forty-one with his feet on the yellow line. It was the word Sherlock had sent at lunch, he realised, the single word on Trevor’s screen, refusing a case before it was offered. He had thought at the time it meant the dolphin did not want it. He thought now that it might simply have been the correct reply to a railway, and that it needed saying more than once.</w:t>
+        <w:t>He said it to the platform in his own voice, the one for tea, as he had said it at sixteen forty-one with his feet on the yellow line. It was the word Sherlock had sent that afternoon, he realised, the single word on Trevor’s screen, refusing a case before it was offered. He had thought at the time it meant the dolphin did not want it. He thought now that it might simply have been the correct reply to a railway, and that it needed saying more than once.</w:t>
       </w:r>
     </w:p>
     <w:p>
@@ -19182,7 +19182,7 @@
           <w:b w:val="0"/>
           <w:sz w:val="22"/>
         </w:rPr>
-        <w:t xml:space="preserve">Then he got out his phone and did Penny’s sum again, on the back of the dishwasher’s patent application, in ink, the textbook way: height makes a clock run fast, speed makes it run slow, and at airliner heights the height wins. About ten billionths of a second. He checked it twice. It was, he thought, the first number in the whole affair whose origin he knew exactly.</w:t>
+        <w:t>Then he got out his pen and did Penny’s sum again, on the back of the dishwasher’s patent application, in ink, the textbook way: height makes a clock run fast, speed makes it run slow, and at airliner heights the height wins. About ten billionths of a second. He checked it twice. It was, he thought, the first number in the whole affair whose origin he knew exactly.</w:t>
       </w:r>
     </w:p>
     <w:p>
@@ -20766,7 +20766,7 @@
           <w:b w:val="0"/>
           <w:sz w:val="22"/>
         </w:rPr>
-        <w:t>He was the landlord’s, not the building’s, and he made the distinction twice on the stairs, to Mrs Marsh, who had not asked for it. His name was Mr Quayle. He had a clipboard of his own, a laser measure in a holster on his belt, and the manner of someone sent to look at a great many damp patches and has never yet found one that was his fault.</w:t>
+        <w:t>He was the landlord’s, not the building’s, and he made the distinction twice on the stairs, to Mrs Marsh, who had not asked for it. His name was Mr Quayle. He had a clipboard of his own, a laser measure in a holster on his belt, and the manner of someone who has been sent to look at a great many damp patches and has never yet found one that was his fault.</w:t>
       </w:r>
     </w:p>
     <w:p>
@@ -22363,7 +22363,7 @@
           <w:b w:val="0"/>
           <w:sz w:val="22"/>
         </w:rPr>
-        <w:t>Penny, at her desk, put down the guidebook. Trevor, who had been sitting on the floor by the filing cabinet doing something to a cable for reasons he had not explained, looked up with his glasses on and then, slowly, took them off.</w:t>
+        <w:t>Penny, at her desk, put down her guidebook to Greece. Trevor, who had been sitting on the floor by the filing cabinet doing something to a cable for reasons he had not explained, looked up with his glasses on and then, slowly, took them off.</w:t>
       </w:r>
     </w:p>
     <w:p>
@@ -23429,7 +23429,7 @@
           <w:b w:val="0"/>
           <w:sz w:val="22"/>
         </w:rPr>
-        <w:t xml:space="preserve">Mrs Marsh took the statement from the desk before he could pick it up, filed the original in drawer three, under Pending Geometry, behind Sunday, behind Case 1047, and came back from the photocopier on the landing with two copies, and gave them both to Mr Haskett. On her way past Derek’s desk she said, without stopping, “I shall want the rest of the case on paper before I lock that drawer at half past six. I do not file screens.”</w:t>
+        <w:t>Mrs Marsh took the statement from the desk before he could pick it up, filed the original in drawer three, under Pending Geometry, behind Sunday, behind Case 1047, and came back from the photocopier on the landing with two copies, and gave them both to Mr Haskett. On her way past Derek’s desk she said, without stopping, “I shall want the rest of the case on paper before I lock that drawer at a quarter to seven. I do not file screens.”</w:t>
       </w:r>
     </w:p>
     <w:p>
@@ -23792,7 +23792,7 @@
           <w:b w:val="0"/>
           <w:sz w:val="22"/>
         </w:rPr>
-        <w:t>RELATIVISTIC INVESTIGATION BUREAU. STATUS OF CASE: NOT YET OCCURRED.</w:t>
+        <w:t>RELATIVISTIC INVESTIGATION BUREAU. CASE STATUS: NOT YET OCCURRED.</w:t>
       </w:r>
     </w:p>
     <w:p>
@@ -23922,7 +23922,7 @@
           <w:b w:val="0"/>
           <w:sz w:val="22"/>
         </w:rPr>
-        <w:t>He rang Penny before he touched the mug. She answered with the sound of a cupboard shutting.</w:t>
+        <w:t>He rang Penny before he touched the mug. She answered over the sound of a bus pulling away.</w:t>
       </w:r>
     </w:p>
     <w:p>
@@ -23987,7 +23987,7 @@
           <w:b w:val="0"/>
           <w:sz w:val="22"/>
         </w:rPr>
-        <w:t>He told her about the rest of the sheet. She asked him to check the date box once more, and the stripe, and whether the form had printed anything he could not trace to a field. He checked. Then she stayed on the line while he read the British Rail delivery instruction aloud. Neither of them called it an instruction to board.</w:t>
+        <w:t>He told her about the rest of the sheet. She asked him to check the date box once more, and the stripe, and whether the form had printed anything he could not trace to a field. He checked. Nothing was left over. She stayed on the line a moment longer than either of them needed, and rang off.</w:t>
       </w:r>
     </w:p>
     <w:p>
@@ -24130,7 +24130,7 @@
           <w:b w:val="0"/>
           <w:sz w:val="22"/>
         </w:rPr>
-        <w:t>The platform began at the sill. He had crossed onto it to refuse on Monday. Nobody had boarded. On Monday afternoon it had crept into the office while they were at Paddington, and it had gone back after he said no at its yellow line and Penny struck Sophie’s name, and since then he had treated the sill as the edge of the world.</w:t>
+        <w:t>The platform began at the sill. On Monday he had stood on its yellow line, on his own carpet, to refuse. Nobody had boarded. On Monday afternoon it had crept into the office while they were at Paddington, and it had gone back after he said no at its yellow line and Penny struck Sophie’s name, and since then he had treated the sill as the edge of the world.</w:t>
       </w:r>
     </w:p>
     <w:p>
@@ -24169,20 +24169,20 @@
           <w:b w:val="0"/>
           <w:sz w:val="22"/>
         </w:rPr>
-        <w:t xml:space="preserve">The slabs were colder than the carpet and slightly gritty underfoot. The air smelled of brake dust and of nothing else: no rain, no street, no buses, no London. The lamp hummed. The bench was wooden, bolted down, with a brass plate on the back polished blank by years of shoulders. He walked past it to the yellow line. Three paces. It felt much further.</w:t>
-      </w:r>
-    </w:p>
-    <w:p>
-      <w:pPr>
-        <w:spacing w:after="160" w:line="240" w:lineRule="auto"/>
-      </w:pPr>
-      <w:r>
-        <w:rPr>
-          <w:rFonts w:ascii="Georgia" w:hAnsi="Georgia" w:eastAsia="Georgia"/>
-          <w:b w:val="0"/>
-          <w:sz w:val="22"/>
-        </w:rPr>
-        <w:t>The three paces were along the platform, towards the leading carriage, not out across its width. The bench stood beside that route. Between the yellow line and the open doorway there was only the narrow strip he had faced on Monday. From here he could reach the end of the first seat. Reaching it would put his hand and shoulder inside. Boarding would put his feet there too.</w:t>
+        <w:t>The slabs were colder than the carpet and slightly gritty underfoot. The air smelled of brake dust and of nothing else: no rain, no street, no buses, no London. The lamp hummed. The bench was wooden, bolted down, with a brass plate on the back polished blank by years of shoulders. He walked past it, along the yellow line, towards the leading carriage. Three paces. It felt much further.</w:t>
+      </w:r>
+    </w:p>
+    <w:p>
+      <w:pPr>
+        <w:spacing w:after="160" w:line="240" w:lineRule="auto"/>
+      </w:pPr>
+      <w:r>
+        <w:rPr>
+          <w:rFonts w:ascii="Georgia" w:hAnsi="Georgia" w:eastAsia="Georgia"/>
+          <w:b w:val="0"/>
+          <w:sz w:val="22"/>
+        </w:rPr>
+        <w:t>Between the yellow line and the carriage there was only the narrow gap he had faced across his own carpet on Monday. From here, with both feet on the slabs, he could reach the first seat. Reaching was not boarding. Boarding would put his feet in there too.</w:t>
       </w:r>
     </w:p>
     <w:p>
@@ -24572,7 +24572,7 @@
           <w:b w:val="0"/>
           <w:sz w:val="22"/>
         </w:rPr>
-        <w:t xml:space="preserve">CARRIER: D. GENT, UNDER FORM PL/9, NOTE 7. ROUTE: THE FIRST SEAT, TUESDAY 18:24; THE TRAIN; THIS DESK, MONDAY, BETWEEN 09:58:12 AND THE OPENING OF THE DOOR. ONCE.</w:t>
+        <w:t>CARRIER: D. GENT, UNDER FORM PL/9, NOTE 7. ROUTE: THE FIRST SEAT, TUESDAY 18:24; THE TRAIN; THIS DESK, MONDAY MORNING, UNDER THE 1047 FOLDER, BEFORE THE DOOR OPENED. TIME UNKNOWN. ONCE.</w:t>
       </w:r>
     </w:p>
     <w:p>
@@ -24883,7 +24883,7 @@
           <w:b w:val="0"/>
           <w:sz w:val="22"/>
         </w:rPr>
-        <w:t xml:space="preserve">Trevor considered this, then regarded the kettle as though it had made the point, and went home. He went the long way, through the park, and did not look at any clocks, and told Derek on Wednesday that it had been the most relaxing walk of his adult life.</w:t>
+        <w:t>Trevor considered this, then regarded the kettle as though it had made the point, and went home. He drove the long way, round the park, and did not look at any clocks, the one on the dashboard included, and told Derek on Wednesday that it had been the most relaxing walk of his adult life.</w:t>
       </w:r>
     </w:p>
     <w:p>
@@ -25390,33 +25390,33 @@
           <w:b w:val="0"/>
           <w:sz w:val="22"/>
         </w:rPr>
-        <w:t xml:space="preserve">She thought about that for the length of a lamp-post. “That’s the worst answer I’ve ever heard. And you didn’t put the nearest name in.”</w:t>
-      </w:r>
-    </w:p>
-    <w:p>
-      <w:pPr>
-        <w:spacing w:after="160" w:line="240" w:lineRule="auto"/>
-      </w:pPr>
-      <w:r>
-        <w:rPr>
-          <w:rFonts w:ascii="Georgia" w:hAnsi="Georgia" w:eastAsia="Georgia"/>
-          <w:b w:val="0"/>
-          <w:sz w:val="22"/>
-        </w:rPr>
-        <w:t>“Not even mine.”</w:t>
-      </w:r>
-    </w:p>
-    <w:p>
-      <w:pPr>
-        <w:spacing w:after="160" w:line="240" w:lineRule="auto"/>
-      </w:pPr>
-      <w:r>
-        <w:rPr>
-          <w:rFonts w:ascii="Georgia" w:hAnsi="Georgia" w:eastAsia="Georgia"/>
-          <w:b w:val="0"/>
-          <w:sz w:val="22"/>
-        </w:rPr>
-        <w:t>“Good. I’d hate to be the nearest name.”</w:t>
+        <w:t>She thought about that for the length of a lamp-post. “That’s the worst answer I’ve ever heard.”</w:t>
+      </w:r>
+    </w:p>
+    <w:p>
+      <w:pPr>
+        <w:spacing w:after="160" w:line="240" w:lineRule="auto"/>
+      </w:pPr>
+      <w:r>
+        <w:rPr>
+          <w:rFonts w:ascii="Georgia" w:hAnsi="Georgia" w:eastAsia="Georgia"/>
+          <w:b w:val="0"/>
+          <w:sz w:val="22"/>
+        </w:rPr>
+        <w:t>“It’s the true one.”</w:t>
+      </w:r>
+    </w:p>
+    <w:p>
+      <w:pPr>
+        <w:spacing w:after="160" w:line="240" w:lineRule="auto"/>
+      </w:pPr>
+      <w:r>
+        <w:rPr>
+          <w:rFonts w:ascii="Georgia" w:hAnsi="Georgia" w:eastAsia="Georgia"/>
+          <w:b w:val="0"/>
+          <w:sz w:val="22"/>
+        </w:rPr>
+        <w:t>“Mr Okafor says the true ones usually are.”</w:t>
       </w:r>
     </w:p>
     <w:p>
@@ -26042,7 +26042,7 @@
           <w:b w:val="0"/>
           <w:sz w:val="22"/>
         </w:rPr>
-        <w:t>The door was already open at 10:05. That is when they noticed. The opening is earlier, and nobody wrote the clock time. The sheet was already in the pocket, and the room’s order is sheet, then door, then the voice that said not to open it. Finishing the reading at 10:22 is not the time the sheet arrived. The voice is after the opening, so it is late for don’t open, and the size of that lateness is unknown. The reading cannot be given the sheet’s arrival, and it cannot be the cause of a door that was already open. Calling 10:05 the act is how you file a noticing as an event. That was the previous case’s mistake, under a different noun.</w:t>
+        <w:t>The door was already open at 10:05. That is when they noticed. The opening is earlier, and nobody wrote the clock time. The sheet was already in Derek’s hand, and the room’s order is sheet, then door, then the voice that said not to open it. Finishing the reading at 10:22 is not the time the sheet arrived. The voice is after the opening, so it is late for don’t open, and the size of that lateness is unknown. The reading cannot be given the sheet’s arrival, and it cannot be the cause of a door that was already open. Calling 10:05 the act is how you file a noticing as an event. That was the previous case’s mistake, under a different noun.</w:t>
       </w:r>
     </w:p>
     <w:p>
@@ -26168,7 +26168,7 @@
           <w:b w:val="0"/>
           <w:sz w:val="22"/>
         </w:rPr>
-        <w:t xml:space="preserve">A warning is not a single moment. It is a message paired with an act, and this file has two messages. Pair the voice with the door: the voice comes after, so that sign is late. Pair the front of the sheet with boarding: the sheet was already in the pocket before the door, and nobody has boarded, so that sign is early. An early sign is still only a forecast until somebody acts on it. In Chapter 12 Derek turns it into an act: he stands on the line, says no, and turns his back, and only then is there a refusal for the form to record. Nothing in that requires the two acts to be the same event. They are not. That was the other case.</w:t>
+        <w:t>A warning is not a single moment. It is a message paired with an act, and this file has two messages. Pair the voice with the door: the voice comes after, so that sign is late. Pair the front of the sheet with boarding: the sheet was already in Derek’s hand before the door, and nobody has boarded, so that sign is early. An early sign is still only a forecast until somebody acts on it. In Chapter 12 Derek turns it into an act: he stands on the line, says no, and turns his back, and only then is there a refusal for the form to record. Nothing in that requires the two acts to be the same event. They are not. That was the other case.</w:t>
       </w:r>
     </w:p>
     <w:p>
@@ -26381,7 +26381,7 @@
           <w:b w:val="0"/>
           <w:sz w:val="22"/>
         </w:rPr>
-        <w:t xml:space="preserve">The form asked for a birthday because it assumed a person. A person who has not been born is not in the past of the paper, so the form correctly refused tomorrow. Derek’s refusal at 16:41, made at the yellow line with the carriage door open, can author that record. It has a time, and the time is after the acts it does not claim to have caused. It is not the sender of the morning sheet. The morning sheet was already in the pocket. Acts have times. A sheet that arrived earlier still needs its own account. In this case the account, found in Chapter 22, was not a sender but a printer, a carrier and a route: the form printed the sheet on Tuesday evening from fields the office had filled for other reasons, Derek carried it to the train, and it arrived on Monday morning. Every word has a source. The sentence has no author.</w:t>
+        <w:t>The form asked for a birthday because it assumed a person. A person who has not been born is not in the past of the paper, so the form correctly refused tomorrow. Derek’s refusal at 16:41, made at the yellow line with the carriage door open, can author that record. It has a time, and the time is after the acts it does not claim to have caused. It is not the sender of the morning sheet. The morning sheet was already in Derek’s hand before the door opened. Acts have times. A sheet that arrived earlier still needs its own account. In this case the account, found in Chapter 22, was not a sender but a printer, a carrier and a route: the form printed the sheet on Tuesday evening from fields the office had filled for other reasons, Derek carried it to the train, and it arrived on Monday morning. Every word has a source. The sentence has no author.</w:t>
       </w:r>
     </w:p>
     <w:p>
@@ -26481,7 +26481,7 @@
           <w:b w:val="0"/>
           <w:sz w:val="22"/>
         </w:rPr>
-        <w:t>If later Derek writes the warning, he learned the sentence from a life in which he boarded, or from a life in which he did not. The first makes the warning a record of failure. The second never teaches him the sentence. The book avoids that trap: Derek records his refusal without composing the warning. The paper has an ordinary origin, a printer on Tuesday evening; it travels back once and then ages normally, so on Tuesday evening the same sheet exists twice, once new and once about thirty-two hours older. Nothing about the paper needs repairing. What closes on itself is the information: the refusal the sheet provoked supplied the words the form printed. Novikov’s self-consistency principle says that if closed timelike curves exist, only histories that agree with themselves can happen on them. Lossev and Novikov called an object that circulates on such a curve with no maker a jinn, and noted that it would have to be restored to its exact earlier state each time round; the morning sheet is not a jinn, because it has a maker and goes round only once. Whether closed timelike curves can exist at all is open; Hawking’s chronology protection conjecture says the laws of physics forbid them. The railway in this book is fiction. The method Derek uses, asking each word where it came from, is not.</w:t>
+        <w:t>If later Derek writes the warning, he learned the sentence from a life in which he boarded, or from a life in which he did not. The first makes the warning a record of failure. The second never teaches him the sentence. The book avoids that trap: Derek records his refusal without composing the warning. The paper has an ordinary origin, a printer on Tuesday evening; it travels back once and then ages normally, so on Tuesday evening the same sheet exists twice, once new and once about thirty-two hours older. Nothing about the paper needs repairing. What closes on itself is the information: the refusal the sheet provoked supplied the words the form printed. Novikov’s self-consistency principle says that if closed timelike curves exist, only histories that agree with themselves can happen on them. Lossev and Novikov called an object that circulates on such a curve with no maker a jinn, and noted that it would have to be restored to its exact earlier state each time round; the morning sheet is not a jinn, because it has a maker and goes round only once. Whether closed timelike curves can exist at all is open; Hawking’s chronology protection conjecture proposes that the laws of physics forbid them. The railway in this book is fiction. The method Derek uses, asking each word where it came from, is not.</w:t>
       </w:r>
     </w:p>
     <w:p>

</xml_diff>

<commit_message>
The Warning That Was Sent Too Late: tightening and humour pass on Chs 15-21 (33 edits, 5 paragraphs cut, ~320 words shorter: repeated beats out, scene goals for Weinstein and Herbert with a payoff, sharper jokes; laser, insurer-letter and interval fixes); covers sharpened (front hook line 'The warning came before it was written.', series line with Book 2, Mrs Marsh's sticky note and the MIND THE ORDER mug; stronger back hook); strict rescore 8.9 to 9.0; course and Chs 1-14, 22+ unchanged; script scripts/tighten_2026-10-11.py; md regenerated; old files in bak/2026-10-11 pre-tighten
(cherry picked from commit 6d38e7b30ca0e6e9228e0a4e8090207df73462db)
</commit_message>
<xml_diff>
--- a/The Relativistic Investigation Bureau - SERIES/Book 2 - The Warning That Was Sent Too Late/The_Warning_That_Was_Sent_Too_Late_BOOK_2_REV02.docx
+++ b/The Relativistic Investigation Bureau - SERIES/Book 2 - The Warning That Was Sent Too Late/The_Warning_That_Was_Sent_Too_Late_BOOK_2_REV02.docx
@@ -16935,7 +16935,7 @@
           <w:b w:val="0"/>
           <w:sz w:val="22"/>
         </w:rPr>
-        <w:t xml:space="preserve">It annoyed her more than she could reasonably account for. He had done it upside down, in his head, in the time it took to put a ticket away, and she had done it with a biro over twenty minutes, and they had got the same number. Very smart and very lazy, Herbert called it. Weinstein quoted it about himself with something not far from pride.</w:t>
+        <w:t>It annoyed her more than she could reasonably account for. He had done it upside down, in his head, in the time it took to put a ticket away; she had done it with a biro over twenty minutes; they had got the same number. Herbert called that very smart and very lazy. Weinstein had more or less had it engraved.</w:t>
       </w:r>
     </w:p>
     <w:p>
@@ -17065,7 +17065,7 @@
           <w:b w:val="0"/>
           <w:sz w:val="22"/>
         </w:rPr>
-        <w:t>She read it to him. Height, gravity, the speed of light. Speed, the speed of light. Four point three in, one and a quarter out, three and a half hours, ten and a half nanoseconds. Weinstein’s number. She read it in the voice she used for reading out flight times, so that he would not hear that it mattered.</w:t>
+        <w:t>She read it to him in the voice she used for flight times, so that he would not hear that it mattered: four point three in, one and a quarter out, three and a half hours, ten and a half nanoseconds. Weinstein’s number.</w:t>
       </w:r>
     </w:p>
     <w:p>
@@ -17364,7 +17364,7 @@
           <w:b w:val="0"/>
           <w:sz w:val="22"/>
         </w:rPr>
-        <w:t>Penny considered the ten and a half on the itinerary, and the x3 in the margin beside it, and at the four of them standing against the sugar bowl.</w:t>
+        <w:t>Penny looked at the ten and a half on the itinerary, and the x3 beside it, and the four of them standing against the sugar bowl.</w:t>
       </w:r>
     </w:p>
     <w:p>
@@ -17442,45 +17442,6 @@
           <w:b w:val="0"/>
           <w:sz w:val="22"/>
         </w:rPr>
-        <w:t>“He’d say it was lazy.”</w:t>
-      </w:r>
-    </w:p>
-    <w:p>
-      <w:pPr>
-        <w:spacing w:after="40" w:line="240" w:lineRule="auto"/>
-      </w:pPr>
-      <w:r>
-        <w:rPr>
-          <w:rFonts w:ascii="Georgia" w:hAnsi="Georgia" w:eastAsia="Georgia"/>
-          <w:b w:val="0"/>
-          <w:sz w:val="22"/>
-        </w:rPr>
-        <w:t>“Herbert would say that. Weinstein would agree with him and be pleased about it.”</w:t>
-      </w:r>
-    </w:p>
-    <w:p>
-      <w:pPr>
-        <w:spacing w:after="160" w:line="240" w:lineRule="auto"/>
-      </w:pPr>
-      <w:r>
-        <w:rPr>
-          <w:rFonts w:ascii="Georgia" w:hAnsi="Georgia" w:eastAsia="Georgia"/>
-          <w:b w:val="0"/>
-          <w:sz w:val="22"/>
-        </w:rPr>
-        <w:t>That was true, and she did not want it to be, and she let it go.</w:t>
-      </w:r>
-    </w:p>
-    <w:p>
-      <w:pPr>
-        <w:spacing w:after="40" w:line="240" w:lineRule="auto"/>
-      </w:pPr>
-      <w:r>
-        <w:rPr>
-          <w:rFonts w:ascii="Georgia" w:hAnsi="Georgia" w:eastAsia="Georgia"/>
-          <w:b w:val="0"/>
-          <w:sz w:val="22"/>
-        </w:rPr>
         <w:t>“Trevor.”</w:t>
       </w:r>
     </w:p>
@@ -17520,7 +17481,7 @@
           <w:b w:val="0"/>
           <w:sz w:val="22"/>
         </w:rPr>
-        <w:t>A silence came down the line. It went on long enough that she thought for a moment the call had dropped, and then she heard him breathing, slowly, as he breathed when he was standing at the edge of a thing and deciding whether to say it.</w:t>
+        <w:t>A silence came down the line, long enough that she thought the call had dropped. Then she heard him breathing slowly, as he did at the edge of a thing he was deciding whether to say.</w:t>
       </w:r>
     </w:p>
     <w:p>
@@ -17897,20 +17858,20 @@
           <w:b w:val="0"/>
           <w:sz w:val="22"/>
         </w:rPr>
-        <w:t xml:space="preserve">He rang off. She sat with the phone in her hand, and the kettle she had boiled at seven and forgotten, and the rain on the window, and a train somewhere across London in a doorway on the second floor of an old building, with Derek sitting in front of it with the face.</w:t>
-      </w:r>
-    </w:p>
-    <w:p>
-      <w:pPr>
-        <w:spacing w:after="160" w:line="240" w:lineRule="auto"/>
-      </w:pPr>
-      <w:r>
-        <w:rPr>
-          <w:rFonts w:ascii="Georgia" w:hAnsi="Georgia" w:eastAsia="Georgia"/>
-          <w:b w:val="0"/>
-          <w:sz w:val="22"/>
-        </w:rPr>
-        <w:t>She thought about ringing him. He had said he would ring if it did anything. He had said nothing about ringing if it did nothing, and she had told him to ring her if it didn’t, and he had not, which meant that it was not doing anything and he was being Derek about it. She left him alone. It was, she thought, the kind of help he was best at accepting.</w:t>
+        <w:t>He rang off. She sat with the phone in her hand, the kettle she had boiled at seven and forgotten, and the rain, and somewhere across London a train in a doorway with Derek sitting in front of it, doing the face at it.</w:t>
+      </w:r>
+    </w:p>
+    <w:p>
+      <w:pPr>
+        <w:spacing w:after="160" w:line="240" w:lineRule="auto"/>
+      </w:pPr>
+      <w:r>
+        <w:rPr>
+          <w:rFonts w:ascii="Georgia" w:hAnsi="Georgia" w:eastAsia="Georgia"/>
+          <w:b w:val="0"/>
+          <w:sz w:val="22"/>
+        </w:rPr>
+        <w:t>She thought about ringing him. He had promised to ring if it did anything. He had not rung, which meant it was doing nothing and he was being Derek about it. She left him alone. It was the kind of help he was best at accepting.</w:t>
       </w:r>
     </w:p>
     <w:p>
@@ -18065,20 +18026,20 @@
           <w:b w:val="0"/>
           <w:sz w:val="22"/>
         </w:rPr>
-        <w:t>He had not meant to. He had meant to stay for a bit, as he had told Penny, and the bit had a habit of becoming another bit, as the evenings had once become shut doors. He made a cup of tea at seven and did not drink it. He made another at eight and drank half. He rang out for nothing and ate nothing. He sat in his own chair, behind his own desk, and turned it, for the first time all day, to face the doorway square.</w:t>
-      </w:r>
-    </w:p>
-    <w:p>
-      <w:pPr>
-        <w:spacing w:after="160" w:line="240" w:lineRule="auto"/>
-      </w:pPr>
-      <w:r>
-        <w:rPr>
-          <w:rFonts w:ascii="Georgia" w:hAnsi="Georgia" w:eastAsia="Georgia"/>
-          <w:b w:val="0"/>
-          <w:sz w:val="22"/>
-        </w:rPr>
-        <w:t>The platform at night was not much different from the platform at ten in the morning. That was the first thing he noticed. The lamp at the far end had not got brighter. The lit windows of the carriage had not changed. The white clock on the far pillar went round at the same rate as every clock in London, as Trevor had shown it did, and told the time it had been telling all day. The board said YESTERDAY.</w:t>
+        <w:t>He had not meant to. He had meant to stay for a bit, as he had told Penny, and the bit had a habit of becoming another bit, as the evenings had once become shut doors. He made a cup of tea at seven and did not drink it. He made another at eight and drank half. He thought about ordering food, and could not face giving a delivery driver directions that ended at a railway on the second floor, so he ate nothing. He sat in his own chair, behind his own desk, and turned it, for the first time all day, to face the doorway square.</w:t>
+      </w:r>
+    </w:p>
+    <w:p>
+      <w:pPr>
+        <w:spacing w:after="160" w:line="240" w:lineRule="auto"/>
+      </w:pPr>
+      <w:r>
+        <w:rPr>
+          <w:rFonts w:ascii="Georgia" w:hAnsi="Georgia" w:eastAsia="Georgia"/>
+          <w:b w:val="0"/>
+          <w:sz w:val="22"/>
+        </w:rPr>
+        <w:t>The platform at night was the platform at ten in the morning. The lamp had not got brighter, the lit windows had not changed, and the white clock on the far pillar went round at the same rate as every clock in London, as Trevor had shown it did. The board said YESTERDAY.</w:t>
       </w:r>
     </w:p>
     <w:p>
@@ -18364,7 +18325,7 @@
           <w:b w:val="0"/>
           <w:sz w:val="22"/>
         </w:rPr>
-        <w:t>He read it three times. He found that it was, in its way, the best thing anyone had said to him all day, and that it was a report about a dog. He typed a reply and deleted it, and typed another and deleted that, and then remembered the pavement at Paddington and the sentence he had already said, and that it did not need saying again in a text message at half past ten to a woman who had already heard it.</w:t>
+        <w:t>He read it three times. It was the best thing anyone had said to him all day, and it was a report about a dog. He typed a reply and deleted it, and then remembered the pavement at Paddington and the sentence he had already said there, which did not need saying again by text at half past ten.</w:t>
       </w:r>
     </w:p>
     <w:p>
@@ -18455,19 +18416,6 @@
           <w:b w:val="0"/>
           <w:sz w:val="22"/>
         </w:rPr>
-        <w:t>The phone buzzed once more. He did not turn it over. He knew roughly what it would say, and he found he did not need to know exactly; that it could wait until the morning, and be read in the morning, and be no less true for being read late.</w:t>
-      </w:r>
-    </w:p>
-    <w:p>
-      <w:pPr>
-        <w:spacing w:after="160" w:line="240" w:lineRule="auto"/>
-      </w:pPr>
-      <w:r>
-        <w:rPr>
-          <w:rFonts w:ascii="Georgia" w:hAnsi="Georgia" w:eastAsia="Georgia"/>
-          <w:b w:val="0"/>
-          <w:sz w:val="22"/>
-        </w:rPr>
         <w:t>At eleven he did, finally, the one thing he had been not doing since six. He got up and walked to the sill.</w:t>
       </w:r>
     </w:p>
@@ -18559,20 +18507,20 @@
           <w:b w:val="0"/>
           <w:sz w:val="22"/>
         </w:rPr>
-        <w:t>Then he turned off the desk lamp. The office went dark, and the platform did not, and he stood for a moment in the light from a train that was going nowhere, in a room lit from the other side of a sill, and found that he was not afraid of it. He was not reconciled to it. He was simply not afraid.</w:t>
-      </w:r>
-    </w:p>
-    <w:p>
-      <w:pPr>
-        <w:spacing w:after="160" w:line="240" w:lineRule="auto"/>
-      </w:pPr>
-      <w:r>
-        <w:rPr>
-          <w:rFonts w:ascii="Georgia" w:hAnsi="Georgia" w:eastAsia="Georgia"/>
-          <w:b w:val="0"/>
-          <w:sz w:val="22"/>
-        </w:rPr>
-        <w:t>On this corridor an open door meant that nobody knew where you had gone. He had written that rule himself. He went out through the outer room, and down the stairs, past the step where Mrs Marsh had sat, and out into the street, and he walked home, because he walked; he had no licence, and there was no one on the pavement to mention it to.</w:t>
+        <w:t>Then he turned off the desk lamp. The office went dark and the platform did not, and he stood for a moment in the light of a train that was going nowhere and found that he was not afraid of it. Not reconciled. Simply not afraid.</w:t>
+      </w:r>
+    </w:p>
+    <w:p>
+      <w:pPr>
+        <w:spacing w:after="160" w:line="240" w:lineRule="auto"/>
+      </w:pPr>
+      <w:r>
+        <w:rPr>
+          <w:rFonts w:ascii="Georgia" w:hAnsi="Georgia" w:eastAsia="Georgia"/>
+          <w:b w:val="0"/>
+          <w:sz w:val="22"/>
+        </w:rPr>
+        <w:t>He went out through the outer room and down the stairs, past the step where Mrs Marsh had sat, and walked home, because he walked; he had never held a licence, and at that hour there was nobody on the pavement to explain it to.</w:t>
       </w:r>
     </w:p>
     <w:p>
@@ -18675,7 +18623,7 @@
           <w:b w:val="0"/>
           <w:sz w:val="22"/>
         </w:rPr>
-        <w:t>He sat at his desk with the blotter in front of him and his jacket on, because he always had his jacket on, and he did not open any of the patent files that were waiting for him. There was a dishwasher in one of them that claimed to clean plates using sound alone. He had been looking forward to the dishwasher for a week. He found, this morning, that he could not make himself care whether it worked.</w:t>
+        <w:t>He had been at his desk since six, in his jacket, because he was always in his jacket, trying to settle one question before anybody arrived to ask it for him. He had not opened the patent files. There was a dishwasher in one of them that claimed to clean plates using sound alone, and he had been looking forward to it for a week. This morning he could not make himself care whether it worked, which worried him more than the railway had.</w:t>
       </w:r>
     </w:p>
     <w:p>
@@ -19065,7 +19013,7 @@
           <w:b w:val="0"/>
           <w:sz w:val="22"/>
         </w:rPr>
-        <w:t>“Then you will find out later. In which case you will know later. You will not know it now, by wishing.” Herbert stood, and took his coat from the chair he had been sitting on, and shook it out. “Novikov would say the universe only permits the stories that were always going to happen. Hawking would say the universe does not permit this kind of story at all. Barbarian would say there is no story, only the relations, and that I am being old-fashioned to want an author. All three of them would agree on one thing: you do not get to be the author by being frightened that you might be.”</w:t>
+        <w:t>“Then you will find out later. In which case you will know later. You will not know it now, by wishing.” Herbert stood, and took his coat from the chair he had been sitting on, and shook it out. “Novikov would say the universe only permits the stories that were always going to happen. Hawking suspected the universe does not permit this kind of story at all. Barbarian would say there is no story, only the relations, and that I am being old-fashioned to want an author. All three of them would agree on one thing: you do not get to be the author by being frightened that you might be.”</w:t>
       </w:r>
     </w:p>
     <w:p>
@@ -19130,7 +19078,7 @@
           <w:b w:val="0"/>
           <w:sz w:val="22"/>
         </w:rPr>
-        <w:t>Weinstein thought about it. He thought about the barrier at Paddington, and turning round once, and Derek’s face, and Penny’s face, and a little girl he had met last week and understood better this week who refused to write down headings she had not read.</w:t>
+        <w:t>Weinstein thought about the barrier at Paddington, and turning round once, and a girl he had met last week who refused to write down headings she had not read.</w:t>
       </w:r>
     </w:p>
     <w:p>
@@ -19337,7 +19285,7 @@
           <w:b w:val="0"/>
           <w:sz w:val="22"/>
         </w:rPr>
-        <w:t>He had made one anyway. He regarded the plaque as an opinion, and he had never in his life allowed an opinion on a door to alter his behaviour on the step.</w:t>
+        <w:t>He had made one anyway. He regarded the plaque as an opinion, and he had never in his life allowed an opinion on a door to alter his behaviour on the step. He had also come with one purpose, written on a card in his breast pocket so that he could not be talked out of it: THE RULER MAY GO. THE CONE STAYS.</w:t>
       </w:r>
     </w:p>
     <w:p>
@@ -19961,7 +19909,7 @@
           <w:b w:val="0"/>
           <w:sz w:val="22"/>
         </w:rPr>
-        <w:t xml:space="preserve">“It is the best convenience in physics. It is so good that people forget they put it there.” Barbarian sat back. “And then a sheet arrives before a door, and a voice comes after, and they look at the wire for the answer, and the wire says nothing. YESTERDAY. Not a date. A direction. It is the most honest railway in Europe. I should like to meet whoever designed it.”</w:t>
+        <w:t>“It is the best convenience in physics. It is so good that people forget they put it there.” Barbarian sat back. “Then a sheet arrives before a door, and they look at the wire for the answer, and the wire says nothing. YESTERDAY. Not a date; a direction. The most honest railway in Europe. It has never once promised to arrive. I should like to meet whoever designed it.”</w:t>
       </w:r>
     </w:p>
     <w:p>
@@ -20039,7 +19987,7 @@
           <w:b w:val="0"/>
           <w:sz w:val="22"/>
         </w:rPr>
-        <w:t xml:space="preserve">“Of course he does. He was holding it. People always want to be the before; it is the only position in a story that cannot be blamed for arriving late.” Barbarian shook his head, slowly, with every appearance of affection. “Tell him he is in the order, and that is honour enough for anyone. He was there for the sheet. That is all.”</w:t>
+        <w:t>“Of course he does. He was holding it. People always want to be the before; it is the only position in a story that cannot be blamed for arriving late.”</w:t>
       </w:r>
     </w:p>
     <w:p>
@@ -20520,20 +20468,20 @@
           <w:b w:val="0"/>
           <w:sz w:val="22"/>
         </w:rPr>
-        <w:t>“Monday. He told me on the telephone that he nearly stayed. He went through the barrier at four and turned round once and did not come back. Staying would have been a tenancy. It was the cleanest act of the day, until Mr Gent’s. Do not tell him I said he was right. Tell him the hurry was. He will know the difference, and it will annoy him.”</w:t>
-      </w:r>
-    </w:p>
-    <w:p>
-      <w:pPr>
-        <w:spacing w:after="160" w:line="240" w:lineRule="auto"/>
-      </w:pPr>
-      <w:r>
-        <w:rPr>
-          <w:rFonts w:ascii="Georgia" w:hAnsi="Georgia" w:eastAsia="Georgia"/>
-          <w:b w:val="0"/>
-          <w:sz w:val="22"/>
-        </w:rPr>
-        <w:t>Herbert let himself out. On the step he looked at the plaque again, and thought about appointments, and decided that he had kept this one, and that the keeping had been entirely his own affair.</w:t>
+        <w:t>“Monday. He nearly stayed. Staying would have been a tenancy. Do not tell him I said he was right. Tell him the hurry was. He will know the difference, and it will annoy him.”</w:t>
+      </w:r>
+    </w:p>
+    <w:p>
+      <w:pPr>
+        <w:spacing w:after="160" w:line="240" w:lineRule="auto"/>
+      </w:pPr>
+      <w:r>
+        <w:rPr>
+          <w:rFonts w:ascii="Georgia" w:hAnsi="Georgia" w:eastAsia="Georgia"/>
+          <w:b w:val="0"/>
+          <w:sz w:val="22"/>
+        </w:rPr>
+        <w:t>Herbert let himself out. On the step he took the card out of his breast pocket, read it, and put it back. Both halves had held.</w:t>
       </w:r>
     </w:p>
     <w:p>
@@ -20559,7 +20507,7 @@
           <w:b w:val="0"/>
           <w:sz w:val="22"/>
         </w:rPr>
-        <w:t>He wrote four hundred words, and found that they explained the joke, and deleted them. He wrote two hundred, and found that they agreed with Herbert, and deleted those too. Then he watched the clocks for a while, each one perfectly honest and none of them in agreement, and wrote four lines that said what he meant.</w:t>
+        <w:t>He wrote four hundred words, found that they explained the joke, and deleted them. He wrote two hundred, found that they agreed with Herbert, and deleted those faster. Then he watched the clocks for a while, each one perfectly honest and none of them in agreement, and wrote four lines that said what he meant.</w:t>
       </w:r>
     </w:p>
     <w:p>
@@ -21091,7 +21039,7 @@
           <w:b w:val="0"/>
           <w:sz w:val="22"/>
         </w:rPr>
-        <w:t xml:space="preserve">“It times it. It sends light out and waits for it to come back. Eight hundred and ninety-six millimetres there and back is about six nanoseconds. It’s measuring when the light gets home.” He was going a little pink. “If you pointed it one inch further, it’d come back off the platform, late by exactly the right amount, because the platform’s there. It doesn’t care about the lease.”</w:t>
+        <w:t>“It times it. It sends light out and waits for it to come back. Eight hundred and ninety-six millimetres there and back is about six nanoseconds. It’s measuring when the light gets home.” He was going a little pink. “If you turned it a few degrees, through the opening, it’d come back off the platform, late by exactly the right amount, because the platform’s there. It doesn’t care about the lease.”</w:t>
       </w:r>
     </w:p>
     <w:p>
@@ -21532,7 +21480,7 @@
           <w:b w:val="0"/>
           <w:sz w:val="22"/>
         </w:rPr>
-        <w:t>They did it as the Bureau had done everything that week, a box at a time, out loud. Location: second floor, inner office. Name of occupier: Derek wrote his own, and Mrs Marsh made him add the word tenant. Date and time first observed: Trevor wrote MONDAY 10:05, NOTICED, ALREADY OPEN, and Mr Pendleton read it upside down and said that he would copy it into his incident report exactly as it stood, because he had written ten oh five in the report on Monday, on the stairs, and he liked his reports to agree with themselves. Nobody thought anything of that at the time. By five o’clock two insurance companies would think a great deal of it.</w:t>
+        <w:t>They did it as the Bureau had done everything that week, a box at a time, out loud. Location: second floor, inner office. Name of occupier: Derek wrote his own, and Mrs Marsh made him add the word tenant. Date and time first observed: Trevor wrote MONDAY 10:05, NOTICED, ALREADY OPEN, and Mr Pendleton read it upside down and said that he would copy it into his incident report exactly as it stood, because he had written ten oh five in the report on Monday, on the stairs, and he liked his reports to agree with themselves. Nobody thought anything of that at the time. By five o’clock it would turn out that two insurance companies had already thought a great deal of it.</w:t>
       </w:r>
     </w:p>
     <w:p>
@@ -21870,7 +21818,7 @@
           <w:b w:val="0"/>
           <w:sz w:val="22"/>
         </w:rPr>
-        <w:t xml:space="preserve">“That isn’t a rule,” said Penny. “That’s a confession.”</w:t>
+        <w:t>“That isn’t a rule,” said Penny. “That’s a confession.” Everybody laughed, Mr Pendleton last and least certainly.</w:t>
       </w:r>
     </w:p>
     <w:p>
@@ -22584,7 +22532,7 @@
           <w:b w:val="0"/>
           <w:sz w:val="22"/>
         </w:rPr>
-        <w:t>“You’re asking us to guess and sign it. That’s the same thing with better handwriting.” Penny got up and came round her desk. She did not come too close; she stood beside the filing cabinet, with one hand on the top of it, in the place where she had stood on Monday when the board had flickered. “We’ve spent two days not doing that. We’re not going to start for an insurer.”</w:t>
+        <w:t>“You’re asking us to guess and sign it. That’s the same thing with better handwriting.” Penny got up and stood by the filing cabinet, one hand on top of it, where she had stood on Monday when the board flickered. “We’ve spent two days not doing that. We’re not going to start for an insurer.”</w:t>
       </w:r>
     </w:p>
     <w:p>
@@ -22909,7 +22857,7 @@
           <w:b w:val="0"/>
           <w:sz w:val="22"/>
         </w:rPr>
-        <w:t>“Ten o’clock is in the middle of it,” said Mr Haskett.</w:t>
+        <w:t>“Ten o’clock is inside it,” said Mr Haskett.</w:t>
       </w:r>
     </w:p>
     <w:p>
@@ -22935,7 +22883,7 @@
           <w:b w:val="0"/>
           <w:sz w:val="22"/>
         </w:rPr>
-        <w:t>“It’s eight minutes wide and ten o’clock is in the middle.”</w:t>
+        <w:t>“It’s eight minutes wide and ten o’clock is sitting in it like a lodger.”</w:t>
       </w:r>
     </w:p>
     <w:p>
@@ -23442,20 +23390,20 @@
           <w:b w:val="0"/>
           <w:sz w:val="22"/>
         </w:rPr>
-        <w:t>“One for each insurer.”</w:t>
-      </w:r>
-    </w:p>
-    <w:p>
-      <w:pPr>
-        <w:spacing w:after="40" w:line="240" w:lineRule="auto"/>
-      </w:pPr>
-      <w:r>
-        <w:rPr>
-          <w:rFonts w:ascii="Georgia" w:hAnsi="Georgia" w:eastAsia="Georgia"/>
-          <w:b w:val="0"/>
-          <w:sz w:val="22"/>
-        </w:rPr>
-        <w:t>“Both for you. In case you read it once.”</w:t>
+        <w:t>“One for each insurer,” said Mr Haskett.</w:t>
+      </w:r>
+    </w:p>
+    <w:p>
+      <w:pPr>
+        <w:spacing w:after="40" w:line="240" w:lineRule="auto"/>
+      </w:pPr>
+      <w:r>
+        <w:rPr>
+          <w:rFonts w:ascii="Georgia" w:hAnsi="Georgia" w:eastAsia="Georgia"/>
+          <w:b w:val="0"/>
+          <w:sz w:val="22"/>
+        </w:rPr>
+        <w:t>“Both for you,” said Mrs Marsh. “In case you read it once.”</w:t>
       </w:r>
     </w:p>
     <w:p>
@@ -23572,20 +23520,7 @@
           <w:b w:val="0"/>
           <w:sz w:val="22"/>
         </w:rPr>
-        <w:t>Trevor sat down on the floor again by the filing cabinet and studied the photograph on his phone, the shut door behind the bottle, at nine fifty-eight and twelve seconds. “That’s the last picture of it. Before.”</w:t>
-      </w:r>
-    </w:p>
-    <w:p>
-      <w:pPr>
-        <w:spacing w:after="160" w:line="240" w:lineRule="auto"/>
-      </w:pPr>
-      <w:r>
-        <w:rPr>
-          <w:rFonts w:ascii="Georgia" w:hAnsi="Georgia" w:eastAsia="Georgia"/>
-          <w:b w:val="0"/>
-          <w:sz w:val="22"/>
-        </w:rPr>
-        <w:t>Trevor put the phone away. At ten past six he glanced at the window, said something about a warden and the Mini, and went down to move it.</w:t>
+        <w:t>At ten past six Trevor glanced at the window, said something about a warden and the Mini, and went down to move it.</w:t>
       </w:r>
     </w:p>
     <w:p>

</xml_diff>

<commit_message>
The Warning That Was Sent Too Late: deeper cut. Ch18 argument trimmed to its turns (~2,230 to 1,940 words, every clue kept), Ch14 reflective stretches shortened (~2,770 to 2,590), small trims in Chs 12, 15, 16; the clock-counting/proper-time/world-line/partial-order exposition moved to a new 'Behind the case' paragraph in Lesson 6 linked to Chapter 18; Quick tests and Chs 19+ unchanged; pacing 8.6 to 9.0, overall 9.0; script scripts/deepcut_2026-10-11.py; md regenerated; old files in bak/2026-10-11 pre-deepcut
</commit_message>
<xml_diff>
--- a/The Relativistic Investigation Bureau - SERIES/Book 2 - The Warning That Was Sent Too Late/The_Warning_That_Was_Sent_Too_Late_BOOK_2_REV02.docx
+++ b/The Relativistic Investigation Bureau - SERIES/Book 2 - The Warning That Was Sent Too Late/The_Warning_That_Was_Sent_Too_Late_BOOK_2_REV02.docx
@@ -13337,7 +13337,7 @@
           <w:b w:val="0"/>
           <w:sz w:val="22"/>
         </w:rPr>
-        <w:t>Derek had known it would be. He had known it all the way back, on foot, with Tabitha’s hand in his. He had known it on the stairs, and on the landing, where Mrs Marsh rose from her step at their approach with the clipboard raised and Penny and Trevor stood behind her, not going in. He knew it, and then he came into his office and saw it, and found that knowing a thing and seeing it were still, after all this, two separate events.</w:t>
+        <w:t>Derek had known it would be. He had known it all the way back, with Tabitha’s hand in his, and on the landing, where Mrs Marsh rose from her step with the clipboard raised and Penny and Trevor stood behind her, not going in. Then he came into his office and saw it, and knowing a thing and seeing it were still, after all this, two separate events.</w:t>
       </w:r>
     </w:p>
     <w:p>
@@ -15558,7 +15558,7 @@
           <w:b w:val="0"/>
           <w:sz w:val="22"/>
         </w:rPr>
-        <w:t>She had sat through a second meeting after Marylebone. She had chaired it. Nobody in the room would have known that her daughter’s name had been on a railway board at lunchtime, because she had made sure nobody would, and because the minutes of a meeting about the refurbishment of a community hall are not the place for it. She had approved a quote for new radiators. She had declined a quote for a mural. She had driven home through the ordinary Monday traffic with her hands at ten to two on the wheel and had not once looked at her phone, because there was nothing on it she needed to read while moving.</w:t>
+        <w:t>She had chaired a second meeting after Marylebone, about the refurbishment of a community hall, and nobody in the room would have known that her daughter’s name had been on a railway board at lunchtime. She had approved a quote for new radiators and declined one for a mural, on the grounds that a mural is a forecast. She had driven home with her hands at ten to two and had not once looked at her phone.</w:t>
       </w:r>
     </w:p>
     <w:p>
@@ -15649,7 +15649,7 @@
           <w:b w:val="0"/>
           <w:sz w:val="22"/>
         </w:rPr>
-        <w:t>Tuppence took her coat off. He held out a hanger for it, one of his own, a good one with the curve right, and she put the coat on it and hung it on the back of the kitchen door, where her coat had hung every evening for three years, and stood for a moment with her hand on the shoulder of it.</w:t>
+        <w:t>Tuppence took her coat off. He held out one of his own hangers for it, a good one with the curve right, and she hung it on the back of the kitchen door and stood for a moment with her hand on its shoulder.</w:t>
       </w:r>
     </w:p>
     <w:p>
@@ -15844,7 +15844,7 @@
           <w:b w:val="0"/>
           <w:sz w:val="22"/>
         </w:rPr>
-        <w:t>Tuppence had chaired committees for twenty years. She knew what a minute was for. A minute recorded a decision, and the time of the decision, and who moved it, so that afterwards nobody could pretend the decision had been made at a different meeting by different people. She had spent a large part of her adult life making sure that the time on a decision was the time the decision was made, and not the time somebody found out about it, or the time somebody first wished it had gone the other way.</w:t>
+        <w:t>Tuppence had chaired committees for twenty years. A minute recorded a decision and the time it was made: not the time somebody found out about it, and not the time somebody first wished it had gone the other way.</w:t>
       </w:r>
     </w:p>
     <w:p>
@@ -15948,7 +15948,7 @@
           <w:b w:val="0"/>
           <w:sz w:val="22"/>
         </w:rPr>
-        <w:t>Julian turned the tap back on, quietly, and then off again, and came and sat down at the end of the table with the beech hanger, which he had picked up again on his way past the worktop. He turned it over in his hands. He did not offer an opinion. He had a rule about not offering opinions on Sophie’s notebook unless asked, and he had never once been asked, and he kept the rule anyway.</w:t>
+        <w:t>Julian came and sat at the end of the table with the beech hanger, turning it over in his hands. He had a rule about not offering opinions on Sophie’s notebook unless asked, and he had never once been asked, and he kept the rule anyway.</w:t>
       </w:r>
     </w:p>
     <w:p>
@@ -16559,7 +16559,7 @@
           <w:b w:val="0"/>
           <w:sz w:val="22"/>
         </w:rPr>
-        <w:t>Tuppence took her phone out of her bag. There was the message she had sent at twenty past one, School told. You’re staying put. Good girl. Mum., which had not been answered and had not needed to be, and nothing since from Derek, because he had said he would not ring Sophie unless Sophie rang him, and he had evidently decided that the same rule covered her.</w:t>
+        <w:t>Tuppence took her phone out of her bag. Nothing from Derek. He had said he would not ring Sophie unless Sophie rang him, and had evidently decided that the same rule covered her.</w:t>
       </w:r>
     </w:p>
     <w:p>
@@ -16805,7 +16805,7 @@
           <w:b w:val="0"/>
           <w:sz w:val="22"/>
         </w:rPr>
-        <w:t xml:space="preserve">She had taken out the itinerary, and her phone, and a biro from the Bureau that said nothing on the side, and the photograph she had taken back off Derek’s monitor at five. She stood it against the sugar bowl, face-up. Four of them and a dog, at half past one on Sunday morning, standing in a row in the office because she had told them to, and herself in the middle, looking furious. She had looked at it a good many times since Sunday. It was still the right way up.</w:t>
+        <w:t>She had taken out the itinerary, her phone, a biro from the Bureau that said nothing on the side, and the photograph she had taken back off Derek’s monitor at five, and stood the photograph against the sugar bowl, face-up: four of them and a dog at half past one on Sunday morning, in a row because she had told them to, and herself in the middle, looking furious. It was still the right way up.</w:t>
       </w:r>
     </w:p>
     <w:p>
@@ -18078,7 +18078,7 @@
           <w:b w:val="0"/>
           <w:sz w:val="22"/>
         </w:rPr>
-        <w:t>It was, he thought, almost the whole lecture. The light came across the sill without being asked, and reached him, and nothing of his had to go back the other way for that to happen. Seeing was not boarding. Being lit by a thing was not being on it. What reaches you is in your past; what you reach is in your future; and a man sitting still in a chair can be reached by a thing all night without once reaching back, for as long as he likes.</w:t>
+        <w:t>It was, he thought, almost the whole lecture. The light came across the sill without being asked, and nothing of his had to go back the other way. Seeing was not boarding. What reaches you is in your past; what you reach is in your future; and a man sitting still in a chair can be reached by a thing all night without once reaching back, for as long as he likes.</w:t>
       </w:r>
     </w:p>
     <w:p>
@@ -18156,7 +18156,7 @@
           <w:b w:val="0"/>
           <w:sz w:val="22"/>
         </w:rPr>
-        <w:t>It was the first thing he had said since Penny left. His own voice in the empty office sounded exactly as it always sounded, the voice for murders and for tea, and it occurred to him that this was the voice the carriage had used, that morning, through three soft knocks. The same register. The same flat calm. Something worn smooth, like a step.</w:t>
+        <w:t>It was the first thing he had said since Penny left. His own voice in the empty office sounded as it always did, the voice for murders and for tea, and it occurred to him that this was the voice the carriage had used that morning, through three soft knocks. The same flat calm, worn smooth, like a step.</w:t>
       </w:r>
     </w:p>
     <w:p>
@@ -19402,20 +19402,20 @@
           <w:b w:val="0"/>
           <w:sz w:val="22"/>
         </w:rPr>
-        <w:t>The room Barbarian took him into had always been the room it was, and Herbert did not look at it. He looked at the table. He could not have done otherwise. It had been cleared, which in that house was itself an event, and on it, in four rows of five, stood twenty clocks.</w:t>
-      </w:r>
-    </w:p>
-    <w:p>
-      <w:pPr>
-        <w:spacing w:after="160" w:line="240" w:lineRule="auto"/>
-      </w:pPr>
-      <w:r>
-        <w:rPr>
-          <w:rFonts w:ascii="Georgia" w:hAnsi="Georgia" w:eastAsia="Georgia"/>
-          <w:b w:val="0"/>
-          <w:sz w:val="22"/>
-        </w:rPr>
-        <w:t xml:space="preserve">They were not a collection in the ordinary sense. There was a kitchen timer shaped like a tomato, a small station clock with its cable cut, a ship’s chronometer in a box, a child’s alarm clock with bells, two wristwatches lying on their backs, an hourglass, a candle marked in rings, a metronome, and others Herbert did not stop to catalogue. Every one that told the time told a different one. The station clock said twenty past nine. The chronometer said a quarter to five. The tomato said nothing, because it did not believe in the hour at all, only in how long until the next thing.</w:t>
+        <w:t>Herbert did not look at the room. He looked at the table, which had been cleared, an event in that house, and on which, in four rows of five, stood twenty clocks.</w:t>
+      </w:r>
+    </w:p>
+    <w:p>
+      <w:pPr>
+        <w:spacing w:after="160" w:line="240" w:lineRule="auto"/>
+      </w:pPr>
+      <w:r>
+        <w:rPr>
+          <w:rFonts w:ascii="Georgia" w:hAnsi="Georgia" w:eastAsia="Georgia"/>
+          <w:b w:val="0"/>
+          <w:sz w:val="22"/>
+        </w:rPr>
+        <w:t>There was a kitchen timer shaped like a tomato, a small station clock with its cable cut, a ship’s chronometer in a box, a child’s alarm clock with bells, two wristwatches lying on their backs, an hourglass, a candle marked in rings, a metronome, and others Herbert did not stop to catalogue. Every one that told the time told a different one. The tomato said nothing, because it did not believe in the hour at all, only in how long until the next thing.</w:t>
       </w:r>
     </w:p>
     <w:p>
@@ -19524,28 +19524,15 @@
     </w:p>
     <w:p>
       <w:pPr>
-        <w:spacing w:after="160" w:line="240" w:lineRule="auto"/>
-      </w:pPr>
-      <w:r>
-        <w:rPr>
-          <w:rFonts w:ascii="Georgia" w:hAnsi="Georgia" w:eastAsia="Georgia"/>
-          <w:b w:val="0"/>
-          <w:sz w:val="22"/>
-        </w:rPr>
-        <w:t>Barbarian studied it for a long time. He did not touch it.</w:t>
-      </w:r>
-    </w:p>
-    <w:p>
-      <w:pPr>
-        <w:spacing w:after="40" w:line="240" w:lineRule="auto"/>
-      </w:pPr>
-      <w:r>
-        <w:rPr>
-          <w:rFonts w:ascii="Georgia" w:hAnsi="Georgia" w:eastAsia="Georgia"/>
-          <w:b w:val="0"/>
-          <w:sz w:val="22"/>
-        </w:rPr>
-        <w:t>“It is beautiful.” He did not look up. “And it has a ruler in it.”</w:t>
+        <w:spacing w:after="40" w:line="240" w:lineRule="auto"/>
+      </w:pPr>
+      <w:r>
+        <w:rPr>
+          <w:rFonts w:ascii="Georgia" w:hAnsi="Georgia" w:eastAsia="Georgia"/>
+          <w:b w:val="0"/>
+          <w:sz w:val="22"/>
+        </w:rPr>
+        <w:t>“It is beautiful,” said Barbarian, without looking up. “And it has a ruler in it.”</w:t>
       </w:r>
     </w:p>
     <w:p>
@@ -19693,19 +19680,6 @@
     </w:p>
     <w:p>
       <w:pPr>
-        <w:spacing w:after="160" w:line="240" w:lineRule="auto"/>
-      </w:pPr>
-      <w:r>
-        <w:rPr>
-          <w:rFonts w:ascii="Georgia" w:hAnsi="Georgia" w:eastAsia="Georgia"/>
-          <w:b w:val="0"/>
-          <w:sz w:val="22"/>
-        </w:rPr>
-        <w:t xml:space="preserve">Herbert took a pencil out of his inside pocket, because he found it easier to think with a pencil in his hand than with twenty clocks in his ear.</w:t>
-      </w:r>
-    </w:p>
-    <w:p>
-      <w:pPr>
         <w:spacing w:after="40" w:line="240" w:lineRule="auto"/>
       </w:pPr>
       <w:r>
@@ -19740,20 +19714,20 @@
           <w:b w:val="0"/>
           <w:sz w:val="22"/>
         </w:rPr>
-        <w:t xml:space="preserve">“In steps. One.” He laid the pencil beside the drawing, parallel to the ruled line, exactly. “Between the door and the reading there is a quantity every good clock at rest in that office would agree on, whatever it said at the start: the difference between its readings. It is not a convention. It is geometry. Two—”</w:t>
-      </w:r>
-    </w:p>
-    <w:p>
-      <w:pPr>
-        <w:spacing w:after="40" w:line="240" w:lineRule="auto"/>
-      </w:pPr>
-      <w:r>
-        <w:rPr>
-          <w:rFonts w:ascii="Georgia" w:hAnsi="Georgia" w:eastAsia="Georgia"/>
-          <w:b w:val="0"/>
-          <w:sz w:val="22"/>
-        </w:rPr>
-        <w:t xml:space="preserve">“Stop. Before two. How would they agree?” said Barbarian. “By counting. Each clock counts its own motion. A pendulum counts swings. Braunschweig counts caesium atoms, because a committee in Paris told it to. Every second there has ever been is one motion counted against another.” He spread his hands over the twenty clocks. “These do not measure time. They measure each other.”</w:t>
+        <w:t>“In steps. One.” He took a pencil from his inside pocket and laid it beside the drawing, parallel to the ruled line, exactly. “Two good clocks at rest side by side in that office agree on the count between the door and the reading, whatever each said at the start. That is not a convention. It is geometry. Two—”</w:t>
+      </w:r>
+    </w:p>
+    <w:p>
+      <w:pPr>
+        <w:spacing w:after="40" w:line="240" w:lineRule="auto"/>
+      </w:pPr>
+      <w:r>
+        <w:rPr>
+          <w:rFonts w:ascii="Georgia" w:hAnsi="Georgia" w:eastAsia="Georgia"/>
+          <w:b w:val="0"/>
+          <w:sz w:val="22"/>
+        </w:rPr>
+        <w:t>“Stop. Before two.” Barbarian spread his hands over the twenty clocks. “They agree because they count. A pendulum counts swings. Braunschweig counts caesium, because a committee in Paris told it to. These do not measure time. They measure each other.”</w:t>
       </w:r>
     </w:p>
     <w:p>
@@ -19831,46 +19805,280 @@
           <w:b w:val="0"/>
           <w:sz w:val="22"/>
         </w:rPr>
-        <w:t xml:space="preserve">“Two. Two good clocks together at the door and together at the reading agree on the count between,” said Herbert. “The world enforces that.”</w:t>
-      </w:r>
-    </w:p>
-    <w:p>
-      <w:pPr>
-        <w:spacing w:after="160" w:line="240" w:lineRule="auto"/>
-      </w:pPr>
-      <w:r>
-        <w:rPr>
-          <w:rFonts w:ascii="Georgia" w:hAnsi="Georgia" w:eastAsia="Georgia"/>
-          <w:b w:val="0"/>
-          <w:sz w:val="22"/>
-        </w:rPr>
-        <w:t xml:space="preserve">“I give you that the world is extraordinarily well behaved about which counts agree. What I do not give you is the wire.” Barbarian tapped the ruled line once with the end of a finger, the only time he touched the paper. “You have the events. You have the order. You have the counts, if anybody counted, which that office mostly did not. Where in any of that is the line?”</w:t>
-      </w:r>
-    </w:p>
-    <w:p>
-      <w:pPr>
-        <w:spacing w:after="160" w:line="240" w:lineRule="auto"/>
-      </w:pPr>
-      <w:r>
-        <w:rPr>
-          <w:rFonts w:ascii="Georgia" w:hAnsi="Georgia" w:eastAsia="Georgia"/>
-          <w:b w:val="0"/>
-          <w:sz w:val="22"/>
-        </w:rPr>
-        <w:t>Herbert regarded the line he had drawn.</w:t>
-      </w:r>
-    </w:p>
-    <w:p>
-      <w:pPr>
-        <w:spacing w:after="40" w:line="240" w:lineRule="auto"/>
-      </w:pPr>
-      <w:r>
-        <w:rPr>
-          <w:rFonts w:ascii="Georgia" w:hAnsi="Georgia" w:eastAsia="Georgia"/>
-          <w:b w:val="0"/>
-          <w:sz w:val="22"/>
-        </w:rPr>
-        <w:t>“It is where I put it.”</w:t>
+        <w:t>“Two. The world enforces that agreement, whatever you call it.”</w:t>
+      </w:r>
+    </w:p>
+    <w:p>
+      <w:pPr>
+        <w:spacing w:after="160" w:line="240" w:lineRule="auto"/>
+      </w:pPr>
+      <w:r>
+        <w:rPr>
+          <w:rFonts w:ascii="Georgia" w:hAnsi="Georgia" w:eastAsia="Georgia"/>
+          <w:b w:val="0"/>
+          <w:sz w:val="22"/>
+        </w:rPr>
+        <w:t>“I give you the counts. I do not give you the wire.” Barbarian waved at the ruled line without touching it. “The line is where you put it. It is the best convenience in physics, so good that people forget they put it there. Then a sheet arrives before a door, and they look at the wire for the answer, and the wire says nothing. YESTERDAY. Not a date; a direction. The most honest railway in Europe. It has never once promised to arrive.”</w:t>
+      </w:r>
+    </w:p>
+    <w:p>
+      <w:pPr>
+        <w:spacing w:after="160" w:line="240" w:lineRule="auto"/>
+      </w:pPr>
+      <w:r>
+        <w:rPr>
+          <w:rFonts w:ascii="Georgia" w:hAnsi="Georgia" w:eastAsia="Georgia"/>
+          <w:b w:val="0"/>
+          <w:sz w:val="22"/>
+        </w:rPr>
+        <w:t>Barbarian’s eyes went to the question mark beside SHEET.</w:t>
+      </w:r>
+    </w:p>
+    <w:p>
+      <w:pPr>
+        <w:spacing w:after="160" w:line="240" w:lineRule="auto"/>
+      </w:pPr>
+      <w:r>
+        <w:rPr>
+          <w:rFonts w:ascii="Georgia" w:hAnsi="Georgia" w:eastAsia="Georgia"/>
+          <w:b w:val="0"/>
+          <w:sz w:val="22"/>
+        </w:rPr>
+        <w:t>“Mr Gent wants to know who sent it. That is the wrong question. Sent is a verb with a before inside it. He wants a person standing at the before, holding the sheet out. But you cannot get a sender out of an order. You can only get one out of a mechanism, and he has no mechanism.” Barbarian considered. “Alfred thinks it was himself, I suppose.”</w:t>
+      </w:r>
+    </w:p>
+    <w:p>
+      <w:pPr>
+        <w:spacing w:after="160" w:line="240" w:lineRule="auto"/>
+      </w:pPr>
+      <w:r>
+        <w:rPr>
+          <w:rFonts w:ascii="Georgia" w:hAnsi="Georgia" w:eastAsia="Georgia"/>
+          <w:b w:val="0"/>
+          <w:sz w:val="22"/>
+        </w:rPr>
+        <w:t>Herbert did not answer, which was an answer.</w:t>
+      </w:r>
+    </w:p>
+    <w:p>
+      <w:pPr>
+        <w:spacing w:after="160" w:line="240" w:lineRule="auto"/>
+      </w:pPr>
+      <w:r>
+        <w:rPr>
+          <w:rFonts w:ascii="Georgia" w:hAnsi="Georgia" w:eastAsia="Georgia"/>
+          <w:b w:val="0"/>
+          <w:sz w:val="22"/>
+        </w:rPr>
+        <w:t>“Of course he does. He was holding it. People always want to be the before; it is the only position in a story that cannot be blamed for arriving late.”</w:t>
+      </w:r>
+    </w:p>
+    <w:p>
+      <w:pPr>
+        <w:spacing w:after="40" w:line="240" w:lineRule="auto"/>
+      </w:pPr>
+      <w:r>
+        <w:rPr>
+          <w:rFonts w:ascii="Georgia" w:hAnsi="Georgia" w:eastAsia="Georgia"/>
+          <w:b w:val="0"/>
+          <w:sz w:val="22"/>
+        </w:rPr>
+        <w:t>“I told him something of the kind this morning.”</w:t>
+      </w:r>
+    </w:p>
+    <w:p>
+      <w:pPr>
+        <w:spacing w:after="40" w:line="240" w:lineRule="auto"/>
+      </w:pPr>
+      <w:r>
+        <w:rPr>
+          <w:rFonts w:ascii="Georgia" w:hAnsi="Georgia" w:eastAsia="Georgia"/>
+          <w:b w:val="0"/>
+          <w:sz w:val="22"/>
+        </w:rPr>
+        <w:t>“Did he listen?”</w:t>
+      </w:r>
+    </w:p>
+    <w:p>
+      <w:pPr>
+        <w:spacing w:after="40" w:line="240" w:lineRule="auto"/>
+      </w:pPr>
+      <w:r>
+        <w:rPr>
+          <w:rFonts w:ascii="Georgia" w:hAnsi="Georgia" w:eastAsia="Georgia"/>
+          <w:b w:val="0"/>
+          <w:sz w:val="22"/>
+        </w:rPr>
+        <w:t>“He opened a patent file about a dishwasher.”</w:t>
+      </w:r>
+    </w:p>
+    <w:p>
+      <w:pPr>
+        <w:spacing w:after="40" w:line="240" w:lineRule="auto"/>
+      </w:pPr>
+      <w:r>
+        <w:rPr>
+          <w:rFonts w:ascii="Georgia" w:hAnsi="Georgia" w:eastAsia="Georgia"/>
+          <w:b w:val="0"/>
+          <w:sz w:val="22"/>
+        </w:rPr>
+        <w:t>“Then he listened.”</w:t>
+      </w:r>
+    </w:p>
+    <w:p>
+      <w:pPr>
+        <w:spacing w:after="160" w:line="240" w:lineRule="auto"/>
+      </w:pPr>
+      <w:r>
+        <w:rPr>
+          <w:rFonts w:ascii="Georgia" w:hAnsi="Georgia" w:eastAsia="Georgia"/>
+          <w:b w:val="0"/>
+          <w:sz w:val="22"/>
+        </w:rPr>
+        <w:t xml:space="preserve">They sat for a while. Twenty clocks went on disagreeing.</w:t>
+      </w:r>
+    </w:p>
+    <w:p>
+      <w:pPr>
+        <w:spacing w:after="40" w:line="240" w:lineRule="auto"/>
+      </w:pPr>
+      <w:r>
+        <w:rPr>
+          <w:rFonts w:ascii="Georgia" w:hAnsi="Georgia" w:eastAsia="Georgia"/>
+          <w:b w:val="0"/>
+          <w:sz w:val="22"/>
+        </w:rPr>
+        <w:t>“You still have not said three.”</w:t>
+      </w:r>
+    </w:p>
+    <w:p>
+      <w:pPr>
+        <w:spacing w:after="160" w:line="240" w:lineRule="auto"/>
+      </w:pPr>
+      <w:r>
+        <w:rPr>
+          <w:rFonts w:ascii="Georgia" w:hAnsi="Georgia" w:eastAsia="Georgia"/>
+          <w:b w:val="0"/>
+          <w:sz w:val="22"/>
+        </w:rPr>
+        <w:t>Herbert picked up the pencil.</w:t>
+      </w:r>
+    </w:p>
+    <w:p>
+      <w:pPr>
+        <w:spacing w:after="160" w:line="240" w:lineRule="auto"/>
+      </w:pPr>
+      <w:r>
+        <w:rPr>
+          <w:rFonts w:ascii="Georgia" w:hAnsi="Georgia" w:eastAsia="Georgia"/>
+          <w:b w:val="0"/>
+          <w:sz w:val="22"/>
+        </w:rPr>
+        <w:t xml:space="preserve">“Three. You may take away my ruler. You may not take away the cone. A sheet and a voice purported to come from somewhere else, and you cannot order events in different places unless you know whether a signal could pass between them. Without the cone your relations are a heap. With it they are a—”</w:t>
+      </w:r>
+    </w:p>
+    <w:p>
+      <w:pPr>
+        <w:spacing w:after="40" w:line="240" w:lineRule="auto"/>
+      </w:pPr>
+      <w:r>
+        <w:rPr>
+          <w:rFonts w:ascii="Georgia" w:hAnsi="Georgia" w:eastAsia="Georgia"/>
+          <w:b w:val="0"/>
+          <w:sz w:val="22"/>
+        </w:rPr>
+        <w:t>“A shape. Yes. Go on.”</w:t>
+      </w:r>
+    </w:p>
+    <w:p>
+      <w:pPr>
+        <w:spacing w:after="160" w:line="240" w:lineRule="auto"/>
+      </w:pPr>
+      <w:r>
+        <w:rPr>
+          <w:rFonts w:ascii="Georgia" w:hAnsi="Georgia" w:eastAsia="Georgia"/>
+          <w:b w:val="0"/>
+          <w:sz w:val="22"/>
+        </w:rPr>
+        <w:t xml:space="preserve">“I am going on. With it they are a partial order. Some pairs before and after. Some pairs neither. The door and the voice: ordered. The sheet and its sender, wherever he is: unknown, because we do not know where he stands.”</w:t>
+      </w:r>
+    </w:p>
+    <w:p>
+      <w:pPr>
+        <w:spacing w:after="160" w:line="240" w:lineRule="auto"/>
+      </w:pPr>
+      <w:r>
+        <w:rPr>
+          <w:rFonts w:ascii="Georgia" w:hAnsi="Georgia" w:eastAsia="Georgia"/>
+          <w:b w:val="0"/>
+          <w:sz w:val="22"/>
+        </w:rPr>
+        <w:t>He stopped, because Barbarian had opened his mouth, and Herbert, for the first time in a conversation with this man that had lasted, on and off, some forty years, held up one hand flat.</w:t>
+      </w:r>
+    </w:p>
+    <w:p>
+      <w:pPr>
+        <w:spacing w:after="40" w:line="240" w:lineRule="auto"/>
+      </w:pPr>
+      <w:r>
+        <w:rPr>
+          <w:rFonts w:ascii="Georgia" w:hAnsi="Georgia" w:eastAsia="Georgia"/>
+          <w:b w:val="0"/>
+          <w:sz w:val="22"/>
+        </w:rPr>
+        <w:t>“No,” Herbert said. “I have not finished.”</w:t>
+      </w:r>
+    </w:p>
+    <w:p>
+      <w:pPr>
+        <w:spacing w:after="160" w:line="240" w:lineRule="auto"/>
+      </w:pPr>
+      <w:r>
+        <w:rPr>
+          <w:rFonts w:ascii="Georgia" w:hAnsi="Georgia" w:eastAsia="Georgia"/>
+          <w:b w:val="0"/>
+          <w:sz w:val="22"/>
+        </w:rPr>
+        <w:t>Barbarian shut his mouth.</w:t>
+      </w:r>
+    </w:p>
+    <w:p>
+      <w:pPr>
+        <w:spacing w:after="160" w:line="240" w:lineRule="auto"/>
+      </w:pPr>
+      <w:r>
+        <w:rPr>
+          <w:rFonts w:ascii="Georgia" w:hAnsi="Georgia" w:eastAsia="Georgia"/>
+          <w:b w:val="0"/>
+          <w:sz w:val="22"/>
+        </w:rPr>
+        <w:t xml:space="preserve">“The sender stays blank because we do not know where the sender stands in the shape. It is not a mystery. It is a missing coordinate. When Mr Gent leaves that field empty, he is writing down accurately that one of his events has no place yet. Now you may speak.”</w:t>
+      </w:r>
+    </w:p>
+    <w:p>
+      <w:pPr>
+        <w:spacing w:after="160" w:line="240" w:lineRule="auto"/>
+      </w:pPr>
+      <w:r>
+        <w:rPr>
+          <w:rFonts w:ascii="Georgia" w:hAnsi="Georgia" w:eastAsia="Georgia"/>
+          <w:b w:val="0"/>
+          <w:sz w:val="22"/>
+        </w:rPr>
+        <w:t>Barbarian looked at him across the twenty clocks with an expression Herbert had never once seen on his face, and which he identified, after a moment, as pure happiness.</w:t>
+      </w:r>
+    </w:p>
+    <w:p>
+      <w:pPr>
+        <w:spacing w:after="40" w:line="240" w:lineRule="auto"/>
+      </w:pPr>
+      <w:r>
+        <w:rPr>
+          <w:rFonts w:ascii="Georgia" w:hAnsi="Georgia" w:eastAsia="Georgia"/>
+          <w:b w:val="0"/>
+          <w:sz w:val="22"/>
+        </w:rPr>
+        <w:t>“You interrupted me.”</w:t>
       </w:r>
     </w:p>
     <w:p>
@@ -19896,331 +20104,6 @@
           <w:b w:val="0"/>
           <w:sz w:val="22"/>
         </w:rPr>
-        <w:t>“It is a convenience.”</w:t>
-      </w:r>
-    </w:p>
-    <w:p>
-      <w:pPr>
-        <w:spacing w:after="160" w:line="240" w:lineRule="auto"/>
-      </w:pPr>
-      <w:r>
-        <w:rPr>
-          <w:rFonts w:ascii="Georgia" w:hAnsi="Georgia" w:eastAsia="Georgia"/>
-          <w:b w:val="0"/>
-          <w:sz w:val="22"/>
-        </w:rPr>
-        <w:t>“It is the best convenience in physics. It is so good that people forget they put it there.” Barbarian sat back. “Then a sheet arrives before a door, and they look at the wire for the answer, and the wire says nothing. YESTERDAY. Not a date; a direction. The most honest railway in Europe. It has never once promised to arrive. I should like to meet whoever designed it.”</w:t>
-      </w:r>
-    </w:p>
-    <w:p>
-      <w:pPr>
-        <w:spacing w:after="40" w:line="240" w:lineRule="auto"/>
-      </w:pPr>
-      <w:r>
-        <w:rPr>
-          <w:rFonts w:ascii="Georgia" w:hAnsi="Georgia" w:eastAsia="Georgia"/>
-          <w:b w:val="0"/>
-          <w:sz w:val="22"/>
-        </w:rPr>
-        <w:t>“So should Mr Gent.”</w:t>
-      </w:r>
-    </w:p>
-    <w:p>
-      <w:pPr>
-        <w:spacing w:after="160" w:line="240" w:lineRule="auto"/>
-      </w:pPr>
-      <w:r>
-        <w:rPr>
-          <w:rFonts w:ascii="Georgia" w:hAnsi="Georgia" w:eastAsia="Georgia"/>
-          <w:b w:val="0"/>
-          <w:sz w:val="22"/>
-        </w:rPr>
-        <w:t>“No. Mr Gent should like to know who sent the sheet. That is a different wish.” Barbarian’s eyes went to the question mark beside SHEET. “And it is the wrong question.”</w:t>
-      </w:r>
-    </w:p>
-    <w:p>
-      <w:pPr>
-        <w:spacing w:after="40" w:line="240" w:lineRule="auto"/>
-      </w:pPr>
-      <w:r>
-        <w:rPr>
-          <w:rFonts w:ascii="Georgia" w:hAnsi="Georgia" w:eastAsia="Georgia"/>
-          <w:b w:val="0"/>
-          <w:sz w:val="22"/>
-        </w:rPr>
-        <w:t>“It is not a wrong question. It is an unanswerable one, at present.”</w:t>
-      </w:r>
-    </w:p>
-    <w:p>
-      <w:pPr>
-        <w:spacing w:after="160" w:line="240" w:lineRule="auto"/>
-      </w:pPr>
-      <w:r>
-        <w:rPr>
-          <w:rFonts w:ascii="Georgia" w:hAnsi="Georgia" w:eastAsia="Georgia"/>
-          <w:b w:val="0"/>
-          <w:sz w:val="22"/>
-        </w:rPr>
-        <w:t xml:space="preserve">“It is wrong in the form he asks it. Who sent it. Sent is a verb with a before inside it. He wants a person standing at the before, holding the sheet out. But you cannot get a sender out of an order. You can only get one out of a mechanism, and he has no mechanism.” Barbarian considered. “Alfred thinks it was himself, I suppose.”</w:t>
-      </w:r>
-    </w:p>
-    <w:p>
-      <w:pPr>
-        <w:spacing w:after="160" w:line="240" w:lineRule="auto"/>
-      </w:pPr>
-      <w:r>
-        <w:rPr>
-          <w:rFonts w:ascii="Georgia" w:hAnsi="Georgia" w:eastAsia="Georgia"/>
-          <w:b w:val="0"/>
-          <w:sz w:val="22"/>
-        </w:rPr>
-        <w:t>Herbert did not answer, which was an answer.</w:t>
-      </w:r>
-    </w:p>
-    <w:p>
-      <w:pPr>
-        <w:spacing w:after="160" w:line="240" w:lineRule="auto"/>
-      </w:pPr>
-      <w:r>
-        <w:rPr>
-          <w:rFonts w:ascii="Georgia" w:hAnsi="Georgia" w:eastAsia="Georgia"/>
-          <w:b w:val="0"/>
-          <w:sz w:val="22"/>
-        </w:rPr>
-        <w:t>“Of course he does. He was holding it. People always want to be the before; it is the only position in a story that cannot be blamed for arriving late.”</w:t>
-      </w:r>
-    </w:p>
-    <w:p>
-      <w:pPr>
-        <w:spacing w:after="40" w:line="240" w:lineRule="auto"/>
-      </w:pPr>
-      <w:r>
-        <w:rPr>
-          <w:rFonts w:ascii="Georgia" w:hAnsi="Georgia" w:eastAsia="Georgia"/>
-          <w:b w:val="0"/>
-          <w:sz w:val="22"/>
-        </w:rPr>
-        <w:t>“I told him something of the kind this morning.”</w:t>
-      </w:r>
-    </w:p>
-    <w:p>
-      <w:pPr>
-        <w:spacing w:after="40" w:line="240" w:lineRule="auto"/>
-      </w:pPr>
-      <w:r>
-        <w:rPr>
-          <w:rFonts w:ascii="Georgia" w:hAnsi="Georgia" w:eastAsia="Georgia"/>
-          <w:b w:val="0"/>
-          <w:sz w:val="22"/>
-        </w:rPr>
-        <w:t>“Did he listen?”</w:t>
-      </w:r>
-    </w:p>
-    <w:p>
-      <w:pPr>
-        <w:spacing w:after="40" w:line="240" w:lineRule="auto"/>
-      </w:pPr>
-      <w:r>
-        <w:rPr>
-          <w:rFonts w:ascii="Georgia" w:hAnsi="Georgia" w:eastAsia="Georgia"/>
-          <w:b w:val="0"/>
-          <w:sz w:val="22"/>
-        </w:rPr>
-        <w:t>“He opened a patent file about a dishwasher.”</w:t>
-      </w:r>
-    </w:p>
-    <w:p>
-      <w:pPr>
-        <w:spacing w:after="40" w:line="240" w:lineRule="auto"/>
-      </w:pPr>
-      <w:r>
-        <w:rPr>
-          <w:rFonts w:ascii="Georgia" w:hAnsi="Georgia" w:eastAsia="Georgia"/>
-          <w:b w:val="0"/>
-          <w:sz w:val="22"/>
-        </w:rPr>
-        <w:t>“Then he listened.”</w:t>
-      </w:r>
-    </w:p>
-    <w:p>
-      <w:pPr>
-        <w:spacing w:after="160" w:line="240" w:lineRule="auto"/>
-      </w:pPr>
-      <w:r>
-        <w:rPr>
-          <w:rFonts w:ascii="Georgia" w:hAnsi="Georgia" w:eastAsia="Georgia"/>
-          <w:b w:val="0"/>
-          <w:sz w:val="22"/>
-        </w:rPr>
-        <w:t xml:space="preserve">They sat for a while. Twenty clocks went on disagreeing.</w:t>
-      </w:r>
-    </w:p>
-    <w:p>
-      <w:pPr>
-        <w:spacing w:after="40" w:line="240" w:lineRule="auto"/>
-      </w:pPr>
-      <w:r>
-        <w:rPr>
-          <w:rFonts w:ascii="Georgia" w:hAnsi="Georgia" w:eastAsia="Georgia"/>
-          <w:b w:val="0"/>
-          <w:sz w:val="22"/>
-        </w:rPr>
-        <w:t>“You still have not said three.”</w:t>
-      </w:r>
-    </w:p>
-    <w:p>
-      <w:pPr>
-        <w:spacing w:after="160" w:line="240" w:lineRule="auto"/>
-      </w:pPr>
-      <w:r>
-        <w:rPr>
-          <w:rFonts w:ascii="Georgia" w:hAnsi="Georgia" w:eastAsia="Georgia"/>
-          <w:b w:val="0"/>
-          <w:sz w:val="22"/>
-        </w:rPr>
-        <w:t>Herbert picked up the pencil.</w:t>
-      </w:r>
-    </w:p>
-    <w:p>
-      <w:pPr>
-        <w:spacing w:after="160" w:line="240" w:lineRule="auto"/>
-      </w:pPr>
-      <w:r>
-        <w:rPr>
-          <w:rFonts w:ascii="Georgia" w:hAnsi="Georgia" w:eastAsia="Georgia"/>
-          <w:b w:val="0"/>
-          <w:sz w:val="22"/>
-        </w:rPr>
-        <w:t xml:space="preserve">“Three. You may take away my ruler. You may not take away the cone. A sheet and a voice purported to come from somewhere else, and you cannot order events in different places unless you know whether a signal could pass between them. Without the cone your relations are a heap. With it they are a—”</w:t>
-      </w:r>
-    </w:p>
-    <w:p>
-      <w:pPr>
-        <w:spacing w:after="40" w:line="240" w:lineRule="auto"/>
-      </w:pPr>
-      <w:r>
-        <w:rPr>
-          <w:rFonts w:ascii="Georgia" w:hAnsi="Georgia" w:eastAsia="Georgia"/>
-          <w:b w:val="0"/>
-          <w:sz w:val="22"/>
-        </w:rPr>
-        <w:t>“A shape. Yes. Go on.”</w:t>
-      </w:r>
-    </w:p>
-    <w:p>
-      <w:pPr>
-        <w:spacing w:after="160" w:line="240" w:lineRule="auto"/>
-      </w:pPr>
-      <w:r>
-        <w:rPr>
-          <w:rFonts w:ascii="Georgia" w:hAnsi="Georgia" w:eastAsia="Georgia"/>
-          <w:b w:val="0"/>
-          <w:sz w:val="22"/>
-        </w:rPr>
-        <w:t xml:space="preserve">“I am going on. With it they are a partial order. Some pairs before and after. Some pairs neither. The door and the voice: ordered. The sheet and its sender, wherever he is: unknown, because we do not know where he stands.”</w:t>
-      </w:r>
-    </w:p>
-    <w:p>
-      <w:pPr>
-        <w:spacing w:after="160" w:line="240" w:lineRule="auto"/>
-      </w:pPr>
-      <w:r>
-        <w:rPr>
-          <w:rFonts w:ascii="Georgia" w:hAnsi="Georgia" w:eastAsia="Georgia"/>
-          <w:b w:val="0"/>
-          <w:sz w:val="22"/>
-        </w:rPr>
-        <w:t>He stopped, because Barbarian had opened his mouth, and Herbert, for the first time in a conversation with this man that had lasted, on and off, some forty years, held up one hand flat.</w:t>
-      </w:r>
-    </w:p>
-    <w:p>
-      <w:pPr>
-        <w:spacing w:after="40" w:line="240" w:lineRule="auto"/>
-      </w:pPr>
-      <w:r>
-        <w:rPr>
-          <w:rFonts w:ascii="Georgia" w:hAnsi="Georgia" w:eastAsia="Georgia"/>
-          <w:b w:val="0"/>
-          <w:sz w:val="22"/>
-        </w:rPr>
-        <w:t>“No,” Herbert said. “I have not finished.”</w:t>
-      </w:r>
-    </w:p>
-    <w:p>
-      <w:pPr>
-        <w:spacing w:after="160" w:line="240" w:lineRule="auto"/>
-      </w:pPr>
-      <w:r>
-        <w:rPr>
-          <w:rFonts w:ascii="Georgia" w:hAnsi="Georgia" w:eastAsia="Georgia"/>
-          <w:b w:val="0"/>
-          <w:sz w:val="22"/>
-        </w:rPr>
-        <w:t>Barbarian shut his mouth.</w:t>
-      </w:r>
-    </w:p>
-    <w:p>
-      <w:pPr>
-        <w:spacing w:after="160" w:line="240" w:lineRule="auto"/>
-      </w:pPr>
-      <w:r>
-        <w:rPr>
-          <w:rFonts w:ascii="Georgia" w:hAnsi="Georgia" w:eastAsia="Georgia"/>
-          <w:b w:val="0"/>
-          <w:sz w:val="22"/>
-        </w:rPr>
-        <w:t xml:space="preserve">“The sender stays blank because we do not know where the sender stands in the shape. It is not a mystery. It is a missing coordinate. When Mr Gent leaves that field empty, he is writing down accurately that one of his events has no place yet. Now you may speak.”</w:t>
-      </w:r>
-    </w:p>
-    <w:p>
-      <w:pPr>
-        <w:spacing w:after="160" w:line="240" w:lineRule="auto"/>
-      </w:pPr>
-      <w:r>
-        <w:rPr>
-          <w:rFonts w:ascii="Georgia" w:hAnsi="Georgia" w:eastAsia="Georgia"/>
-          <w:b w:val="0"/>
-          <w:sz w:val="22"/>
-        </w:rPr>
-        <w:t>Barbarian looked at him across the twenty clocks with an expression Herbert had never once seen on his face, and which he identified, after a moment, as pure happiness.</w:t>
-      </w:r>
-    </w:p>
-    <w:p>
-      <w:pPr>
-        <w:spacing w:after="40" w:line="240" w:lineRule="auto"/>
-      </w:pPr>
-      <w:r>
-        <w:rPr>
-          <w:rFonts w:ascii="Georgia" w:hAnsi="Georgia" w:eastAsia="Georgia"/>
-          <w:b w:val="0"/>
-          <w:sz w:val="22"/>
-        </w:rPr>
-        <w:t>“You interrupted me.”</w:t>
-      </w:r>
-    </w:p>
-    <w:p>
-      <w:pPr>
-        <w:spacing w:after="40" w:line="240" w:lineRule="auto"/>
-      </w:pPr>
-      <w:r>
-        <w:rPr>
-          <w:rFonts w:ascii="Georgia" w:hAnsi="Georgia" w:eastAsia="Georgia"/>
-          <w:b w:val="0"/>
-          <w:sz w:val="22"/>
-        </w:rPr>
-        <w:t>“Yes.”</w:t>
-      </w:r>
-    </w:p>
-    <w:p>
-      <w:pPr>
-        <w:spacing w:after="40" w:line="240" w:lineRule="auto"/>
-      </w:pPr>
-      <w:r>
-        <w:rPr>
-          <w:rFonts w:ascii="Georgia" w:hAnsi="Georgia" w:eastAsia="Georgia"/>
-          <w:b w:val="0"/>
-          <w:sz w:val="22"/>
-        </w:rPr>
         <w:t>“In forty years you have never interrupted me.”</w:t>
       </w:r>
     </w:p>
@@ -20247,7 +20130,7 @@
           <w:b w:val="0"/>
           <w:sz w:val="22"/>
         </w:rPr>
-        <w:t>“Excellent,” said Julius Barbarian. “Oh, excellent.” He leaned forward. “A partial order. Not a wire. A shape with holes in it where we do not know the places yet. I can live in that. I have always lived in that. You have simply never said it to me without a ruler in your hand.” He reached out, and for the second time touched the drawing, and this time he turned it face-down. “May I have this? For the collection.”</w:t>
+        <w:t>“Excellent,” said Julius Barbarian. “Oh, excellent.” He leaned forward. “A partial order. Not a wire. A shape with holes in it where we do not know the places yet. I can live in that. I have always lived in that. You have simply never said it to me without a ruler in your hand.” He reached out and, for the first time, touched the drawing, turning it face-down. “May I have this? For the collection.”</w:t>
       </w:r>
     </w:p>
     <w:p>
@@ -20312,7 +20195,7 @@
           <w:b w:val="0"/>
           <w:sz w:val="22"/>
         </w:rPr>
-        <w:t>Herbert considered refusing, and found that he did not want to. He asked for a clean sheet, which took some time to find, because the papers in that house were where they had been put for reasons, and he took his ruler out of his inside pocket and then, after a moment’s thought, put it back. He drew the five events freehand, as small circles, without a line between them. He joined the ones that could be ordered with short arrows: sheet to door, door to voice, voice to reading, reading to refusal. He drew the train, out to one side, as a sixth circle, and an arrow from the sheet to the train, and nothing at all from the train back. He drew Sunday’s radiator as a seventh circle, lower down, and an arrow from it to the door, and wrote on the arrow, in his immaculate hand: POSSIBLE. NOT SHOWN. And off on its own, unconnected to anything, an eighth circle, empty, with a question mark inside it, and no arrow either way.</w:t>
+        <w:t>Herbert considered refusing, and found that he did not want to. He took his ruler out of his inside pocket and, after a moment’s thought, put it back. On a clean sheet he drew the five events freehand, as small circles, and joined the ones that could be ordered with short arrows: sheet to door, door to voice, voice to reading, reading to refusal. The train went out to one side, with an arrow from the sheet to it and nothing at all coming back. Sunday’s radiator went lower down, with an arrow to the door on which he wrote, in his immaculate hand, POSSIBLE. NOT SHOWN. And off on its own, unconnected to anything, an empty circle with a question mark inside it.</w:t>
       </w:r>
     </w:p>
     <w:p>
@@ -20390,7 +20273,7 @@
           <w:b w:val="0"/>
           <w:sz w:val="22"/>
         </w:rPr>
-        <w:t>Herbert left it. He stood, and put on his coat, and buttoned it, and looked at his watch, which said a quarter to four, because Braunschweig said so; and he found, to his own surprise, that he looked at it as one more clock on a table of twenty and did not mind.</w:t>
+        <w:t>Herbert left it. He put on his coat and looked at his watch, which said a quarter to four because Braunschweig said so, and found, to his own surprise, that he looked at it as one more clock on a table of twenty and did not mind.</w:t>
       </w:r>
     </w:p>
     <w:p>
@@ -26543,6 +26426,39 @@
           <w:sz w:val="22"/>
         </w:rPr>
         <w:t xml:space="preserve">Keep this: earlier opening left in the past, boarding refused while it was still future, no name invented for the morning sheet. When the evidence showed a printer and a route, they went in the record, and the author field stayed empty.</w:t>
+      </w:r>
+    </w:p>
+    <w:p>
+      <w:pPr>
+        <w:spacing w:after="160" w:line="240" w:lineRule="auto"/>
+      </w:pPr>
+      <w:r>
+        <w:rPr>
+          <w:rFonts w:ascii="Georgia" w:hAnsi="Georgia" w:eastAsia="Georgia"/>
+          <w:b w:val="0"/>
+          <w:sz w:val="22"/>
+        </w:rPr>
+        <w:t xml:space="preserve">Behind the case: what Herbert and Barbarian argue about over twenty clocks in </w:t>
+      </w:r>
+      <w:hyperlink w:anchor="chapter_18">
+        <w:r>
+          <w:rPr>
+            <w:rFonts w:ascii="Georgia" w:hAnsi="Georgia" w:eastAsia="Georgia"/>
+            <w:b w:val="0"/>
+            <w:sz w:val="22"/>
+            <w:color w:val="0563C1"/>
+            <w:u w:val="single"/>
+          </w:rPr>
+          <w:t xml:space="preserve">Chapter 18</w:t>
+        </w:r>
+      </w:hyperlink>
+      <w:r>
+        <w:rPr>
+          <w:rFonts w:ascii="Georgia" w:hAnsi="Georgia" w:eastAsia="Georgia"/>
+          <w:b w:val="0"/>
+          <w:sz w:val="22"/>
+        </w:rPr>
+        <w:t xml:space="preserve">. Every clock is a counter. A pendulum counts swings; since 1967 the SI second has been defined as 9,192,631,770 periods of the radiation from a caesium-133 atom, so every second ever recorded is one motion counted against another. Two good clocks at rest side by side in the office, set to different readings, still agree on the count between the door and the reading. That count, the proper time, is geometry, not convention. The ruled line on Herbert’s squared paper, the office’s world line, is a drawing aid: what the evidence supplies is events, their order, and counts where anybody counted. The light cone turns that into a partial order. Pairs that a signal could connect are ordered for every observer. Pairs that no signal could connect are neither before nor after. An event with no known place, like the sender of the morning sheet, cannot be ordered at all, which is why that field stays blank.</w:t>
       </w:r>
     </w:p>
     <w:p>

</xml_diff>